<commit_message>
Deploying to gh-pages from @ lognitilab/lognitilab.github.io@5dfe169b810848d6b58de1a503ecad2980e2b0d7 🚀
</commit_message>
<xml_diff>
--- a/assets/doc/cv-anmolpahwa.docx
+++ b/assets/doc/cv-anmolpahwa.docx
@@ -343,8 +343,20 @@
                   <w:szCs w:val="24"/>
                   <w:lang w:val="en-IN"/>
                 </w:rPr>
-                <w:t>civil.iitm.ac.im/faculty/anmpahwa</w:t>
+                <w:t>civil.iitm.ac.im/faculty/</w:t>
               </w:r>
+              <w:proofErr w:type="spellStart"/>
+              <w:r>
+                <w:rPr>
+                  <w:rStyle w:val="Hyperlink"/>
+                  <w:rFonts w:eastAsia="Times New Roman"/>
+                  <w:sz w:val="24"/>
+                  <w:szCs w:val="24"/>
+                  <w:lang w:val="en-IN"/>
+                </w:rPr>
+                <w:t>anmpahwa</w:t>
+              </w:r>
+              <w:proofErr w:type="spellEnd"/>
             </w:hyperlink>
           </w:p>
         </w:tc>
@@ -814,7 +826,27 @@
                 <w:szCs w:val="24"/>
                 <w:lang w:val="en-IN"/>
               </w:rPr>
-              <w:t>Dr. Geetam Tiwari</w:t>
+              <w:t xml:space="preserve">Dr. </w:t>
+            </w:r>
+            <w:proofErr w:type="spellStart"/>
+            <w:r>
+              <w:rPr>
+                <w:rFonts w:eastAsia="Times New Roman"/>
+                <w:sz w:val="24"/>
+                <w:szCs w:val="24"/>
+                <w:lang w:val="en-IN"/>
+              </w:rPr>
+              <w:t>Geetam</w:t>
+            </w:r>
+            <w:proofErr w:type="spellEnd"/>
+            <w:r>
+              <w:rPr>
+                <w:rFonts w:eastAsia="Times New Roman"/>
+                <w:sz w:val="24"/>
+                <w:szCs w:val="24"/>
+                <w:lang w:val="en-IN"/>
+              </w:rPr>
+              <w:t xml:space="preserve"> Tiwari</w:t>
             </w:r>
           </w:p>
         </w:tc>
@@ -1558,7 +1590,27 @@
           <w:szCs w:val="24"/>
           <w:lang w:val="en-IN"/>
         </w:rPr>
-        <w:t xml:space="preserve">Jaller, M., Xiao, R. I., Dennis-Bauer, S., Rivera-Royero, D., &amp; Pahwa, A. (2023). Estimating last-mile deliveries and shopping travel emissions by 2050. </w:t>
+        <w:t>Jaller, M., Xiao, R. I., Dennis-Bauer, S., Rivera-</w:t>
+      </w:r>
+      <w:proofErr w:type="spellStart"/>
+      <w:r>
+        <w:rPr>
+          <w:rFonts w:eastAsia="Times New Roman"/>
+          <w:sz w:val="24"/>
+          <w:szCs w:val="24"/>
+          <w:lang w:val="en-IN"/>
+        </w:rPr>
+        <w:t>Royero</w:t>
+      </w:r>
+      <w:proofErr w:type="spellEnd"/>
+      <w:r>
+        <w:rPr>
+          <w:rFonts w:eastAsia="Times New Roman"/>
+          <w:sz w:val="24"/>
+          <w:szCs w:val="24"/>
+          <w:lang w:val="en-IN"/>
+        </w:rPr>
+        <w:t xml:space="preserve">, D., &amp; Pahwa, A. (2023). Estimating last-mile deliveries and shopping travel emissions by 2050. </w:t>
       </w:r>
       <w:r>
         <w:rPr>
@@ -1695,7 +1747,27 @@
           <w:szCs w:val="24"/>
           <w:lang w:val="en-IN"/>
         </w:rPr>
-        <w:t xml:space="preserve">Jaller, M., &amp; Pahwa, A. (2020). Evaluating the environmental impacts of online shopping: A behavioral and transportation approach. </w:t>
+        <w:t xml:space="preserve">Jaller, M., &amp; Pahwa, A. (2020). Evaluating the environmental impacts of online shopping: A </w:t>
+      </w:r>
+      <w:proofErr w:type="spellStart"/>
+      <w:r>
+        <w:rPr>
+          <w:rFonts w:eastAsia="Times New Roman"/>
+          <w:sz w:val="24"/>
+          <w:szCs w:val="24"/>
+          <w:lang w:val="en-IN"/>
+        </w:rPr>
+        <w:t>behavioral</w:t>
+      </w:r>
+      <w:proofErr w:type="spellEnd"/>
+      <w:r>
+        <w:rPr>
+          <w:rFonts w:eastAsia="Times New Roman"/>
+          <w:sz w:val="24"/>
+          <w:szCs w:val="24"/>
+          <w:lang w:val="en-IN"/>
+        </w:rPr>
+        <w:t xml:space="preserve"> and transportation approach. </w:t>
       </w:r>
       <w:r>
         <w:rPr>
@@ -1881,18 +1953,62 @@
           <w:szCs w:val="24"/>
           <w:lang w:val="en-IN"/>
         </w:rPr>
-        <w:t xml:space="preserve">Jaller, M., Pahwa, A., &amp; Center, M. T. (2023). Sketch Planning Tool for Sustainable and Resilient Urban Goods Distribution: User Manual. </w:t>
-      </w:r>
-      <w:r>
-        <w:rPr>
-          <w:rFonts w:eastAsia="Times New Roman"/>
-          <w:i/>
-          <w:iCs/>
-          <w:sz w:val="24"/>
-          <w:szCs w:val="24"/>
-          <w:lang w:val="en-IN"/>
-        </w:rPr>
-        <w:t>METRANS Transportation Center (Calif.).</w:t>
+        <w:t xml:space="preserve">Jaller, M., Pahwa, A., &amp; </w:t>
+      </w:r>
+      <w:proofErr w:type="spellStart"/>
+      <w:r>
+        <w:rPr>
+          <w:rFonts w:eastAsia="Times New Roman"/>
+          <w:sz w:val="24"/>
+          <w:szCs w:val="24"/>
+          <w:lang w:val="en-IN"/>
+        </w:rPr>
+        <w:t>Center</w:t>
+      </w:r>
+      <w:proofErr w:type="spellEnd"/>
+      <w:r>
+        <w:rPr>
+          <w:rFonts w:eastAsia="Times New Roman"/>
+          <w:sz w:val="24"/>
+          <w:szCs w:val="24"/>
+          <w:lang w:val="en-IN"/>
+        </w:rPr>
+        <w:t xml:space="preserve">, M. T. (2023). Sketch Planning Tool for Sustainable and Resilient Urban Goods Distribution: User Manual. </w:t>
+      </w:r>
+      <w:r>
+        <w:rPr>
+          <w:rFonts w:eastAsia="Times New Roman"/>
+          <w:i/>
+          <w:iCs/>
+          <w:sz w:val="24"/>
+          <w:szCs w:val="24"/>
+          <w:lang w:val="en-IN"/>
+        </w:rPr>
+        <w:t xml:space="preserve">METRANS Transportation </w:t>
+      </w:r>
+      <w:proofErr w:type="spellStart"/>
+      <w:r>
+        <w:rPr>
+          <w:rFonts w:eastAsia="Times New Roman"/>
+          <w:i/>
+          <w:iCs/>
+          <w:sz w:val="24"/>
+          <w:szCs w:val="24"/>
+          <w:lang w:val="en-IN"/>
+        </w:rPr>
+        <w:t>Center</w:t>
+      </w:r>
+      <w:proofErr w:type="spellEnd"/>
+      <w:r>
+        <w:rPr>
+          <w:rFonts w:eastAsia="Times New Roman"/>
+          <w:i/>
+          <w:iCs/>
+          <w:sz w:val="24"/>
+          <w:szCs w:val="24"/>
+          <w:lang w:val="en-IN"/>
+        </w:rPr>
+        <w:t xml:space="preserve"> (Calif.).</w:t>
       </w:r>
     </w:p>
     <w:p>
@@ -1926,7 +2042,31 @@
           <w:szCs w:val="24"/>
           <w:lang w:val="en-IN"/>
         </w:rPr>
-        <w:t xml:space="preserve">National Center for </w:t>
+        <w:t xml:space="preserve">National </w:t>
+      </w:r>
+      <w:proofErr w:type="spellStart"/>
+      <w:r>
+        <w:rPr>
+          <w:rFonts w:eastAsia="Times New Roman"/>
+          <w:i/>
+          <w:iCs/>
+          <w:sz w:val="24"/>
+          <w:szCs w:val="24"/>
+          <w:lang w:val="en-IN"/>
+        </w:rPr>
+        <w:t>Center</w:t>
+      </w:r>
+      <w:proofErr w:type="spellEnd"/>
+      <w:r>
+        <w:rPr>
+          <w:rFonts w:eastAsia="Times New Roman"/>
+          <w:i/>
+          <w:iCs/>
+          <w:sz w:val="24"/>
+          <w:szCs w:val="24"/>
+          <w:lang w:val="en-IN"/>
+        </w:rPr>
+        <w:t xml:space="preserve"> for </w:t>
       </w:r>
       <w:r>
         <w:rPr>
@@ -1958,7 +2098,23 @@
           <w:sz w:val="24"/>
           <w:szCs w:val="24"/>
         </w:rPr>
-        <w:t xml:space="preserve">Giuliano, G., Boarnet, M., Jaller, M., Franco, W., Binder, R. B., Dexter, S., </w:t>
+        <w:t xml:space="preserve">Giuliano, G., </w:t>
+      </w:r>
+      <w:proofErr w:type="spellStart"/>
+      <w:r>
+        <w:rPr>
+          <w:sz w:val="24"/>
+          <w:szCs w:val="24"/>
+        </w:rPr>
+        <w:t>Boarnet</w:t>
+      </w:r>
+      <w:proofErr w:type="spellEnd"/>
+      <w:r>
+        <w:rPr>
+          <w:sz w:val="24"/>
+          <w:szCs w:val="24"/>
+        </w:rPr>
+        <w:t xml:space="preserve">, M., Jaller, M., Franco, W., Binder, R. B., Dexter, S., </w:t>
       </w:r>
       <w:r>
         <w:rPr>
@@ -2162,18 +2318,62 @@
           <w:szCs w:val="24"/>
           <w:lang w:val="en-IN"/>
         </w:rPr>
-        <w:t xml:space="preserve">Jaller, M., Xiao, R., Dennis, S., Rivera-Royero, D., &amp; Pahwa, A. (2022). National Impacts of E-commerce Growth: Development of a Spatial Demand Based Tool. </w:t>
-      </w:r>
-      <w:r>
-        <w:rPr>
-          <w:rFonts w:eastAsia="Times New Roman"/>
-          <w:i/>
-          <w:iCs/>
-          <w:sz w:val="24"/>
-          <w:szCs w:val="24"/>
-          <w:lang w:val="en-IN"/>
-        </w:rPr>
-        <w:t>National Center for Sustainable Transportation.</w:t>
+        <w:t>Jaller, M., Xiao, R., Dennis, S., Rivera-</w:t>
+      </w:r>
+      <w:proofErr w:type="spellStart"/>
+      <w:r>
+        <w:rPr>
+          <w:rFonts w:eastAsia="Times New Roman"/>
+          <w:sz w:val="24"/>
+          <w:szCs w:val="24"/>
+          <w:lang w:val="en-IN"/>
+        </w:rPr>
+        <w:t>Royero</w:t>
+      </w:r>
+      <w:proofErr w:type="spellEnd"/>
+      <w:r>
+        <w:rPr>
+          <w:rFonts w:eastAsia="Times New Roman"/>
+          <w:sz w:val="24"/>
+          <w:szCs w:val="24"/>
+          <w:lang w:val="en-IN"/>
+        </w:rPr>
+        <w:t xml:space="preserve">, D., &amp; Pahwa, A. (2022). National Impacts of E-commerce Growth: Development of a Spatial Demand Based Tool. </w:t>
+      </w:r>
+      <w:r>
+        <w:rPr>
+          <w:rFonts w:eastAsia="Times New Roman"/>
+          <w:i/>
+          <w:iCs/>
+          <w:sz w:val="24"/>
+          <w:szCs w:val="24"/>
+          <w:lang w:val="en-IN"/>
+        </w:rPr>
+        <w:t xml:space="preserve">National </w:t>
+      </w:r>
+      <w:proofErr w:type="spellStart"/>
+      <w:r>
+        <w:rPr>
+          <w:rFonts w:eastAsia="Times New Roman"/>
+          <w:i/>
+          <w:iCs/>
+          <w:sz w:val="24"/>
+          <w:szCs w:val="24"/>
+          <w:lang w:val="en-IN"/>
+        </w:rPr>
+        <w:t>Center</w:t>
+      </w:r>
+      <w:proofErr w:type="spellEnd"/>
+      <w:r>
+        <w:rPr>
+          <w:rFonts w:eastAsia="Times New Roman"/>
+          <w:i/>
+          <w:iCs/>
+          <w:sz w:val="24"/>
+          <w:szCs w:val="24"/>
+          <w:lang w:val="en-IN"/>
+        </w:rPr>
+        <w:t xml:space="preserve"> for Sustainable Transportation.</w:t>
       </w:r>
     </w:p>
     <w:p>
@@ -2205,7 +2405,31 @@
           <w:szCs w:val="24"/>
           <w:lang w:val="en-IN"/>
         </w:rPr>
-        <w:t xml:space="preserve"> Pacific Southwest Region University Transportation Center.</w:t>
+        <w:t xml:space="preserve"> Pacific Southwest Region University Transportation </w:t>
+      </w:r>
+      <w:proofErr w:type="spellStart"/>
+      <w:r>
+        <w:rPr>
+          <w:rFonts w:eastAsia="Times New Roman"/>
+          <w:i/>
+          <w:iCs/>
+          <w:sz w:val="24"/>
+          <w:szCs w:val="24"/>
+          <w:lang w:val="en-IN"/>
+        </w:rPr>
+        <w:t>Center</w:t>
+      </w:r>
+      <w:proofErr w:type="spellEnd"/>
+      <w:r>
+        <w:rPr>
+          <w:rFonts w:eastAsia="Times New Roman"/>
+          <w:i/>
+          <w:iCs/>
+          <w:sz w:val="24"/>
+          <w:szCs w:val="24"/>
+          <w:lang w:val="en-IN"/>
+        </w:rPr>
+        <w:t>.</w:t>
       </w:r>
     </w:p>
     <w:p>
@@ -2226,7 +2450,27 @@
           <w:szCs w:val="24"/>
           <w:lang w:val="en-IN"/>
         </w:rPr>
-        <w:t xml:space="preserve">Jaller, M., &amp; Pahwa, A. (2020). Analytical Modeling Framework to Assess the Economic and Environmental Impacts of Residential </w:t>
+        <w:t xml:space="preserve">Jaller, M., &amp; Pahwa, A. (2020). Analytical </w:t>
+      </w:r>
+      <w:proofErr w:type="spellStart"/>
+      <w:r>
+        <w:rPr>
+          <w:rFonts w:eastAsia="Times New Roman"/>
+          <w:sz w:val="24"/>
+          <w:szCs w:val="24"/>
+          <w:lang w:val="en-IN"/>
+        </w:rPr>
+        <w:t>Modeling</w:t>
+      </w:r>
+      <w:proofErr w:type="spellEnd"/>
+      <w:r>
+        <w:rPr>
+          <w:rFonts w:eastAsia="Times New Roman"/>
+          <w:sz w:val="24"/>
+          <w:szCs w:val="24"/>
+          <w:lang w:val="en-IN"/>
+        </w:rPr>
+        <w:t xml:space="preserve"> Framework to Assess the Economic and Environmental Impacts of Residential </w:t>
       </w:r>
       <w:r>
         <w:rPr>
@@ -2255,7 +2499,31 @@
           <w:szCs w:val="24"/>
           <w:lang w:val="en-IN"/>
         </w:rPr>
-        <w:t>National Center for Sustainable Transportation.</w:t>
+        <w:t xml:space="preserve">National </w:t>
+      </w:r>
+      <w:proofErr w:type="spellStart"/>
+      <w:r>
+        <w:rPr>
+          <w:rFonts w:eastAsia="Times New Roman"/>
+          <w:i/>
+          <w:iCs/>
+          <w:sz w:val="24"/>
+          <w:szCs w:val="24"/>
+          <w:lang w:val="en-IN"/>
+        </w:rPr>
+        <w:t>Center</w:t>
+      </w:r>
+      <w:proofErr w:type="spellEnd"/>
+      <w:r>
+        <w:rPr>
+          <w:rFonts w:eastAsia="Times New Roman"/>
+          <w:i/>
+          <w:iCs/>
+          <w:sz w:val="24"/>
+          <w:szCs w:val="24"/>
+          <w:lang w:val="en-IN"/>
+        </w:rPr>
+        <w:t xml:space="preserve"> for Sustainable Transportation.</w:t>
       </w:r>
     </w:p>
     <w:p>
@@ -2278,18 +2546,62 @@
           <w:szCs w:val="24"/>
           <w:lang w:val="en-IN"/>
         </w:rPr>
-        <w:t xml:space="preserve">Rodier, C., Jaller, M., Pourrahmani, E., Bischoff, J., Freedman, J., &amp; Pahwa, A. (2018). Automated vehicle scenarios: Simulation of system-level travel effects using agent-based demand and supply models in the San Francisco Bay area. </w:t>
-      </w:r>
-      <w:r>
-        <w:rPr>
-          <w:rFonts w:eastAsia="Times New Roman"/>
-          <w:i/>
-          <w:iCs/>
-          <w:sz w:val="24"/>
-          <w:szCs w:val="24"/>
-          <w:lang w:val="en-IN"/>
-        </w:rPr>
-        <w:t>National Center for Sustainable Transportation.</w:t>
+        <w:t xml:space="preserve">Rodier, C., Jaller, M., </w:t>
+      </w:r>
+      <w:proofErr w:type="spellStart"/>
+      <w:r>
+        <w:rPr>
+          <w:rFonts w:eastAsia="Times New Roman"/>
+          <w:sz w:val="24"/>
+          <w:szCs w:val="24"/>
+          <w:lang w:val="en-IN"/>
+        </w:rPr>
+        <w:t>Pourrahmani</w:t>
+      </w:r>
+      <w:proofErr w:type="spellEnd"/>
+      <w:r>
+        <w:rPr>
+          <w:rFonts w:eastAsia="Times New Roman"/>
+          <w:sz w:val="24"/>
+          <w:szCs w:val="24"/>
+          <w:lang w:val="en-IN"/>
+        </w:rPr>
+        <w:t xml:space="preserve">, E., Bischoff, J., Freedman, J., &amp; Pahwa, A. (2018). Automated vehicle scenarios: Simulation of system-level travel effects using agent-based demand and supply models in the San Francisco Bay area. </w:t>
+      </w:r>
+      <w:r>
+        <w:rPr>
+          <w:rFonts w:eastAsia="Times New Roman"/>
+          <w:i/>
+          <w:iCs/>
+          <w:sz w:val="24"/>
+          <w:szCs w:val="24"/>
+          <w:lang w:val="en-IN"/>
+        </w:rPr>
+        <w:t xml:space="preserve">National </w:t>
+      </w:r>
+      <w:proofErr w:type="spellStart"/>
+      <w:r>
+        <w:rPr>
+          <w:rFonts w:eastAsia="Times New Roman"/>
+          <w:i/>
+          <w:iCs/>
+          <w:sz w:val="24"/>
+          <w:szCs w:val="24"/>
+          <w:lang w:val="en-IN"/>
+        </w:rPr>
+        <w:t>Center</w:t>
+      </w:r>
+      <w:proofErr w:type="spellEnd"/>
+      <w:r>
+        <w:rPr>
+          <w:rFonts w:eastAsia="Times New Roman"/>
+          <w:i/>
+          <w:iCs/>
+          <w:sz w:val="24"/>
+          <w:szCs w:val="24"/>
+          <w:lang w:val="en-IN"/>
+        </w:rPr>
+        <w:t xml:space="preserve"> for Sustainable Transportation.</w:t>
       </w:r>
     </w:p>
     <w:p>
@@ -2375,7 +2687,31 @@
           <w:szCs w:val="24"/>
           <w:lang w:val="en-IN"/>
         </w:rPr>
-        <w:t>National Center for Sustainable Transportation.</w:t>
+        <w:t xml:space="preserve">National </w:t>
+      </w:r>
+      <w:proofErr w:type="spellStart"/>
+      <w:r>
+        <w:rPr>
+          <w:rFonts w:eastAsia="Times New Roman"/>
+          <w:i/>
+          <w:iCs/>
+          <w:sz w:val="24"/>
+          <w:szCs w:val="24"/>
+          <w:lang w:val="en-IN"/>
+        </w:rPr>
+        <w:t>Center</w:t>
+      </w:r>
+      <w:proofErr w:type="spellEnd"/>
+      <w:r>
+        <w:rPr>
+          <w:rFonts w:eastAsia="Times New Roman"/>
+          <w:i/>
+          <w:iCs/>
+          <w:sz w:val="24"/>
+          <w:szCs w:val="24"/>
+          <w:lang w:val="en-IN"/>
+        </w:rPr>
+        <w:t xml:space="preserve"> for Sustainable Transportation.</w:t>
       </w:r>
     </w:p>
     <w:p>
@@ -2439,7 +2775,31 @@
           <w:szCs w:val="24"/>
           <w:lang w:val="en-IN"/>
         </w:rPr>
-        <w:t>National Center for Sustainable Transportation.</w:t>
+        <w:t xml:space="preserve">National </w:t>
+      </w:r>
+      <w:proofErr w:type="spellStart"/>
+      <w:r>
+        <w:rPr>
+          <w:rFonts w:eastAsia="Times New Roman"/>
+          <w:i/>
+          <w:iCs/>
+          <w:sz w:val="24"/>
+          <w:szCs w:val="24"/>
+          <w:lang w:val="en-IN"/>
+        </w:rPr>
+        <w:t>Center</w:t>
+      </w:r>
+      <w:proofErr w:type="spellEnd"/>
+      <w:r>
+        <w:rPr>
+          <w:rFonts w:eastAsia="Times New Roman"/>
+          <w:i/>
+          <w:iCs/>
+          <w:sz w:val="24"/>
+          <w:szCs w:val="24"/>
+          <w:lang w:val="en-IN"/>
+        </w:rPr>
+        <w:t xml:space="preserve"> for Sustainable Transportation.</w:t>
       </w:r>
     </w:p>
     <w:p>
@@ -2463,7 +2823,27 @@
           <w:lang w:val="en-IN"/>
         </w:rPr>
         <w:lastRenderedPageBreak/>
-        <w:t xml:space="preserve">Rodier, C., Jaller, M., Pourrahmani, E., Pahwa, A., Bischoff, J., &amp; Freedman, J. (2020). Automated Vehicles are Expected to Increase Driving and Emissions Without Policy Intervention. </w:t>
+        <w:t xml:space="preserve">Rodier, C., Jaller, M., </w:t>
+      </w:r>
+      <w:proofErr w:type="spellStart"/>
+      <w:r>
+        <w:rPr>
+          <w:rFonts w:eastAsia="Times New Roman"/>
+          <w:sz w:val="24"/>
+          <w:szCs w:val="24"/>
+          <w:lang w:val="en-IN"/>
+        </w:rPr>
+        <w:t>Pourrahmani</w:t>
+      </w:r>
+      <w:proofErr w:type="spellEnd"/>
+      <w:r>
+        <w:rPr>
+          <w:rFonts w:eastAsia="Times New Roman"/>
+          <w:sz w:val="24"/>
+          <w:szCs w:val="24"/>
+          <w:lang w:val="en-IN"/>
+        </w:rPr>
+        <w:t xml:space="preserve">, E., Pahwa, A., Bischoff, J., &amp; Freedman, J. (2020). Automated Vehicles are Expected to Increase Driving and Emissions Without Policy Intervention. </w:t>
       </w:r>
       <w:r>
         <w:rPr>
@@ -2539,7 +2919,27 @@
           <w:szCs w:val="24"/>
           <w:lang w:val="en-IN"/>
         </w:rPr>
-        <w:t xml:space="preserve">Jaller, M., Pahwa, A., Otero-Palencia, C., &amp; Pourrahmani, E. (2023). 19. Overview of city logistics and urban freight transport operations. </w:t>
+        <w:t xml:space="preserve">Jaller, M., Pahwa, A., Otero-Palencia, C., &amp; </w:t>
+      </w:r>
+      <w:proofErr w:type="spellStart"/>
+      <w:r>
+        <w:rPr>
+          <w:rFonts w:eastAsia="Times New Roman"/>
+          <w:sz w:val="24"/>
+          <w:szCs w:val="24"/>
+          <w:lang w:val="en-IN"/>
+        </w:rPr>
+        <w:t>Pourrahmani</w:t>
+      </w:r>
+      <w:proofErr w:type="spellEnd"/>
+      <w:r>
+        <w:rPr>
+          <w:rFonts w:eastAsia="Times New Roman"/>
+          <w:sz w:val="24"/>
+          <w:szCs w:val="24"/>
+          <w:lang w:val="en-IN"/>
+        </w:rPr>
+        <w:t xml:space="preserve">, E. (2023). 19. Overview of city logistics and urban freight transport operations. </w:t>
       </w:r>
       <w:r>
         <w:rPr>
@@ -2791,7 +3191,27 @@
           <w:szCs w:val="24"/>
           <w:lang w:val="es-CO"/>
         </w:rPr>
-        <w:t xml:space="preserve">Xiao, R., Jaller, M., </w:t>
+        <w:t xml:space="preserve">Xiao, R., </w:t>
+      </w:r>
+      <w:proofErr w:type="spellStart"/>
+      <w:r>
+        <w:rPr>
+          <w:rFonts w:eastAsia="Times New Roman"/>
+          <w:sz w:val="24"/>
+          <w:szCs w:val="24"/>
+          <w:lang w:val="es-CO"/>
+        </w:rPr>
+        <w:t>Jaller</w:t>
+      </w:r>
+      <w:proofErr w:type="spellEnd"/>
+      <w:r>
+        <w:rPr>
+          <w:rFonts w:eastAsia="Times New Roman"/>
+          <w:sz w:val="24"/>
+          <w:szCs w:val="24"/>
+          <w:lang w:val="es-CO"/>
+        </w:rPr>
+        <w:t xml:space="preserve">, M., </w:t>
       </w:r>
       <w:r>
         <w:rPr>
@@ -3298,7 +3718,27 @@
           <w:szCs w:val="24"/>
           <w:lang w:val="en-IN"/>
         </w:rPr>
-        <w:t xml:space="preserve">Bischoff, J., Rodier, C. J., Pourrahmani, E., Jaller, M., Pahwa, A., &amp; Maciejewski, M. (2019). </w:t>
+        <w:t xml:space="preserve">Bischoff, J., Rodier, C. J., </w:t>
+      </w:r>
+      <w:proofErr w:type="spellStart"/>
+      <w:r>
+        <w:rPr>
+          <w:rFonts w:eastAsia="Times New Roman"/>
+          <w:sz w:val="24"/>
+          <w:szCs w:val="24"/>
+          <w:lang w:val="en-IN"/>
+        </w:rPr>
+        <w:t>Pourrahmani</w:t>
+      </w:r>
+      <w:proofErr w:type="spellEnd"/>
+      <w:r>
+        <w:rPr>
+          <w:rFonts w:eastAsia="Times New Roman"/>
+          <w:sz w:val="24"/>
+          <w:szCs w:val="24"/>
+          <w:lang w:val="en-IN"/>
+        </w:rPr>
+        <w:t xml:space="preserve">, E., Jaller, M., Pahwa, A., &amp; Maciejewski, M. (2019). </w:t>
       </w:r>
       <w:r>
         <w:rPr>
@@ -3351,7 +3791,31 @@
           <w:szCs w:val="24"/>
           <w:lang w:val="en-IN"/>
         </w:rPr>
-        <w:t xml:space="preserve">Evaluating the Environmental Impacts of Online Shopping: A Behavioral Analysis using the American Time Use Survey (ATUS) Data. </w:t>
+        <w:t xml:space="preserve">Evaluating the Environmental Impacts of Online Shopping: A </w:t>
+      </w:r>
+      <w:proofErr w:type="spellStart"/>
+      <w:r>
+        <w:rPr>
+          <w:rFonts w:eastAsia="Times New Roman"/>
+          <w:i/>
+          <w:iCs/>
+          <w:sz w:val="24"/>
+          <w:szCs w:val="24"/>
+          <w:lang w:val="en-IN"/>
+        </w:rPr>
+        <w:t>Behavioral</w:t>
+      </w:r>
+      <w:proofErr w:type="spellEnd"/>
+      <w:r>
+        <w:rPr>
+          <w:rFonts w:eastAsia="Times New Roman"/>
+          <w:i/>
+          <w:iCs/>
+          <w:sz w:val="24"/>
+          <w:szCs w:val="24"/>
+          <w:lang w:val="en-IN"/>
+        </w:rPr>
+        <w:t xml:space="preserve"> Analysis using the American Time Use Survey (ATUS) Data. </w:t>
       </w:r>
       <w:r>
         <w:rPr>
@@ -3594,7 +4058,27 @@
                 <w:szCs w:val="24"/>
                 <w:lang w:val="en-IN"/>
               </w:rPr>
-              <w:t>National Center for Sustainable Transportation Research Grant</w:t>
+              <w:t xml:space="preserve">National </w:t>
+            </w:r>
+            <w:proofErr w:type="spellStart"/>
+            <w:r>
+              <w:rPr>
+                <w:rFonts w:eastAsia="Times New Roman"/>
+                <w:sz w:val="24"/>
+                <w:szCs w:val="24"/>
+                <w:lang w:val="en-IN"/>
+              </w:rPr>
+              <w:t>Center</w:t>
+            </w:r>
+            <w:proofErr w:type="spellEnd"/>
+            <w:r>
+              <w:rPr>
+                <w:rFonts w:eastAsia="Times New Roman"/>
+                <w:sz w:val="24"/>
+                <w:szCs w:val="24"/>
+                <w:lang w:val="en-IN"/>
+              </w:rPr>
+              <w:t xml:space="preserve"> for Sustainable Transportation Research Grant</w:t>
             </w:r>
           </w:p>
         </w:tc>
@@ -3726,7 +4210,27 @@
                 <w:szCs w:val="24"/>
                 <w:lang w:val="en-IN"/>
               </w:rPr>
-              <w:t>National Center for Sustainable Transportation Research Fellowship</w:t>
+              <w:t xml:space="preserve">National </w:t>
+            </w:r>
+            <w:proofErr w:type="spellStart"/>
+            <w:r>
+              <w:rPr>
+                <w:rFonts w:eastAsia="Times New Roman"/>
+                <w:sz w:val="24"/>
+                <w:szCs w:val="24"/>
+                <w:lang w:val="en-IN"/>
+              </w:rPr>
+              <w:t>Center</w:t>
+            </w:r>
+            <w:proofErr w:type="spellEnd"/>
+            <w:r>
+              <w:rPr>
+                <w:rFonts w:eastAsia="Times New Roman"/>
+                <w:sz w:val="24"/>
+                <w:szCs w:val="24"/>
+                <w:lang w:val="en-IN"/>
+              </w:rPr>
+              <w:t xml:space="preserve"> for Sustainable Transportation Research Fellowship</w:t>
             </w:r>
           </w:p>
         </w:tc>
@@ -3934,7 +4438,47 @@
           <w:szCs w:val="24"/>
           <w:lang w:val="en-IN"/>
         </w:rPr>
-        <w:t>: TransCAD, Maptitude, ArcGIS, VS Code, Git</w:t>
+        <w:t xml:space="preserve">: </w:t>
+      </w:r>
+      <w:proofErr w:type="spellStart"/>
+      <w:r>
+        <w:rPr>
+          <w:rFonts w:eastAsia="Times New Roman"/>
+          <w:sz w:val="24"/>
+          <w:szCs w:val="24"/>
+          <w:lang w:val="en-IN"/>
+        </w:rPr>
+        <w:t>TransCAD</w:t>
+      </w:r>
+      <w:proofErr w:type="spellEnd"/>
+      <w:r>
+        <w:rPr>
+          <w:rFonts w:eastAsia="Times New Roman"/>
+          <w:sz w:val="24"/>
+          <w:szCs w:val="24"/>
+          <w:lang w:val="en-IN"/>
+        </w:rPr>
+        <w:t xml:space="preserve">, </w:t>
+      </w:r>
+      <w:proofErr w:type="spellStart"/>
+      <w:r>
+        <w:rPr>
+          <w:rFonts w:eastAsia="Times New Roman"/>
+          <w:sz w:val="24"/>
+          <w:szCs w:val="24"/>
+          <w:lang w:val="en-IN"/>
+        </w:rPr>
+        <w:t>Maptitude</w:t>
+      </w:r>
+      <w:proofErr w:type="spellEnd"/>
+      <w:r>
+        <w:rPr>
+          <w:rFonts w:eastAsia="Times New Roman"/>
+          <w:sz w:val="24"/>
+          <w:szCs w:val="24"/>
+          <w:lang w:val="en-IN"/>
+        </w:rPr>
+        <w:t>, ArcGIS, VS Code, Git</w:t>
       </w:r>
     </w:p>
     <w:p>
@@ -4714,7 +5258,25 @@
           <w:szCs w:val="24"/>
           <w:lang w:val="en-IN"/>
         </w:rPr>
-        <w:t>: International Journal of Transportation</w:t>
+        <w:t xml:space="preserve">: </w:t>
+      </w:r>
+      <w:r>
+        <w:rPr>
+          <w:rFonts w:eastAsia="Times New Roman"/>
+          <w:sz w:val="24"/>
+          <w:szCs w:val="24"/>
+          <w:lang w:val="en-IN"/>
+        </w:rPr>
+        <w:t xml:space="preserve">The </w:t>
+      </w:r>
+      <w:r>
+        <w:rPr>
+          <w:rFonts w:eastAsia="Times New Roman"/>
+          <w:sz w:val="24"/>
+          <w:szCs w:val="24"/>
+          <w:lang w:val="en-IN"/>
+        </w:rPr>
+        <w:t>International Journal of Transportation</w:t>
       </w:r>
       <w:r>
         <w:rPr>
@@ -4833,7 +5395,7 @@
           <w:lang w:val="en-IN"/>
         </w:rPr>
         <w:lastRenderedPageBreak/>
-        <w:t>Transportation Research Part A: Policy and Planning</w:t>
+        <w:t>Transportation Research Interdisciplinary Perspectives</w:t>
       </w:r>
     </w:p>
     <w:p>
@@ -4858,16 +5420,7 @@
           <w:szCs w:val="24"/>
           <w:lang w:val="en-IN"/>
         </w:rPr>
-        <w:t>Transportation Research Part B:</w:t>
-      </w:r>
-      <w:r>
-        <w:rPr>
-          <w:rFonts w:eastAsia="Times New Roman"/>
-          <w:sz w:val="24"/>
-          <w:szCs w:val="24"/>
-          <w:lang w:val="en-IN"/>
-        </w:rPr>
-        <w:t xml:space="preserve"> Methodological</w:t>
+        <w:t>Transportation Research Part A: Policy and Planning</w:t>
       </w:r>
     </w:p>
     <w:p>
@@ -4892,16 +5445,16 @@
           <w:szCs w:val="24"/>
           <w:lang w:val="en-IN"/>
         </w:rPr>
-        <w:t xml:space="preserve">Transportation Research Part C: </w:t>
-      </w:r>
-      <w:r>
-        <w:rPr>
-          <w:rFonts w:eastAsia="Times New Roman"/>
-          <w:sz w:val="24"/>
-          <w:szCs w:val="24"/>
-          <w:lang w:val="en-IN"/>
-        </w:rPr>
-        <w:t>Emerging Technologies</w:t>
+        <w:t>Transportation Research Part B:</w:t>
+      </w:r>
+      <w:r>
+        <w:rPr>
+          <w:rFonts w:eastAsia="Times New Roman"/>
+          <w:sz w:val="24"/>
+          <w:szCs w:val="24"/>
+          <w:lang w:val="en-IN"/>
+        </w:rPr>
+        <w:t xml:space="preserve"> Methodological</w:t>
       </w:r>
     </w:p>
     <w:p>
@@ -4926,7 +5479,16 @@
           <w:szCs w:val="24"/>
           <w:lang w:val="en-IN"/>
         </w:rPr>
-        <w:t>Transportation Research Part D: Transport and Environment</w:t>
+        <w:t xml:space="preserve">Transportation Research Part C: </w:t>
+      </w:r>
+      <w:r>
+        <w:rPr>
+          <w:rFonts w:eastAsia="Times New Roman"/>
+          <w:sz w:val="24"/>
+          <w:szCs w:val="24"/>
+          <w:lang w:val="en-IN"/>
+        </w:rPr>
+        <w:t>Emerging Technologies</w:t>
       </w:r>
     </w:p>
     <w:p>
@@ -4951,7 +5513,7 @@
           <w:szCs w:val="24"/>
           <w:lang w:val="en-IN"/>
         </w:rPr>
-        <w:t>Transportation Research Part E: Logistics and Transportation Review</w:t>
+        <w:t>Transportation Research Part D: Transport and Environment</w:t>
       </w:r>
     </w:p>
     <w:p>
@@ -4976,7 +5538,7 @@
           <w:szCs w:val="24"/>
           <w:lang w:val="en-IN"/>
         </w:rPr>
-        <w:t>Transportation Research Record</w:t>
+        <w:t>Transportation Research Part E: Logistics and Transportation Review</w:t>
       </w:r>
     </w:p>
     <w:p>
@@ -5001,7 +5563,7 @@
           <w:szCs w:val="24"/>
           <w:lang w:val="en-IN"/>
         </w:rPr>
-        <w:t>Trauma care</w:t>
+        <w:t>Transportation Research Record</w:t>
       </w:r>
     </w:p>
     <w:p>
@@ -5026,93 +5588,7 @@
           <w:szCs w:val="24"/>
           <w:lang w:val="en-IN"/>
         </w:rPr>
-        <w:t>World Symposium on Transport and Land Use Research</w:t>
-      </w:r>
-    </w:p>
-    <w:p>
-      <w:pPr>
-        <w:pStyle w:val="ListParagraph"/>
-        <w:rPr>
-          <w:rFonts w:ascii="Calibri Light" w:eastAsia="Calibri Light" w:hAnsi="Calibri Light" w:cs="Calibri Light"/>
-          <w:sz w:val="24"/>
-          <w:szCs w:val="24"/>
-          <w:lang w:val="en-IN"/>
-        </w:rPr>
-      </w:pPr>
-    </w:p>
-    <w:p>
-      <w:pPr>
-        <w:ind w:left="360"/>
-        <w:rPr>
-          <w:rFonts w:eastAsia="Times New Roman"/>
-          <w:b/>
-          <w:bCs/>
-          <w:sz w:val="24"/>
-          <w:szCs w:val="24"/>
-          <w:lang w:val="en-IN"/>
-        </w:rPr>
-      </w:pPr>
-      <w:r>
-        <w:rPr>
-          <w:rFonts w:eastAsia="Times New Roman"/>
-          <w:b/>
-          <w:bCs/>
-          <w:sz w:val="24"/>
-          <w:szCs w:val="24"/>
-          <w:lang w:val="en-IN"/>
-        </w:rPr>
-        <w:t>Postdoc Supervisor</w:t>
-      </w:r>
-    </w:p>
-    <w:p>
-      <w:pPr>
-        <w:spacing w:line="238" w:lineRule="auto"/>
-        <w:ind w:left="540"/>
-        <w:rPr>
-          <w:sz w:val="20"/>
-          <w:szCs w:val="20"/>
-          <w:lang w:val="en-IN"/>
-        </w:rPr>
-      </w:pPr>
-      <w:r>
-        <w:rPr>
-          <w:rFonts w:ascii="Calibri Light" w:eastAsia="Calibri Light" w:hAnsi="Calibri Light" w:cs="Calibri Light"/>
-          <w:sz w:val="24"/>
-          <w:szCs w:val="24"/>
-          <w:lang w:val="en-IN"/>
-        </w:rPr>
-        <w:t>-</w:t>
-      </w:r>
-    </w:p>
-    <w:p>
-      <w:pPr>
-        <w:spacing w:line="266" w:lineRule="exact"/>
-        <w:rPr>
-          <w:sz w:val="20"/>
-          <w:szCs w:val="20"/>
-          <w:lang w:val="en-IN"/>
-        </w:rPr>
-      </w:pPr>
-    </w:p>
-    <w:p>
-      <w:pPr>
-        <w:ind w:left="360"/>
-        <w:rPr>
-          <w:sz w:val="20"/>
-          <w:szCs w:val="20"/>
-          <w:lang w:val="en-IN"/>
-        </w:rPr>
-      </w:pPr>
-      <w:r>
-        <w:rPr>
-          <w:rFonts w:eastAsia="Times New Roman"/>
-          <w:b/>
-          <w:bCs/>
-          <w:sz w:val="24"/>
-          <w:szCs w:val="24"/>
-          <w:lang w:val="en-IN"/>
-        </w:rPr>
-        <w:t>PhD Supervisor</w:t>
+        <w:t>Trauma care</w:t>
       </w:r>
     </w:p>
     <w:p>
@@ -5137,16 +5613,7 @@
           <w:szCs w:val="24"/>
           <w:lang w:val="en-IN"/>
         </w:rPr>
-        <w:t xml:space="preserve">Blessy K. </w:t>
-      </w:r>
-      <w:r>
-        <w:rPr>
-          <w:rFonts w:eastAsia="Times New Roman"/>
-          <w:sz w:val="24"/>
-          <w:szCs w:val="24"/>
-          <w:lang w:val="en-IN"/>
-        </w:rPr>
-        <w:t>(current)</w:t>
+        <w:t>Urban Transitions</w:t>
       </w:r>
     </w:p>
     <w:p>
@@ -5171,25 +5638,93 @@
           <w:szCs w:val="24"/>
           <w:lang w:val="en-IN"/>
         </w:rPr>
-        <w:t>Stephen Babu</w:t>
-      </w:r>
-      <w:r>
-        <w:rPr>
-          <w:rFonts w:eastAsia="Times New Roman"/>
-          <w:sz w:val="24"/>
-          <w:szCs w:val="24"/>
-          <w:lang w:val="en-IN"/>
-        </w:rPr>
-        <w:t xml:space="preserve"> </w:t>
-      </w:r>
-      <w:r>
-        <w:rPr>
-          <w:rFonts w:eastAsia="Times New Roman"/>
-          <w:sz w:val="24"/>
-          <w:szCs w:val="24"/>
-          <w:lang w:val="en-IN"/>
-        </w:rPr>
-        <w:t>(current)</w:t>
+        <w:t>World Symposium on Transport and Land Use Research</w:t>
+      </w:r>
+    </w:p>
+    <w:p>
+      <w:pPr>
+        <w:pStyle w:val="ListParagraph"/>
+        <w:rPr>
+          <w:rFonts w:ascii="Calibri Light" w:eastAsia="Calibri Light" w:hAnsi="Calibri Light" w:cs="Calibri Light"/>
+          <w:sz w:val="24"/>
+          <w:szCs w:val="24"/>
+          <w:lang w:val="en-IN"/>
+        </w:rPr>
+      </w:pPr>
+    </w:p>
+    <w:p>
+      <w:pPr>
+        <w:ind w:left="360"/>
+        <w:rPr>
+          <w:rFonts w:eastAsia="Times New Roman"/>
+          <w:b/>
+          <w:bCs/>
+          <w:sz w:val="24"/>
+          <w:szCs w:val="24"/>
+          <w:lang w:val="en-IN"/>
+        </w:rPr>
+      </w:pPr>
+      <w:r>
+        <w:rPr>
+          <w:rFonts w:eastAsia="Times New Roman"/>
+          <w:b/>
+          <w:bCs/>
+          <w:sz w:val="24"/>
+          <w:szCs w:val="24"/>
+          <w:lang w:val="en-IN"/>
+        </w:rPr>
+        <w:t>Postdoc Supervisor</w:t>
+      </w:r>
+    </w:p>
+    <w:p>
+      <w:pPr>
+        <w:spacing w:line="238" w:lineRule="auto"/>
+        <w:ind w:left="540"/>
+        <w:rPr>
+          <w:sz w:val="20"/>
+          <w:szCs w:val="20"/>
+          <w:lang w:val="en-IN"/>
+        </w:rPr>
+      </w:pPr>
+      <w:r>
+        <w:rPr>
+          <w:rFonts w:ascii="Calibri Light" w:eastAsia="Calibri Light" w:hAnsi="Calibri Light" w:cs="Calibri Light"/>
+          <w:sz w:val="24"/>
+          <w:szCs w:val="24"/>
+          <w:lang w:val="en-IN"/>
+        </w:rPr>
+        <w:t>-</w:t>
+      </w:r>
+    </w:p>
+    <w:p>
+      <w:pPr>
+        <w:spacing w:line="266" w:lineRule="exact"/>
+        <w:rPr>
+          <w:sz w:val="20"/>
+          <w:szCs w:val="20"/>
+          <w:lang w:val="en-IN"/>
+        </w:rPr>
+      </w:pPr>
+    </w:p>
+    <w:p>
+      <w:pPr>
+        <w:ind w:left="360"/>
+        <w:rPr>
+          <w:sz w:val="20"/>
+          <w:szCs w:val="20"/>
+          <w:lang w:val="en-IN"/>
+        </w:rPr>
+      </w:pPr>
+      <w:r>
+        <w:rPr>
+          <w:rFonts w:eastAsia="Times New Roman"/>
+          <w:b/>
+          <w:bCs/>
+          <w:sz w:val="24"/>
+          <w:szCs w:val="24"/>
+          <w:lang w:val="en-IN"/>
+        </w:rPr>
+        <w:t>PhD Supervisor</w:t>
       </w:r>
     </w:p>
     <w:p>
@@ -5214,25 +5749,7 @@
           <w:szCs w:val="24"/>
           <w:lang w:val="en-IN"/>
         </w:rPr>
-        <w:t xml:space="preserve">Nagasai </w:t>
-      </w:r>
-      <w:r>
-        <w:rPr>
-          <w:rFonts w:eastAsia="Times New Roman"/>
-          <w:sz w:val="24"/>
-          <w:szCs w:val="24"/>
-          <w:lang w:val="en-IN"/>
-        </w:rPr>
-        <w:t>Panidarapu</w:t>
-      </w:r>
-      <w:r>
-        <w:rPr>
-          <w:rFonts w:eastAsia="Times New Roman"/>
-          <w:sz w:val="24"/>
-          <w:szCs w:val="24"/>
-          <w:lang w:val="en-IN"/>
-        </w:rPr>
-        <w:t xml:space="preserve"> </w:t>
+        <w:t xml:space="preserve">Blessy K. </w:t>
       </w:r>
       <w:r>
         <w:rPr>
@@ -5242,37 +5759,6 @@
           <w:lang w:val="en-IN"/>
         </w:rPr>
         <w:t>(current)</w:t>
-      </w:r>
-    </w:p>
-    <w:p>
-      <w:pPr>
-        <w:spacing w:line="267" w:lineRule="exact"/>
-        <w:rPr>
-          <w:sz w:val="20"/>
-          <w:szCs w:val="20"/>
-          <w:lang w:val="en-IN"/>
-        </w:rPr>
-      </w:pPr>
-    </w:p>
-    <w:p>
-      <w:pPr>
-        <w:ind w:left="360"/>
-        <w:rPr>
-          <w:sz w:val="20"/>
-          <w:szCs w:val="20"/>
-          <w:lang w:val="en-IN"/>
-        </w:rPr>
-      </w:pPr>
-      <w:r>
-        <w:rPr>
-          <w:rFonts w:eastAsia="Times New Roman"/>
-          <w:b/>
-          <w:bCs/>
-          <w:sz w:val="24"/>
-          <w:szCs w:val="24"/>
-          <w:lang w:val="en-IN"/>
-        </w:rPr>
-        <w:t>MTech Supervisor</w:t>
       </w:r>
     </w:p>
     <w:p>
@@ -5297,16 +5783,16 @@
           <w:szCs w:val="24"/>
           <w:lang w:val="en-IN"/>
         </w:rPr>
-        <w:t>Varun A</w:t>
-      </w:r>
-      <w:r>
-        <w:rPr>
-          <w:rFonts w:eastAsia="Times New Roman"/>
-          <w:sz w:val="24"/>
-          <w:szCs w:val="24"/>
-          <w:lang w:val="en-IN"/>
-        </w:rPr>
-        <w:t>. (2025)</w:t>
+        <w:t>Stephen Babu</w:t>
+      </w:r>
+      <w:r>
+        <w:rPr>
+          <w:rFonts w:eastAsia="Times New Roman"/>
+          <w:sz w:val="24"/>
+          <w:szCs w:val="24"/>
+          <w:lang w:val="en-IN"/>
+        </w:rPr>
+        <w:t xml:space="preserve"> (current)</w:t>
       </w:r>
     </w:p>
     <w:p>
@@ -5324,23 +5810,76 @@
           <w:lang w:val="en-IN"/>
         </w:rPr>
       </w:pPr>
-      <w:r>
-        <w:rPr>
-          <w:rFonts w:eastAsia="Times New Roman"/>
-          <w:sz w:val="24"/>
-          <w:szCs w:val="24"/>
-          <w:lang w:val="en-IN"/>
-        </w:rPr>
-        <w:t xml:space="preserve">Harshvardhan Shivram Ket </w:t>
-      </w:r>
-      <w:r>
-        <w:rPr>
-          <w:rFonts w:eastAsia="Times New Roman"/>
-          <w:sz w:val="24"/>
-          <w:szCs w:val="24"/>
-          <w:lang w:val="en-IN"/>
-        </w:rPr>
-        <w:t>(current)</w:t>
+      <w:proofErr w:type="spellStart"/>
+      <w:r>
+        <w:rPr>
+          <w:rFonts w:eastAsia="Times New Roman"/>
+          <w:sz w:val="24"/>
+          <w:szCs w:val="24"/>
+          <w:lang w:val="en-IN"/>
+        </w:rPr>
+        <w:t>Nagasai</w:t>
+      </w:r>
+      <w:proofErr w:type="spellEnd"/>
+      <w:r>
+        <w:rPr>
+          <w:rFonts w:eastAsia="Times New Roman"/>
+          <w:sz w:val="24"/>
+          <w:szCs w:val="24"/>
+          <w:lang w:val="en-IN"/>
+        </w:rPr>
+        <w:t xml:space="preserve"> </w:t>
+      </w:r>
+      <w:proofErr w:type="spellStart"/>
+      <w:r>
+        <w:rPr>
+          <w:rFonts w:eastAsia="Times New Roman"/>
+          <w:sz w:val="24"/>
+          <w:szCs w:val="24"/>
+          <w:lang w:val="en-IN"/>
+        </w:rPr>
+        <w:t>Panidarapu</w:t>
+      </w:r>
+      <w:proofErr w:type="spellEnd"/>
+      <w:r>
+        <w:rPr>
+          <w:rFonts w:eastAsia="Times New Roman"/>
+          <w:sz w:val="24"/>
+          <w:szCs w:val="24"/>
+          <w:lang w:val="en-IN"/>
+        </w:rPr>
+        <w:t xml:space="preserve"> (current)</w:t>
+      </w:r>
+    </w:p>
+    <w:p>
+      <w:pPr>
+        <w:spacing w:line="267" w:lineRule="exact"/>
+        <w:rPr>
+          <w:sz w:val="20"/>
+          <w:szCs w:val="20"/>
+          <w:lang w:val="en-IN"/>
+        </w:rPr>
+      </w:pPr>
+    </w:p>
+    <w:p>
+      <w:pPr>
+        <w:ind w:left="360"/>
+        <w:rPr>
+          <w:sz w:val="20"/>
+          <w:szCs w:val="20"/>
+          <w:lang w:val="en-IN"/>
+        </w:rPr>
+      </w:pPr>
+      <w:r>
+        <w:rPr>
+          <w:rFonts w:eastAsia="Times New Roman"/>
+          <w:b/>
+          <w:bCs/>
+          <w:sz w:val="24"/>
+          <w:szCs w:val="24"/>
+          <w:lang w:val="en-IN"/>
+        </w:rPr>
+        <w:t>MTech Supervisor</w:t>
       </w:r>
     </w:p>
     <w:p>
@@ -5365,38 +5904,16 @@
           <w:szCs w:val="24"/>
           <w:lang w:val="en-IN"/>
         </w:rPr>
-        <w:t>Aditya Aggarwal (current)</w:t>
-      </w:r>
-    </w:p>
-    <w:p>
-      <w:pPr>
-        <w:spacing w:line="266" w:lineRule="exact"/>
-        <w:rPr>
-          <w:sz w:val="20"/>
-          <w:szCs w:val="20"/>
-          <w:lang w:val="en-IN"/>
-        </w:rPr>
-      </w:pPr>
-    </w:p>
-    <w:p>
-      <w:pPr>
-        <w:ind w:left="360"/>
-        <w:rPr>
-          <w:sz w:val="20"/>
-          <w:szCs w:val="20"/>
-          <w:lang w:val="en-IN"/>
-        </w:rPr>
-      </w:pPr>
-      <w:r>
-        <w:rPr>
-          <w:rFonts w:eastAsia="Times New Roman"/>
-          <w:b/>
-          <w:bCs/>
-          <w:sz w:val="24"/>
-          <w:szCs w:val="24"/>
-          <w:lang w:val="en-IN"/>
-        </w:rPr>
-        <w:t>BTech Supervisor</w:t>
+        <w:t>Varun A</w:t>
+      </w:r>
+      <w:r>
+        <w:rPr>
+          <w:rFonts w:eastAsia="Times New Roman"/>
+          <w:sz w:val="24"/>
+          <w:szCs w:val="24"/>
+          <w:lang w:val="en-IN"/>
+        </w:rPr>
+        <w:t>. (2025)</w:t>
       </w:r>
     </w:p>
     <w:p>
@@ -5421,25 +5938,7 @@
           <w:szCs w:val="24"/>
           <w:lang w:val="en-IN"/>
         </w:rPr>
-        <w:t>Arvind Vidhyashankar</w:t>
-      </w:r>
-      <w:r>
-        <w:rPr>
-          <w:rFonts w:eastAsia="Times New Roman"/>
-          <w:sz w:val="24"/>
-          <w:szCs w:val="24"/>
-          <w:lang w:val="en-IN"/>
-        </w:rPr>
-        <w:t xml:space="preserve"> </w:t>
-      </w:r>
-      <w:r>
-        <w:rPr>
-          <w:rFonts w:eastAsia="Times New Roman"/>
-          <w:sz w:val="24"/>
-          <w:szCs w:val="24"/>
-          <w:lang w:val="en-IN"/>
-        </w:rPr>
-        <w:t>(current)</w:t>
+        <w:t>Harshvardhan Shivram Ket (current)</w:t>
       </w:r>
     </w:p>
     <w:p>
@@ -5464,8 +5963,75 @@
           <w:szCs w:val="24"/>
           <w:lang w:val="en-IN"/>
         </w:rPr>
-        <w:t>Om Ramavtar Yadav</w:t>
-      </w:r>
+        <w:t>Aditya Aggarwal (current)</w:t>
+      </w:r>
+    </w:p>
+    <w:p>
+      <w:pPr>
+        <w:spacing w:line="266" w:lineRule="exact"/>
+        <w:rPr>
+          <w:sz w:val="20"/>
+          <w:szCs w:val="20"/>
+          <w:lang w:val="en-IN"/>
+        </w:rPr>
+      </w:pPr>
+    </w:p>
+    <w:p>
+      <w:pPr>
+        <w:ind w:left="360"/>
+        <w:rPr>
+          <w:sz w:val="20"/>
+          <w:szCs w:val="20"/>
+          <w:lang w:val="en-IN"/>
+        </w:rPr>
+      </w:pPr>
+      <w:r>
+        <w:rPr>
+          <w:rFonts w:eastAsia="Times New Roman"/>
+          <w:b/>
+          <w:bCs/>
+          <w:sz w:val="24"/>
+          <w:szCs w:val="24"/>
+          <w:lang w:val="en-IN"/>
+        </w:rPr>
+        <w:t>BTech Supervisor</w:t>
+      </w:r>
+    </w:p>
+    <w:p>
+      <w:pPr>
+        <w:pStyle w:val="ListParagraph"/>
+        <w:numPr>
+          <w:ilvl w:val="0"/>
+          <w:numId w:val="1"/>
+        </w:numPr>
+        <w:ind w:left="810" w:hanging="270"/>
+        <w:rPr>
+          <w:rFonts w:eastAsia="Times New Roman"/>
+          <w:sz w:val="24"/>
+          <w:szCs w:val="24"/>
+          <w:lang w:val="en-IN"/>
+        </w:rPr>
+      </w:pPr>
+      <w:r>
+        <w:rPr>
+          <w:rFonts w:eastAsia="Times New Roman"/>
+          <w:sz w:val="24"/>
+          <w:szCs w:val="24"/>
+          <w:lang w:val="en-IN"/>
+        </w:rPr>
+        <w:t xml:space="preserve">Arvind </w:t>
+      </w:r>
+      <w:proofErr w:type="spellStart"/>
+      <w:r>
+        <w:rPr>
+          <w:rFonts w:eastAsia="Times New Roman"/>
+          <w:sz w:val="24"/>
+          <w:szCs w:val="24"/>
+          <w:lang w:val="en-IN"/>
+        </w:rPr>
+        <w:t>Vidhyashankar</w:t>
+      </w:r>
+      <w:proofErr w:type="spellEnd"/>
       <w:r>
         <w:rPr>
           <w:rFonts w:eastAsia="Times New Roman"/>
@@ -5483,6 +6049,60 @@
           <w:lang w:val="en-IN"/>
         </w:rPr>
         <w:t>(current)</w:t>
+      </w:r>
+    </w:p>
+    <w:p>
+      <w:pPr>
+        <w:pStyle w:val="ListParagraph"/>
+        <w:numPr>
+          <w:ilvl w:val="0"/>
+          <w:numId w:val="1"/>
+        </w:numPr>
+        <w:ind w:left="810" w:hanging="270"/>
+        <w:rPr>
+          <w:rFonts w:eastAsia="Times New Roman"/>
+          <w:sz w:val="24"/>
+          <w:szCs w:val="24"/>
+          <w:lang w:val="en-IN"/>
+        </w:rPr>
+      </w:pPr>
+      <w:r>
+        <w:rPr>
+          <w:rFonts w:eastAsia="Times New Roman"/>
+          <w:sz w:val="24"/>
+          <w:szCs w:val="24"/>
+          <w:lang w:val="en-IN"/>
+        </w:rPr>
+        <w:t xml:space="preserve">Om </w:t>
+      </w:r>
+      <w:proofErr w:type="spellStart"/>
+      <w:r>
+        <w:rPr>
+          <w:rFonts w:eastAsia="Times New Roman"/>
+          <w:sz w:val="24"/>
+          <w:szCs w:val="24"/>
+          <w:lang w:val="en-IN"/>
+        </w:rPr>
+        <w:t>Ramavtar</w:t>
+      </w:r>
+      <w:proofErr w:type="spellEnd"/>
+      <w:r>
+        <w:rPr>
+          <w:rFonts w:eastAsia="Times New Roman"/>
+          <w:sz w:val="24"/>
+          <w:szCs w:val="24"/>
+          <w:lang w:val="en-IN"/>
+        </w:rPr>
+        <w:t xml:space="preserve"> Yadav</w:t>
+      </w:r>
+      <w:r>
+        <w:rPr>
+          <w:rFonts w:eastAsia="Times New Roman"/>
+          <w:sz w:val="24"/>
+          <w:szCs w:val="24"/>
+          <w:lang w:val="en-IN"/>
+        </w:rPr>
+        <w:t xml:space="preserve"> (current)</w:t>
       </w:r>
     </w:p>
     <w:p>
@@ -6162,6 +6782,7 @@
   <w:style w:type="character" w:default="1" w:styleId="DefaultParagraphFont">
     <w:name w:val="Default Paragraph Font"/>
     <w:uiPriority w:val="1"/>
+    <w:semiHidden/>
     <w:unhideWhenUsed/>
   </w:style>
   <w:style w:type="table" w:default="1" w:styleId="TableNormal">

</xml_diff>

<commit_message>
Deploying to gh-pages from @ lognitilab/lognitilab.github.io@a3401dcb1b17e977faa80f0cfd56aff22ef9d3ab 🚀
</commit_message>
<xml_diff>
--- a/assets/doc/cv-anmolpahwa.docx
+++ b/assets/doc/cv-anmolpahwa.docx
@@ -343,20 +343,8 @@
                   <w:szCs w:val="24"/>
                   <w:lang w:val="en-IN"/>
                 </w:rPr>
-                <w:t>civil.iitm.ac.im/faculty/</w:t>
+                <w:t>civil.iitm.ac.im/faculty/anmpahwa</w:t>
               </w:r>
-              <w:proofErr w:type="spellStart"/>
-              <w:r>
-                <w:rPr>
-                  <w:rStyle w:val="Hyperlink"/>
-                  <w:rFonts w:eastAsia="Times New Roman"/>
-                  <w:sz w:val="24"/>
-                  <w:szCs w:val="24"/>
-                  <w:lang w:val="en-IN"/>
-                </w:rPr>
-                <w:t>anmpahwa</w:t>
-              </w:r>
-              <w:proofErr w:type="spellEnd"/>
             </w:hyperlink>
           </w:p>
         </w:tc>
@@ -826,27 +814,7 @@
                 <w:szCs w:val="24"/>
                 <w:lang w:val="en-IN"/>
               </w:rPr>
-              <w:t xml:space="preserve">Dr. </w:t>
-            </w:r>
-            <w:proofErr w:type="spellStart"/>
-            <w:r>
-              <w:rPr>
-                <w:rFonts w:eastAsia="Times New Roman"/>
-                <w:sz w:val="24"/>
-                <w:szCs w:val="24"/>
-                <w:lang w:val="en-IN"/>
-              </w:rPr>
-              <w:t>Geetam</w:t>
-            </w:r>
-            <w:proofErr w:type="spellEnd"/>
-            <w:r>
-              <w:rPr>
-                <w:rFonts w:eastAsia="Times New Roman"/>
-                <w:sz w:val="24"/>
-                <w:szCs w:val="24"/>
-                <w:lang w:val="en-IN"/>
-              </w:rPr>
-              <w:t xml:space="preserve"> Tiwari</w:t>
+              <w:t>Dr. Geetam Tiwari</w:t>
             </w:r>
           </w:p>
         </w:tc>
@@ -1590,27 +1558,7 @@
           <w:szCs w:val="24"/>
           <w:lang w:val="en-IN"/>
         </w:rPr>
-        <w:t>Jaller, M., Xiao, R. I., Dennis-Bauer, S., Rivera-</w:t>
-      </w:r>
-      <w:proofErr w:type="spellStart"/>
-      <w:r>
-        <w:rPr>
-          <w:rFonts w:eastAsia="Times New Roman"/>
-          <w:sz w:val="24"/>
-          <w:szCs w:val="24"/>
-          <w:lang w:val="en-IN"/>
-        </w:rPr>
-        <w:t>Royero</w:t>
-      </w:r>
-      <w:proofErr w:type="spellEnd"/>
-      <w:r>
-        <w:rPr>
-          <w:rFonts w:eastAsia="Times New Roman"/>
-          <w:sz w:val="24"/>
-          <w:szCs w:val="24"/>
-          <w:lang w:val="en-IN"/>
-        </w:rPr>
-        <w:t xml:space="preserve">, D., &amp; Pahwa, A. (2023). Estimating last-mile deliveries and shopping travel emissions by 2050. </w:t>
+        <w:t xml:space="preserve">Jaller, M., Xiao, R. I., Dennis-Bauer, S., Rivera-Royero, D., &amp; Pahwa, A. (2023). Estimating last-mile deliveries and shopping travel emissions by 2050. </w:t>
       </w:r>
       <w:r>
         <w:rPr>
@@ -1747,27 +1695,7 @@
           <w:szCs w:val="24"/>
           <w:lang w:val="en-IN"/>
         </w:rPr>
-        <w:t xml:space="preserve">Jaller, M., &amp; Pahwa, A. (2020). Evaluating the environmental impacts of online shopping: A </w:t>
-      </w:r>
-      <w:proofErr w:type="spellStart"/>
-      <w:r>
-        <w:rPr>
-          <w:rFonts w:eastAsia="Times New Roman"/>
-          <w:sz w:val="24"/>
-          <w:szCs w:val="24"/>
-          <w:lang w:val="en-IN"/>
-        </w:rPr>
-        <w:t>behavioral</w:t>
-      </w:r>
-      <w:proofErr w:type="spellEnd"/>
-      <w:r>
-        <w:rPr>
-          <w:rFonts w:eastAsia="Times New Roman"/>
-          <w:sz w:val="24"/>
-          <w:szCs w:val="24"/>
-          <w:lang w:val="en-IN"/>
-        </w:rPr>
-        <w:t xml:space="preserve"> and transportation approach. </w:t>
+        <w:t xml:space="preserve">Jaller, M., &amp; Pahwa, A. (2020). Evaluating the environmental impacts of online shopping: A behavioral and transportation approach. </w:t>
       </w:r>
       <w:r>
         <w:rPr>
@@ -1953,62 +1881,18 @@
           <w:szCs w:val="24"/>
           <w:lang w:val="en-IN"/>
         </w:rPr>
-        <w:t xml:space="preserve">Jaller, M., Pahwa, A., &amp; </w:t>
-      </w:r>
-      <w:proofErr w:type="spellStart"/>
-      <w:r>
-        <w:rPr>
-          <w:rFonts w:eastAsia="Times New Roman"/>
-          <w:sz w:val="24"/>
-          <w:szCs w:val="24"/>
-          <w:lang w:val="en-IN"/>
-        </w:rPr>
-        <w:t>Center</w:t>
-      </w:r>
-      <w:proofErr w:type="spellEnd"/>
-      <w:r>
-        <w:rPr>
-          <w:rFonts w:eastAsia="Times New Roman"/>
-          <w:sz w:val="24"/>
-          <w:szCs w:val="24"/>
-          <w:lang w:val="en-IN"/>
-        </w:rPr>
-        <w:t xml:space="preserve">, M. T. (2023). Sketch Planning Tool for Sustainable and Resilient Urban Goods Distribution: User Manual. </w:t>
-      </w:r>
-      <w:r>
-        <w:rPr>
-          <w:rFonts w:eastAsia="Times New Roman"/>
-          <w:i/>
-          <w:iCs/>
-          <w:sz w:val="24"/>
-          <w:szCs w:val="24"/>
-          <w:lang w:val="en-IN"/>
-        </w:rPr>
-        <w:t xml:space="preserve">METRANS Transportation </w:t>
-      </w:r>
-      <w:proofErr w:type="spellStart"/>
-      <w:r>
-        <w:rPr>
-          <w:rFonts w:eastAsia="Times New Roman"/>
-          <w:i/>
-          <w:iCs/>
-          <w:sz w:val="24"/>
-          <w:szCs w:val="24"/>
-          <w:lang w:val="en-IN"/>
-        </w:rPr>
-        <w:t>Center</w:t>
-      </w:r>
-      <w:proofErr w:type="spellEnd"/>
-      <w:r>
-        <w:rPr>
-          <w:rFonts w:eastAsia="Times New Roman"/>
-          <w:i/>
-          <w:iCs/>
-          <w:sz w:val="24"/>
-          <w:szCs w:val="24"/>
-          <w:lang w:val="en-IN"/>
-        </w:rPr>
-        <w:t xml:space="preserve"> (Calif.).</w:t>
+        <w:t xml:space="preserve">Jaller, M., Pahwa, A., &amp; Center, M. T. (2023). Sketch Planning Tool for Sustainable and Resilient Urban Goods Distribution: User Manual. </w:t>
+      </w:r>
+      <w:r>
+        <w:rPr>
+          <w:rFonts w:eastAsia="Times New Roman"/>
+          <w:i/>
+          <w:iCs/>
+          <w:sz w:val="24"/>
+          <w:szCs w:val="24"/>
+          <w:lang w:val="en-IN"/>
+        </w:rPr>
+        <w:t>METRANS Transportation Center (Calif.).</w:t>
       </w:r>
     </w:p>
     <w:p>
@@ -2042,31 +1926,7 @@
           <w:szCs w:val="24"/>
           <w:lang w:val="en-IN"/>
         </w:rPr>
-        <w:t xml:space="preserve">National </w:t>
-      </w:r>
-      <w:proofErr w:type="spellStart"/>
-      <w:r>
-        <w:rPr>
-          <w:rFonts w:eastAsia="Times New Roman"/>
-          <w:i/>
-          <w:iCs/>
-          <w:sz w:val="24"/>
-          <w:szCs w:val="24"/>
-          <w:lang w:val="en-IN"/>
-        </w:rPr>
-        <w:t>Center</w:t>
-      </w:r>
-      <w:proofErr w:type="spellEnd"/>
-      <w:r>
-        <w:rPr>
-          <w:rFonts w:eastAsia="Times New Roman"/>
-          <w:i/>
-          <w:iCs/>
-          <w:sz w:val="24"/>
-          <w:szCs w:val="24"/>
-          <w:lang w:val="en-IN"/>
-        </w:rPr>
-        <w:t xml:space="preserve"> for </w:t>
+        <w:t xml:space="preserve">National Center for </w:t>
       </w:r>
       <w:r>
         <w:rPr>
@@ -2098,23 +1958,7 @@
           <w:sz w:val="24"/>
           <w:szCs w:val="24"/>
         </w:rPr>
-        <w:t xml:space="preserve">Giuliano, G., </w:t>
-      </w:r>
-      <w:proofErr w:type="spellStart"/>
-      <w:r>
-        <w:rPr>
-          <w:sz w:val="24"/>
-          <w:szCs w:val="24"/>
-        </w:rPr>
-        <w:t>Boarnet</w:t>
-      </w:r>
-      <w:proofErr w:type="spellEnd"/>
-      <w:r>
-        <w:rPr>
-          <w:sz w:val="24"/>
-          <w:szCs w:val="24"/>
-        </w:rPr>
-        <w:t xml:space="preserve">, M., Jaller, M., Franco, W., Binder, R. B., Dexter, S., </w:t>
+        <w:t xml:space="preserve">Giuliano, G., Boarnet, M., Jaller, M., Franco, W., Binder, R. B., Dexter, S., </w:t>
       </w:r>
       <w:r>
         <w:rPr>
@@ -2318,62 +2162,18 @@
           <w:szCs w:val="24"/>
           <w:lang w:val="en-IN"/>
         </w:rPr>
-        <w:t>Jaller, M., Xiao, R., Dennis, S., Rivera-</w:t>
-      </w:r>
-      <w:proofErr w:type="spellStart"/>
-      <w:r>
-        <w:rPr>
-          <w:rFonts w:eastAsia="Times New Roman"/>
-          <w:sz w:val="24"/>
-          <w:szCs w:val="24"/>
-          <w:lang w:val="en-IN"/>
-        </w:rPr>
-        <w:t>Royero</w:t>
-      </w:r>
-      <w:proofErr w:type="spellEnd"/>
-      <w:r>
-        <w:rPr>
-          <w:rFonts w:eastAsia="Times New Roman"/>
-          <w:sz w:val="24"/>
-          <w:szCs w:val="24"/>
-          <w:lang w:val="en-IN"/>
-        </w:rPr>
-        <w:t xml:space="preserve">, D., &amp; Pahwa, A. (2022). National Impacts of E-commerce Growth: Development of a Spatial Demand Based Tool. </w:t>
-      </w:r>
-      <w:r>
-        <w:rPr>
-          <w:rFonts w:eastAsia="Times New Roman"/>
-          <w:i/>
-          <w:iCs/>
-          <w:sz w:val="24"/>
-          <w:szCs w:val="24"/>
-          <w:lang w:val="en-IN"/>
-        </w:rPr>
-        <w:t xml:space="preserve">National </w:t>
-      </w:r>
-      <w:proofErr w:type="spellStart"/>
-      <w:r>
-        <w:rPr>
-          <w:rFonts w:eastAsia="Times New Roman"/>
-          <w:i/>
-          <w:iCs/>
-          <w:sz w:val="24"/>
-          <w:szCs w:val="24"/>
-          <w:lang w:val="en-IN"/>
-        </w:rPr>
-        <w:t>Center</w:t>
-      </w:r>
-      <w:proofErr w:type="spellEnd"/>
-      <w:r>
-        <w:rPr>
-          <w:rFonts w:eastAsia="Times New Roman"/>
-          <w:i/>
-          <w:iCs/>
-          <w:sz w:val="24"/>
-          <w:szCs w:val="24"/>
-          <w:lang w:val="en-IN"/>
-        </w:rPr>
-        <w:t xml:space="preserve"> for Sustainable Transportation.</w:t>
+        <w:t xml:space="preserve">Jaller, M., Xiao, R., Dennis, S., Rivera-Royero, D., &amp; Pahwa, A. (2022). National Impacts of E-commerce Growth: Development of a Spatial Demand Based Tool. </w:t>
+      </w:r>
+      <w:r>
+        <w:rPr>
+          <w:rFonts w:eastAsia="Times New Roman"/>
+          <w:i/>
+          <w:iCs/>
+          <w:sz w:val="24"/>
+          <w:szCs w:val="24"/>
+          <w:lang w:val="en-IN"/>
+        </w:rPr>
+        <w:t>National Center for Sustainable Transportation.</w:t>
       </w:r>
     </w:p>
     <w:p>
@@ -2405,31 +2205,7 @@
           <w:szCs w:val="24"/>
           <w:lang w:val="en-IN"/>
         </w:rPr>
-        <w:t xml:space="preserve"> Pacific Southwest Region University Transportation </w:t>
-      </w:r>
-      <w:proofErr w:type="spellStart"/>
-      <w:r>
-        <w:rPr>
-          <w:rFonts w:eastAsia="Times New Roman"/>
-          <w:i/>
-          <w:iCs/>
-          <w:sz w:val="24"/>
-          <w:szCs w:val="24"/>
-          <w:lang w:val="en-IN"/>
-        </w:rPr>
-        <w:t>Center</w:t>
-      </w:r>
-      <w:proofErr w:type="spellEnd"/>
-      <w:r>
-        <w:rPr>
-          <w:rFonts w:eastAsia="Times New Roman"/>
-          <w:i/>
-          <w:iCs/>
-          <w:sz w:val="24"/>
-          <w:szCs w:val="24"/>
-          <w:lang w:val="en-IN"/>
-        </w:rPr>
-        <w:t>.</w:t>
+        <w:t xml:space="preserve"> Pacific Southwest Region University Transportation Center.</w:t>
       </w:r>
     </w:p>
     <w:p>
@@ -2450,27 +2226,7 @@
           <w:szCs w:val="24"/>
           <w:lang w:val="en-IN"/>
         </w:rPr>
-        <w:t xml:space="preserve">Jaller, M., &amp; Pahwa, A. (2020). Analytical </w:t>
-      </w:r>
-      <w:proofErr w:type="spellStart"/>
-      <w:r>
-        <w:rPr>
-          <w:rFonts w:eastAsia="Times New Roman"/>
-          <w:sz w:val="24"/>
-          <w:szCs w:val="24"/>
-          <w:lang w:val="en-IN"/>
-        </w:rPr>
-        <w:t>Modeling</w:t>
-      </w:r>
-      <w:proofErr w:type="spellEnd"/>
-      <w:r>
-        <w:rPr>
-          <w:rFonts w:eastAsia="Times New Roman"/>
-          <w:sz w:val="24"/>
-          <w:szCs w:val="24"/>
-          <w:lang w:val="en-IN"/>
-        </w:rPr>
-        <w:t xml:space="preserve"> Framework to Assess the Economic and Environmental Impacts of Residential </w:t>
+        <w:t xml:space="preserve">Jaller, M., &amp; Pahwa, A. (2020). Analytical Modeling Framework to Assess the Economic and Environmental Impacts of Residential </w:t>
       </w:r>
       <w:r>
         <w:rPr>
@@ -2499,31 +2255,7 @@
           <w:szCs w:val="24"/>
           <w:lang w:val="en-IN"/>
         </w:rPr>
-        <w:t xml:space="preserve">National </w:t>
-      </w:r>
-      <w:proofErr w:type="spellStart"/>
-      <w:r>
-        <w:rPr>
-          <w:rFonts w:eastAsia="Times New Roman"/>
-          <w:i/>
-          <w:iCs/>
-          <w:sz w:val="24"/>
-          <w:szCs w:val="24"/>
-          <w:lang w:val="en-IN"/>
-        </w:rPr>
-        <w:t>Center</w:t>
-      </w:r>
-      <w:proofErr w:type="spellEnd"/>
-      <w:r>
-        <w:rPr>
-          <w:rFonts w:eastAsia="Times New Roman"/>
-          <w:i/>
-          <w:iCs/>
-          <w:sz w:val="24"/>
-          <w:szCs w:val="24"/>
-          <w:lang w:val="en-IN"/>
-        </w:rPr>
-        <w:t xml:space="preserve"> for Sustainable Transportation.</w:t>
+        <w:t>National Center for Sustainable Transportation.</w:t>
       </w:r>
     </w:p>
     <w:p>
@@ -2546,62 +2278,18 @@
           <w:szCs w:val="24"/>
           <w:lang w:val="en-IN"/>
         </w:rPr>
-        <w:t xml:space="preserve">Rodier, C., Jaller, M., </w:t>
-      </w:r>
-      <w:proofErr w:type="spellStart"/>
-      <w:r>
-        <w:rPr>
-          <w:rFonts w:eastAsia="Times New Roman"/>
-          <w:sz w:val="24"/>
-          <w:szCs w:val="24"/>
-          <w:lang w:val="en-IN"/>
-        </w:rPr>
-        <w:t>Pourrahmani</w:t>
-      </w:r>
-      <w:proofErr w:type="spellEnd"/>
-      <w:r>
-        <w:rPr>
-          <w:rFonts w:eastAsia="Times New Roman"/>
-          <w:sz w:val="24"/>
-          <w:szCs w:val="24"/>
-          <w:lang w:val="en-IN"/>
-        </w:rPr>
-        <w:t xml:space="preserve">, E., Bischoff, J., Freedman, J., &amp; Pahwa, A. (2018). Automated vehicle scenarios: Simulation of system-level travel effects using agent-based demand and supply models in the San Francisco Bay area. </w:t>
-      </w:r>
-      <w:r>
-        <w:rPr>
-          <w:rFonts w:eastAsia="Times New Roman"/>
-          <w:i/>
-          <w:iCs/>
-          <w:sz w:val="24"/>
-          <w:szCs w:val="24"/>
-          <w:lang w:val="en-IN"/>
-        </w:rPr>
-        <w:t xml:space="preserve">National </w:t>
-      </w:r>
-      <w:proofErr w:type="spellStart"/>
-      <w:r>
-        <w:rPr>
-          <w:rFonts w:eastAsia="Times New Roman"/>
-          <w:i/>
-          <w:iCs/>
-          <w:sz w:val="24"/>
-          <w:szCs w:val="24"/>
-          <w:lang w:val="en-IN"/>
-        </w:rPr>
-        <w:t>Center</w:t>
-      </w:r>
-      <w:proofErr w:type="spellEnd"/>
-      <w:r>
-        <w:rPr>
-          <w:rFonts w:eastAsia="Times New Roman"/>
-          <w:i/>
-          <w:iCs/>
-          <w:sz w:val="24"/>
-          <w:szCs w:val="24"/>
-          <w:lang w:val="en-IN"/>
-        </w:rPr>
-        <w:t xml:space="preserve"> for Sustainable Transportation.</w:t>
+        <w:t xml:space="preserve">Rodier, C., Jaller, M., Pourrahmani, E., Bischoff, J., Freedman, J., &amp; Pahwa, A. (2018). Automated vehicle scenarios: Simulation of system-level travel effects using agent-based demand and supply models in the San Francisco Bay area. </w:t>
+      </w:r>
+      <w:r>
+        <w:rPr>
+          <w:rFonts w:eastAsia="Times New Roman"/>
+          <w:i/>
+          <w:iCs/>
+          <w:sz w:val="24"/>
+          <w:szCs w:val="24"/>
+          <w:lang w:val="en-IN"/>
+        </w:rPr>
+        <w:t>National Center for Sustainable Transportation.</w:t>
       </w:r>
     </w:p>
     <w:p>
@@ -2687,31 +2375,7 @@
           <w:szCs w:val="24"/>
           <w:lang w:val="en-IN"/>
         </w:rPr>
-        <w:t xml:space="preserve">National </w:t>
-      </w:r>
-      <w:proofErr w:type="spellStart"/>
-      <w:r>
-        <w:rPr>
-          <w:rFonts w:eastAsia="Times New Roman"/>
-          <w:i/>
-          <w:iCs/>
-          <w:sz w:val="24"/>
-          <w:szCs w:val="24"/>
-          <w:lang w:val="en-IN"/>
-        </w:rPr>
-        <w:t>Center</w:t>
-      </w:r>
-      <w:proofErr w:type="spellEnd"/>
-      <w:r>
-        <w:rPr>
-          <w:rFonts w:eastAsia="Times New Roman"/>
-          <w:i/>
-          <w:iCs/>
-          <w:sz w:val="24"/>
-          <w:szCs w:val="24"/>
-          <w:lang w:val="en-IN"/>
-        </w:rPr>
-        <w:t xml:space="preserve"> for Sustainable Transportation.</w:t>
+        <w:t>National Center for Sustainable Transportation.</w:t>
       </w:r>
     </w:p>
     <w:p>
@@ -2775,31 +2439,7 @@
           <w:szCs w:val="24"/>
           <w:lang w:val="en-IN"/>
         </w:rPr>
-        <w:t xml:space="preserve">National </w:t>
-      </w:r>
-      <w:proofErr w:type="spellStart"/>
-      <w:r>
-        <w:rPr>
-          <w:rFonts w:eastAsia="Times New Roman"/>
-          <w:i/>
-          <w:iCs/>
-          <w:sz w:val="24"/>
-          <w:szCs w:val="24"/>
-          <w:lang w:val="en-IN"/>
-        </w:rPr>
-        <w:t>Center</w:t>
-      </w:r>
-      <w:proofErr w:type="spellEnd"/>
-      <w:r>
-        <w:rPr>
-          <w:rFonts w:eastAsia="Times New Roman"/>
-          <w:i/>
-          <w:iCs/>
-          <w:sz w:val="24"/>
-          <w:szCs w:val="24"/>
-          <w:lang w:val="en-IN"/>
-        </w:rPr>
-        <w:t xml:space="preserve"> for Sustainable Transportation.</w:t>
+        <w:t>National Center for Sustainable Transportation.</w:t>
       </w:r>
     </w:p>
     <w:p>
@@ -2823,27 +2463,7 @@
           <w:lang w:val="en-IN"/>
         </w:rPr>
         <w:lastRenderedPageBreak/>
-        <w:t xml:space="preserve">Rodier, C., Jaller, M., </w:t>
-      </w:r>
-      <w:proofErr w:type="spellStart"/>
-      <w:r>
-        <w:rPr>
-          <w:rFonts w:eastAsia="Times New Roman"/>
-          <w:sz w:val="24"/>
-          <w:szCs w:val="24"/>
-          <w:lang w:val="en-IN"/>
-        </w:rPr>
-        <w:t>Pourrahmani</w:t>
-      </w:r>
-      <w:proofErr w:type="spellEnd"/>
-      <w:r>
-        <w:rPr>
-          <w:rFonts w:eastAsia="Times New Roman"/>
-          <w:sz w:val="24"/>
-          <w:szCs w:val="24"/>
-          <w:lang w:val="en-IN"/>
-        </w:rPr>
-        <w:t xml:space="preserve">, E., Pahwa, A., Bischoff, J., &amp; Freedman, J. (2020). Automated Vehicles are Expected to Increase Driving and Emissions Without Policy Intervention. </w:t>
+        <w:t xml:space="preserve">Rodier, C., Jaller, M., Pourrahmani, E., Pahwa, A., Bischoff, J., &amp; Freedman, J. (2020). Automated Vehicles are Expected to Increase Driving and Emissions Without Policy Intervention. </w:t>
       </w:r>
       <w:r>
         <w:rPr>
@@ -2919,27 +2539,7 @@
           <w:szCs w:val="24"/>
           <w:lang w:val="en-IN"/>
         </w:rPr>
-        <w:t xml:space="preserve">Jaller, M., Pahwa, A., Otero-Palencia, C., &amp; </w:t>
-      </w:r>
-      <w:proofErr w:type="spellStart"/>
-      <w:r>
-        <w:rPr>
-          <w:rFonts w:eastAsia="Times New Roman"/>
-          <w:sz w:val="24"/>
-          <w:szCs w:val="24"/>
-          <w:lang w:val="en-IN"/>
-        </w:rPr>
-        <w:t>Pourrahmani</w:t>
-      </w:r>
-      <w:proofErr w:type="spellEnd"/>
-      <w:r>
-        <w:rPr>
-          <w:rFonts w:eastAsia="Times New Roman"/>
-          <w:sz w:val="24"/>
-          <w:szCs w:val="24"/>
-          <w:lang w:val="en-IN"/>
-        </w:rPr>
-        <w:t xml:space="preserve">, E. (2023). 19. Overview of city logistics and urban freight transport operations. </w:t>
+        <w:t xml:space="preserve">Jaller, M., Pahwa, A., Otero-Palencia, C., &amp; Pourrahmani, E. (2023). 19. Overview of city logistics and urban freight transport operations. </w:t>
       </w:r>
       <w:r>
         <w:rPr>
@@ -3191,27 +2791,7 @@
           <w:szCs w:val="24"/>
           <w:lang w:val="es-CO"/>
         </w:rPr>
-        <w:t xml:space="preserve">Xiao, R., </w:t>
-      </w:r>
-      <w:proofErr w:type="spellStart"/>
-      <w:r>
-        <w:rPr>
-          <w:rFonts w:eastAsia="Times New Roman"/>
-          <w:sz w:val="24"/>
-          <w:szCs w:val="24"/>
-          <w:lang w:val="es-CO"/>
-        </w:rPr>
-        <w:t>Jaller</w:t>
-      </w:r>
-      <w:proofErr w:type="spellEnd"/>
-      <w:r>
-        <w:rPr>
-          <w:rFonts w:eastAsia="Times New Roman"/>
-          <w:sz w:val="24"/>
-          <w:szCs w:val="24"/>
-          <w:lang w:val="es-CO"/>
-        </w:rPr>
-        <w:t xml:space="preserve">, M., </w:t>
+        <w:t xml:space="preserve">Xiao, R., Jaller, M., </w:t>
       </w:r>
       <w:r>
         <w:rPr>
@@ -3718,27 +3298,7 @@
           <w:szCs w:val="24"/>
           <w:lang w:val="en-IN"/>
         </w:rPr>
-        <w:t xml:space="preserve">Bischoff, J., Rodier, C. J., </w:t>
-      </w:r>
-      <w:proofErr w:type="spellStart"/>
-      <w:r>
-        <w:rPr>
-          <w:rFonts w:eastAsia="Times New Roman"/>
-          <w:sz w:val="24"/>
-          <w:szCs w:val="24"/>
-          <w:lang w:val="en-IN"/>
-        </w:rPr>
-        <w:t>Pourrahmani</w:t>
-      </w:r>
-      <w:proofErr w:type="spellEnd"/>
-      <w:r>
-        <w:rPr>
-          <w:rFonts w:eastAsia="Times New Roman"/>
-          <w:sz w:val="24"/>
-          <w:szCs w:val="24"/>
-          <w:lang w:val="en-IN"/>
-        </w:rPr>
-        <w:t xml:space="preserve">, E., Jaller, M., Pahwa, A., &amp; Maciejewski, M. (2019). </w:t>
+        <w:t xml:space="preserve">Bischoff, J., Rodier, C. J., Pourrahmani, E., Jaller, M., Pahwa, A., &amp; Maciejewski, M. (2019). </w:t>
       </w:r>
       <w:r>
         <w:rPr>
@@ -3791,31 +3351,7 @@
           <w:szCs w:val="24"/>
           <w:lang w:val="en-IN"/>
         </w:rPr>
-        <w:t xml:space="preserve">Evaluating the Environmental Impacts of Online Shopping: A </w:t>
-      </w:r>
-      <w:proofErr w:type="spellStart"/>
-      <w:r>
-        <w:rPr>
-          <w:rFonts w:eastAsia="Times New Roman"/>
-          <w:i/>
-          <w:iCs/>
-          <w:sz w:val="24"/>
-          <w:szCs w:val="24"/>
-          <w:lang w:val="en-IN"/>
-        </w:rPr>
-        <w:t>Behavioral</w:t>
-      </w:r>
-      <w:proofErr w:type="spellEnd"/>
-      <w:r>
-        <w:rPr>
-          <w:rFonts w:eastAsia="Times New Roman"/>
-          <w:i/>
-          <w:iCs/>
-          <w:sz w:val="24"/>
-          <w:szCs w:val="24"/>
-          <w:lang w:val="en-IN"/>
-        </w:rPr>
-        <w:t xml:space="preserve"> Analysis using the American Time Use Survey (ATUS) Data. </w:t>
+        <w:t xml:space="preserve">Evaluating the Environmental Impacts of Online Shopping: A Behavioral Analysis using the American Time Use Survey (ATUS) Data. </w:t>
       </w:r>
       <w:r>
         <w:rPr>
@@ -4058,27 +3594,7 @@
                 <w:szCs w:val="24"/>
                 <w:lang w:val="en-IN"/>
               </w:rPr>
-              <w:t xml:space="preserve">National </w:t>
-            </w:r>
-            <w:proofErr w:type="spellStart"/>
-            <w:r>
-              <w:rPr>
-                <w:rFonts w:eastAsia="Times New Roman"/>
-                <w:sz w:val="24"/>
-                <w:szCs w:val="24"/>
-                <w:lang w:val="en-IN"/>
-              </w:rPr>
-              <w:t>Center</w:t>
-            </w:r>
-            <w:proofErr w:type="spellEnd"/>
-            <w:r>
-              <w:rPr>
-                <w:rFonts w:eastAsia="Times New Roman"/>
-                <w:sz w:val="24"/>
-                <w:szCs w:val="24"/>
-                <w:lang w:val="en-IN"/>
-              </w:rPr>
-              <w:t xml:space="preserve"> for Sustainable Transportation Research Grant</w:t>
+              <w:t>National Center for Sustainable Transportation Research Grant</w:t>
             </w:r>
           </w:p>
         </w:tc>
@@ -4210,27 +3726,7 @@
                 <w:szCs w:val="24"/>
                 <w:lang w:val="en-IN"/>
               </w:rPr>
-              <w:t xml:space="preserve">National </w:t>
-            </w:r>
-            <w:proofErr w:type="spellStart"/>
-            <w:r>
-              <w:rPr>
-                <w:rFonts w:eastAsia="Times New Roman"/>
-                <w:sz w:val="24"/>
-                <w:szCs w:val="24"/>
-                <w:lang w:val="en-IN"/>
-              </w:rPr>
-              <w:t>Center</w:t>
-            </w:r>
-            <w:proofErr w:type="spellEnd"/>
-            <w:r>
-              <w:rPr>
-                <w:rFonts w:eastAsia="Times New Roman"/>
-                <w:sz w:val="24"/>
-                <w:szCs w:val="24"/>
-                <w:lang w:val="en-IN"/>
-              </w:rPr>
-              <w:t xml:space="preserve"> for Sustainable Transportation Research Fellowship</w:t>
+              <w:t>National Center for Sustainable Transportation Research Fellowship</w:t>
             </w:r>
           </w:p>
         </w:tc>
@@ -4438,47 +3934,7 @@
           <w:szCs w:val="24"/>
           <w:lang w:val="en-IN"/>
         </w:rPr>
-        <w:t xml:space="preserve">: </w:t>
-      </w:r>
-      <w:proofErr w:type="spellStart"/>
-      <w:r>
-        <w:rPr>
-          <w:rFonts w:eastAsia="Times New Roman"/>
-          <w:sz w:val="24"/>
-          <w:szCs w:val="24"/>
-          <w:lang w:val="en-IN"/>
-        </w:rPr>
-        <w:t>TransCAD</w:t>
-      </w:r>
-      <w:proofErr w:type="spellEnd"/>
-      <w:r>
-        <w:rPr>
-          <w:rFonts w:eastAsia="Times New Roman"/>
-          <w:sz w:val="24"/>
-          <w:szCs w:val="24"/>
-          <w:lang w:val="en-IN"/>
-        </w:rPr>
-        <w:t xml:space="preserve">, </w:t>
-      </w:r>
-      <w:proofErr w:type="spellStart"/>
-      <w:r>
-        <w:rPr>
-          <w:rFonts w:eastAsia="Times New Roman"/>
-          <w:sz w:val="24"/>
-          <w:szCs w:val="24"/>
-          <w:lang w:val="en-IN"/>
-        </w:rPr>
-        <w:t>Maptitude</w:t>
-      </w:r>
-      <w:proofErr w:type="spellEnd"/>
-      <w:r>
-        <w:rPr>
-          <w:rFonts w:eastAsia="Times New Roman"/>
-          <w:sz w:val="24"/>
-          <w:szCs w:val="24"/>
-          <w:lang w:val="en-IN"/>
-        </w:rPr>
-        <w:t>, ArcGIS, VS Code, Git</w:t>
+        <w:t>: TransCAD, Maptitude, ArcGIS, VS Code, Git</w:t>
       </w:r>
     </w:p>
     <w:p>
@@ -5224,7 +4680,7 @@
           <w:szCs w:val="24"/>
           <w:lang w:val="en-IN"/>
         </w:rPr>
-        <w:t>Transportation in Developing Economies</w:t>
+        <w:t>Transport Policy</w:t>
       </w:r>
     </w:p>
     <w:p>
@@ -5249,52 +4705,7 @@
           <w:szCs w:val="24"/>
           <w:lang w:val="en-IN"/>
         </w:rPr>
-        <w:t>Transportation Letters</w:t>
-      </w:r>
-      <w:r>
-        <w:rPr>
-          <w:rFonts w:eastAsia="Times New Roman"/>
-          <w:sz w:val="24"/>
-          <w:szCs w:val="24"/>
-          <w:lang w:val="en-IN"/>
-        </w:rPr>
-        <w:t xml:space="preserve">: </w:t>
-      </w:r>
-      <w:r>
-        <w:rPr>
-          <w:rFonts w:eastAsia="Times New Roman"/>
-          <w:sz w:val="24"/>
-          <w:szCs w:val="24"/>
-          <w:lang w:val="en-IN"/>
-        </w:rPr>
-        <w:t xml:space="preserve">The </w:t>
-      </w:r>
-      <w:r>
-        <w:rPr>
-          <w:rFonts w:eastAsia="Times New Roman"/>
-          <w:sz w:val="24"/>
-          <w:szCs w:val="24"/>
-          <w:lang w:val="en-IN"/>
-        </w:rPr>
-        <w:t>International Journal of Transportation</w:t>
-      </w:r>
-      <w:r>
-        <w:rPr>
-          <w:rFonts w:eastAsia="Times New Roman"/>
-          <w:sz w:val="24"/>
-          <w:szCs w:val="24"/>
-          <w:lang w:val="en-IN"/>
-        </w:rPr>
-        <w:t xml:space="preserve"> </w:t>
-      </w:r>
-      <w:r>
-        <w:rPr>
-          <w:rFonts w:eastAsia="Times New Roman"/>
-          <w:sz w:val="24"/>
-          <w:szCs w:val="24"/>
-          <w:lang w:val="en-IN"/>
-        </w:rPr>
-        <w:t>Research</w:t>
+        <w:t>Transportation in Developing Economies</w:t>
       </w:r>
     </w:p>
     <w:p>
@@ -5319,7 +4730,52 @@
           <w:szCs w:val="24"/>
           <w:lang w:val="en-IN"/>
         </w:rPr>
-        <w:t>Transportation Planning and Implementation Methodologies for Developing Countries</w:t>
+        <w:t>Transportation Letters</w:t>
+      </w:r>
+      <w:r>
+        <w:rPr>
+          <w:rFonts w:eastAsia="Times New Roman"/>
+          <w:sz w:val="24"/>
+          <w:szCs w:val="24"/>
+          <w:lang w:val="en-IN"/>
+        </w:rPr>
+        <w:t xml:space="preserve">: </w:t>
+      </w:r>
+      <w:r>
+        <w:rPr>
+          <w:rFonts w:eastAsia="Times New Roman"/>
+          <w:sz w:val="24"/>
+          <w:szCs w:val="24"/>
+          <w:lang w:val="en-IN"/>
+        </w:rPr>
+        <w:t xml:space="preserve">The </w:t>
+      </w:r>
+      <w:r>
+        <w:rPr>
+          <w:rFonts w:eastAsia="Times New Roman"/>
+          <w:sz w:val="24"/>
+          <w:szCs w:val="24"/>
+          <w:lang w:val="en-IN"/>
+        </w:rPr>
+        <w:t>International Journal of Transportation</w:t>
+      </w:r>
+      <w:r>
+        <w:rPr>
+          <w:rFonts w:eastAsia="Times New Roman"/>
+          <w:sz w:val="24"/>
+          <w:szCs w:val="24"/>
+          <w:lang w:val="en-IN"/>
+        </w:rPr>
+        <w:t xml:space="preserve"> </w:t>
+      </w:r>
+      <w:r>
+        <w:rPr>
+          <w:rFonts w:eastAsia="Times New Roman"/>
+          <w:sz w:val="24"/>
+          <w:szCs w:val="24"/>
+          <w:lang w:val="en-IN"/>
+        </w:rPr>
+        <w:t>Research</w:t>
       </w:r>
     </w:p>
     <w:p>
@@ -5344,7 +4800,7 @@
           <w:szCs w:val="24"/>
           <w:lang w:val="en-IN"/>
         </w:rPr>
-        <w:t>Transportation Planning and Technology</w:t>
+        <w:t>Transportation Planning and Implementation Methodologies for Developing Countries</w:t>
       </w:r>
     </w:p>
     <w:p>
@@ -5369,7 +4825,7 @@
           <w:szCs w:val="24"/>
           <w:lang w:val="en-IN"/>
         </w:rPr>
-        <w:t>Transportation Research Board Annual Meeting</w:t>
+        <w:t>Transportation Planning and Technology</w:t>
       </w:r>
     </w:p>
     <w:p>
@@ -5394,8 +4850,7 @@
           <w:szCs w:val="24"/>
           <w:lang w:val="en-IN"/>
         </w:rPr>
-        <w:lastRenderedPageBreak/>
-        <w:t>Transportation Research Interdisciplinary Perspectives</w:t>
+        <w:t>Transportation Research Board Annual Meeting</w:t>
       </w:r>
     </w:p>
     <w:p>
@@ -5420,7 +4875,7 @@
           <w:szCs w:val="24"/>
           <w:lang w:val="en-IN"/>
         </w:rPr>
-        <w:t>Transportation Research Part A: Policy and Planning</w:t>
+        <w:t>Transportation Research Interdisciplinary Perspectives</w:t>
       </w:r>
     </w:p>
     <w:p>
@@ -5445,16 +4900,7 @@
           <w:szCs w:val="24"/>
           <w:lang w:val="en-IN"/>
         </w:rPr>
-        <w:t>Transportation Research Part B:</w:t>
-      </w:r>
-      <w:r>
-        <w:rPr>
-          <w:rFonts w:eastAsia="Times New Roman"/>
-          <w:sz w:val="24"/>
-          <w:szCs w:val="24"/>
-          <w:lang w:val="en-IN"/>
-        </w:rPr>
-        <w:t xml:space="preserve"> Methodological</w:t>
+        <w:t>Transportation Research Part A: Policy and Planning</w:t>
       </w:r>
     </w:p>
     <w:p>
@@ -5479,16 +4925,16 @@
           <w:szCs w:val="24"/>
           <w:lang w:val="en-IN"/>
         </w:rPr>
-        <w:t xml:space="preserve">Transportation Research Part C: </w:t>
-      </w:r>
-      <w:r>
-        <w:rPr>
-          <w:rFonts w:eastAsia="Times New Roman"/>
-          <w:sz w:val="24"/>
-          <w:szCs w:val="24"/>
-          <w:lang w:val="en-IN"/>
-        </w:rPr>
-        <w:t>Emerging Technologies</w:t>
+        <w:t>Transportation Research Part B:</w:t>
+      </w:r>
+      <w:r>
+        <w:rPr>
+          <w:rFonts w:eastAsia="Times New Roman"/>
+          <w:sz w:val="24"/>
+          <w:szCs w:val="24"/>
+          <w:lang w:val="en-IN"/>
+        </w:rPr>
+        <w:t xml:space="preserve"> Methodological</w:t>
       </w:r>
     </w:p>
     <w:p>
@@ -5513,7 +4959,16 @@
           <w:szCs w:val="24"/>
           <w:lang w:val="en-IN"/>
         </w:rPr>
-        <w:t>Transportation Research Part D: Transport and Environment</w:t>
+        <w:t xml:space="preserve">Transportation Research Part C: </w:t>
+      </w:r>
+      <w:r>
+        <w:rPr>
+          <w:rFonts w:eastAsia="Times New Roman"/>
+          <w:sz w:val="24"/>
+          <w:szCs w:val="24"/>
+          <w:lang w:val="en-IN"/>
+        </w:rPr>
+        <w:t>Emerging Technologies</w:t>
       </w:r>
     </w:p>
     <w:p>
@@ -5538,7 +4993,7 @@
           <w:szCs w:val="24"/>
           <w:lang w:val="en-IN"/>
         </w:rPr>
-        <w:t>Transportation Research Part E: Logistics and Transportation Review</w:t>
+        <w:t>Transportation Research Part D: Transport and Environment</w:t>
       </w:r>
     </w:p>
     <w:p>
@@ -5563,7 +5018,7 @@
           <w:szCs w:val="24"/>
           <w:lang w:val="en-IN"/>
         </w:rPr>
-        <w:t>Transportation Research Record</w:t>
+        <w:t>Transportation Research Part E: Logistics and Transportation Review</w:t>
       </w:r>
     </w:p>
     <w:p>
@@ -5588,7 +5043,7 @@
           <w:szCs w:val="24"/>
           <w:lang w:val="en-IN"/>
         </w:rPr>
-        <w:t>Trauma care</w:t>
+        <w:t>Transportation Research Record</w:t>
       </w:r>
     </w:p>
     <w:p>
@@ -5613,7 +5068,7 @@
           <w:szCs w:val="24"/>
           <w:lang w:val="en-IN"/>
         </w:rPr>
-        <w:t>Urban Transitions</w:t>
+        <w:t>Trauma care</w:t>
       </w:r>
     </w:p>
     <w:p>
@@ -5638,93 +5093,7 @@
           <w:szCs w:val="24"/>
           <w:lang w:val="en-IN"/>
         </w:rPr>
-        <w:t>World Symposium on Transport and Land Use Research</w:t>
-      </w:r>
-    </w:p>
-    <w:p>
-      <w:pPr>
-        <w:pStyle w:val="ListParagraph"/>
-        <w:rPr>
-          <w:rFonts w:ascii="Calibri Light" w:eastAsia="Calibri Light" w:hAnsi="Calibri Light" w:cs="Calibri Light"/>
-          <w:sz w:val="24"/>
-          <w:szCs w:val="24"/>
-          <w:lang w:val="en-IN"/>
-        </w:rPr>
-      </w:pPr>
-    </w:p>
-    <w:p>
-      <w:pPr>
-        <w:ind w:left="360"/>
-        <w:rPr>
-          <w:rFonts w:eastAsia="Times New Roman"/>
-          <w:b/>
-          <w:bCs/>
-          <w:sz w:val="24"/>
-          <w:szCs w:val="24"/>
-          <w:lang w:val="en-IN"/>
-        </w:rPr>
-      </w:pPr>
-      <w:r>
-        <w:rPr>
-          <w:rFonts w:eastAsia="Times New Roman"/>
-          <w:b/>
-          <w:bCs/>
-          <w:sz w:val="24"/>
-          <w:szCs w:val="24"/>
-          <w:lang w:val="en-IN"/>
-        </w:rPr>
-        <w:t>Postdoc Supervisor</w:t>
-      </w:r>
-    </w:p>
-    <w:p>
-      <w:pPr>
-        <w:spacing w:line="238" w:lineRule="auto"/>
-        <w:ind w:left="540"/>
-        <w:rPr>
-          <w:sz w:val="20"/>
-          <w:szCs w:val="20"/>
-          <w:lang w:val="en-IN"/>
-        </w:rPr>
-      </w:pPr>
-      <w:r>
-        <w:rPr>
-          <w:rFonts w:ascii="Calibri Light" w:eastAsia="Calibri Light" w:hAnsi="Calibri Light" w:cs="Calibri Light"/>
-          <w:sz w:val="24"/>
-          <w:szCs w:val="24"/>
-          <w:lang w:val="en-IN"/>
-        </w:rPr>
-        <w:t>-</w:t>
-      </w:r>
-    </w:p>
-    <w:p>
-      <w:pPr>
-        <w:spacing w:line="266" w:lineRule="exact"/>
-        <w:rPr>
-          <w:sz w:val="20"/>
-          <w:szCs w:val="20"/>
-          <w:lang w:val="en-IN"/>
-        </w:rPr>
-      </w:pPr>
-    </w:p>
-    <w:p>
-      <w:pPr>
-        <w:ind w:left="360"/>
-        <w:rPr>
-          <w:sz w:val="20"/>
-          <w:szCs w:val="20"/>
-          <w:lang w:val="en-IN"/>
-        </w:rPr>
-      </w:pPr>
-      <w:r>
-        <w:rPr>
-          <w:rFonts w:eastAsia="Times New Roman"/>
-          <w:b/>
-          <w:bCs/>
-          <w:sz w:val="24"/>
-          <w:szCs w:val="24"/>
-          <w:lang w:val="en-IN"/>
-        </w:rPr>
-        <w:t>PhD Supervisor</w:t>
+        <w:t>Urban Transitions</w:t>
       </w:r>
     </w:p>
     <w:p>
@@ -5749,16 +5118,93 @@
           <w:szCs w:val="24"/>
           <w:lang w:val="en-IN"/>
         </w:rPr>
-        <w:t xml:space="preserve">Blessy K. </w:t>
-      </w:r>
-      <w:r>
-        <w:rPr>
-          <w:rFonts w:eastAsia="Times New Roman"/>
-          <w:sz w:val="24"/>
-          <w:szCs w:val="24"/>
-          <w:lang w:val="en-IN"/>
-        </w:rPr>
-        <w:t>(current)</w:t>
+        <w:t>World Symposium on Transport and Land Use Research</w:t>
+      </w:r>
+    </w:p>
+    <w:p>
+      <w:pPr>
+        <w:pStyle w:val="ListParagraph"/>
+        <w:rPr>
+          <w:rFonts w:ascii="Calibri Light" w:eastAsia="Calibri Light" w:hAnsi="Calibri Light" w:cs="Calibri Light"/>
+          <w:sz w:val="24"/>
+          <w:szCs w:val="24"/>
+          <w:lang w:val="en-IN"/>
+        </w:rPr>
+      </w:pPr>
+    </w:p>
+    <w:p>
+      <w:pPr>
+        <w:ind w:left="360"/>
+        <w:rPr>
+          <w:rFonts w:eastAsia="Times New Roman"/>
+          <w:b/>
+          <w:bCs/>
+          <w:sz w:val="24"/>
+          <w:szCs w:val="24"/>
+          <w:lang w:val="en-IN"/>
+        </w:rPr>
+      </w:pPr>
+      <w:r>
+        <w:rPr>
+          <w:rFonts w:eastAsia="Times New Roman"/>
+          <w:b/>
+          <w:bCs/>
+          <w:sz w:val="24"/>
+          <w:szCs w:val="24"/>
+          <w:lang w:val="en-IN"/>
+        </w:rPr>
+        <w:t>Postdoc Supervisor</w:t>
+      </w:r>
+    </w:p>
+    <w:p>
+      <w:pPr>
+        <w:spacing w:line="238" w:lineRule="auto"/>
+        <w:ind w:left="540"/>
+        <w:rPr>
+          <w:sz w:val="20"/>
+          <w:szCs w:val="20"/>
+          <w:lang w:val="en-IN"/>
+        </w:rPr>
+      </w:pPr>
+      <w:r>
+        <w:rPr>
+          <w:rFonts w:ascii="Calibri Light" w:eastAsia="Calibri Light" w:hAnsi="Calibri Light" w:cs="Calibri Light"/>
+          <w:sz w:val="24"/>
+          <w:szCs w:val="24"/>
+          <w:lang w:val="en-IN"/>
+        </w:rPr>
+        <w:t>-</w:t>
+      </w:r>
+    </w:p>
+    <w:p>
+      <w:pPr>
+        <w:spacing w:line="266" w:lineRule="exact"/>
+        <w:rPr>
+          <w:sz w:val="20"/>
+          <w:szCs w:val="20"/>
+          <w:lang w:val="en-IN"/>
+        </w:rPr>
+      </w:pPr>
+    </w:p>
+    <w:p>
+      <w:pPr>
+        <w:ind w:left="360"/>
+        <w:rPr>
+          <w:sz w:val="20"/>
+          <w:szCs w:val="20"/>
+          <w:lang w:val="en-IN"/>
+        </w:rPr>
+      </w:pPr>
+      <w:r>
+        <w:rPr>
+          <w:rFonts w:eastAsia="Times New Roman"/>
+          <w:b/>
+          <w:bCs/>
+          <w:sz w:val="24"/>
+          <w:szCs w:val="24"/>
+          <w:lang w:val="en-IN"/>
+        </w:rPr>
+        <w:t>PhD Supervisor</w:t>
       </w:r>
     </w:p>
     <w:p>
@@ -5783,16 +5229,16 @@
           <w:szCs w:val="24"/>
           <w:lang w:val="en-IN"/>
         </w:rPr>
-        <w:t>Stephen Babu</w:t>
-      </w:r>
-      <w:r>
-        <w:rPr>
-          <w:rFonts w:eastAsia="Times New Roman"/>
-          <w:sz w:val="24"/>
-          <w:szCs w:val="24"/>
-          <w:lang w:val="en-IN"/>
-        </w:rPr>
-        <w:t xml:space="preserve"> (current)</w:t>
+        <w:t xml:space="preserve">Blessy K. </w:t>
+      </w:r>
+      <w:r>
+        <w:rPr>
+          <w:rFonts w:eastAsia="Times New Roman"/>
+          <w:sz w:val="24"/>
+          <w:szCs w:val="24"/>
+          <w:lang w:val="en-IN"/>
+        </w:rPr>
+        <w:t>(current)</w:t>
       </w:r>
     </w:p>
     <w:p>
@@ -5810,37 +5256,15 @@
           <w:lang w:val="en-IN"/>
         </w:rPr>
       </w:pPr>
-      <w:proofErr w:type="spellStart"/>
-      <w:r>
-        <w:rPr>
-          <w:rFonts w:eastAsia="Times New Roman"/>
-          <w:sz w:val="24"/>
-          <w:szCs w:val="24"/>
-          <w:lang w:val="en-IN"/>
-        </w:rPr>
-        <w:t>Nagasai</w:t>
-      </w:r>
-      <w:proofErr w:type="spellEnd"/>
-      <w:r>
-        <w:rPr>
-          <w:rFonts w:eastAsia="Times New Roman"/>
-          <w:sz w:val="24"/>
-          <w:szCs w:val="24"/>
-          <w:lang w:val="en-IN"/>
-        </w:rPr>
-        <w:t xml:space="preserve"> </w:t>
-      </w:r>
-      <w:proofErr w:type="spellStart"/>
-      <w:r>
-        <w:rPr>
-          <w:rFonts w:eastAsia="Times New Roman"/>
-          <w:sz w:val="24"/>
-          <w:szCs w:val="24"/>
-          <w:lang w:val="en-IN"/>
-        </w:rPr>
-        <w:t>Panidarapu</w:t>
-      </w:r>
-      <w:proofErr w:type="spellEnd"/>
+      <w:r>
+        <w:rPr>
+          <w:rFonts w:eastAsia="Times New Roman"/>
+          <w:sz w:val="24"/>
+          <w:szCs w:val="24"/>
+          <w:lang w:val="en-IN"/>
+        </w:rPr>
+        <w:t>Stephen Babu</w:t>
+      </w:r>
       <w:r>
         <w:rPr>
           <w:rFonts w:eastAsia="Times New Roman"/>
@@ -5849,37 +5273,6 @@
           <w:lang w:val="en-IN"/>
         </w:rPr>
         <w:t xml:space="preserve"> (current)</w:t>
-      </w:r>
-    </w:p>
-    <w:p>
-      <w:pPr>
-        <w:spacing w:line="267" w:lineRule="exact"/>
-        <w:rPr>
-          <w:sz w:val="20"/>
-          <w:szCs w:val="20"/>
-          <w:lang w:val="en-IN"/>
-        </w:rPr>
-      </w:pPr>
-    </w:p>
-    <w:p>
-      <w:pPr>
-        <w:ind w:left="360"/>
-        <w:rPr>
-          <w:sz w:val="20"/>
-          <w:szCs w:val="20"/>
-          <w:lang w:val="en-IN"/>
-        </w:rPr>
-      </w:pPr>
-      <w:r>
-        <w:rPr>
-          <w:rFonts w:eastAsia="Times New Roman"/>
-          <w:b/>
-          <w:bCs/>
-          <w:sz w:val="24"/>
-          <w:szCs w:val="24"/>
-          <w:lang w:val="en-IN"/>
-        </w:rPr>
-        <w:t>MTech Supervisor</w:t>
       </w:r>
     </w:p>
     <w:p>
@@ -5904,16 +5297,56 @@
           <w:szCs w:val="24"/>
           <w:lang w:val="en-IN"/>
         </w:rPr>
-        <w:t>Varun A</w:t>
-      </w:r>
-      <w:r>
-        <w:rPr>
-          <w:rFonts w:eastAsia="Times New Roman"/>
-          <w:sz w:val="24"/>
-          <w:szCs w:val="24"/>
-          <w:lang w:val="en-IN"/>
-        </w:rPr>
-        <w:t>. (2025)</w:t>
+        <w:t xml:space="preserve">Nagasai </w:t>
+      </w:r>
+      <w:r>
+        <w:rPr>
+          <w:rFonts w:eastAsia="Times New Roman"/>
+          <w:sz w:val="24"/>
+          <w:szCs w:val="24"/>
+          <w:lang w:val="en-IN"/>
+        </w:rPr>
+        <w:t>Panidarapu</w:t>
+      </w:r>
+      <w:r>
+        <w:rPr>
+          <w:rFonts w:eastAsia="Times New Roman"/>
+          <w:sz w:val="24"/>
+          <w:szCs w:val="24"/>
+          <w:lang w:val="en-IN"/>
+        </w:rPr>
+        <w:t xml:space="preserve"> (current)</w:t>
+      </w:r>
+    </w:p>
+    <w:p>
+      <w:pPr>
+        <w:spacing w:line="267" w:lineRule="exact"/>
+        <w:rPr>
+          <w:sz w:val="20"/>
+          <w:szCs w:val="20"/>
+          <w:lang w:val="en-IN"/>
+        </w:rPr>
+      </w:pPr>
+    </w:p>
+    <w:p>
+      <w:pPr>
+        <w:ind w:left="360"/>
+        <w:rPr>
+          <w:sz w:val="20"/>
+          <w:szCs w:val="20"/>
+          <w:lang w:val="en-IN"/>
+        </w:rPr>
+      </w:pPr>
+      <w:r>
+        <w:rPr>
+          <w:rFonts w:eastAsia="Times New Roman"/>
+          <w:b/>
+          <w:bCs/>
+          <w:sz w:val="24"/>
+          <w:szCs w:val="24"/>
+          <w:lang w:val="en-IN"/>
+        </w:rPr>
+        <w:t>MTech Supervisor</w:t>
       </w:r>
     </w:p>
     <w:p>
@@ -5938,7 +5371,16 @@
           <w:szCs w:val="24"/>
           <w:lang w:val="en-IN"/>
         </w:rPr>
-        <w:t>Harshvardhan Shivram Ket (current)</w:t>
+        <w:t>Varun A</w:t>
+      </w:r>
+      <w:r>
+        <w:rPr>
+          <w:rFonts w:eastAsia="Times New Roman"/>
+          <w:sz w:val="24"/>
+          <w:szCs w:val="24"/>
+          <w:lang w:val="en-IN"/>
+        </w:rPr>
+        <w:t>. (2025)</w:t>
       </w:r>
     </w:p>
     <w:p>
@@ -5963,38 +5405,7 @@
           <w:szCs w:val="24"/>
           <w:lang w:val="en-IN"/>
         </w:rPr>
-        <w:t>Aditya Aggarwal (current)</w:t>
-      </w:r>
-    </w:p>
-    <w:p>
-      <w:pPr>
-        <w:spacing w:line="266" w:lineRule="exact"/>
-        <w:rPr>
-          <w:sz w:val="20"/>
-          <w:szCs w:val="20"/>
-          <w:lang w:val="en-IN"/>
-        </w:rPr>
-      </w:pPr>
-    </w:p>
-    <w:p>
-      <w:pPr>
-        <w:ind w:left="360"/>
-        <w:rPr>
-          <w:sz w:val="20"/>
-          <w:szCs w:val="20"/>
-          <w:lang w:val="en-IN"/>
-        </w:rPr>
-      </w:pPr>
-      <w:r>
-        <w:rPr>
-          <w:rFonts w:eastAsia="Times New Roman"/>
-          <w:b/>
-          <w:bCs/>
-          <w:sz w:val="24"/>
-          <w:szCs w:val="24"/>
-          <w:lang w:val="en-IN"/>
-        </w:rPr>
-        <w:t>BTech Supervisor</w:t>
+        <w:t>Harshvardhan Shivram Ket (current)</w:t>
       </w:r>
     </w:p>
     <w:p>
@@ -6019,36 +5430,38 @@
           <w:szCs w:val="24"/>
           <w:lang w:val="en-IN"/>
         </w:rPr>
-        <w:t xml:space="preserve">Arvind </w:t>
-      </w:r>
-      <w:proofErr w:type="spellStart"/>
-      <w:r>
-        <w:rPr>
-          <w:rFonts w:eastAsia="Times New Roman"/>
-          <w:sz w:val="24"/>
-          <w:szCs w:val="24"/>
-          <w:lang w:val="en-IN"/>
-        </w:rPr>
-        <w:t>Vidhyashankar</w:t>
-      </w:r>
-      <w:proofErr w:type="spellEnd"/>
-      <w:r>
-        <w:rPr>
-          <w:rFonts w:eastAsia="Times New Roman"/>
-          <w:sz w:val="24"/>
-          <w:szCs w:val="24"/>
-          <w:lang w:val="en-IN"/>
-        </w:rPr>
-        <w:t xml:space="preserve"> </w:t>
-      </w:r>
-      <w:r>
-        <w:rPr>
-          <w:rFonts w:eastAsia="Times New Roman"/>
-          <w:sz w:val="24"/>
-          <w:szCs w:val="24"/>
-          <w:lang w:val="en-IN"/>
-        </w:rPr>
-        <w:t>(current)</w:t>
+        <w:t>Aditya Aggarwal (current)</w:t>
+      </w:r>
+    </w:p>
+    <w:p>
+      <w:pPr>
+        <w:spacing w:line="266" w:lineRule="exact"/>
+        <w:rPr>
+          <w:sz w:val="20"/>
+          <w:szCs w:val="20"/>
+          <w:lang w:val="en-IN"/>
+        </w:rPr>
+      </w:pPr>
+    </w:p>
+    <w:p>
+      <w:pPr>
+        <w:ind w:left="360"/>
+        <w:rPr>
+          <w:sz w:val="20"/>
+          <w:szCs w:val="20"/>
+          <w:lang w:val="en-IN"/>
+        </w:rPr>
+      </w:pPr>
+      <w:r>
+        <w:rPr>
+          <w:rFonts w:eastAsia="Times New Roman"/>
+          <w:b/>
+          <w:bCs/>
+          <w:sz w:val="24"/>
+          <w:szCs w:val="24"/>
+          <w:lang w:val="en-IN"/>
+        </w:rPr>
+        <w:t>BTech Supervisor</w:t>
       </w:r>
     </w:p>
     <w:p>
@@ -6073,27 +5486,50 @@
           <w:szCs w:val="24"/>
           <w:lang w:val="en-IN"/>
         </w:rPr>
-        <w:t xml:space="preserve">Om </w:t>
-      </w:r>
-      <w:proofErr w:type="spellStart"/>
-      <w:r>
-        <w:rPr>
-          <w:rFonts w:eastAsia="Times New Roman"/>
-          <w:sz w:val="24"/>
-          <w:szCs w:val="24"/>
-          <w:lang w:val="en-IN"/>
-        </w:rPr>
-        <w:t>Ramavtar</w:t>
-      </w:r>
-      <w:proofErr w:type="spellEnd"/>
-      <w:r>
-        <w:rPr>
-          <w:rFonts w:eastAsia="Times New Roman"/>
-          <w:sz w:val="24"/>
-          <w:szCs w:val="24"/>
-          <w:lang w:val="en-IN"/>
-        </w:rPr>
-        <w:t xml:space="preserve"> Yadav</w:t>
+        <w:t>Arvind Vidhyashankar</w:t>
+      </w:r>
+      <w:r>
+        <w:rPr>
+          <w:rFonts w:eastAsia="Times New Roman"/>
+          <w:sz w:val="24"/>
+          <w:szCs w:val="24"/>
+          <w:lang w:val="en-IN"/>
+        </w:rPr>
+        <w:t xml:space="preserve"> </w:t>
+      </w:r>
+      <w:r>
+        <w:rPr>
+          <w:rFonts w:eastAsia="Times New Roman"/>
+          <w:sz w:val="24"/>
+          <w:szCs w:val="24"/>
+          <w:lang w:val="en-IN"/>
+        </w:rPr>
+        <w:t>(current)</w:t>
+      </w:r>
+    </w:p>
+    <w:p>
+      <w:pPr>
+        <w:pStyle w:val="ListParagraph"/>
+        <w:numPr>
+          <w:ilvl w:val="0"/>
+          <w:numId w:val="1"/>
+        </w:numPr>
+        <w:ind w:left="810" w:hanging="270"/>
+        <w:rPr>
+          <w:rFonts w:eastAsia="Times New Roman"/>
+          <w:sz w:val="24"/>
+          <w:szCs w:val="24"/>
+          <w:lang w:val="en-IN"/>
+        </w:rPr>
+      </w:pPr>
+      <w:r>
+        <w:rPr>
+          <w:rFonts w:eastAsia="Times New Roman"/>
+          <w:sz w:val="24"/>
+          <w:szCs w:val="24"/>
+          <w:lang w:val="en-IN"/>
+        </w:rPr>
+        <w:t>Om Ramavtar Yadav</w:t>
       </w:r>
       <w:r>
         <w:rPr>

</xml_diff>

<commit_message>
Deploying to gh-pages from @ lognitilab/lognitilab.github.io@f924c838b613695ad1efa53bc2468f0dd46d320d 🚀
</commit_message>
<xml_diff>
--- a/assets/doc/cv-anmolpahwa.docx
+++ b/assets/doc/cv-anmolpahwa.docx
@@ -151,7 +151,7 @@
                 <w:szCs w:val="24"/>
                 <w:lang w:val="en-IN"/>
               </w:rPr>
-              <w:t>Room BSB 338</w:t>
+              <w:t>338</w:t>
             </w:r>
           </w:p>
         </w:tc>
@@ -343,8 +343,20 @@
                   <w:szCs w:val="24"/>
                   <w:lang w:val="en-IN"/>
                 </w:rPr>
-                <w:t>civil.iitm.ac.im/faculty/anmpahwa</w:t>
+                <w:t>civil.iitm.ac.im/faculty/</w:t>
               </w:r>
+              <w:proofErr w:type="spellStart"/>
+              <w:r>
+                <w:rPr>
+                  <w:rStyle w:val="Hyperlink"/>
+                  <w:rFonts w:eastAsia="Times New Roman"/>
+                  <w:sz w:val="24"/>
+                  <w:szCs w:val="24"/>
+                  <w:lang w:val="en-IN"/>
+                </w:rPr>
+                <w:t>anmpahwa</w:t>
+              </w:r>
+              <w:proofErr w:type="spellEnd"/>
             </w:hyperlink>
           </w:p>
         </w:tc>
@@ -762,7 +774,27 @@
                 <w:szCs w:val="24"/>
                 <w:lang w:val="en-IN"/>
               </w:rPr>
-              <w:t>Dr. Geetam Tiwari</w:t>
+              <w:t xml:space="preserve">Dr. </w:t>
+            </w:r>
+            <w:proofErr w:type="spellStart"/>
+            <w:r>
+              <w:rPr>
+                <w:rFonts w:eastAsia="Times New Roman"/>
+                <w:sz w:val="24"/>
+                <w:szCs w:val="24"/>
+                <w:lang w:val="en-IN"/>
+              </w:rPr>
+              <w:t>Geetam</w:t>
+            </w:r>
+            <w:proofErr w:type="spellEnd"/>
+            <w:r>
+              <w:rPr>
+                <w:rFonts w:eastAsia="Times New Roman"/>
+                <w:sz w:val="24"/>
+                <w:szCs w:val="24"/>
+                <w:lang w:val="en-IN"/>
+              </w:rPr>
+              <w:t xml:space="preserve"> Tiwari</w:t>
             </w:r>
           </w:p>
         </w:tc>
@@ -1278,7 +1310,47 @@
           <w:szCs w:val="24"/>
           <w:lang w:val="es-CO"/>
         </w:rPr>
-        <w:t xml:space="preserve">(Under Review). </w:t>
+        <w:t>(</w:t>
+      </w:r>
+      <w:proofErr w:type="spellStart"/>
+      <w:r>
+        <w:rPr>
+          <w:rFonts w:eastAsia="Times New Roman"/>
+          <w:sz w:val="24"/>
+          <w:szCs w:val="24"/>
+          <w:lang w:val="es-CO"/>
+        </w:rPr>
+        <w:t>Under</w:t>
+      </w:r>
+      <w:proofErr w:type="spellEnd"/>
+      <w:r>
+        <w:rPr>
+          <w:rFonts w:eastAsia="Times New Roman"/>
+          <w:sz w:val="24"/>
+          <w:szCs w:val="24"/>
+          <w:lang w:val="es-CO"/>
+        </w:rPr>
+        <w:t xml:space="preserve"> </w:t>
+      </w:r>
+      <w:proofErr w:type="spellStart"/>
+      <w:r>
+        <w:rPr>
+          <w:rFonts w:eastAsia="Times New Roman"/>
+          <w:sz w:val="24"/>
+          <w:szCs w:val="24"/>
+          <w:lang w:val="es-CO"/>
+        </w:rPr>
+        <w:t>Review</w:t>
+      </w:r>
+      <w:proofErr w:type="spellEnd"/>
+      <w:r>
+        <w:rPr>
+          <w:rFonts w:eastAsia="Times New Roman"/>
+          <w:sz w:val="24"/>
+          <w:szCs w:val="24"/>
+          <w:lang w:val="es-CO"/>
+        </w:rPr>
+        <w:t xml:space="preserve">). </w:t>
       </w:r>
       <w:r>
         <w:rPr>
@@ -1544,7 +1616,27 @@
           <w:szCs w:val="24"/>
           <w:lang w:val="en-IN"/>
         </w:rPr>
-        <w:t xml:space="preserve">Jaller, M., Xiao, R. I., Dennis-Bauer, S., Rivera-Royero, D., &amp; Pahwa, A. (2023). Estimating last-mile deliveries and shopping travel emissions by 2050. </w:t>
+        <w:t>Jaller, M., Xiao, R. I., Dennis-Bauer, S., Rivera-</w:t>
+      </w:r>
+      <w:proofErr w:type="spellStart"/>
+      <w:r>
+        <w:rPr>
+          <w:rFonts w:eastAsia="Times New Roman"/>
+          <w:sz w:val="24"/>
+          <w:szCs w:val="24"/>
+          <w:lang w:val="en-IN"/>
+        </w:rPr>
+        <w:t>Royero</w:t>
+      </w:r>
+      <w:proofErr w:type="spellEnd"/>
+      <w:r>
+        <w:rPr>
+          <w:rFonts w:eastAsia="Times New Roman"/>
+          <w:sz w:val="24"/>
+          <w:szCs w:val="24"/>
+          <w:lang w:val="en-IN"/>
+        </w:rPr>
+        <w:t xml:space="preserve">, D., &amp; Pahwa, A. (2023). Estimating last-mile deliveries and shopping travel emissions by 2050. </w:t>
       </w:r>
       <w:r>
         <w:rPr>
@@ -1680,7 +1772,27 @@
           <w:szCs w:val="24"/>
           <w:lang w:val="en-IN"/>
         </w:rPr>
-        <w:t xml:space="preserve">Jaller, M., &amp; Pahwa, A. (2020). Evaluating the environmental impacts of online shopping: A behavioral and transportation approach. </w:t>
+        <w:t xml:space="preserve">Jaller, M., &amp; Pahwa, A. (2020). Evaluating the environmental impacts of online shopping: A </w:t>
+      </w:r>
+      <w:proofErr w:type="spellStart"/>
+      <w:r>
+        <w:rPr>
+          <w:rFonts w:eastAsia="Times New Roman"/>
+          <w:sz w:val="24"/>
+          <w:szCs w:val="24"/>
+          <w:lang w:val="en-IN"/>
+        </w:rPr>
+        <w:t>behavioral</w:t>
+      </w:r>
+      <w:proofErr w:type="spellEnd"/>
+      <w:r>
+        <w:rPr>
+          <w:rFonts w:eastAsia="Times New Roman"/>
+          <w:sz w:val="24"/>
+          <w:szCs w:val="24"/>
+          <w:lang w:val="en-IN"/>
+        </w:rPr>
+        <w:t xml:space="preserve"> and transportation approach. </w:t>
       </w:r>
       <w:r>
         <w:rPr>
@@ -1926,7 +2038,27 @@
           <w:szCs w:val="24"/>
           <w:lang w:val="en-IN"/>
         </w:rPr>
-        <w:t xml:space="preserve">Jaller, M., Pahwa, A., Otero-Palencia, C., &amp; Pourrahmani, E. (2023). Overview of city logistics and urban freight transport operations. </w:t>
+        <w:t xml:space="preserve">Jaller, M., Pahwa, A., Otero-Palencia, C., &amp; </w:t>
+      </w:r>
+      <w:proofErr w:type="spellStart"/>
+      <w:r>
+        <w:rPr>
+          <w:rFonts w:eastAsia="Times New Roman"/>
+          <w:sz w:val="24"/>
+          <w:szCs w:val="24"/>
+          <w:lang w:val="en-IN"/>
+        </w:rPr>
+        <w:t>Pourrahmani</w:t>
+      </w:r>
+      <w:proofErr w:type="spellEnd"/>
+      <w:r>
+        <w:rPr>
+          <w:rFonts w:eastAsia="Times New Roman"/>
+          <w:sz w:val="24"/>
+          <w:szCs w:val="24"/>
+          <w:lang w:val="en-IN"/>
+        </w:rPr>
+        <w:t xml:space="preserve">, E. (2023). Overview of city logistics and urban freight transport operations. </w:t>
       </w:r>
       <w:r>
         <w:rPr>
@@ -2028,7 +2160,23 @@
           <w:sz w:val="24"/>
           <w:szCs w:val="24"/>
         </w:rPr>
-        <w:t>Jaller, M., Pahwa, A., Saphores, J. D., &amp; Hyland, M. (2024). Benefits, Challenges, and Opportunities of Different Last-Mile Delivery Strategies.</w:t>
+        <w:t xml:space="preserve">Jaller, M., Pahwa, A., </w:t>
+      </w:r>
+      <w:proofErr w:type="spellStart"/>
+      <w:r>
+        <w:rPr>
+          <w:sz w:val="24"/>
+          <w:szCs w:val="24"/>
+        </w:rPr>
+        <w:t>Saphores</w:t>
+      </w:r>
+      <w:proofErr w:type="spellEnd"/>
+      <w:r>
+        <w:rPr>
+          <w:sz w:val="24"/>
+          <w:szCs w:val="24"/>
+        </w:rPr>
+        <w:t>, J. D., &amp; Hyland, M. (2024). Benefits, Challenges, and Opportunities of Different Last-Mile Delivery Strategies.</w:t>
       </w:r>
       <w:r>
         <w:rPr>
@@ -2065,18 +2213,62 @@
           <w:szCs w:val="24"/>
           <w:lang w:val="en-IN"/>
         </w:rPr>
-        <w:t xml:space="preserve">Jaller, M., Pahwa, A., &amp; Center, M. T. (2023). Sketch Planning Tool for Sustainable and Resilient Urban Goods Distribution: User Manual. </w:t>
-      </w:r>
-      <w:r>
-        <w:rPr>
-          <w:rFonts w:eastAsia="Times New Roman"/>
-          <w:i/>
-          <w:iCs/>
-          <w:sz w:val="24"/>
-          <w:szCs w:val="24"/>
-          <w:lang w:val="en-IN"/>
-        </w:rPr>
-        <w:t>METRANS Transportation Center (Calif.).</w:t>
+        <w:t xml:space="preserve">Jaller, M., Pahwa, A., &amp; </w:t>
+      </w:r>
+      <w:proofErr w:type="spellStart"/>
+      <w:r>
+        <w:rPr>
+          <w:rFonts w:eastAsia="Times New Roman"/>
+          <w:sz w:val="24"/>
+          <w:szCs w:val="24"/>
+          <w:lang w:val="en-IN"/>
+        </w:rPr>
+        <w:t>Center</w:t>
+      </w:r>
+      <w:proofErr w:type="spellEnd"/>
+      <w:r>
+        <w:rPr>
+          <w:rFonts w:eastAsia="Times New Roman"/>
+          <w:sz w:val="24"/>
+          <w:szCs w:val="24"/>
+          <w:lang w:val="en-IN"/>
+        </w:rPr>
+        <w:t xml:space="preserve">, M. T. (2023). Sketch Planning Tool for Sustainable and Resilient Urban Goods Distribution: User Manual. </w:t>
+      </w:r>
+      <w:r>
+        <w:rPr>
+          <w:rFonts w:eastAsia="Times New Roman"/>
+          <w:i/>
+          <w:iCs/>
+          <w:sz w:val="24"/>
+          <w:szCs w:val="24"/>
+          <w:lang w:val="en-IN"/>
+        </w:rPr>
+        <w:t xml:space="preserve">METRANS Transportation </w:t>
+      </w:r>
+      <w:proofErr w:type="spellStart"/>
+      <w:r>
+        <w:rPr>
+          <w:rFonts w:eastAsia="Times New Roman"/>
+          <w:i/>
+          <w:iCs/>
+          <w:sz w:val="24"/>
+          <w:szCs w:val="24"/>
+          <w:lang w:val="en-IN"/>
+        </w:rPr>
+        <w:t>Center</w:t>
+      </w:r>
+      <w:proofErr w:type="spellEnd"/>
+      <w:r>
+        <w:rPr>
+          <w:rFonts w:eastAsia="Times New Roman"/>
+          <w:i/>
+          <w:iCs/>
+          <w:sz w:val="24"/>
+          <w:szCs w:val="24"/>
+          <w:lang w:val="en-IN"/>
+        </w:rPr>
+        <w:t xml:space="preserve"> (Calif.).</w:t>
       </w:r>
     </w:p>
     <w:p>
@@ -2110,7 +2302,31 @@
           <w:szCs w:val="24"/>
           <w:lang w:val="en-IN"/>
         </w:rPr>
-        <w:t xml:space="preserve">National Center for </w:t>
+        <w:t xml:space="preserve">National </w:t>
+      </w:r>
+      <w:proofErr w:type="spellStart"/>
+      <w:r>
+        <w:rPr>
+          <w:rFonts w:eastAsia="Times New Roman"/>
+          <w:i/>
+          <w:iCs/>
+          <w:sz w:val="24"/>
+          <w:szCs w:val="24"/>
+          <w:lang w:val="en-IN"/>
+        </w:rPr>
+        <w:t>Center</w:t>
+      </w:r>
+      <w:proofErr w:type="spellEnd"/>
+      <w:r>
+        <w:rPr>
+          <w:rFonts w:eastAsia="Times New Roman"/>
+          <w:i/>
+          <w:iCs/>
+          <w:sz w:val="24"/>
+          <w:szCs w:val="24"/>
+          <w:lang w:val="en-IN"/>
+        </w:rPr>
+        <w:t xml:space="preserve"> for </w:t>
       </w:r>
       <w:r>
         <w:rPr>
@@ -2142,7 +2358,23 @@
           <w:sz w:val="24"/>
           <w:szCs w:val="24"/>
         </w:rPr>
-        <w:t>Giuliano, G., Boarnet, M., Jaller, M., Franco, W., Binder, R. B., Dexter, S., Fang, J., David Flores, M., Pahwa,</w:t>
+        <w:t xml:space="preserve">Giuliano, G., </w:t>
+      </w:r>
+      <w:proofErr w:type="spellStart"/>
+      <w:r>
+        <w:rPr>
+          <w:sz w:val="24"/>
+          <w:szCs w:val="24"/>
+        </w:rPr>
+        <w:t>Boarnet</w:t>
+      </w:r>
+      <w:proofErr w:type="spellEnd"/>
+      <w:r>
+        <w:rPr>
+          <w:sz w:val="24"/>
+          <w:szCs w:val="24"/>
+        </w:rPr>
+        <w:t>, M., Jaller, M., Franco, W., Binder, R. B., Dexter, S., Fang, J., David Flores, M., Pahwa,</w:t>
       </w:r>
       <w:r>
         <w:rPr>
@@ -2276,18 +2508,62 @@
           <w:szCs w:val="24"/>
           <w:lang w:val="en-IN"/>
         </w:rPr>
-        <w:t xml:space="preserve">Jaller, M., Xiao, R., Dennis, S., Rivera-Royero, D., &amp; Pahwa, A. (2022). National Impacts of E-commerce Growth: Development of a Spatial Demand Based Tool. </w:t>
-      </w:r>
-      <w:r>
-        <w:rPr>
-          <w:rFonts w:eastAsia="Times New Roman"/>
-          <w:i/>
-          <w:iCs/>
-          <w:sz w:val="24"/>
-          <w:szCs w:val="24"/>
-          <w:lang w:val="en-IN"/>
-        </w:rPr>
-        <w:t>National Center for Sustainable Transportation.</w:t>
+        <w:t>Jaller, M., Xiao, R., Dennis, S., Rivera-</w:t>
+      </w:r>
+      <w:proofErr w:type="spellStart"/>
+      <w:r>
+        <w:rPr>
+          <w:rFonts w:eastAsia="Times New Roman"/>
+          <w:sz w:val="24"/>
+          <w:szCs w:val="24"/>
+          <w:lang w:val="en-IN"/>
+        </w:rPr>
+        <w:t>Royero</w:t>
+      </w:r>
+      <w:proofErr w:type="spellEnd"/>
+      <w:r>
+        <w:rPr>
+          <w:rFonts w:eastAsia="Times New Roman"/>
+          <w:sz w:val="24"/>
+          <w:szCs w:val="24"/>
+          <w:lang w:val="en-IN"/>
+        </w:rPr>
+        <w:t xml:space="preserve">, D., &amp; Pahwa, A. (2022). National Impacts of E-commerce Growth: Development of a Spatial Demand Based Tool. </w:t>
+      </w:r>
+      <w:r>
+        <w:rPr>
+          <w:rFonts w:eastAsia="Times New Roman"/>
+          <w:i/>
+          <w:iCs/>
+          <w:sz w:val="24"/>
+          <w:szCs w:val="24"/>
+          <w:lang w:val="en-IN"/>
+        </w:rPr>
+        <w:t xml:space="preserve">National </w:t>
+      </w:r>
+      <w:proofErr w:type="spellStart"/>
+      <w:r>
+        <w:rPr>
+          <w:rFonts w:eastAsia="Times New Roman"/>
+          <w:i/>
+          <w:iCs/>
+          <w:sz w:val="24"/>
+          <w:szCs w:val="24"/>
+          <w:lang w:val="en-IN"/>
+        </w:rPr>
+        <w:t>Center</w:t>
+      </w:r>
+      <w:proofErr w:type="spellEnd"/>
+      <w:r>
+        <w:rPr>
+          <w:rFonts w:eastAsia="Times New Roman"/>
+          <w:i/>
+          <w:iCs/>
+          <w:sz w:val="24"/>
+          <w:szCs w:val="24"/>
+          <w:lang w:val="en-IN"/>
+        </w:rPr>
+        <w:t xml:space="preserve"> for Sustainable Transportation.</w:t>
       </w:r>
     </w:p>
     <w:p>
@@ -2319,7 +2595,31 @@
           <w:szCs w:val="24"/>
           <w:lang w:val="en-IN"/>
         </w:rPr>
-        <w:t xml:space="preserve"> Pacific Southwest Region University Transportation Center.</w:t>
+        <w:t xml:space="preserve"> Pacific Southwest Region University Transportation </w:t>
+      </w:r>
+      <w:proofErr w:type="spellStart"/>
+      <w:r>
+        <w:rPr>
+          <w:rFonts w:eastAsia="Times New Roman"/>
+          <w:i/>
+          <w:iCs/>
+          <w:sz w:val="24"/>
+          <w:szCs w:val="24"/>
+          <w:lang w:val="en-IN"/>
+        </w:rPr>
+        <w:t>Center</w:t>
+      </w:r>
+      <w:proofErr w:type="spellEnd"/>
+      <w:r>
+        <w:rPr>
+          <w:rFonts w:eastAsia="Times New Roman"/>
+          <w:i/>
+          <w:iCs/>
+          <w:sz w:val="24"/>
+          <w:szCs w:val="24"/>
+          <w:lang w:val="en-IN"/>
+        </w:rPr>
+        <w:t>.</w:t>
       </w:r>
     </w:p>
     <w:p>
@@ -2340,18 +2640,62 @@
           <w:szCs w:val="24"/>
           <w:lang w:val="en-IN"/>
         </w:rPr>
-        <w:t xml:space="preserve">Jaller, M., &amp; Pahwa, A. (2020). Analytical Modeling Framework to Assess the Economic and Environmental Impacts of Residential Deliveries and Evaluate Sustainable Last-Mile Strategies. </w:t>
-      </w:r>
-      <w:r>
-        <w:rPr>
-          <w:rFonts w:eastAsia="Times New Roman"/>
-          <w:i/>
-          <w:iCs/>
-          <w:sz w:val="24"/>
-          <w:szCs w:val="24"/>
-          <w:lang w:val="en-IN"/>
-        </w:rPr>
-        <w:t>National Center for Sustainable Transportation.</w:t>
+        <w:t xml:space="preserve">Jaller, M., &amp; Pahwa, A. (2020). Analytical </w:t>
+      </w:r>
+      <w:proofErr w:type="spellStart"/>
+      <w:r>
+        <w:rPr>
+          <w:rFonts w:eastAsia="Times New Roman"/>
+          <w:sz w:val="24"/>
+          <w:szCs w:val="24"/>
+          <w:lang w:val="en-IN"/>
+        </w:rPr>
+        <w:t>Modeling</w:t>
+      </w:r>
+      <w:proofErr w:type="spellEnd"/>
+      <w:r>
+        <w:rPr>
+          <w:rFonts w:eastAsia="Times New Roman"/>
+          <w:sz w:val="24"/>
+          <w:szCs w:val="24"/>
+          <w:lang w:val="en-IN"/>
+        </w:rPr>
+        <w:t xml:space="preserve"> Framework to Assess the Economic and Environmental Impacts of Residential Deliveries and Evaluate Sustainable Last-Mile Strategies. </w:t>
+      </w:r>
+      <w:r>
+        <w:rPr>
+          <w:rFonts w:eastAsia="Times New Roman"/>
+          <w:i/>
+          <w:iCs/>
+          <w:sz w:val="24"/>
+          <w:szCs w:val="24"/>
+          <w:lang w:val="en-IN"/>
+        </w:rPr>
+        <w:t xml:space="preserve">National </w:t>
+      </w:r>
+      <w:proofErr w:type="spellStart"/>
+      <w:r>
+        <w:rPr>
+          <w:rFonts w:eastAsia="Times New Roman"/>
+          <w:i/>
+          <w:iCs/>
+          <w:sz w:val="24"/>
+          <w:szCs w:val="24"/>
+          <w:lang w:val="en-IN"/>
+        </w:rPr>
+        <w:t>Center</w:t>
+      </w:r>
+      <w:proofErr w:type="spellEnd"/>
+      <w:r>
+        <w:rPr>
+          <w:rFonts w:eastAsia="Times New Roman"/>
+          <w:i/>
+          <w:iCs/>
+          <w:sz w:val="24"/>
+          <w:szCs w:val="24"/>
+          <w:lang w:val="en-IN"/>
+        </w:rPr>
+        <w:t xml:space="preserve"> for Sustainable Transportation.</w:t>
       </w:r>
     </w:p>
     <w:p>
@@ -2385,7 +2729,31 @@
           <w:szCs w:val="24"/>
           <w:lang w:val="en-IN"/>
         </w:rPr>
-        <w:t>National Center for Sustainable Transportation.</w:t>
+        <w:t xml:space="preserve">National </w:t>
+      </w:r>
+      <w:proofErr w:type="spellStart"/>
+      <w:r>
+        <w:rPr>
+          <w:rFonts w:eastAsia="Times New Roman"/>
+          <w:i/>
+          <w:iCs/>
+          <w:sz w:val="24"/>
+          <w:szCs w:val="24"/>
+          <w:lang w:val="en-IN"/>
+        </w:rPr>
+        <w:t>Center</w:t>
+      </w:r>
+      <w:proofErr w:type="spellEnd"/>
+      <w:r>
+        <w:rPr>
+          <w:rFonts w:eastAsia="Times New Roman"/>
+          <w:i/>
+          <w:iCs/>
+          <w:sz w:val="24"/>
+          <w:szCs w:val="24"/>
+          <w:lang w:val="en-IN"/>
+        </w:rPr>
+        <w:t xml:space="preserve"> for Sustainable Transportation.</w:t>
       </w:r>
     </w:p>
     <w:p>
@@ -2473,7 +2841,31 @@
           <w:szCs w:val="24"/>
           <w:lang w:val="en-IN"/>
         </w:rPr>
-        <w:t>National Center for Sustainable Transportation.</w:t>
+        <w:t xml:space="preserve">National </w:t>
+      </w:r>
+      <w:proofErr w:type="spellStart"/>
+      <w:r>
+        <w:rPr>
+          <w:rFonts w:eastAsia="Times New Roman"/>
+          <w:i/>
+          <w:iCs/>
+          <w:sz w:val="24"/>
+          <w:szCs w:val="24"/>
+          <w:lang w:val="en-IN"/>
+        </w:rPr>
+        <w:t>Center</w:t>
+      </w:r>
+      <w:proofErr w:type="spellEnd"/>
+      <w:r>
+        <w:rPr>
+          <w:rFonts w:eastAsia="Times New Roman"/>
+          <w:i/>
+          <w:iCs/>
+          <w:sz w:val="24"/>
+          <w:szCs w:val="24"/>
+          <w:lang w:val="en-IN"/>
+        </w:rPr>
+        <w:t xml:space="preserve"> for Sustainable Transportation.</w:t>
       </w:r>
     </w:p>
     <w:p>
@@ -2537,7 +2929,31 @@
           <w:szCs w:val="24"/>
           <w:lang w:val="en-IN"/>
         </w:rPr>
-        <w:t>National Center for Sustainable Transportation.</w:t>
+        <w:t xml:space="preserve">National </w:t>
+      </w:r>
+      <w:proofErr w:type="spellStart"/>
+      <w:r>
+        <w:rPr>
+          <w:rFonts w:eastAsia="Times New Roman"/>
+          <w:i/>
+          <w:iCs/>
+          <w:sz w:val="24"/>
+          <w:szCs w:val="24"/>
+          <w:lang w:val="en-IN"/>
+        </w:rPr>
+        <w:t>Center</w:t>
+      </w:r>
+      <w:proofErr w:type="spellEnd"/>
+      <w:r>
+        <w:rPr>
+          <w:rFonts w:eastAsia="Times New Roman"/>
+          <w:i/>
+          <w:iCs/>
+          <w:sz w:val="24"/>
+          <w:szCs w:val="24"/>
+          <w:lang w:val="en-IN"/>
+        </w:rPr>
+        <w:t xml:space="preserve"> for Sustainable Transportation.</w:t>
       </w:r>
     </w:p>
     <w:p>
@@ -2664,6 +3080,87 @@
     </w:p>
     <w:p>
       <w:pPr>
+        <w:ind w:left="720" w:hanging="360"/>
+        <w:jc w:val="both"/>
+        <w:rPr>
+          <w:rFonts w:eastAsia="Times New Roman"/>
+          <w:sz w:val="24"/>
+          <w:szCs w:val="24"/>
+          <w:lang w:val="en-IN"/>
+        </w:rPr>
+      </w:pPr>
+      <w:r>
+        <w:rPr>
+          <w:rFonts w:eastAsia="Times New Roman"/>
+          <w:sz w:val="24"/>
+          <w:szCs w:val="24"/>
+          <w:lang w:val="en-IN"/>
+        </w:rPr>
+        <w:t>Pahwa, A. (2026)</w:t>
+      </w:r>
+      <w:r>
+        <w:rPr>
+          <w:rFonts w:eastAsia="Times New Roman"/>
+          <w:sz w:val="24"/>
+          <w:szCs w:val="24"/>
+          <w:lang w:val="en-IN"/>
+        </w:rPr>
+        <w:t xml:space="preserve">. </w:t>
+      </w:r>
+      <w:r>
+        <w:rPr>
+          <w:rFonts w:eastAsia="Times New Roman"/>
+          <w:i/>
+          <w:iCs/>
+          <w:sz w:val="24"/>
+          <w:szCs w:val="24"/>
+          <w:lang w:val="en-IN"/>
+        </w:rPr>
+        <w:t xml:space="preserve">Challenges and Opportunities in </w:t>
+      </w:r>
+      <w:r>
+        <w:rPr>
+          <w:rFonts w:eastAsia="Times New Roman"/>
+          <w:i/>
+          <w:iCs/>
+          <w:sz w:val="24"/>
+          <w:szCs w:val="24"/>
+          <w:lang w:val="en-IN"/>
+        </w:rPr>
+        <w:t xml:space="preserve">Long-Haul and Last-Mile Freight Transportation. </w:t>
+      </w:r>
+      <w:r>
+        <w:rPr>
+          <w:rFonts w:eastAsia="Times New Roman"/>
+          <w:sz w:val="24"/>
+          <w:szCs w:val="24"/>
+          <w:lang w:val="en-IN"/>
+        </w:rPr>
+        <w:t xml:space="preserve">Urban Mobility and Logistics Training and Workshop, </w:t>
+      </w:r>
+      <w:proofErr w:type="spellStart"/>
+      <w:r>
+        <w:rPr>
+          <w:rFonts w:eastAsia="Times New Roman"/>
+          <w:sz w:val="24"/>
+          <w:szCs w:val="24"/>
+          <w:lang w:val="en-IN"/>
+        </w:rPr>
+        <w:t>CiSTUP</w:t>
+      </w:r>
+      <w:proofErr w:type="spellEnd"/>
+      <w:r>
+        <w:rPr>
+          <w:rFonts w:eastAsia="Times New Roman"/>
+          <w:sz w:val="24"/>
+          <w:szCs w:val="24"/>
+          <w:lang w:val="en-IN"/>
+        </w:rPr>
+        <w:t>, IISc Bangalore, India.</w:t>
+      </w:r>
+    </w:p>
+    <w:p>
+      <w:pPr>
         <w:spacing w:line="276" w:lineRule="auto"/>
         <w:ind w:left="480" w:hanging="120"/>
         <w:jc w:val="both"/>
@@ -2824,6 +3321,7 @@
           <w:szCs w:val="24"/>
           <w:lang w:val="en-IN"/>
         </w:rPr>
+        <w:lastRenderedPageBreak/>
         <w:t xml:space="preserve">Pahwa, A., &amp; Jaller, M. (2022). </w:t>
       </w:r>
       <w:r>
@@ -2883,7 +3381,6 @@
           <w:szCs w:val="24"/>
           <w:lang w:val="en-IN"/>
         </w:rPr>
-        <w:lastRenderedPageBreak/>
         <w:t xml:space="preserve">Pahwa, A., &amp; Jaller, M. (2022). </w:t>
       </w:r>
       <w:r>
@@ -3046,7 +3543,31 @@
           <w:szCs w:val="24"/>
           <w:lang w:val="en-IN"/>
         </w:rPr>
-        <w:t>Assessing pre- and post- pandemic shopping behavior in Indian consumers</w:t>
+        <w:t xml:space="preserve">Assessing pre- and post- pandemic shopping </w:t>
+      </w:r>
+      <w:proofErr w:type="spellStart"/>
+      <w:r>
+        <w:rPr>
+          <w:rFonts w:eastAsia="Times New Roman"/>
+          <w:i/>
+          <w:iCs/>
+          <w:sz w:val="24"/>
+          <w:szCs w:val="24"/>
+          <w:lang w:val="en-IN"/>
+        </w:rPr>
+        <w:t>behavior</w:t>
+      </w:r>
+      <w:proofErr w:type="spellEnd"/>
+      <w:r>
+        <w:rPr>
+          <w:rFonts w:eastAsia="Times New Roman"/>
+          <w:i/>
+          <w:iCs/>
+          <w:sz w:val="24"/>
+          <w:szCs w:val="24"/>
+          <w:lang w:val="en-IN"/>
+        </w:rPr>
+        <w:t xml:space="preserve"> in Indian consumers</w:t>
       </w:r>
       <w:r>
         <w:rPr>
@@ -3318,7 +3839,27 @@
           <w:szCs w:val="24"/>
           <w:lang w:val="en-IN"/>
         </w:rPr>
-        <w:t xml:space="preserve">Bischoff, J., Rodier, C. J., Pourrahmani, E., Jaller, M., Pahwa, A., &amp; Maciejewski, M. (2019). </w:t>
+        <w:t xml:space="preserve">Bischoff, J., Rodier, C. J., </w:t>
+      </w:r>
+      <w:proofErr w:type="spellStart"/>
+      <w:r>
+        <w:rPr>
+          <w:rFonts w:eastAsia="Times New Roman"/>
+          <w:sz w:val="24"/>
+          <w:szCs w:val="24"/>
+          <w:lang w:val="en-IN"/>
+        </w:rPr>
+        <w:t>Pourrahmani</w:t>
+      </w:r>
+      <w:proofErr w:type="spellEnd"/>
+      <w:r>
+        <w:rPr>
+          <w:rFonts w:eastAsia="Times New Roman"/>
+          <w:sz w:val="24"/>
+          <w:szCs w:val="24"/>
+          <w:lang w:val="en-IN"/>
+        </w:rPr>
+        <w:t xml:space="preserve">, E., Jaller, M., Pahwa, A., &amp; Maciejewski, M. (2019). </w:t>
       </w:r>
       <w:r>
         <w:rPr>
@@ -3370,7 +3911,31 @@
           <w:szCs w:val="24"/>
           <w:lang w:val="en-IN"/>
         </w:rPr>
-        <w:t xml:space="preserve">Evaluating the Environmental Impacts of Online Shopping: A Behavioral Analysis using the American Time Use Survey (ATUS) Data. </w:t>
+        <w:t xml:space="preserve">Evaluating the Environmental Impacts of Online Shopping: A </w:t>
+      </w:r>
+      <w:proofErr w:type="spellStart"/>
+      <w:r>
+        <w:rPr>
+          <w:rFonts w:eastAsia="Times New Roman"/>
+          <w:i/>
+          <w:iCs/>
+          <w:sz w:val="24"/>
+          <w:szCs w:val="24"/>
+          <w:lang w:val="en-IN"/>
+        </w:rPr>
+        <w:t>Behavioral</w:t>
+      </w:r>
+      <w:proofErr w:type="spellEnd"/>
+      <w:r>
+        <w:rPr>
+          <w:rFonts w:eastAsia="Times New Roman"/>
+          <w:i/>
+          <w:iCs/>
+          <w:sz w:val="24"/>
+          <w:szCs w:val="24"/>
+          <w:lang w:val="en-IN"/>
+        </w:rPr>
+        <w:t xml:space="preserve"> Analysis using the American Time Use Survey (ATUS) Data. </w:t>
       </w:r>
       <w:r>
         <w:rPr>
@@ -3712,14 +4277,25 @@
         </w:rPr>
         <w:t xml:space="preserve">. Funded by </w:t>
       </w:r>
-      <w:r>
-        <w:rPr>
-          <w:rFonts w:eastAsia="Times New Roman"/>
-          <w:sz w:val="24"/>
-          <w:szCs w:val="24"/>
-          <w:lang w:val="en-IN"/>
-        </w:rPr>
-        <w:t>Fedex Corporate Services</w:t>
+      <w:proofErr w:type="spellStart"/>
+      <w:r>
+        <w:rPr>
+          <w:rFonts w:eastAsia="Times New Roman"/>
+          <w:sz w:val="24"/>
+          <w:szCs w:val="24"/>
+          <w:lang w:val="en-IN"/>
+        </w:rPr>
+        <w:t>Fedex</w:t>
+      </w:r>
+      <w:proofErr w:type="spellEnd"/>
+      <w:r>
+        <w:rPr>
+          <w:rFonts w:eastAsia="Times New Roman"/>
+          <w:sz w:val="24"/>
+          <w:szCs w:val="24"/>
+          <w:lang w:val="en-IN"/>
+        </w:rPr>
+        <w:t xml:space="preserve"> Corporate Services</w:t>
       </w:r>
       <w:r>
         <w:rPr>
@@ -3891,7 +4467,27 @@
           <w:szCs w:val="24"/>
           <w:lang w:val="en-IN"/>
         </w:rPr>
-        <w:t>National Center for Sustainable Transportation Research Grant</w:t>
+        <w:t xml:space="preserve">National </w:t>
+      </w:r>
+      <w:proofErr w:type="spellStart"/>
+      <w:r>
+        <w:rPr>
+          <w:rFonts w:eastAsia="Times New Roman"/>
+          <w:sz w:val="24"/>
+          <w:szCs w:val="24"/>
+          <w:lang w:val="en-IN"/>
+        </w:rPr>
+        <w:t>Center</w:t>
+      </w:r>
+      <w:proofErr w:type="spellEnd"/>
+      <w:r>
+        <w:rPr>
+          <w:rFonts w:eastAsia="Times New Roman"/>
+          <w:sz w:val="24"/>
+          <w:szCs w:val="24"/>
+          <w:lang w:val="en-IN"/>
+        </w:rPr>
+        <w:t xml:space="preserve"> for Sustainable Transportation Research Grant</w:t>
       </w:r>
       <w:r>
         <w:rPr>
@@ -3948,34 +4544,36 @@
           <w:szCs w:val="24"/>
           <w:lang w:val="en-IN"/>
         </w:rPr>
-        <w:t>National Center for Sustainable Transportation Research Grant</w:t>
-      </w:r>
-      <w:r>
-        <w:rPr>
-          <w:rFonts w:eastAsia="Times New Roman"/>
-          <w:sz w:val="24"/>
-          <w:szCs w:val="24"/>
-          <w:lang w:val="en-IN"/>
-        </w:rPr>
-        <w:t xml:space="preserve"> (20</w:t>
-      </w:r>
-      <w:r>
-        <w:rPr>
-          <w:rFonts w:eastAsia="Times New Roman"/>
-          <w:sz w:val="24"/>
-          <w:szCs w:val="24"/>
-          <w:lang w:val="en-IN"/>
-        </w:rPr>
-        <w:t>17</w:t>
-      </w:r>
-      <w:r>
-        <w:rPr>
-          <w:rFonts w:eastAsia="Times New Roman"/>
-          <w:sz w:val="24"/>
-          <w:szCs w:val="24"/>
-          <w:lang w:val="en-IN"/>
-        </w:rPr>
-        <w:t>)</w:t>
+        <w:t xml:space="preserve">National </w:t>
+      </w:r>
+      <w:proofErr w:type="spellStart"/>
+      <w:r>
+        <w:rPr>
+          <w:rFonts w:eastAsia="Times New Roman"/>
+          <w:sz w:val="24"/>
+          <w:szCs w:val="24"/>
+          <w:lang w:val="en-IN"/>
+        </w:rPr>
+        <w:t>Center</w:t>
+      </w:r>
+      <w:proofErr w:type="spellEnd"/>
+      <w:r>
+        <w:rPr>
+          <w:rFonts w:eastAsia="Times New Roman"/>
+          <w:sz w:val="24"/>
+          <w:szCs w:val="24"/>
+          <w:lang w:val="en-IN"/>
+        </w:rPr>
+        <w:t xml:space="preserve"> for Sustainable Transportation Research Grant</w:t>
+      </w:r>
+      <w:r>
+        <w:rPr>
+          <w:rFonts w:eastAsia="Times New Roman"/>
+          <w:sz w:val="24"/>
+          <w:szCs w:val="24"/>
+          <w:lang w:val="en-IN"/>
+        </w:rPr>
+        <w:t xml:space="preserve"> (2017)</w:t>
       </w:r>
     </w:p>
     <w:p>
@@ -4227,6 +4825,19 @@
       <w:pPr>
         <w:ind w:left="360"/>
         <w:rPr>
+          <w:rFonts w:eastAsia="Times New Roman"/>
+          <w:b/>
+          <w:bCs/>
+          <w:sz w:val="24"/>
+          <w:szCs w:val="24"/>
+          <w:lang w:val="en-IN"/>
+        </w:rPr>
+      </w:pPr>
+    </w:p>
+    <w:p>
+      <w:pPr>
+        <w:ind w:left="360"/>
+        <w:rPr>
           <w:sz w:val="20"/>
           <w:szCs w:val="20"/>
           <w:lang w:val="en-IN"/>
@@ -4241,6 +4852,7 @@
           <w:szCs w:val="24"/>
           <w:lang w:val="en-IN"/>
         </w:rPr>
+        <w:lastRenderedPageBreak/>
         <w:t>Peer-Reviewer</w:t>
       </w:r>
     </w:p>
@@ -4301,7 +4913,6 @@
           <w:szCs w:val="24"/>
           <w:lang w:val="en-IN"/>
         </w:rPr>
-        <w:lastRenderedPageBreak/>
         <w:t>Civil Engineering and Environmental Systems</w:t>
       </w:r>
     </w:p>
@@ -4542,6 +5153,26 @@
           <w:szCs w:val="24"/>
           <w:lang w:val="en-IN"/>
         </w:rPr>
+        <w:t>Sustainable Futures</w:t>
+      </w:r>
+    </w:p>
+    <w:p>
+      <w:pPr>
+        <w:ind w:firstLine="540"/>
+        <w:rPr>
+          <w:rFonts w:eastAsia="Times New Roman"/>
+          <w:sz w:val="24"/>
+          <w:szCs w:val="24"/>
+          <w:lang w:val="en-IN"/>
+        </w:rPr>
+      </w:pPr>
+      <w:r>
+        <w:rPr>
+          <w:rFonts w:eastAsia="Times New Roman"/>
+          <w:sz w:val="24"/>
+          <w:szCs w:val="24"/>
+          <w:lang w:val="en-IN"/>
+        </w:rPr>
         <w:t>Sustainability</w:t>
       </w:r>
     </w:p>
@@ -4563,6 +5194,26 @@
           <w:lang w:val="en-IN"/>
         </w:rPr>
         <w:t>Systems</w:t>
+      </w:r>
+    </w:p>
+    <w:p>
+      <w:pPr>
+        <w:ind w:firstLine="540"/>
+        <w:rPr>
+          <w:rFonts w:eastAsia="Times New Roman"/>
+          <w:sz w:val="24"/>
+          <w:szCs w:val="24"/>
+          <w:lang w:val="en-IN"/>
+        </w:rPr>
+      </w:pPr>
+      <w:r>
+        <w:rPr>
+          <w:rFonts w:eastAsia="Times New Roman"/>
+          <w:sz w:val="24"/>
+          <w:szCs w:val="24"/>
+          <w:lang w:val="en-IN"/>
+        </w:rPr>
+        <w:t>Transactions on Engineering Management</w:t>
       </w:r>
     </w:p>
     <w:p>
@@ -5147,15 +5798,37 @@
           <w:lang w:val="en-IN"/>
         </w:rPr>
       </w:pPr>
-      <w:r>
-        <w:rPr>
-          <w:rFonts w:eastAsia="Times New Roman"/>
-          <w:sz w:val="24"/>
-          <w:szCs w:val="24"/>
-          <w:lang w:val="en-IN"/>
-        </w:rPr>
-        <w:t>Nagasai Panidarapu</w:t>
-      </w:r>
+      <w:proofErr w:type="spellStart"/>
+      <w:r>
+        <w:rPr>
+          <w:rFonts w:eastAsia="Times New Roman"/>
+          <w:sz w:val="24"/>
+          <w:szCs w:val="24"/>
+          <w:lang w:val="en-IN"/>
+        </w:rPr>
+        <w:t>Nagasai</w:t>
+      </w:r>
+      <w:proofErr w:type="spellEnd"/>
+      <w:r>
+        <w:rPr>
+          <w:rFonts w:eastAsia="Times New Roman"/>
+          <w:sz w:val="24"/>
+          <w:szCs w:val="24"/>
+          <w:lang w:val="en-IN"/>
+        </w:rPr>
+        <w:t xml:space="preserve"> </w:t>
+      </w:r>
+      <w:proofErr w:type="spellStart"/>
+      <w:r>
+        <w:rPr>
+          <w:rFonts w:eastAsia="Times New Roman"/>
+          <w:sz w:val="24"/>
+          <w:szCs w:val="24"/>
+          <w:lang w:val="en-IN"/>
+        </w:rPr>
+        <w:t>Panidarapu</w:t>
+      </w:r>
+      <w:proofErr w:type="spellEnd"/>
       <w:r>
         <w:rPr>
           <w:rFonts w:eastAsia="Times New Roman"/>
@@ -5202,6 +5875,7 @@
           <w:lang w:val="en-IN"/>
         </w:rPr>
       </w:pPr>
+      <w:proofErr w:type="spellStart"/>
       <w:r>
         <w:rPr>
           <w:rFonts w:eastAsia="Times New Roman"/>
@@ -5235,6 +5909,7 @@
         </w:rPr>
         <w:t>Tech</w:t>
       </w:r>
+      <w:proofErr w:type="spellEnd"/>
       <w:r>
         <w:rPr>
           <w:rFonts w:eastAsia="Times New Roman"/>
@@ -5331,7 +6006,7 @@
           <w:szCs w:val="24"/>
           <w:lang w:val="en-IN"/>
         </w:rPr>
-        <w:t>present</w:t>
+        <w:t>26</w:t>
       </w:r>
       <w:r>
         <w:rPr>
@@ -5378,7 +6053,7 @@
           <w:szCs w:val="24"/>
           <w:lang w:val="en-IN"/>
         </w:rPr>
-        <w:t>present</w:t>
+        <w:t>26</w:t>
       </w:r>
       <w:r>
         <w:rPr>
@@ -5479,7 +6154,7 @@
           <w:szCs w:val="24"/>
           <w:lang w:val="en-IN"/>
         </w:rPr>
-        <w:t>present</w:t>
+        <w:t>26</w:t>
       </w:r>
       <w:r>
         <w:rPr>
@@ -5508,7 +6183,27 @@
           <w:szCs w:val="24"/>
           <w:lang w:val="en-IN"/>
         </w:rPr>
-        <w:t>Om Ramavtar Yadav (</w:t>
+        <w:t xml:space="preserve">Om </w:t>
+      </w:r>
+      <w:proofErr w:type="spellStart"/>
+      <w:r>
+        <w:rPr>
+          <w:rFonts w:eastAsia="Times New Roman"/>
+          <w:sz w:val="24"/>
+          <w:szCs w:val="24"/>
+          <w:lang w:val="en-IN"/>
+        </w:rPr>
+        <w:t>Ramavtar</w:t>
+      </w:r>
+      <w:proofErr w:type="spellEnd"/>
+      <w:r>
+        <w:rPr>
+          <w:rFonts w:eastAsia="Times New Roman"/>
+          <w:sz w:val="24"/>
+          <w:szCs w:val="24"/>
+          <w:lang w:val="en-IN"/>
+        </w:rPr>
+        <w:t xml:space="preserve"> Yadav (</w:t>
       </w:r>
       <w:r>
         <w:rPr>
@@ -5526,7 +6221,7 @@
           <w:szCs w:val="24"/>
           <w:lang w:val="en-IN"/>
         </w:rPr>
-        <w:t>present</w:t>
+        <w:t>26</w:t>
       </w:r>
       <w:r>
         <w:rPr>
@@ -5552,6 +6247,32 @@
       <w:pPr>
         <w:ind w:left="360"/>
         <w:rPr>
+          <w:rFonts w:eastAsia="Times New Roman"/>
+          <w:b/>
+          <w:bCs/>
+          <w:sz w:val="24"/>
+          <w:szCs w:val="24"/>
+          <w:lang w:val="en-IN"/>
+        </w:rPr>
+      </w:pPr>
+    </w:p>
+    <w:p>
+      <w:pPr>
+        <w:ind w:left="360"/>
+        <w:rPr>
+          <w:rFonts w:eastAsia="Times New Roman"/>
+          <w:b/>
+          <w:bCs/>
+          <w:sz w:val="24"/>
+          <w:szCs w:val="24"/>
+          <w:lang w:val="en-IN"/>
+        </w:rPr>
+      </w:pPr>
+    </w:p>
+    <w:p>
+      <w:pPr>
+        <w:ind w:left="360"/>
+        <w:rPr>
           <w:sz w:val="20"/>
           <w:szCs w:val="20"/>
           <w:lang w:val="en-IN"/>
@@ -5566,6 +6287,7 @@
           <w:szCs w:val="24"/>
           <w:lang w:val="en-IN"/>
         </w:rPr>
+        <w:lastRenderedPageBreak/>
         <w:t xml:space="preserve">Course </w:t>
       </w:r>
       <w:r>

</xml_diff>

<commit_message>
Deploying to gh-pages from @ lognitilab/lognitilab.github.io@77fa1091320ad306bbd7900f6b4dcc554e5743f3 🚀
</commit_message>
<xml_diff>
--- a/assets/doc/cv-anmolpahwa.docx
+++ b/assets/doc/cv-anmolpahwa.docx
@@ -1,6 +1,6 @@
 
 <file path=word/document.xml><?xml version="1.0" encoding="utf-8"?>
-<w:document xmlns:wpc="http://schemas.microsoft.com/office/word/2010/wordprocessingCanvas" xmlns:cx="http://schemas.microsoft.com/office/drawing/2014/chartex" xmlns:cx1="http://schemas.microsoft.com/office/drawing/2015/9/8/chartex" xmlns:cx2="http://schemas.microsoft.com/office/drawing/2015/10/21/chartex" xmlns:cx3="http://schemas.microsoft.com/office/drawing/2016/5/9/chartex" xmlns:cx4="http://schemas.microsoft.com/office/drawing/2016/5/10/chartex" xmlns:cx5="http://schemas.microsoft.com/office/drawing/2016/5/11/chartex" xmlns:cx6="http://schemas.microsoft.com/office/drawing/2016/5/12/chartex" xmlns:cx7="http://schemas.microsoft.com/office/drawing/2016/5/13/chartex" xmlns:cx8="http://schemas.microsoft.com/office/drawing/2016/5/14/chartex" xmlns:mc="http://schemas.openxmlformats.org/markup-compatibility/2006" xmlns:aink="http://schemas.microsoft.com/office/drawing/2016/ink" xmlns:am3d="http://schemas.microsoft.com/office/drawing/2017/model3d" xmlns:o="urn:schemas-microsoft-com:office:office" xmlns:oel="http://schemas.microsoft.com/office/2019/extlst" xmlns:r="http://schemas.openxmlformats.org/officeDocument/2006/relationships" xmlns:m="http://schemas.openxmlformats.org/officeDocument/2006/math" xmlns:v="urn:schemas-microsoft-com:vml" xmlns:wp14="http://schemas.microsoft.com/office/word/2010/wordprocessingDrawing" xmlns:wp="http://schemas.openxmlformats.org/drawingml/2006/wordprocessingDrawing" xmlns:w10="urn:schemas-microsoft-com:office:word" xmlns:w="http://schemas.openxmlformats.org/wordprocessingml/2006/main" xmlns:w14="http://schemas.microsoft.com/office/word/2010/wordml" xmlns:w15="http://schemas.microsoft.com/office/word/2012/wordml" xmlns:w16cex="http://schemas.microsoft.com/office/word/2018/wordml/cex" xmlns:w16cid="http://schemas.microsoft.com/office/word/2016/wordml/cid" xmlns:w16="http://schemas.microsoft.com/office/word/2018/wordml" xmlns:w16du="http://schemas.microsoft.com/office/word/2023/wordml/word16du" xmlns:w16sdtdh="http://schemas.microsoft.com/office/word/2020/wordml/sdtdatahash" xmlns:w16sdtfl="http://schemas.microsoft.com/office/word/2024/wordml/sdtformatlock" xmlns:w16se="http://schemas.microsoft.com/office/word/2015/wordml/symex" xmlns:wpg="http://schemas.microsoft.com/office/word/2010/wordprocessingGroup" xmlns:wpi="http://schemas.microsoft.com/office/word/2010/wordprocessingInk" xmlns:wne="http://schemas.microsoft.com/office/word/2006/wordml" xmlns:wps="http://schemas.microsoft.com/office/word/2010/wordprocessingShape" mc:Ignorable="w14 w15 w16se w16cid w16 w16cex w16sdtdh w16sdtfl w16du wp14">
+<w:document xmlns:wpc="http://schemas.microsoft.com/office/word/2010/wordprocessingCanvas" xmlns:cx="http://schemas.microsoft.com/office/drawing/2014/chartex" xmlns:cx1="http://schemas.microsoft.com/office/drawing/2015/9/8/chartex" xmlns:cx2="http://schemas.microsoft.com/office/drawing/2015/10/21/chartex" xmlns:cx3="http://schemas.microsoft.com/office/drawing/2016/5/9/chartex" xmlns:cx4="http://schemas.microsoft.com/office/drawing/2016/5/10/chartex" xmlns:cx5="http://schemas.microsoft.com/office/drawing/2016/5/11/chartex" xmlns:cx6="http://schemas.microsoft.com/office/drawing/2016/5/12/chartex" xmlns:cx7="http://schemas.microsoft.com/office/drawing/2016/5/13/chartex" xmlns:cx8="http://schemas.microsoft.com/office/drawing/2016/5/14/chartex" xmlns:mc="http://schemas.openxmlformats.org/markup-compatibility/2006" xmlns:m="http://schemas.openxmlformats.org/officeDocument/2006/math" xmlns:aink="http://schemas.microsoft.com/office/drawing/2016/ink" xmlns:am3d="http://schemas.microsoft.com/office/drawing/2017/model3d" xmlns:oel="http://schemas.microsoft.com/office/2019/extlst" xmlns:r="http://schemas.openxmlformats.org/officeDocument/2006/relationships" xmlns:wp14="http://schemas.microsoft.com/office/word/2010/wordprocessingDrawing" xmlns:wp="http://schemas.openxmlformats.org/drawingml/2006/wordprocessingDrawing" xmlns:wpg="http://schemas.microsoft.com/office/word/2010/wordprocessingGroup" xmlns:wpi="http://schemas.microsoft.com/office/word/2010/wordprocessingInk" xmlns:wps="http://schemas.microsoft.com/office/word/2010/wordprocessingShape" xmlns:o="urn:schemas-microsoft-com:office:office" xmlns:v="urn:schemas-microsoft-com:vml" xmlns:w10="urn:schemas-microsoft-com:office:word" xmlns:w="http://schemas.openxmlformats.org/wordprocessingml/2006/main" xmlns:w14="http://schemas.microsoft.com/office/word/2010/wordml" xmlns:w15="http://schemas.microsoft.com/office/word/2012/wordml" xmlns:w16cex="http://schemas.microsoft.com/office/word/2018/wordml/cex" xmlns:w16cid="http://schemas.microsoft.com/office/word/2016/wordml/cid" xmlns:w16="http://schemas.microsoft.com/office/word/2018/wordml" xmlns:w16sdtdh="http://schemas.microsoft.com/office/word/2020/wordml/sdtdatahash" xmlns:w16sdtfl="http://schemas.microsoft.com/office/word/2024/wordml/sdtformatlock" xmlns:w16se="http://schemas.microsoft.com/office/word/2015/wordml/symex" xmlns:w16du="http://schemas.microsoft.com/office/word/2023/wordml/word16du" xmlns:wne="http://schemas.microsoft.com/office/word/2006/wordml" mc:Ignorable="w14 w15 w16se w16cid w16 w16cex w16sdtdh w16sdtfl w16du wp14">
   <w:body>
     <w:p>
       <w:pPr>
@@ -114,7 +114,7 @@
               </w:rPr>
               <w:t xml:space="preserve"> </w:t>
             </w:r>
-            <w:hyperlink r:id="rId5">
+            <w:hyperlink r:id="rId7">
               <w:r>
                 <w:rPr>
                   <w:rFonts w:eastAsia="Times New Roman"/>
@@ -194,7 +194,7 @@
               </w:rPr>
               <w:t xml:space="preserve"> </w:t>
             </w:r>
-            <w:hyperlink r:id="rId6" w:history="1">
+            <w:hyperlink r:id="rId8" w:history="1">
               <w:r>
                 <w:rPr>
                   <w:rStyle w:val="Hyperlink"/>
@@ -264,7 +264,7 @@
               </w:rPr>
               <w:t xml:space="preserve">Website: </w:t>
             </w:r>
-            <w:hyperlink r:id="rId7">
+            <w:hyperlink r:id="rId9">
               <w:r>
                 <w:rPr>
                   <w:rStyle w:val="Hyperlink"/>
@@ -334,7 +334,7 @@
               </w:rPr>
               <w:t xml:space="preserve">URL: </w:t>
             </w:r>
-            <w:hyperlink r:id="rId8">
+            <w:hyperlink r:id="rId10">
               <w:r>
                 <w:rPr>
                   <w:rStyle w:val="Hyperlink"/>
@@ -343,7 +343,27 @@
                   <w:szCs w:val="24"/>
                   <w:lang w:val="en-IN"/>
                 </w:rPr>
-                <w:t>civil.iitm.ac.im/faculty/</w:t>
+                <w:t>civil.iitm.ac.</w:t>
+              </w:r>
+              <w:r>
+                <w:rPr>
+                  <w:rStyle w:val="Hyperlink"/>
+                  <w:rFonts w:eastAsia="Times New Roman"/>
+                  <w:sz w:val="24"/>
+                  <w:szCs w:val="24"/>
+                  <w:lang w:val="en-IN"/>
+                </w:rPr>
+                <w:t>in</w:t>
+              </w:r>
+              <w:r>
+                <w:rPr>
+                  <w:rStyle w:val="Hyperlink"/>
+                  <w:rFonts w:eastAsia="Times New Roman"/>
+                  <w:sz w:val="24"/>
+                  <w:szCs w:val="24"/>
+                  <w:lang w:val="en-IN"/>
+                </w:rPr>
+                <w:t>/faculty/</w:t>
               </w:r>
               <w:proofErr w:type="spellStart"/>
               <w:r>
@@ -550,7 +570,25 @@
                 <w:szCs w:val="24"/>
                 <w:lang w:val="en-IN"/>
               </w:rPr>
-              <w:t>September 2017 – June2023</w:t>
+              <w:t>September 2017 – June</w:t>
+            </w:r>
+            <w:r>
+              <w:rPr>
+                <w:rFonts w:eastAsia="Times New Roman"/>
+                <w:sz w:val="24"/>
+                <w:szCs w:val="24"/>
+                <w:lang w:val="en-IN"/>
+              </w:rPr>
+              <w:t xml:space="preserve"> </w:t>
+            </w:r>
+            <w:r>
+              <w:rPr>
+                <w:rFonts w:eastAsia="Times New Roman"/>
+                <w:sz w:val="24"/>
+                <w:szCs w:val="24"/>
+                <w:lang w:val="en-IN"/>
+              </w:rPr>
+              <w:t>2023</w:t>
             </w:r>
           </w:p>
         </w:tc>
@@ -1299,102 +1337,88 @@
           <w:rFonts w:eastAsia="Times New Roman"/>
           <w:sz w:val="24"/>
           <w:szCs w:val="24"/>
-          <w:lang w:val="es-CO"/>
-        </w:rPr>
-        <w:t xml:space="preserve">Xiao, R., Jaller, M., Pahwa, A. &amp; Cunha, C.B. </w:t>
-      </w:r>
-      <w:r>
-        <w:rPr>
-          <w:rFonts w:eastAsia="Times New Roman"/>
-          <w:sz w:val="24"/>
-          <w:szCs w:val="24"/>
-          <w:lang w:val="es-CO"/>
-        </w:rPr>
-        <w:t>(</w:t>
-      </w:r>
-      <w:proofErr w:type="spellStart"/>
-      <w:r>
-        <w:rPr>
-          <w:rFonts w:eastAsia="Times New Roman"/>
-          <w:sz w:val="24"/>
-          <w:szCs w:val="24"/>
-          <w:lang w:val="es-CO"/>
-        </w:rPr>
-        <w:t>Under</w:t>
-      </w:r>
-      <w:proofErr w:type="spellEnd"/>
-      <w:r>
-        <w:rPr>
-          <w:rFonts w:eastAsia="Times New Roman"/>
-          <w:sz w:val="24"/>
-          <w:szCs w:val="24"/>
-          <w:lang w:val="es-CO"/>
-        </w:rPr>
-        <w:t xml:space="preserve"> </w:t>
-      </w:r>
-      <w:proofErr w:type="spellStart"/>
-      <w:r>
-        <w:rPr>
-          <w:rFonts w:eastAsia="Times New Roman"/>
-          <w:sz w:val="24"/>
-          <w:szCs w:val="24"/>
-          <w:lang w:val="es-CO"/>
-        </w:rPr>
-        <w:t>Review</w:t>
-      </w:r>
-      <w:proofErr w:type="spellEnd"/>
-      <w:r>
-        <w:rPr>
-          <w:rFonts w:eastAsia="Times New Roman"/>
-          <w:sz w:val="24"/>
-          <w:szCs w:val="24"/>
-          <w:lang w:val="es-CO"/>
-        </w:rPr>
-        <w:t xml:space="preserve">). </w:t>
-      </w:r>
-      <w:r>
-        <w:rPr>
-          <w:rFonts w:eastAsia="Times New Roman"/>
-          <w:sz w:val="24"/>
-          <w:szCs w:val="24"/>
-        </w:rPr>
-        <w:t>Charging Infrastructure Planning for Freight Electrification Using Data-Driven Optimization</w:t>
-      </w:r>
-      <w:r>
-        <w:rPr>
-          <w:rFonts w:eastAsia="Times New Roman"/>
-          <w:sz w:val="24"/>
-          <w:szCs w:val="24"/>
-        </w:rPr>
-        <w:t>.</w:t>
-      </w:r>
-      <w:r>
-        <w:rPr>
-          <w:rFonts w:eastAsia="Times New Roman"/>
-          <w:i/>
-          <w:iCs/>
-          <w:sz w:val="24"/>
-          <w:szCs w:val="24"/>
-        </w:rPr>
-        <w:t xml:space="preserve"> </w:t>
-      </w:r>
-      <w:r>
-        <w:rPr>
-          <w:rFonts w:eastAsia="Times New Roman"/>
-          <w:i/>
-          <w:iCs/>
-          <w:sz w:val="24"/>
-          <w:szCs w:val="24"/>
-        </w:rPr>
-        <w:t>Transportation Research Part D: Transport and Environment</w:t>
-      </w:r>
-      <w:r>
-        <w:rPr>
-          <w:rFonts w:eastAsia="Times New Roman"/>
-          <w:sz w:val="24"/>
-          <w:szCs w:val="24"/>
-        </w:rPr>
-        <w:t xml:space="preserve"> </w:t>
+        </w:rPr>
+        <w:t>Kirubakaran, B.</w:t>
+      </w:r>
+      <w:r>
+        <w:rPr>
+          <w:rFonts w:eastAsia="Times New Roman"/>
+          <w:sz w:val="24"/>
+          <w:szCs w:val="24"/>
+        </w:rPr>
+        <w:t xml:space="preserve">, &amp; </w:t>
+      </w:r>
+      <w:r>
+        <w:rPr>
+          <w:rFonts w:eastAsia="Times New Roman"/>
+          <w:sz w:val="24"/>
+          <w:szCs w:val="24"/>
+        </w:rPr>
+        <w:t>Pahwa, A.</w:t>
+      </w:r>
+      <w:r>
+        <w:rPr>
+          <w:rFonts w:eastAsia="Times New Roman"/>
+          <w:sz w:val="24"/>
+          <w:szCs w:val="24"/>
+        </w:rPr>
+        <w:t xml:space="preserve"> (Under Review) </w:t>
+      </w:r>
+      <w:r>
+        <w:rPr>
+          <w:rFonts w:eastAsia="Times New Roman"/>
+          <w:sz w:val="24"/>
+          <w:szCs w:val="24"/>
+        </w:rPr>
+        <w:t>Evolving Consumer Shopping Behavior Patterns in India: Evidence from the Indian Time Use Survey</w:t>
+      </w:r>
+      <w:r>
+        <w:rPr>
+          <w:rFonts w:eastAsia="Times New Roman"/>
+          <w:sz w:val="24"/>
+          <w:szCs w:val="24"/>
+        </w:rPr>
+        <w:t xml:space="preserve">. </w:t>
+      </w:r>
+      <w:r>
+        <w:rPr>
+          <w:rFonts w:eastAsia="Times New Roman"/>
+          <w:i/>
+          <w:iCs/>
+          <w:sz w:val="24"/>
+          <w:szCs w:val="24"/>
+        </w:rPr>
+        <w:t xml:space="preserve">Transportation Research Part </w:t>
+      </w:r>
+      <w:r>
+        <w:rPr>
+          <w:rFonts w:eastAsia="Times New Roman"/>
+          <w:i/>
+          <w:iCs/>
+          <w:sz w:val="24"/>
+          <w:szCs w:val="24"/>
+        </w:rPr>
+        <w:t>A</w:t>
+      </w:r>
+      <w:r>
+        <w:rPr>
+          <w:rFonts w:eastAsia="Times New Roman"/>
+          <w:i/>
+          <w:iCs/>
+          <w:sz w:val="24"/>
+          <w:szCs w:val="24"/>
+        </w:rPr>
+        <w:t xml:space="preserve">: </w:t>
+      </w:r>
+      <w:r>
+        <w:rPr>
+          <w:rFonts w:eastAsia="Times New Roman"/>
+          <w:i/>
+          <w:iCs/>
+          <w:sz w:val="24"/>
+          <w:szCs w:val="24"/>
+        </w:rPr>
+        <w:t>Policy and Practice</w:t>
       </w:r>
     </w:p>
     <w:p>
@@ -1412,44 +1436,102 @@
           <w:rFonts w:eastAsia="Times New Roman"/>
           <w:sz w:val="24"/>
           <w:szCs w:val="24"/>
-        </w:rPr>
-        <w:t xml:space="preserve">Kirubakaran, B., Pahwa, A., Kancharla, S. R., &amp; Waller, S. T. (2026). A holistic continuous approximation framework for strategic last-mile distribution planning. </w:t>
-      </w:r>
-      <w:r>
-        <w:rPr>
-          <w:rFonts w:eastAsia="Times New Roman"/>
-          <w:i/>
-          <w:iCs/>
-          <w:sz w:val="24"/>
-          <w:szCs w:val="24"/>
-        </w:rPr>
-        <w:t>Transportation Research Interdisciplinary Perspectives</w:t>
-      </w:r>
-      <w:r>
-        <w:rPr>
-          <w:rFonts w:eastAsia="Times New Roman"/>
-          <w:sz w:val="24"/>
-          <w:szCs w:val="24"/>
-        </w:rPr>
-        <w:t xml:space="preserve">, </w:t>
-      </w:r>
-      <w:r>
-        <w:rPr>
-          <w:rFonts w:eastAsia="Times New Roman"/>
-          <w:i/>
-          <w:iCs/>
-          <w:sz w:val="24"/>
-          <w:szCs w:val="24"/>
-        </w:rPr>
-        <w:t>35</w:t>
-      </w:r>
-      <w:r>
-        <w:rPr>
-          <w:rFonts w:eastAsia="Times New Roman"/>
-          <w:sz w:val="24"/>
-          <w:szCs w:val="24"/>
-        </w:rPr>
-        <w:t>, 101720.</w:t>
+          <w:lang w:val="es-CO"/>
+        </w:rPr>
+        <w:t xml:space="preserve">Xiao, R., Jaller, M., Pahwa, A. &amp; Cunha, C.B. </w:t>
+      </w:r>
+      <w:r>
+        <w:rPr>
+          <w:rFonts w:eastAsia="Times New Roman"/>
+          <w:sz w:val="24"/>
+          <w:szCs w:val="24"/>
+          <w:lang w:val="es-CO"/>
+        </w:rPr>
+        <w:t>(</w:t>
+      </w:r>
+      <w:proofErr w:type="spellStart"/>
+      <w:r>
+        <w:rPr>
+          <w:rFonts w:eastAsia="Times New Roman"/>
+          <w:sz w:val="24"/>
+          <w:szCs w:val="24"/>
+          <w:lang w:val="es-CO"/>
+        </w:rPr>
+        <w:t>Under</w:t>
+      </w:r>
+      <w:proofErr w:type="spellEnd"/>
+      <w:r>
+        <w:rPr>
+          <w:rFonts w:eastAsia="Times New Roman"/>
+          <w:sz w:val="24"/>
+          <w:szCs w:val="24"/>
+          <w:lang w:val="es-CO"/>
+        </w:rPr>
+        <w:t xml:space="preserve"> </w:t>
+      </w:r>
+      <w:proofErr w:type="spellStart"/>
+      <w:r>
+        <w:rPr>
+          <w:rFonts w:eastAsia="Times New Roman"/>
+          <w:sz w:val="24"/>
+          <w:szCs w:val="24"/>
+          <w:lang w:val="es-CO"/>
+        </w:rPr>
+        <w:t>Review</w:t>
+      </w:r>
+      <w:proofErr w:type="spellEnd"/>
+      <w:r>
+        <w:rPr>
+          <w:rFonts w:eastAsia="Times New Roman"/>
+          <w:sz w:val="24"/>
+          <w:szCs w:val="24"/>
+          <w:lang w:val="es-CO"/>
+        </w:rPr>
+        <w:t xml:space="preserve">). </w:t>
+      </w:r>
+      <w:r>
+        <w:rPr>
+          <w:rFonts w:eastAsia="Times New Roman"/>
+          <w:sz w:val="24"/>
+          <w:szCs w:val="24"/>
+        </w:rPr>
+        <w:t>Charging Infrastructure Planning for Freight Electrification Using Data-Driven Optimization</w:t>
+      </w:r>
+      <w:r>
+        <w:rPr>
+          <w:rFonts w:eastAsia="Times New Roman"/>
+          <w:sz w:val="24"/>
+          <w:szCs w:val="24"/>
+        </w:rPr>
+        <w:t>.</w:t>
+      </w:r>
+      <w:r>
+        <w:rPr>
+          <w:rFonts w:eastAsia="Times New Roman"/>
+          <w:i/>
+          <w:iCs/>
+          <w:sz w:val="24"/>
+          <w:szCs w:val="24"/>
+        </w:rPr>
+        <w:t xml:space="preserve"> </w:t>
+      </w:r>
+      <w:r>
+        <w:rPr>
+          <w:rFonts w:eastAsia="Times New Roman"/>
+          <w:i/>
+          <w:iCs/>
+          <w:sz w:val="24"/>
+          <w:szCs w:val="24"/>
+        </w:rPr>
+        <w:t>Transportation Research Part D: Transport and Environment</w:t>
+      </w:r>
+      <w:r>
+        <w:rPr>
+          <w:rFonts w:eastAsia="Times New Roman"/>
+          <w:sz w:val="24"/>
+          <w:szCs w:val="24"/>
+        </w:rPr>
+        <w:t xml:space="preserve"> </w:t>
       </w:r>
     </w:p>
     <w:p>
@@ -1468,17 +1550,17 @@
           <w:sz w:val="24"/>
           <w:szCs w:val="24"/>
         </w:rPr>
-        <w:t xml:space="preserve">Dennis-Bauer, S., Pahwa, A., &amp; Jaller, M. (2026). Explicit consideration of human exposure to minimize freight routing impacts. </w:t>
-      </w:r>
-      <w:r>
-        <w:rPr>
-          <w:rFonts w:eastAsia="Times New Roman"/>
-          <w:i/>
-          <w:iCs/>
-          <w:sz w:val="24"/>
-          <w:szCs w:val="24"/>
-        </w:rPr>
-        <w:t>Transportation Research Part D: Transport and Environment</w:t>
+        <w:t xml:space="preserve">Kirubakaran, B., Pahwa, A., Kancharla, S. R., &amp; Waller, S. T. (2026). A holistic continuous approximation framework for strategic last-mile distribution planning. </w:t>
+      </w:r>
+      <w:r>
+        <w:rPr>
+          <w:rFonts w:eastAsia="Times New Roman"/>
+          <w:i/>
+          <w:iCs/>
+          <w:sz w:val="24"/>
+          <w:szCs w:val="24"/>
+        </w:rPr>
+        <w:t>Transportation Research Interdisciplinary Perspectives</w:t>
       </w:r>
       <w:r>
         <w:rPr>
@@ -1491,20 +1573,18 @@
       <w:r>
         <w:rPr>
           <w:rFonts w:eastAsia="Times New Roman"/>
-          <w:i/>
-          <w:iCs/>
-          <w:sz w:val="24"/>
-          <w:szCs w:val="24"/>
-        </w:rPr>
-        <w:t>151</w:t>
-      </w:r>
-      <w:r>
-        <w:rPr>
-          <w:rFonts w:eastAsia="Times New Roman"/>
-          <w:sz w:val="24"/>
-          <w:szCs w:val="24"/>
-        </w:rPr>
-        <w:t>, 105133.</w:t>
+          <w:sz w:val="24"/>
+          <w:szCs w:val="24"/>
+        </w:rPr>
+        <w:t>35</w:t>
+      </w:r>
+      <w:r>
+        <w:rPr>
+          <w:rFonts w:eastAsia="Times New Roman"/>
+          <w:sz w:val="24"/>
+          <w:szCs w:val="24"/>
+        </w:rPr>
+        <w:t>, 101720.</w:t>
       </w:r>
     </w:p>
     <w:p>
@@ -1523,17 +1603,17 @@
           <w:sz w:val="24"/>
           <w:szCs w:val="24"/>
         </w:rPr>
-        <w:t xml:space="preserve">Pahwa, A., &amp; Jaller, M. (2025). Assessing the sustainability of last-mile distribution strategies to manage expedited shipping with dynamic and stochastic demand. </w:t>
-      </w:r>
-      <w:r>
-        <w:rPr>
-          <w:rFonts w:eastAsia="Times New Roman"/>
-          <w:i/>
-          <w:iCs/>
-          <w:sz w:val="24"/>
-          <w:szCs w:val="24"/>
-        </w:rPr>
-        <w:t>Transportation Research Part E: Logistics and Transportation Review</w:t>
+        <w:t xml:space="preserve">Dennis-Bauer, S., Pahwa, A., &amp; Jaller, M. (2026). Explicit consideration of human exposure to minimize freight routing impacts. </w:t>
+      </w:r>
+      <w:r>
+        <w:rPr>
+          <w:rFonts w:eastAsia="Times New Roman"/>
+          <w:i/>
+          <w:iCs/>
+          <w:sz w:val="24"/>
+          <w:szCs w:val="24"/>
+        </w:rPr>
+        <w:t>Transportation Research Part D: Transport and Environment</w:t>
       </w:r>
       <w:r>
         <w:rPr>
@@ -1551,15 +1631,15 @@
           <w:sz w:val="24"/>
           <w:szCs w:val="24"/>
         </w:rPr>
-        <w:t>201</w:t>
-      </w:r>
-      <w:r>
-        <w:rPr>
-          <w:rFonts w:eastAsia="Times New Roman"/>
-          <w:sz w:val="24"/>
-          <w:szCs w:val="24"/>
-        </w:rPr>
-        <w:t>, 104273.</w:t>
+        <w:t>151</w:t>
+      </w:r>
+      <w:r>
+        <w:rPr>
+          <w:rFonts w:eastAsia="Times New Roman"/>
+          <w:sz w:val="24"/>
+          <w:szCs w:val="24"/>
+        </w:rPr>
+        <w:t>, 105133.</w:t>
       </w:r>
     </w:p>
     <w:p>
@@ -1568,32 +1648,51 @@
         <w:jc w:val="both"/>
         <w:rPr>
           <w:rFonts w:eastAsia="Times New Roman"/>
-          <w:i/>
-          <w:iCs/>
-          <w:sz w:val="24"/>
-          <w:szCs w:val="24"/>
-          <w:lang w:val="en-IN"/>
-        </w:rPr>
-      </w:pPr>
-      <w:r>
-        <w:rPr>
-          <w:rFonts w:eastAsia="Times New Roman"/>
-          <w:sz w:val="24"/>
-          <w:szCs w:val="24"/>
-          <w:lang w:val="en-IN"/>
-        </w:rPr>
-        <w:t xml:space="preserve">Pahwa, A., &amp; Jaller, M. (2024). Evaluating private and system-wide impacts of freight eco-routing. </w:t>
-      </w:r>
-      <w:r>
-        <w:rPr>
-          <w:rFonts w:eastAsia="Times New Roman"/>
-          <w:i/>
-          <w:iCs/>
-          <w:sz w:val="24"/>
-          <w:szCs w:val="24"/>
-          <w:lang w:val="en-IN"/>
-        </w:rPr>
-        <w:t>Transportation Research Part D: Transport and Environment, 130, 104170.</w:t>
+          <w:sz w:val="24"/>
+          <w:szCs w:val="24"/>
+        </w:rPr>
+      </w:pPr>
+      <w:r>
+        <w:rPr>
+          <w:rFonts w:eastAsia="Times New Roman"/>
+          <w:sz w:val="24"/>
+          <w:szCs w:val="24"/>
+        </w:rPr>
+        <w:t xml:space="preserve">Pahwa, A., &amp; Jaller, M. (2025). Assessing the sustainability of last-mile distribution strategies to manage expedited shipping with dynamic and stochastic demand. </w:t>
+      </w:r>
+      <w:r>
+        <w:rPr>
+          <w:rFonts w:eastAsia="Times New Roman"/>
+          <w:i/>
+          <w:iCs/>
+          <w:sz w:val="24"/>
+          <w:szCs w:val="24"/>
+        </w:rPr>
+        <w:t>Transportation Research Part E: Logistics and Transportation Review</w:t>
+      </w:r>
+      <w:r>
+        <w:rPr>
+          <w:rFonts w:eastAsia="Times New Roman"/>
+          <w:sz w:val="24"/>
+          <w:szCs w:val="24"/>
+        </w:rPr>
+        <w:t xml:space="preserve">, </w:t>
+      </w:r>
+      <w:r>
+        <w:rPr>
+          <w:rFonts w:eastAsia="Times New Roman"/>
+          <w:sz w:val="24"/>
+          <w:szCs w:val="24"/>
+        </w:rPr>
+        <w:t>201</w:t>
+      </w:r>
+      <w:r>
+        <w:rPr>
+          <w:rFonts w:eastAsia="Times New Roman"/>
+          <w:sz w:val="24"/>
+          <w:szCs w:val="24"/>
+        </w:rPr>
+        <w:t>, 104273.</w:t>
       </w:r>
     </w:p>
     <w:p>
@@ -1616,38 +1715,39 @@
           <w:szCs w:val="24"/>
           <w:lang w:val="en-IN"/>
         </w:rPr>
-        <w:t>Jaller, M., Xiao, R. I., Dennis-Bauer, S., Rivera-</w:t>
-      </w:r>
-      <w:proofErr w:type="spellStart"/>
-      <w:r>
-        <w:rPr>
-          <w:rFonts w:eastAsia="Times New Roman"/>
-          <w:sz w:val="24"/>
-          <w:szCs w:val="24"/>
-          <w:lang w:val="en-IN"/>
-        </w:rPr>
-        <w:t>Royero</w:t>
-      </w:r>
-      <w:proofErr w:type="spellEnd"/>
-      <w:r>
-        <w:rPr>
-          <w:rFonts w:eastAsia="Times New Roman"/>
-          <w:sz w:val="24"/>
-          <w:szCs w:val="24"/>
-          <w:lang w:val="en-IN"/>
-        </w:rPr>
-        <w:t xml:space="preserve">, D., &amp; Pahwa, A. (2023). Estimating last-mile deliveries and shopping travel emissions by 2050. </w:t>
-      </w:r>
-      <w:r>
-        <w:rPr>
-          <w:rFonts w:eastAsia="Times New Roman"/>
-          <w:i/>
-          <w:iCs/>
-          <w:sz w:val="24"/>
-          <w:szCs w:val="24"/>
-          <w:lang w:val="en-IN"/>
-        </w:rPr>
-        <w:t>Transportation Research Part D: Transport and Environment, 123, 103913.</w:t>
+        <w:t xml:space="preserve">Pahwa, A., &amp; Jaller, M. (2024). Evaluating private and system-wide impacts of freight eco-routing. </w:t>
+      </w:r>
+      <w:r>
+        <w:rPr>
+          <w:rFonts w:eastAsia="Times New Roman"/>
+          <w:i/>
+          <w:iCs/>
+          <w:sz w:val="24"/>
+          <w:szCs w:val="24"/>
+          <w:lang w:val="en-IN"/>
+        </w:rPr>
+        <w:t>Transportation Research Part D: Transport and Environment</w:t>
+      </w:r>
+      <w:r>
+        <w:rPr>
+          <w:rFonts w:eastAsia="Times New Roman"/>
+          <w:iCs/>
+          <w:sz w:val="24"/>
+          <w:szCs w:val="24"/>
+          <w:lang w:val="en-IN"/>
+        </w:rPr>
+        <w:t>, 130, 104170</w:t>
+      </w:r>
+      <w:r>
+        <w:rPr>
+          <w:rFonts w:eastAsia="Times New Roman"/>
+          <w:i/>
+          <w:iCs/>
+          <w:sz w:val="24"/>
+          <w:szCs w:val="24"/>
+          <w:lang w:val="en-IN"/>
+        </w:rPr>
+        <w:t>.</w:t>
       </w:r>
     </w:p>
     <w:p>
@@ -1670,18 +1770,59 @@
           <w:szCs w:val="24"/>
           <w:lang w:val="en-IN"/>
         </w:rPr>
-        <w:t xml:space="preserve">Pahwa, A., &amp; Jaller, M. (2023). Assessing last-mile distribution resilience under demand disruptions. </w:t>
-      </w:r>
-      <w:r>
-        <w:rPr>
-          <w:rFonts w:eastAsia="Times New Roman"/>
-          <w:i/>
-          <w:iCs/>
-          <w:sz w:val="24"/>
-          <w:szCs w:val="24"/>
-          <w:lang w:val="en-IN"/>
-        </w:rPr>
-        <w:t>Transportation Research Part E: Logistics and Transportation Review, 172, 103066.</w:t>
+        <w:t>Jaller, M., Xiao, R. I., Dennis-Bauer, S., Rivera-</w:t>
+      </w:r>
+      <w:proofErr w:type="spellStart"/>
+      <w:r>
+        <w:rPr>
+          <w:rFonts w:eastAsia="Times New Roman"/>
+          <w:sz w:val="24"/>
+          <w:szCs w:val="24"/>
+          <w:lang w:val="en-IN"/>
+        </w:rPr>
+        <w:t>Royero</w:t>
+      </w:r>
+      <w:proofErr w:type="spellEnd"/>
+      <w:r>
+        <w:rPr>
+          <w:rFonts w:eastAsia="Times New Roman"/>
+          <w:sz w:val="24"/>
+          <w:szCs w:val="24"/>
+          <w:lang w:val="en-IN"/>
+        </w:rPr>
+        <w:t xml:space="preserve">, D., &amp; Pahwa, A. (2023). Estimating last-mile deliveries and shopping travel emissions by 2050. </w:t>
+      </w:r>
+      <w:r>
+        <w:rPr>
+          <w:rFonts w:eastAsia="Times New Roman"/>
+          <w:i/>
+          <w:iCs/>
+          <w:sz w:val="24"/>
+          <w:szCs w:val="24"/>
+          <w:lang w:val="en-IN"/>
+        </w:rPr>
+        <w:t>Transportation Research Part D: Transport and Environment</w:t>
+      </w:r>
+      <w:r>
+        <w:rPr>
+          <w:rFonts w:eastAsia="Times New Roman"/>
+          <w:iCs/>
+          <w:sz w:val="24"/>
+          <w:szCs w:val="24"/>
+          <w:lang w:val="en-IN"/>
+        </w:rPr>
+        <w:t>, 123, 103913</w:t>
+      </w:r>
+      <w:r>
+        <w:rPr>
+          <w:rFonts w:eastAsia="Times New Roman"/>
+          <w:i/>
+          <w:iCs/>
+          <w:sz w:val="24"/>
+          <w:szCs w:val="24"/>
+          <w:lang w:val="en-IN"/>
+        </w:rPr>
+        <w:t>.</w:t>
       </w:r>
     </w:p>
     <w:p>
@@ -1704,18 +1845,39 @@
           <w:szCs w:val="24"/>
           <w:lang w:val="en-IN"/>
         </w:rPr>
-        <w:t xml:space="preserve">Pahwa, A., &amp; Jaller, M. (2022). A cost-based comparative analysis of different last-mile strategies for e-commerce delivery. </w:t>
-      </w:r>
-      <w:r>
-        <w:rPr>
-          <w:rFonts w:eastAsia="Times New Roman"/>
-          <w:i/>
-          <w:iCs/>
-          <w:sz w:val="24"/>
-          <w:szCs w:val="24"/>
-          <w:lang w:val="en-IN"/>
-        </w:rPr>
-        <w:t>Transportation Research Part E: Logistics and Transportation Review, 164, 102783.</w:t>
+        <w:t xml:space="preserve">Pahwa, A., &amp; Jaller, M. (2023). Assessing last-mile distribution resilience under demand disruptions. </w:t>
+      </w:r>
+      <w:r>
+        <w:rPr>
+          <w:rFonts w:eastAsia="Times New Roman"/>
+          <w:i/>
+          <w:iCs/>
+          <w:sz w:val="24"/>
+          <w:szCs w:val="24"/>
+          <w:lang w:val="en-IN"/>
+        </w:rPr>
+        <w:t>Transportation Research Part E: Logistics and Transportation Review</w:t>
+      </w:r>
+      <w:r>
+        <w:rPr>
+          <w:rFonts w:eastAsia="Times New Roman"/>
+          <w:iCs/>
+          <w:sz w:val="24"/>
+          <w:szCs w:val="24"/>
+          <w:lang w:val="en-IN"/>
+        </w:rPr>
+        <w:t>, 172, 103066</w:t>
+      </w:r>
+      <w:r>
+        <w:rPr>
+          <w:rFonts w:eastAsia="Times New Roman"/>
+          <w:i/>
+          <w:iCs/>
+          <w:sz w:val="24"/>
+          <w:szCs w:val="24"/>
+          <w:lang w:val="en-IN"/>
+        </w:rPr>
+        <w:t>.</w:t>
       </w:r>
     </w:p>
     <w:p>
@@ -1738,18 +1900,39 @@
           <w:szCs w:val="24"/>
           <w:lang w:val="en-IN"/>
         </w:rPr>
-        <w:t xml:space="preserve">Jaller, M., Otero-Palencia, C., &amp; Pahwa, A. (2020). Automation, electrification, and shared mobility in urban freight: opportunities and challenges. </w:t>
-      </w:r>
-      <w:r>
-        <w:rPr>
-          <w:rFonts w:eastAsia="Times New Roman"/>
-          <w:i/>
-          <w:iCs/>
-          <w:sz w:val="24"/>
-          <w:szCs w:val="24"/>
-          <w:lang w:val="en-IN"/>
-        </w:rPr>
-        <w:t>Transportation Research Procedia, 46, 13-20.</w:t>
+        <w:t xml:space="preserve">Pahwa, A., &amp; Jaller, M. (2022). A cost-based comparative analysis of different last-mile strategies for e-commerce delivery. </w:t>
+      </w:r>
+      <w:r>
+        <w:rPr>
+          <w:rFonts w:eastAsia="Times New Roman"/>
+          <w:i/>
+          <w:iCs/>
+          <w:sz w:val="24"/>
+          <w:szCs w:val="24"/>
+          <w:lang w:val="en-IN"/>
+        </w:rPr>
+        <w:t>Transportation Research Part E: Logistics and Transportation Review</w:t>
+      </w:r>
+      <w:r>
+        <w:rPr>
+          <w:rFonts w:eastAsia="Times New Roman"/>
+          <w:iCs/>
+          <w:sz w:val="24"/>
+          <w:szCs w:val="24"/>
+          <w:lang w:val="en-IN"/>
+        </w:rPr>
+        <w:t>, 164, 102783</w:t>
+      </w:r>
+      <w:r>
+        <w:rPr>
+          <w:rFonts w:eastAsia="Times New Roman"/>
+          <w:i/>
+          <w:iCs/>
+          <w:sz w:val="24"/>
+          <w:szCs w:val="24"/>
+          <w:lang w:val="en-IN"/>
+        </w:rPr>
+        <w:t>.</w:t>
       </w:r>
     </w:p>
     <w:p>
@@ -1772,38 +1955,39 @@
           <w:szCs w:val="24"/>
           <w:lang w:val="en-IN"/>
         </w:rPr>
-        <w:t xml:space="preserve">Jaller, M., &amp; Pahwa, A. (2020). Evaluating the environmental impacts of online shopping: A </w:t>
-      </w:r>
-      <w:proofErr w:type="spellStart"/>
-      <w:r>
-        <w:rPr>
-          <w:rFonts w:eastAsia="Times New Roman"/>
-          <w:sz w:val="24"/>
-          <w:szCs w:val="24"/>
-          <w:lang w:val="en-IN"/>
-        </w:rPr>
-        <w:t>behavioral</w:t>
-      </w:r>
-      <w:proofErr w:type="spellEnd"/>
-      <w:r>
-        <w:rPr>
-          <w:rFonts w:eastAsia="Times New Roman"/>
-          <w:sz w:val="24"/>
-          <w:szCs w:val="24"/>
-          <w:lang w:val="en-IN"/>
-        </w:rPr>
-        <w:t xml:space="preserve"> and transportation approach. </w:t>
-      </w:r>
-      <w:r>
-        <w:rPr>
-          <w:rFonts w:eastAsia="Times New Roman"/>
-          <w:i/>
-          <w:iCs/>
-          <w:sz w:val="24"/>
-          <w:szCs w:val="24"/>
-          <w:lang w:val="en-IN"/>
-        </w:rPr>
-        <w:t>Transportation Research Part D: Transport and Environment, 80, 102223.</w:t>
+        <w:t xml:space="preserve">Jaller, M., Otero-Palencia, C., &amp; Pahwa, A. (2020). Automation, electrification, and shared mobility in urban freight: opportunities and challenges. </w:t>
+      </w:r>
+      <w:r>
+        <w:rPr>
+          <w:rFonts w:eastAsia="Times New Roman"/>
+          <w:i/>
+          <w:iCs/>
+          <w:sz w:val="24"/>
+          <w:szCs w:val="24"/>
+          <w:lang w:val="en-IN"/>
+        </w:rPr>
+        <w:t>Transportation Research Procedia</w:t>
+      </w:r>
+      <w:r>
+        <w:rPr>
+          <w:rFonts w:eastAsia="Times New Roman"/>
+          <w:iCs/>
+          <w:sz w:val="24"/>
+          <w:szCs w:val="24"/>
+          <w:lang w:val="en-IN"/>
+        </w:rPr>
+        <w:t>, 46, 13-20</w:t>
+      </w:r>
+      <w:r>
+        <w:rPr>
+          <w:rFonts w:eastAsia="Times New Roman"/>
+          <w:i/>
+          <w:iCs/>
+          <w:sz w:val="24"/>
+          <w:szCs w:val="24"/>
+          <w:lang w:val="en-IN"/>
+        </w:rPr>
+        <w:t>.</w:t>
       </w:r>
     </w:p>
     <w:p>
@@ -1826,6 +2010,82 @@
           <w:szCs w:val="24"/>
           <w:lang w:val="en-IN"/>
         </w:rPr>
+        <w:lastRenderedPageBreak/>
+        <w:t xml:space="preserve">Jaller, M., &amp; Pahwa, A. (2020). Evaluating the environmental impacts of online shopping: A </w:t>
+      </w:r>
+      <w:proofErr w:type="spellStart"/>
+      <w:r>
+        <w:rPr>
+          <w:rFonts w:eastAsia="Times New Roman"/>
+          <w:sz w:val="24"/>
+          <w:szCs w:val="24"/>
+          <w:lang w:val="en-IN"/>
+        </w:rPr>
+        <w:t>behavioral</w:t>
+      </w:r>
+      <w:proofErr w:type="spellEnd"/>
+      <w:r>
+        <w:rPr>
+          <w:rFonts w:eastAsia="Times New Roman"/>
+          <w:sz w:val="24"/>
+          <w:szCs w:val="24"/>
+          <w:lang w:val="en-IN"/>
+        </w:rPr>
+        <w:t xml:space="preserve"> and transportation approach. </w:t>
+      </w:r>
+      <w:r>
+        <w:rPr>
+          <w:rFonts w:eastAsia="Times New Roman"/>
+          <w:i/>
+          <w:iCs/>
+          <w:sz w:val="24"/>
+          <w:szCs w:val="24"/>
+          <w:lang w:val="en-IN"/>
+        </w:rPr>
+        <w:t>Transportation Research Part D: Transport and Environment</w:t>
+      </w:r>
+      <w:r>
+        <w:rPr>
+          <w:rFonts w:eastAsia="Times New Roman"/>
+          <w:iCs/>
+          <w:sz w:val="24"/>
+          <w:szCs w:val="24"/>
+          <w:lang w:val="en-IN"/>
+        </w:rPr>
+        <w:t>, 80, 102223</w:t>
+      </w:r>
+      <w:r>
+        <w:rPr>
+          <w:rFonts w:eastAsia="Times New Roman"/>
+          <w:i/>
+          <w:iCs/>
+          <w:sz w:val="24"/>
+          <w:szCs w:val="24"/>
+          <w:lang w:val="en-IN"/>
+        </w:rPr>
+        <w:t>.</w:t>
+      </w:r>
+    </w:p>
+    <w:p>
+      <w:pPr>
+        <w:ind w:left="540" w:hanging="180"/>
+        <w:jc w:val="both"/>
+        <w:rPr>
+          <w:rFonts w:eastAsia="Times New Roman"/>
+          <w:i/>
+          <w:iCs/>
+          <w:sz w:val="24"/>
+          <w:szCs w:val="24"/>
+          <w:lang w:val="en-IN"/>
+        </w:rPr>
+      </w:pPr>
+      <w:r>
+        <w:rPr>
+          <w:rFonts w:eastAsia="Times New Roman"/>
+          <w:sz w:val="24"/>
+          <w:szCs w:val="24"/>
+          <w:lang w:val="en-IN"/>
+        </w:rPr>
         <w:t>Pahwa, A., Lakhotia, S., &amp; Tiwari, G. (2017). Methodology for using GPS data from buses to assess link-based travel time variation.</w:t>
       </w:r>
       <w:r>
@@ -1837,7 +2097,28 @@
           <w:szCs w:val="24"/>
           <w:lang w:val="en-IN"/>
         </w:rPr>
-        <w:t xml:space="preserve"> Journal of the Eastern Asia Society for Transportation Studies, 12, 1238-1251.</w:t>
+        <w:t xml:space="preserve"> Journal of the Eastern Asia Society for Transportation Studies</w:t>
+      </w:r>
+      <w:r>
+        <w:rPr>
+          <w:rFonts w:eastAsia="Times New Roman"/>
+          <w:iCs/>
+          <w:sz w:val="24"/>
+          <w:szCs w:val="24"/>
+          <w:lang w:val="en-IN"/>
+        </w:rPr>
+        <w:t>, 12, 1238-1251</w:t>
+      </w:r>
+      <w:r>
+        <w:rPr>
+          <w:rFonts w:eastAsia="Times New Roman"/>
+          <w:i/>
+          <w:iCs/>
+          <w:sz w:val="24"/>
+          <w:szCs w:val="24"/>
+          <w:lang w:val="en-IN"/>
+        </w:rPr>
+        <w:t>.</w:t>
       </w:r>
     </w:p>
     <w:p>
@@ -1881,7 +2162,6 @@
           <w:szCs w:val="24"/>
           <w:lang w:val="en-IN"/>
         </w:rPr>
-        <w:lastRenderedPageBreak/>
         <w:t>Book Chapters</w:t>
       </w:r>
     </w:p>
@@ -2918,7 +3198,25 @@
           <w:szCs w:val="24"/>
           <w:lang w:val="en-IN"/>
         </w:rPr>
-        <w:t xml:space="preserve">Jaller, M., &amp; Pahwa, A (2021). The Sustainability of Alternative Last-Mile Delivery Strategies. </w:t>
+        <w:t>Jaller, M., &amp; Pahwa, A</w:t>
+      </w:r>
+      <w:r>
+        <w:rPr>
+          <w:rFonts w:eastAsia="Times New Roman"/>
+          <w:sz w:val="24"/>
+          <w:szCs w:val="24"/>
+          <w:lang w:val="en-IN"/>
+        </w:rPr>
+        <w:t>.</w:t>
+      </w:r>
+      <w:r>
+        <w:rPr>
+          <w:rFonts w:eastAsia="Times New Roman"/>
+          <w:sz w:val="24"/>
+          <w:szCs w:val="24"/>
+          <w:lang w:val="en-IN"/>
+        </w:rPr>
+        <w:t xml:space="preserve"> (2021). The Sustainability of Alternative Last-Mile Delivery Strategies. </w:t>
       </w:r>
       <w:r>
         <w:rPr>
@@ -3178,6 +3476,7 @@
           <w:szCs w:val="24"/>
           <w:lang w:val="en-IN"/>
         </w:rPr>
+        <w:lastRenderedPageBreak/>
         <w:t xml:space="preserve">Blessy, K., &amp; </w:t>
       </w:r>
       <w:r>
@@ -3321,7 +3620,6 @@
           <w:szCs w:val="24"/>
           <w:lang w:val="en-IN"/>
         </w:rPr>
-        <w:lastRenderedPageBreak/>
         <w:t xml:space="preserve">Pahwa, A., &amp; Jaller, M. (2022). </w:t>
       </w:r>
       <w:r>
@@ -4245,136 +4543,129 @@
         <w:jc w:val="both"/>
         <w:rPr>
           <w:rFonts w:eastAsia="Times New Roman"/>
-          <w:sz w:val="24"/>
-          <w:szCs w:val="24"/>
-          <w:lang w:val="en-IN"/>
-        </w:rPr>
-      </w:pPr>
-      <w:r>
-        <w:rPr>
-          <w:rFonts w:eastAsia="Times New Roman"/>
-          <w:sz w:val="24"/>
-          <w:szCs w:val="24"/>
-          <w:lang w:val="en-IN"/>
-        </w:rPr>
-        <w:t xml:space="preserve">Co-Principal Investigator on </w:t>
-      </w:r>
-      <w:r>
-        <w:rPr>
-          <w:rFonts w:eastAsia="Times New Roman"/>
-          <w:sz w:val="24"/>
-          <w:szCs w:val="24"/>
-          <w:lang w:val="en-IN"/>
-        </w:rPr>
-        <w:t>Sustainable Logistics Infrastructure and Planning</w:t>
-      </w:r>
-      <w:r>
-        <w:rPr>
-          <w:rFonts w:eastAsia="Times New Roman"/>
-          <w:sz w:val="24"/>
-          <w:szCs w:val="24"/>
-          <w:lang w:val="en-IN"/>
-        </w:rPr>
-        <w:t xml:space="preserve">. Funded by </w:t>
-      </w:r>
-      <w:proofErr w:type="spellStart"/>
-      <w:r>
-        <w:rPr>
-          <w:rFonts w:eastAsia="Times New Roman"/>
-          <w:sz w:val="24"/>
-          <w:szCs w:val="24"/>
-          <w:lang w:val="en-IN"/>
-        </w:rPr>
-        <w:t>Fedex</w:t>
-      </w:r>
-      <w:proofErr w:type="spellEnd"/>
-      <w:r>
-        <w:rPr>
-          <w:rFonts w:eastAsia="Times New Roman"/>
-          <w:sz w:val="24"/>
-          <w:szCs w:val="24"/>
-          <w:lang w:val="en-IN"/>
-        </w:rPr>
-        <w:t xml:space="preserve"> Corporate Services</w:t>
-      </w:r>
-      <w:r>
-        <w:rPr>
-          <w:rFonts w:eastAsia="Times New Roman"/>
-          <w:sz w:val="24"/>
-          <w:szCs w:val="24"/>
-          <w:lang w:val="en-IN"/>
-        </w:rPr>
-        <w:t xml:space="preserve"> Inc. (2025-28, </w:t>
-      </w:r>
-      <w:r>
-        <w:rPr>
-          <w:rFonts w:eastAsia="Times New Roman"/>
-          <w:sz w:val="24"/>
-          <w:szCs w:val="24"/>
-          <w:lang w:val="en-IN"/>
-        </w:rPr>
-        <w:t>₹2</w:t>
-      </w:r>
-      <w:r>
-        <w:rPr>
-          <w:rFonts w:eastAsia="Times New Roman"/>
-          <w:sz w:val="24"/>
-          <w:szCs w:val="24"/>
-          <w:lang w:val="en-IN"/>
-        </w:rPr>
-        <w:t>5</w:t>
-      </w:r>
-      <w:r>
-        <w:rPr>
-          <w:rFonts w:eastAsia="Times New Roman"/>
-          <w:sz w:val="24"/>
-          <w:szCs w:val="24"/>
-          <w:lang w:val="en-IN"/>
-        </w:rPr>
-        <w:t>L</w:t>
-      </w:r>
-      <w:r>
-        <w:rPr>
-          <w:rFonts w:eastAsia="Times New Roman"/>
-          <w:sz w:val="24"/>
-          <w:szCs w:val="24"/>
-          <w:lang w:val="en-IN"/>
-        </w:rPr>
-        <w:t>)</w:t>
-      </w:r>
-    </w:p>
-    <w:p>
-      <w:pPr>
-        <w:ind w:left="540" w:hanging="180"/>
-        <w:jc w:val="both"/>
-        <w:rPr>
-          <w:rFonts w:eastAsia="Times New Roman"/>
-          <w:sz w:val="24"/>
-          <w:szCs w:val="24"/>
-          <w:lang w:val="en-IN"/>
-        </w:rPr>
-      </w:pPr>
-    </w:p>
-    <w:p>
-      <w:pPr>
-        <w:pBdr>
-          <w:bottom w:val="single" w:sz="4" w:space="1" w:color="auto"/>
-        </w:pBdr>
-        <w:rPr>
-          <w:sz w:val="20"/>
-          <w:szCs w:val="20"/>
-          <w:lang w:val="en-IN"/>
-        </w:rPr>
-      </w:pPr>
-      <w:r>
-        <w:rPr>
-          <w:rFonts w:eastAsia="Times New Roman"/>
           <w:b/>
           <w:bCs/>
           <w:sz w:val="24"/>
           <w:szCs w:val="24"/>
           <w:lang w:val="en-IN"/>
         </w:rPr>
+      </w:pPr>
+      <w:r>
+        <w:rPr>
+          <w:rFonts w:eastAsia="Times New Roman"/>
+          <w:sz w:val="24"/>
+          <w:szCs w:val="24"/>
+          <w:lang w:val="en-IN"/>
+        </w:rPr>
+        <w:t xml:space="preserve">Co-Principal Investigator on </w:t>
+      </w:r>
+      <w:r>
+        <w:rPr>
+          <w:rFonts w:eastAsia="Times New Roman"/>
+          <w:sz w:val="24"/>
+          <w:szCs w:val="24"/>
+          <w:lang w:val="en-IN"/>
+        </w:rPr>
+        <w:t>Sustainable Logistics Infrastructure and Planning</w:t>
+      </w:r>
+      <w:r>
+        <w:rPr>
+          <w:rFonts w:eastAsia="Times New Roman"/>
+          <w:sz w:val="24"/>
+          <w:szCs w:val="24"/>
+          <w:lang w:val="en-IN"/>
+        </w:rPr>
+        <w:t xml:space="preserve">. Funded by </w:t>
+      </w:r>
+      <w:proofErr w:type="spellStart"/>
+      <w:r>
+        <w:rPr>
+          <w:rFonts w:eastAsia="Times New Roman"/>
+          <w:sz w:val="24"/>
+          <w:szCs w:val="24"/>
+          <w:lang w:val="en-IN"/>
+        </w:rPr>
+        <w:t>Fedex</w:t>
+      </w:r>
+      <w:proofErr w:type="spellEnd"/>
+      <w:r>
+        <w:rPr>
+          <w:rFonts w:eastAsia="Times New Roman"/>
+          <w:sz w:val="24"/>
+          <w:szCs w:val="24"/>
+          <w:lang w:val="en-IN"/>
+        </w:rPr>
+        <w:t xml:space="preserve"> Corporate Services</w:t>
+      </w:r>
+      <w:r>
+        <w:rPr>
+          <w:rFonts w:eastAsia="Times New Roman"/>
+          <w:sz w:val="24"/>
+          <w:szCs w:val="24"/>
+          <w:lang w:val="en-IN"/>
+        </w:rPr>
+        <w:t xml:space="preserve"> Inc. (2025-28, </w:t>
+      </w:r>
+      <w:r>
+        <w:rPr>
+          <w:rFonts w:eastAsia="Times New Roman"/>
+          <w:sz w:val="24"/>
+          <w:szCs w:val="24"/>
+          <w:lang w:val="en-IN"/>
+        </w:rPr>
+        <w:t>₹2</w:t>
+      </w:r>
+      <w:r>
+        <w:rPr>
+          <w:rFonts w:eastAsia="Times New Roman"/>
+          <w:sz w:val="24"/>
+          <w:szCs w:val="24"/>
+          <w:lang w:val="en-IN"/>
+        </w:rPr>
+        <w:t>5</w:t>
+      </w:r>
+      <w:r>
+        <w:rPr>
+          <w:rFonts w:eastAsia="Times New Roman"/>
+          <w:sz w:val="24"/>
+          <w:szCs w:val="24"/>
+          <w:lang w:val="en-IN"/>
+        </w:rPr>
+        <w:t>L</w:t>
+      </w:r>
+      <w:r>
+        <w:rPr>
+          <w:rFonts w:eastAsia="Times New Roman"/>
+          <w:sz w:val="24"/>
+          <w:szCs w:val="24"/>
+          <w:lang w:val="en-IN"/>
+        </w:rPr>
+        <w:t>)</w:t>
+      </w:r>
+    </w:p>
+    <w:p>
+      <w:pPr>
+        <w:spacing w:line="276" w:lineRule="auto"/>
+        <w:jc w:val="both"/>
+        <w:rPr>
+          <w:rFonts w:eastAsia="Times New Roman"/>
+          <w:b/>
+          <w:bCs/>
+          <w:sz w:val="24"/>
+          <w:szCs w:val="24"/>
+          <w:lang w:val="en-IN"/>
+        </w:rPr>
+      </w:pPr>
+      <w:r>
+        <w:rPr>
+          <w:rFonts w:eastAsia="Times New Roman"/>
+          <w:b/>
+          <w:bCs/>
+          <w:sz w:val="24"/>
+          <w:szCs w:val="24"/>
+          <w:lang w:val="en-IN"/>
+        </w:rPr>
+        <w:lastRenderedPageBreak/>
         <w:t>H</w:t>
       </w:r>
       <w:r>
@@ -4410,6 +4701,81 @@
         </w:rPr>
         <w:t>WARDS</w:t>
       </w:r>
+    </w:p>
+    <w:p>
+      <w:pPr>
+        <w:spacing w:line="20" w:lineRule="exact"/>
+        <w:rPr>
+          <w:sz w:val="20"/>
+          <w:szCs w:val="20"/>
+          <w:lang w:val="en-IN"/>
+        </w:rPr>
+      </w:pPr>
+      <w:r>
+        <w:rPr>
+          <w:noProof/>
+          <w:sz w:val="20"/>
+          <w:szCs w:val="20"/>
+          <w:lang w:val="en-IN"/>
+        </w:rPr>
+        <w:drawing>
+          <wp:anchor distT="0" distB="0" distL="114300" distR="114300" simplePos="0" relativeHeight="251661312" behindDoc="1" locked="0" layoutInCell="0" allowOverlap="1" wp14:anchorId="3FDF0BEB" wp14:editId="6AD91753">
+            <wp:simplePos x="0" y="0"/>
+            <wp:positionH relativeFrom="column">
+              <wp:posOffset>-18415</wp:posOffset>
+            </wp:positionH>
+            <wp:positionV relativeFrom="paragraph">
+              <wp:posOffset>13335</wp:posOffset>
+            </wp:positionV>
+            <wp:extent cx="5982335" cy="6350"/>
+            <wp:effectExtent l="0" t="0" r="0" b="0"/>
+            <wp:wrapNone/>
+            <wp:docPr id="540175735" name="Picture 540175735"/>
+            <wp:cNvGraphicFramePr>
+              <a:graphicFrameLocks xmlns:a="http://schemas.openxmlformats.org/drawingml/2006/main" noChangeAspect="1"/>
+            </wp:cNvGraphicFramePr>
+            <a:graphic xmlns:a="http://schemas.openxmlformats.org/drawingml/2006/main">
+              <a:graphicData uri="http://schemas.openxmlformats.org/drawingml/2006/picture">
+                <pic:pic xmlns:pic="http://schemas.openxmlformats.org/drawingml/2006/picture">
+                  <pic:nvPicPr>
+                    <pic:cNvPr id="0" name="Picture 6"/>
+                    <pic:cNvPicPr>
+                      <a:picLocks noChangeAspect="1" noChangeArrowheads="1"/>
+                    </pic:cNvPicPr>
+                  </pic:nvPicPr>
+                  <pic:blipFill>
+                    <a:blip r:embed="rId11"/>
+                    <a:srcRect/>
+                    <a:stretch>
+                      <a:fillRect/>
+                    </a:stretch>
+                  </pic:blipFill>
+                  <pic:spPr bwMode="auto">
+                    <a:xfrm>
+                      <a:off x="0" y="0"/>
+                      <a:ext cx="5982335" cy="6350"/>
+                    </a:xfrm>
+                    <a:prstGeom prst="rect">
+                      <a:avLst/>
+                    </a:prstGeom>
+                    <a:noFill/>
+                  </pic:spPr>
+                </pic:pic>
+              </a:graphicData>
+            </a:graphic>
+          </wp:anchor>
+        </w:drawing>
+      </w:r>
+    </w:p>
+    <w:p>
+      <w:pPr>
+        <w:spacing w:line="10" w:lineRule="exact"/>
+        <w:rPr>
+          <w:sz w:val="20"/>
+          <w:szCs w:val="20"/>
+          <w:lang w:val="en-IN"/>
+        </w:rPr>
+      </w:pPr>
     </w:p>
     <w:p>
       <w:pPr>
@@ -4683,7 +5049,7 @@
                     </pic:cNvPicPr>
                   </pic:nvPicPr>
                   <pic:blipFill>
-                    <a:blip r:embed="rId9"/>
+                    <a:blip r:embed="rId11"/>
                     <a:srcRect/>
                     <a:stretch>
                       <a:fillRect/>
@@ -4810,7 +5176,6 @@
     </w:p>
     <w:p>
       <w:pPr>
-        <w:ind w:left="360"/>
         <w:rPr>
           <w:rFonts w:eastAsia="Times New Roman"/>
           <w:b/>
@@ -4825,6 +5190,13 @@
       <w:pPr>
         <w:ind w:left="360"/>
         <w:rPr>
+          <w:sz w:val="20"/>
+          <w:szCs w:val="20"/>
+          <w:lang w:val="en-IN"/>
+        </w:rPr>
+      </w:pPr>
+      <w:r>
+        <w:rPr>
           <w:rFonts w:eastAsia="Times New Roman"/>
           <w:b/>
           <w:bCs/>
@@ -4832,11 +5204,785 @@
           <w:szCs w:val="24"/>
           <w:lang w:val="en-IN"/>
         </w:rPr>
+        <w:t>Peer-Reviewer</w:t>
+      </w:r>
+    </w:p>
+    <w:p>
+      <w:pPr>
+        <w:ind w:firstLine="540"/>
+        <w:rPr>
+          <w:rFonts w:eastAsia="Times New Roman"/>
+          <w:sz w:val="24"/>
+          <w:szCs w:val="24"/>
+          <w:lang w:val="en-IN"/>
+        </w:rPr>
+      </w:pPr>
+      <w:r>
+        <w:rPr>
+          <w:rFonts w:eastAsia="Times New Roman"/>
+          <w:sz w:val="24"/>
+          <w:szCs w:val="24"/>
+          <w:lang w:val="en-IN"/>
+        </w:rPr>
+        <w:t>Applied Sciences</w:t>
+      </w:r>
+    </w:p>
+    <w:p>
+      <w:pPr>
+        <w:ind w:firstLine="540"/>
+        <w:rPr>
+          <w:rFonts w:eastAsia="Times New Roman"/>
+          <w:sz w:val="24"/>
+          <w:szCs w:val="24"/>
+          <w:lang w:val="en-IN"/>
+        </w:rPr>
+      </w:pPr>
+      <w:r>
+        <w:rPr>
+          <w:rFonts w:eastAsia="Times New Roman"/>
+          <w:sz w:val="24"/>
+          <w:szCs w:val="24"/>
+          <w:lang w:val="en-IN"/>
+        </w:rPr>
+        <w:t>Central European Journal of Operations Research</w:t>
+      </w:r>
+    </w:p>
+    <w:p>
+      <w:pPr>
+        <w:ind w:firstLine="540"/>
+        <w:rPr>
+          <w:rFonts w:eastAsia="Times New Roman"/>
+          <w:sz w:val="24"/>
+          <w:szCs w:val="24"/>
+          <w:lang w:val="en-IN"/>
+        </w:rPr>
+      </w:pPr>
+      <w:r>
+        <w:rPr>
+          <w:rFonts w:eastAsia="Times New Roman"/>
+          <w:sz w:val="24"/>
+          <w:szCs w:val="24"/>
+          <w:lang w:val="en-IN"/>
+        </w:rPr>
+        <w:t>Civil Engineering and Environmental Systems</w:t>
+      </w:r>
+    </w:p>
+    <w:p>
+      <w:pPr>
+        <w:ind w:firstLine="540"/>
+        <w:rPr>
+          <w:rFonts w:eastAsia="Times New Roman"/>
+          <w:sz w:val="24"/>
+          <w:szCs w:val="24"/>
+          <w:lang w:val="en-IN"/>
+        </w:rPr>
+      </w:pPr>
+      <w:r>
+        <w:rPr>
+          <w:rFonts w:eastAsia="Times New Roman"/>
+          <w:sz w:val="24"/>
+          <w:szCs w:val="24"/>
+          <w:lang w:val="en-IN"/>
+        </w:rPr>
+        <w:t>Cogent Engineering</w:t>
+      </w:r>
+    </w:p>
+    <w:p>
+      <w:pPr>
+        <w:ind w:firstLine="540"/>
+        <w:rPr>
+          <w:rFonts w:eastAsia="Times New Roman"/>
+          <w:sz w:val="24"/>
+          <w:szCs w:val="24"/>
+          <w:lang w:val="en-IN"/>
+        </w:rPr>
+      </w:pPr>
+      <w:r>
+        <w:rPr>
+          <w:rFonts w:eastAsia="Times New Roman"/>
+          <w:sz w:val="24"/>
+          <w:szCs w:val="24"/>
+          <w:lang w:val="en-IN"/>
+        </w:rPr>
+        <w:t>Conference of Transportation Research Group of India</w:t>
+      </w:r>
+    </w:p>
+    <w:p>
+      <w:pPr>
+        <w:ind w:firstLine="540"/>
+        <w:rPr>
+          <w:rFonts w:eastAsia="Times New Roman"/>
+          <w:sz w:val="24"/>
+          <w:szCs w:val="24"/>
+          <w:lang w:val="en-IN"/>
+        </w:rPr>
+      </w:pPr>
+      <w:r>
+        <w:rPr>
+          <w:rFonts w:eastAsia="Times New Roman"/>
+          <w:sz w:val="24"/>
+          <w:szCs w:val="24"/>
+          <w:lang w:val="en-IN"/>
+        </w:rPr>
+        <w:t>Computers and Industrial Engineering</w:t>
+      </w:r>
+    </w:p>
+    <w:p>
+      <w:pPr>
+        <w:ind w:firstLine="540"/>
+        <w:rPr>
+          <w:rFonts w:eastAsia="Times New Roman"/>
+          <w:sz w:val="24"/>
+          <w:szCs w:val="24"/>
+          <w:lang w:val="en-IN"/>
+        </w:rPr>
+      </w:pPr>
+      <w:r>
+        <w:rPr>
+          <w:rFonts w:eastAsia="Times New Roman"/>
+          <w:sz w:val="24"/>
+          <w:szCs w:val="24"/>
+          <w:lang w:val="en-IN"/>
+        </w:rPr>
+        <w:t>IEEE Transactions on Transportation Electrification</w:t>
+      </w:r>
+    </w:p>
+    <w:p>
+      <w:pPr>
+        <w:ind w:firstLine="540"/>
+        <w:rPr>
+          <w:rFonts w:eastAsia="Times New Roman"/>
+          <w:sz w:val="24"/>
+          <w:szCs w:val="24"/>
+          <w:lang w:val="en-IN"/>
+        </w:rPr>
+      </w:pPr>
+      <w:r>
+        <w:rPr>
+          <w:rFonts w:eastAsia="Times New Roman"/>
+          <w:sz w:val="24"/>
+          <w:szCs w:val="24"/>
+          <w:lang w:val="en-IN"/>
+        </w:rPr>
+        <w:t>International Journal of Environmental Research and Public Health</w:t>
+      </w:r>
+    </w:p>
+    <w:p>
+      <w:pPr>
+        <w:ind w:firstLine="540"/>
+        <w:rPr>
+          <w:rFonts w:eastAsia="Times New Roman"/>
+          <w:sz w:val="24"/>
+          <w:szCs w:val="24"/>
+          <w:lang w:val="en-IN"/>
+        </w:rPr>
+      </w:pPr>
+      <w:r>
+        <w:rPr>
+          <w:rFonts w:eastAsia="Times New Roman"/>
+          <w:sz w:val="24"/>
+          <w:szCs w:val="24"/>
+          <w:lang w:val="en-IN"/>
+        </w:rPr>
+        <w:t>International Journal of Logistics</w:t>
+      </w:r>
+    </w:p>
+    <w:p>
+      <w:pPr>
+        <w:ind w:firstLine="540"/>
+        <w:rPr>
+          <w:rFonts w:eastAsia="Times New Roman"/>
+          <w:sz w:val="24"/>
+          <w:szCs w:val="24"/>
+          <w:lang w:val="en-IN"/>
+        </w:rPr>
+      </w:pPr>
+      <w:r>
+        <w:rPr>
+          <w:rFonts w:eastAsia="Times New Roman"/>
+          <w:sz w:val="24"/>
+          <w:szCs w:val="24"/>
+          <w:lang w:val="en-IN"/>
+        </w:rPr>
+        <w:t>International Journal of Systems Science: Operations &amp; Logistics</w:t>
+      </w:r>
+    </w:p>
+    <w:p>
+      <w:pPr>
+        <w:ind w:firstLine="540"/>
+        <w:rPr>
+          <w:rFonts w:eastAsia="Times New Roman"/>
+          <w:sz w:val="24"/>
+          <w:szCs w:val="24"/>
+          <w:lang w:val="en-IN"/>
+        </w:rPr>
+      </w:pPr>
+      <w:r>
+        <w:rPr>
+          <w:rFonts w:eastAsia="Times New Roman"/>
+          <w:sz w:val="24"/>
+          <w:szCs w:val="24"/>
+          <w:lang w:val="en-IN"/>
+        </w:rPr>
+        <w:t>Journal of Advanced Transportation</w:t>
+      </w:r>
+    </w:p>
+    <w:p>
+      <w:pPr>
+        <w:ind w:firstLine="540"/>
+        <w:rPr>
+          <w:rFonts w:eastAsia="Times New Roman"/>
+          <w:sz w:val="24"/>
+          <w:szCs w:val="24"/>
+          <w:lang w:val="en-IN"/>
+        </w:rPr>
+      </w:pPr>
+      <w:r>
+        <w:rPr>
+          <w:rFonts w:eastAsia="Times New Roman"/>
+          <w:sz w:val="24"/>
+          <w:szCs w:val="24"/>
+          <w:lang w:val="en-IN"/>
+        </w:rPr>
+        <w:t>Journal of The Institution of Engineers (India): Series A</w:t>
+      </w:r>
+    </w:p>
+    <w:p>
+      <w:pPr>
+        <w:ind w:firstLine="540"/>
+        <w:rPr>
+          <w:rFonts w:eastAsia="Times New Roman"/>
+          <w:sz w:val="24"/>
+          <w:szCs w:val="24"/>
+          <w:lang w:val="en-IN"/>
+        </w:rPr>
+      </w:pPr>
+      <w:r>
+        <w:rPr>
+          <w:rFonts w:eastAsia="Times New Roman"/>
+          <w:sz w:val="24"/>
+          <w:szCs w:val="24"/>
+          <w:lang w:val="en-IN"/>
+        </w:rPr>
+        <w:t>Networks and Spatial Economics</w:t>
+      </w:r>
+    </w:p>
+    <w:p>
+      <w:pPr>
+        <w:ind w:firstLine="540"/>
+        <w:rPr>
+          <w:rFonts w:eastAsia="Times New Roman"/>
+          <w:sz w:val="24"/>
+          <w:szCs w:val="24"/>
+          <w:lang w:val="en-IN"/>
+        </w:rPr>
+      </w:pPr>
+      <w:r>
+        <w:rPr>
+          <w:rFonts w:eastAsia="Times New Roman"/>
+          <w:sz w:val="24"/>
+          <w:szCs w:val="24"/>
+          <w:lang w:val="en-IN"/>
+        </w:rPr>
+        <w:t>NPJ Sustainable Mobility and Transport</w:t>
+      </w:r>
+    </w:p>
+    <w:p>
+      <w:pPr>
+        <w:ind w:firstLine="540"/>
+        <w:rPr>
+          <w:rFonts w:eastAsia="Times New Roman"/>
+          <w:sz w:val="24"/>
+          <w:szCs w:val="24"/>
+          <w:lang w:val="en-IN"/>
+        </w:rPr>
+      </w:pPr>
+      <w:r>
+        <w:rPr>
+          <w:rFonts w:eastAsia="Times New Roman"/>
+          <w:sz w:val="24"/>
+          <w:szCs w:val="24"/>
+          <w:lang w:val="en-IN"/>
+        </w:rPr>
+        <w:t>Sustainable Futures</w:t>
+      </w:r>
+    </w:p>
+    <w:p>
+      <w:pPr>
+        <w:ind w:firstLine="540"/>
+        <w:rPr>
+          <w:rFonts w:eastAsia="Times New Roman"/>
+          <w:sz w:val="24"/>
+          <w:szCs w:val="24"/>
+          <w:lang w:val="en-IN"/>
+        </w:rPr>
+      </w:pPr>
+      <w:r>
+        <w:rPr>
+          <w:rFonts w:eastAsia="Times New Roman"/>
+          <w:sz w:val="24"/>
+          <w:szCs w:val="24"/>
+          <w:lang w:val="en-IN"/>
+        </w:rPr>
+        <w:t>Sustainability</w:t>
+      </w:r>
+    </w:p>
+    <w:p>
+      <w:pPr>
+        <w:ind w:firstLine="540"/>
+        <w:rPr>
+          <w:rFonts w:eastAsia="Times New Roman"/>
+          <w:sz w:val="24"/>
+          <w:szCs w:val="24"/>
+          <w:lang w:val="en-IN"/>
+        </w:rPr>
+      </w:pPr>
+      <w:r>
+        <w:rPr>
+          <w:rFonts w:eastAsia="Times New Roman"/>
+          <w:sz w:val="24"/>
+          <w:szCs w:val="24"/>
+          <w:lang w:val="en-IN"/>
+        </w:rPr>
+        <w:t>Systems</w:t>
+      </w:r>
+    </w:p>
+    <w:p>
+      <w:pPr>
+        <w:ind w:firstLine="540"/>
+        <w:rPr>
+          <w:rFonts w:eastAsia="Times New Roman"/>
+          <w:sz w:val="24"/>
+          <w:szCs w:val="24"/>
+          <w:lang w:val="en-IN"/>
+        </w:rPr>
+      </w:pPr>
+      <w:r>
+        <w:rPr>
+          <w:rFonts w:eastAsia="Times New Roman"/>
+          <w:sz w:val="24"/>
+          <w:szCs w:val="24"/>
+          <w:lang w:val="en-IN"/>
+        </w:rPr>
+        <w:t>Transactions on Engineering Management</w:t>
+      </w:r>
+    </w:p>
+    <w:p>
+      <w:pPr>
+        <w:ind w:firstLine="540"/>
+        <w:rPr>
+          <w:rFonts w:eastAsia="Times New Roman"/>
+          <w:sz w:val="24"/>
+          <w:szCs w:val="24"/>
+          <w:lang w:val="en-IN"/>
+        </w:rPr>
+      </w:pPr>
+      <w:r>
+        <w:rPr>
+          <w:rFonts w:eastAsia="Times New Roman"/>
+          <w:sz w:val="24"/>
+          <w:szCs w:val="24"/>
+          <w:lang w:val="en-IN"/>
+        </w:rPr>
+        <w:t>Transport Policy</w:t>
+      </w:r>
+    </w:p>
+    <w:p>
+      <w:pPr>
+        <w:ind w:firstLine="540"/>
+        <w:rPr>
+          <w:rFonts w:eastAsia="Times New Roman"/>
+          <w:sz w:val="24"/>
+          <w:szCs w:val="24"/>
+          <w:lang w:val="en-IN"/>
+        </w:rPr>
+      </w:pPr>
+      <w:r>
+        <w:rPr>
+          <w:rFonts w:eastAsia="Times New Roman"/>
+          <w:sz w:val="24"/>
+          <w:szCs w:val="24"/>
+          <w:lang w:val="en-IN"/>
+        </w:rPr>
+        <w:t>Transportation in Developing Economies</w:t>
+      </w:r>
+    </w:p>
+    <w:p>
+      <w:pPr>
+        <w:ind w:firstLine="540"/>
+        <w:rPr>
+          <w:rFonts w:eastAsia="Times New Roman"/>
+          <w:sz w:val="24"/>
+          <w:szCs w:val="24"/>
+          <w:lang w:val="en-IN"/>
+        </w:rPr>
+      </w:pPr>
+      <w:r>
+        <w:rPr>
+          <w:rFonts w:eastAsia="Times New Roman"/>
+          <w:sz w:val="24"/>
+          <w:szCs w:val="24"/>
+          <w:lang w:val="en-IN"/>
+        </w:rPr>
+        <w:t xml:space="preserve">Transportation Letters: </w:t>
+      </w:r>
+      <w:r>
+        <w:rPr>
+          <w:rFonts w:eastAsia="Times New Roman"/>
+          <w:sz w:val="24"/>
+          <w:szCs w:val="24"/>
+          <w:lang w:val="en-IN"/>
+        </w:rPr>
+        <w:t xml:space="preserve">The </w:t>
+      </w:r>
+      <w:r>
+        <w:rPr>
+          <w:rFonts w:eastAsia="Times New Roman"/>
+          <w:sz w:val="24"/>
+          <w:szCs w:val="24"/>
+          <w:lang w:val="en-IN"/>
+        </w:rPr>
+        <w:t>International Journal of Transportation</w:t>
+      </w:r>
+      <w:r>
+        <w:rPr>
+          <w:rFonts w:eastAsia="Times New Roman"/>
+          <w:sz w:val="24"/>
+          <w:szCs w:val="24"/>
+          <w:lang w:val="en-IN"/>
+        </w:rPr>
+        <w:t xml:space="preserve"> </w:t>
+      </w:r>
+      <w:r>
+        <w:rPr>
+          <w:rFonts w:eastAsia="Times New Roman"/>
+          <w:sz w:val="24"/>
+          <w:szCs w:val="24"/>
+          <w:lang w:val="en-IN"/>
+        </w:rPr>
+        <w:t>Research</w:t>
+      </w:r>
+    </w:p>
+    <w:p>
+      <w:pPr>
+        <w:ind w:firstLine="540"/>
+        <w:rPr>
+          <w:rFonts w:eastAsia="Times New Roman"/>
+          <w:sz w:val="24"/>
+          <w:szCs w:val="24"/>
+          <w:lang w:val="en-IN"/>
+        </w:rPr>
+      </w:pPr>
+      <w:r>
+        <w:rPr>
+          <w:rFonts w:eastAsia="Times New Roman"/>
+          <w:sz w:val="24"/>
+          <w:szCs w:val="24"/>
+          <w:lang w:val="en-IN"/>
+        </w:rPr>
+        <w:t>Transportation Planning and Implementation Methodologies for Developing Countries</w:t>
+      </w:r>
+    </w:p>
+    <w:p>
+      <w:pPr>
+        <w:ind w:firstLine="540"/>
+        <w:rPr>
+          <w:rFonts w:eastAsia="Times New Roman"/>
+          <w:sz w:val="24"/>
+          <w:szCs w:val="24"/>
+          <w:lang w:val="en-IN"/>
+        </w:rPr>
+      </w:pPr>
+      <w:r>
+        <w:rPr>
+          <w:rFonts w:eastAsia="Times New Roman"/>
+          <w:sz w:val="24"/>
+          <w:szCs w:val="24"/>
+          <w:lang w:val="en-IN"/>
+        </w:rPr>
+        <w:t>Transportation Planning and Technology</w:t>
+      </w:r>
+    </w:p>
+    <w:p>
+      <w:pPr>
+        <w:ind w:firstLine="540"/>
+        <w:rPr>
+          <w:rFonts w:eastAsia="Times New Roman"/>
+          <w:sz w:val="24"/>
+          <w:szCs w:val="24"/>
+          <w:lang w:val="en-IN"/>
+        </w:rPr>
+      </w:pPr>
+      <w:r>
+        <w:rPr>
+          <w:rFonts w:eastAsia="Times New Roman"/>
+          <w:sz w:val="24"/>
+          <w:szCs w:val="24"/>
+          <w:lang w:val="en-IN"/>
+        </w:rPr>
+        <w:t>Transportation Research Board Annual Meeting</w:t>
+      </w:r>
+    </w:p>
+    <w:p>
+      <w:pPr>
+        <w:ind w:firstLine="540"/>
+        <w:rPr>
+          <w:rFonts w:eastAsia="Times New Roman"/>
+          <w:sz w:val="24"/>
+          <w:szCs w:val="24"/>
+          <w:lang w:val="en-IN"/>
+        </w:rPr>
+      </w:pPr>
+      <w:r>
+        <w:rPr>
+          <w:rFonts w:eastAsia="Times New Roman"/>
+          <w:sz w:val="24"/>
+          <w:szCs w:val="24"/>
+          <w:lang w:val="en-IN"/>
+        </w:rPr>
+        <w:t>Transportation Research Interdisciplinary Perspectives</w:t>
+      </w:r>
+    </w:p>
+    <w:p>
+      <w:pPr>
+        <w:ind w:firstLine="540"/>
+        <w:rPr>
+          <w:rFonts w:eastAsia="Times New Roman"/>
+          <w:sz w:val="24"/>
+          <w:szCs w:val="24"/>
+          <w:lang w:val="en-IN"/>
+        </w:rPr>
+      </w:pPr>
+      <w:r>
+        <w:rPr>
+          <w:rFonts w:eastAsia="Times New Roman"/>
+          <w:sz w:val="24"/>
+          <w:szCs w:val="24"/>
+          <w:lang w:val="en-IN"/>
+        </w:rPr>
+        <w:t>Transportation Research Part A: Policy and Planning</w:t>
+      </w:r>
+    </w:p>
+    <w:p>
+      <w:pPr>
+        <w:ind w:firstLine="540"/>
+        <w:rPr>
+          <w:rFonts w:eastAsia="Times New Roman"/>
+          <w:sz w:val="24"/>
+          <w:szCs w:val="24"/>
+          <w:lang w:val="en-IN"/>
+        </w:rPr>
+      </w:pPr>
+      <w:r>
+        <w:rPr>
+          <w:rFonts w:eastAsia="Times New Roman"/>
+          <w:sz w:val="24"/>
+          <w:szCs w:val="24"/>
+          <w:lang w:val="en-IN"/>
+        </w:rPr>
+        <w:t>Transportation Research Part B: Methodological</w:t>
+      </w:r>
+    </w:p>
+    <w:p>
+      <w:pPr>
+        <w:ind w:firstLine="540"/>
+        <w:rPr>
+          <w:rFonts w:eastAsia="Times New Roman"/>
+          <w:sz w:val="24"/>
+          <w:szCs w:val="24"/>
+          <w:lang w:val="en-IN"/>
+        </w:rPr>
+      </w:pPr>
+      <w:r>
+        <w:rPr>
+          <w:rFonts w:eastAsia="Times New Roman"/>
+          <w:sz w:val="24"/>
+          <w:szCs w:val="24"/>
+          <w:lang w:val="en-IN"/>
+        </w:rPr>
+        <w:t>Transportation Research Part C: Emerging Technologies</w:t>
+      </w:r>
+    </w:p>
+    <w:p>
+      <w:pPr>
+        <w:ind w:firstLine="540"/>
+        <w:rPr>
+          <w:rFonts w:eastAsia="Times New Roman"/>
+          <w:sz w:val="24"/>
+          <w:szCs w:val="24"/>
+          <w:lang w:val="en-IN"/>
+        </w:rPr>
+      </w:pPr>
+      <w:r>
+        <w:rPr>
+          <w:rFonts w:eastAsia="Times New Roman"/>
+          <w:sz w:val="24"/>
+          <w:szCs w:val="24"/>
+          <w:lang w:val="en-IN"/>
+        </w:rPr>
+        <w:t>Transportation Research Part D: Transport and Environment</w:t>
+      </w:r>
+    </w:p>
+    <w:p>
+      <w:pPr>
+        <w:ind w:firstLine="540"/>
+        <w:rPr>
+          <w:rFonts w:eastAsia="Times New Roman"/>
+          <w:sz w:val="24"/>
+          <w:szCs w:val="24"/>
+          <w:lang w:val="en-IN"/>
+        </w:rPr>
+      </w:pPr>
+      <w:r>
+        <w:rPr>
+          <w:rFonts w:eastAsia="Times New Roman"/>
+          <w:sz w:val="24"/>
+          <w:szCs w:val="24"/>
+          <w:lang w:val="en-IN"/>
+        </w:rPr>
+        <w:t>Transportation Research Part E: Logistics and Transportation Review</w:t>
+      </w:r>
+    </w:p>
+    <w:p>
+      <w:pPr>
+        <w:ind w:firstLine="540"/>
+        <w:rPr>
+          <w:rFonts w:eastAsia="Times New Roman"/>
+          <w:sz w:val="24"/>
+          <w:szCs w:val="24"/>
+          <w:lang w:val="en-IN"/>
+        </w:rPr>
+      </w:pPr>
+      <w:r>
+        <w:rPr>
+          <w:rFonts w:eastAsia="Times New Roman"/>
+          <w:sz w:val="24"/>
+          <w:szCs w:val="24"/>
+          <w:lang w:val="en-IN"/>
+        </w:rPr>
+        <w:t>Transportation Research Record</w:t>
+      </w:r>
+    </w:p>
+    <w:p>
+      <w:pPr>
+        <w:ind w:firstLine="540"/>
+        <w:rPr>
+          <w:rFonts w:eastAsia="Times New Roman"/>
+          <w:sz w:val="24"/>
+          <w:szCs w:val="24"/>
+          <w:lang w:val="en-IN"/>
+        </w:rPr>
+      </w:pPr>
+      <w:r>
+        <w:rPr>
+          <w:rFonts w:eastAsia="Times New Roman"/>
+          <w:sz w:val="24"/>
+          <w:szCs w:val="24"/>
+          <w:lang w:val="en-IN"/>
+        </w:rPr>
+        <w:t>Trauma care</w:t>
+      </w:r>
+    </w:p>
+    <w:p>
+      <w:pPr>
+        <w:ind w:firstLine="540"/>
+        <w:rPr>
+          <w:rFonts w:eastAsia="Times New Roman"/>
+          <w:sz w:val="24"/>
+          <w:szCs w:val="24"/>
+          <w:lang w:val="en-IN"/>
+        </w:rPr>
+      </w:pPr>
+      <w:r>
+        <w:rPr>
+          <w:rFonts w:eastAsia="Times New Roman"/>
+          <w:sz w:val="24"/>
+          <w:szCs w:val="24"/>
+          <w:lang w:val="en-IN"/>
+        </w:rPr>
+        <w:t>Urban Transitions</w:t>
+      </w:r>
+    </w:p>
+    <w:p>
+      <w:pPr>
+        <w:ind w:firstLine="540"/>
+        <w:rPr>
+          <w:rFonts w:eastAsia="Times New Roman"/>
+          <w:sz w:val="24"/>
+          <w:szCs w:val="24"/>
+          <w:lang w:val="en-IN"/>
+        </w:rPr>
+      </w:pPr>
+      <w:r>
+        <w:rPr>
+          <w:rFonts w:eastAsia="Times New Roman"/>
+          <w:sz w:val="24"/>
+          <w:szCs w:val="24"/>
+          <w:lang w:val="en-IN"/>
+        </w:rPr>
+        <w:t>World Symposium on Transport and Land Use Research</w:t>
+      </w:r>
+    </w:p>
+    <w:p>
+      <w:pPr>
+        <w:pStyle w:val="ListParagraph"/>
+        <w:rPr>
+          <w:rFonts w:ascii="Calibri Light" w:eastAsia="Calibri Light" w:hAnsi="Calibri Light" w:cs="Calibri Light"/>
+          <w:sz w:val="24"/>
+          <w:szCs w:val="24"/>
+          <w:lang w:val="en-IN"/>
+        </w:rPr>
       </w:pPr>
     </w:p>
     <w:p>
       <w:pPr>
         <w:ind w:left="360"/>
+        <w:rPr>
+          <w:rFonts w:eastAsia="Times New Roman"/>
+          <w:b/>
+          <w:bCs/>
+          <w:sz w:val="24"/>
+          <w:szCs w:val="24"/>
+          <w:lang w:val="en-IN"/>
+        </w:rPr>
+      </w:pPr>
+      <w:r>
+        <w:rPr>
+          <w:rFonts w:eastAsia="Times New Roman"/>
+          <w:b/>
+          <w:bCs/>
+          <w:sz w:val="24"/>
+          <w:szCs w:val="24"/>
+          <w:lang w:val="en-IN"/>
+        </w:rPr>
+        <w:t>Supervisor</w:t>
+      </w:r>
+    </w:p>
+    <w:p>
+      <w:pPr>
+        <w:ind w:firstLine="540"/>
+        <w:rPr>
+          <w:b/>
+          <w:bCs/>
+          <w:sz w:val="24"/>
+          <w:szCs w:val="24"/>
+          <w:lang w:val="en-IN"/>
+        </w:rPr>
+      </w:pPr>
+      <w:r>
+        <w:rPr>
+          <w:b/>
+          <w:bCs/>
+          <w:sz w:val="24"/>
+          <w:szCs w:val="24"/>
+          <w:lang w:val="en-IN"/>
+        </w:rPr>
+        <w:t>Postdoc</w:t>
+      </w:r>
+    </w:p>
+    <w:p>
+      <w:pPr>
+        <w:ind w:left="360" w:firstLine="180"/>
         <w:rPr>
           <w:sz w:val="20"/>
           <w:szCs w:val="20"/>
@@ -4852,740 +5998,9 @@
           <w:szCs w:val="24"/>
           <w:lang w:val="en-IN"/>
         </w:rPr>
-        <w:lastRenderedPageBreak/>
-        <w:t>Peer-Reviewer</w:t>
-      </w:r>
-    </w:p>
-    <w:p>
-      <w:pPr>
-        <w:ind w:firstLine="540"/>
-        <w:rPr>
-          <w:rFonts w:eastAsia="Times New Roman"/>
-          <w:sz w:val="24"/>
-          <w:szCs w:val="24"/>
-          <w:lang w:val="en-IN"/>
-        </w:rPr>
-      </w:pPr>
-      <w:r>
-        <w:rPr>
-          <w:rFonts w:eastAsia="Times New Roman"/>
-          <w:sz w:val="24"/>
-          <w:szCs w:val="24"/>
-          <w:lang w:val="en-IN"/>
-        </w:rPr>
-        <w:t>Applied Sciences</w:t>
-      </w:r>
-    </w:p>
-    <w:p>
-      <w:pPr>
-        <w:ind w:firstLine="540"/>
-        <w:rPr>
-          <w:rFonts w:eastAsia="Times New Roman"/>
-          <w:sz w:val="24"/>
-          <w:szCs w:val="24"/>
-          <w:lang w:val="en-IN"/>
-        </w:rPr>
-      </w:pPr>
-      <w:r>
-        <w:rPr>
-          <w:rFonts w:eastAsia="Times New Roman"/>
-          <w:sz w:val="24"/>
-          <w:szCs w:val="24"/>
-          <w:lang w:val="en-IN"/>
-        </w:rPr>
-        <w:t>Central European Journal of Operations Research</w:t>
-      </w:r>
-    </w:p>
-    <w:p>
-      <w:pPr>
-        <w:ind w:firstLine="540"/>
-        <w:rPr>
-          <w:rFonts w:eastAsia="Times New Roman"/>
-          <w:sz w:val="24"/>
-          <w:szCs w:val="24"/>
-          <w:lang w:val="en-IN"/>
-        </w:rPr>
-      </w:pPr>
-      <w:r>
-        <w:rPr>
-          <w:rFonts w:eastAsia="Times New Roman"/>
-          <w:sz w:val="24"/>
-          <w:szCs w:val="24"/>
-          <w:lang w:val="en-IN"/>
-        </w:rPr>
-        <w:t>Civil Engineering and Environmental Systems</w:t>
-      </w:r>
-    </w:p>
-    <w:p>
-      <w:pPr>
-        <w:ind w:firstLine="540"/>
-        <w:rPr>
-          <w:rFonts w:eastAsia="Times New Roman"/>
-          <w:sz w:val="24"/>
-          <w:szCs w:val="24"/>
-          <w:lang w:val="en-IN"/>
-        </w:rPr>
-      </w:pPr>
-      <w:r>
-        <w:rPr>
-          <w:rFonts w:eastAsia="Times New Roman"/>
-          <w:sz w:val="24"/>
-          <w:szCs w:val="24"/>
-          <w:lang w:val="en-IN"/>
-        </w:rPr>
-        <w:t>Cogent Engineering</w:t>
-      </w:r>
-    </w:p>
-    <w:p>
-      <w:pPr>
-        <w:ind w:firstLine="540"/>
-        <w:rPr>
-          <w:rFonts w:eastAsia="Times New Roman"/>
-          <w:sz w:val="24"/>
-          <w:szCs w:val="24"/>
-          <w:lang w:val="en-IN"/>
-        </w:rPr>
-      </w:pPr>
-      <w:r>
-        <w:rPr>
-          <w:rFonts w:eastAsia="Times New Roman"/>
-          <w:sz w:val="24"/>
-          <w:szCs w:val="24"/>
-          <w:lang w:val="en-IN"/>
-        </w:rPr>
-        <w:t>Conference of Transportation Research Group of India</w:t>
-      </w:r>
-    </w:p>
-    <w:p>
-      <w:pPr>
-        <w:ind w:firstLine="540"/>
-        <w:rPr>
-          <w:rFonts w:eastAsia="Times New Roman"/>
-          <w:sz w:val="24"/>
-          <w:szCs w:val="24"/>
-          <w:lang w:val="en-IN"/>
-        </w:rPr>
-      </w:pPr>
-      <w:r>
-        <w:rPr>
-          <w:rFonts w:eastAsia="Times New Roman"/>
-          <w:sz w:val="24"/>
-          <w:szCs w:val="24"/>
-          <w:lang w:val="en-IN"/>
-        </w:rPr>
-        <w:t>Computers and Industrial Engineering</w:t>
-      </w:r>
-    </w:p>
-    <w:p>
-      <w:pPr>
-        <w:ind w:firstLine="540"/>
-        <w:rPr>
-          <w:rFonts w:eastAsia="Times New Roman"/>
-          <w:sz w:val="24"/>
-          <w:szCs w:val="24"/>
-          <w:lang w:val="en-IN"/>
-        </w:rPr>
-      </w:pPr>
-      <w:r>
-        <w:rPr>
-          <w:rFonts w:eastAsia="Times New Roman"/>
-          <w:sz w:val="24"/>
-          <w:szCs w:val="24"/>
-          <w:lang w:val="en-IN"/>
-        </w:rPr>
-        <w:t>IEEE Transactions on Transportation Electrification</w:t>
-      </w:r>
-    </w:p>
-    <w:p>
-      <w:pPr>
-        <w:ind w:firstLine="540"/>
-        <w:rPr>
-          <w:rFonts w:eastAsia="Times New Roman"/>
-          <w:sz w:val="24"/>
-          <w:szCs w:val="24"/>
-          <w:lang w:val="en-IN"/>
-        </w:rPr>
-      </w:pPr>
-      <w:r>
-        <w:rPr>
-          <w:rFonts w:eastAsia="Times New Roman"/>
-          <w:sz w:val="24"/>
-          <w:szCs w:val="24"/>
-          <w:lang w:val="en-IN"/>
-        </w:rPr>
-        <w:t>International Journal of Environmental Research and Public Health</w:t>
-      </w:r>
-    </w:p>
-    <w:p>
-      <w:pPr>
-        <w:ind w:firstLine="540"/>
-        <w:rPr>
-          <w:rFonts w:eastAsia="Times New Roman"/>
-          <w:sz w:val="24"/>
-          <w:szCs w:val="24"/>
-          <w:lang w:val="en-IN"/>
-        </w:rPr>
-      </w:pPr>
-      <w:r>
-        <w:rPr>
-          <w:rFonts w:eastAsia="Times New Roman"/>
-          <w:sz w:val="24"/>
-          <w:szCs w:val="24"/>
-          <w:lang w:val="en-IN"/>
-        </w:rPr>
-        <w:t>International Journal of Logistics</w:t>
-      </w:r>
-    </w:p>
-    <w:p>
-      <w:pPr>
-        <w:ind w:firstLine="540"/>
-        <w:rPr>
-          <w:rFonts w:eastAsia="Times New Roman"/>
-          <w:sz w:val="24"/>
-          <w:szCs w:val="24"/>
-          <w:lang w:val="en-IN"/>
-        </w:rPr>
-      </w:pPr>
-      <w:r>
-        <w:rPr>
-          <w:rFonts w:eastAsia="Times New Roman"/>
-          <w:sz w:val="24"/>
-          <w:szCs w:val="24"/>
-          <w:lang w:val="en-IN"/>
-        </w:rPr>
-        <w:t>International Journal of Systems Science: Operations &amp; Logistics</w:t>
-      </w:r>
-    </w:p>
-    <w:p>
-      <w:pPr>
-        <w:ind w:firstLine="540"/>
-        <w:rPr>
-          <w:rFonts w:eastAsia="Times New Roman"/>
-          <w:sz w:val="24"/>
-          <w:szCs w:val="24"/>
-          <w:lang w:val="en-IN"/>
-        </w:rPr>
-      </w:pPr>
-      <w:r>
-        <w:rPr>
-          <w:rFonts w:eastAsia="Times New Roman"/>
-          <w:sz w:val="24"/>
-          <w:szCs w:val="24"/>
-          <w:lang w:val="en-IN"/>
-        </w:rPr>
-        <w:t>Journal of Advanced Transportation</w:t>
-      </w:r>
-    </w:p>
-    <w:p>
-      <w:pPr>
-        <w:ind w:firstLine="540"/>
-        <w:rPr>
-          <w:rFonts w:eastAsia="Times New Roman"/>
-          <w:sz w:val="24"/>
-          <w:szCs w:val="24"/>
-          <w:lang w:val="en-IN"/>
-        </w:rPr>
-      </w:pPr>
-      <w:r>
-        <w:rPr>
-          <w:rFonts w:eastAsia="Times New Roman"/>
-          <w:sz w:val="24"/>
-          <w:szCs w:val="24"/>
-          <w:lang w:val="en-IN"/>
-        </w:rPr>
-        <w:t>Journal of The Institution of Engineers (India): Series A</w:t>
-      </w:r>
-    </w:p>
-    <w:p>
-      <w:pPr>
-        <w:ind w:firstLine="540"/>
-        <w:rPr>
-          <w:rFonts w:eastAsia="Times New Roman"/>
-          <w:sz w:val="24"/>
-          <w:szCs w:val="24"/>
-          <w:lang w:val="en-IN"/>
-        </w:rPr>
-      </w:pPr>
-      <w:r>
-        <w:rPr>
-          <w:rFonts w:eastAsia="Times New Roman"/>
-          <w:sz w:val="24"/>
-          <w:szCs w:val="24"/>
-          <w:lang w:val="en-IN"/>
-        </w:rPr>
-        <w:t>Networks and Spatial Economics</w:t>
-      </w:r>
-    </w:p>
-    <w:p>
-      <w:pPr>
-        <w:ind w:firstLine="540"/>
-        <w:rPr>
-          <w:rFonts w:eastAsia="Times New Roman"/>
-          <w:sz w:val="24"/>
-          <w:szCs w:val="24"/>
-          <w:lang w:val="en-IN"/>
-        </w:rPr>
-      </w:pPr>
-      <w:r>
-        <w:rPr>
-          <w:rFonts w:eastAsia="Times New Roman"/>
-          <w:sz w:val="24"/>
-          <w:szCs w:val="24"/>
-          <w:lang w:val="en-IN"/>
-        </w:rPr>
-        <w:t>NPJ Sustainable Mobility and Transport</w:t>
-      </w:r>
-    </w:p>
-    <w:p>
-      <w:pPr>
-        <w:ind w:firstLine="540"/>
-        <w:rPr>
-          <w:rFonts w:eastAsia="Times New Roman"/>
-          <w:sz w:val="24"/>
-          <w:szCs w:val="24"/>
-          <w:lang w:val="en-IN"/>
-        </w:rPr>
-      </w:pPr>
-      <w:r>
-        <w:rPr>
-          <w:rFonts w:eastAsia="Times New Roman"/>
-          <w:sz w:val="24"/>
-          <w:szCs w:val="24"/>
-          <w:lang w:val="en-IN"/>
-        </w:rPr>
-        <w:t>Sustainable Futures</w:t>
-      </w:r>
-    </w:p>
-    <w:p>
-      <w:pPr>
-        <w:ind w:firstLine="540"/>
-        <w:rPr>
-          <w:rFonts w:eastAsia="Times New Roman"/>
-          <w:sz w:val="24"/>
-          <w:szCs w:val="24"/>
-          <w:lang w:val="en-IN"/>
-        </w:rPr>
-      </w:pPr>
-      <w:r>
-        <w:rPr>
-          <w:rFonts w:eastAsia="Times New Roman"/>
-          <w:sz w:val="24"/>
-          <w:szCs w:val="24"/>
-          <w:lang w:val="en-IN"/>
-        </w:rPr>
-        <w:t>Sustainability</w:t>
-      </w:r>
-    </w:p>
-    <w:p>
-      <w:pPr>
-        <w:ind w:firstLine="540"/>
-        <w:rPr>
-          <w:rFonts w:eastAsia="Times New Roman"/>
-          <w:sz w:val="24"/>
-          <w:szCs w:val="24"/>
-          <w:lang w:val="en-IN"/>
-        </w:rPr>
-      </w:pPr>
-      <w:r>
-        <w:rPr>
-          <w:rFonts w:eastAsia="Times New Roman"/>
-          <w:sz w:val="24"/>
-          <w:szCs w:val="24"/>
-          <w:lang w:val="en-IN"/>
-        </w:rPr>
-        <w:t>Systems</w:t>
-      </w:r>
-    </w:p>
-    <w:p>
-      <w:pPr>
-        <w:ind w:firstLine="540"/>
-        <w:rPr>
-          <w:rFonts w:eastAsia="Times New Roman"/>
-          <w:sz w:val="24"/>
-          <w:szCs w:val="24"/>
-          <w:lang w:val="en-IN"/>
-        </w:rPr>
-      </w:pPr>
-      <w:r>
-        <w:rPr>
-          <w:rFonts w:eastAsia="Times New Roman"/>
-          <w:sz w:val="24"/>
-          <w:szCs w:val="24"/>
-          <w:lang w:val="en-IN"/>
-        </w:rPr>
-        <w:t>Transactions on Engineering Management</w:t>
-      </w:r>
-    </w:p>
-    <w:p>
-      <w:pPr>
-        <w:ind w:firstLine="540"/>
-        <w:rPr>
-          <w:rFonts w:eastAsia="Times New Roman"/>
-          <w:sz w:val="24"/>
-          <w:szCs w:val="24"/>
-          <w:lang w:val="en-IN"/>
-        </w:rPr>
-      </w:pPr>
-      <w:r>
-        <w:rPr>
-          <w:rFonts w:eastAsia="Times New Roman"/>
-          <w:sz w:val="24"/>
-          <w:szCs w:val="24"/>
-          <w:lang w:val="en-IN"/>
-        </w:rPr>
-        <w:t>Transport Policy</w:t>
-      </w:r>
-    </w:p>
-    <w:p>
-      <w:pPr>
-        <w:ind w:firstLine="540"/>
-        <w:rPr>
-          <w:rFonts w:eastAsia="Times New Roman"/>
-          <w:sz w:val="24"/>
-          <w:szCs w:val="24"/>
-          <w:lang w:val="en-IN"/>
-        </w:rPr>
-      </w:pPr>
-      <w:r>
-        <w:rPr>
-          <w:rFonts w:eastAsia="Times New Roman"/>
-          <w:sz w:val="24"/>
-          <w:szCs w:val="24"/>
-          <w:lang w:val="en-IN"/>
-        </w:rPr>
-        <w:t>Transportation in Developing Economies</w:t>
-      </w:r>
-    </w:p>
-    <w:p>
-      <w:pPr>
-        <w:ind w:firstLine="540"/>
-        <w:rPr>
-          <w:rFonts w:eastAsia="Times New Roman"/>
-          <w:sz w:val="24"/>
-          <w:szCs w:val="24"/>
-          <w:lang w:val="en-IN"/>
-        </w:rPr>
-      </w:pPr>
-      <w:r>
-        <w:rPr>
-          <w:rFonts w:eastAsia="Times New Roman"/>
-          <w:sz w:val="24"/>
-          <w:szCs w:val="24"/>
-          <w:lang w:val="en-IN"/>
-        </w:rPr>
-        <w:t xml:space="preserve">Transportation Letters: </w:t>
-      </w:r>
-      <w:r>
-        <w:rPr>
-          <w:rFonts w:eastAsia="Times New Roman"/>
-          <w:sz w:val="24"/>
-          <w:szCs w:val="24"/>
-          <w:lang w:val="en-IN"/>
-        </w:rPr>
-        <w:t xml:space="preserve">The </w:t>
-      </w:r>
-      <w:r>
-        <w:rPr>
-          <w:rFonts w:eastAsia="Times New Roman"/>
-          <w:sz w:val="24"/>
-          <w:szCs w:val="24"/>
-          <w:lang w:val="en-IN"/>
-        </w:rPr>
-        <w:t>International Journal of Transportation</w:t>
-      </w:r>
-      <w:r>
-        <w:rPr>
-          <w:rFonts w:eastAsia="Times New Roman"/>
-          <w:sz w:val="24"/>
-          <w:szCs w:val="24"/>
-          <w:lang w:val="en-IN"/>
-        </w:rPr>
-        <w:t xml:space="preserve"> </w:t>
-      </w:r>
-      <w:r>
-        <w:rPr>
-          <w:rFonts w:eastAsia="Times New Roman"/>
-          <w:sz w:val="24"/>
-          <w:szCs w:val="24"/>
-          <w:lang w:val="en-IN"/>
-        </w:rPr>
-        <w:t>Research</w:t>
-      </w:r>
-    </w:p>
-    <w:p>
-      <w:pPr>
-        <w:ind w:firstLine="540"/>
-        <w:rPr>
-          <w:rFonts w:eastAsia="Times New Roman"/>
-          <w:sz w:val="24"/>
-          <w:szCs w:val="24"/>
-          <w:lang w:val="en-IN"/>
-        </w:rPr>
-      </w:pPr>
-      <w:r>
-        <w:rPr>
-          <w:rFonts w:eastAsia="Times New Roman"/>
-          <w:sz w:val="24"/>
-          <w:szCs w:val="24"/>
-          <w:lang w:val="en-IN"/>
-        </w:rPr>
-        <w:t>Transportation Planning and Implementation Methodologies for Developing Countries</w:t>
-      </w:r>
-    </w:p>
-    <w:p>
-      <w:pPr>
-        <w:ind w:firstLine="540"/>
-        <w:rPr>
-          <w:rFonts w:eastAsia="Times New Roman"/>
-          <w:sz w:val="24"/>
-          <w:szCs w:val="24"/>
-          <w:lang w:val="en-IN"/>
-        </w:rPr>
-      </w:pPr>
-      <w:r>
-        <w:rPr>
-          <w:rFonts w:eastAsia="Times New Roman"/>
-          <w:sz w:val="24"/>
-          <w:szCs w:val="24"/>
-          <w:lang w:val="en-IN"/>
-        </w:rPr>
-        <w:t>Transportation Planning and Technology</w:t>
-      </w:r>
-    </w:p>
-    <w:p>
-      <w:pPr>
-        <w:ind w:firstLine="540"/>
-        <w:rPr>
-          <w:rFonts w:eastAsia="Times New Roman"/>
-          <w:sz w:val="24"/>
-          <w:szCs w:val="24"/>
-          <w:lang w:val="en-IN"/>
-        </w:rPr>
-      </w:pPr>
-      <w:r>
-        <w:rPr>
-          <w:rFonts w:eastAsia="Times New Roman"/>
-          <w:sz w:val="24"/>
-          <w:szCs w:val="24"/>
-          <w:lang w:val="en-IN"/>
-        </w:rPr>
-        <w:t>Transportation Research Board Annual Meeting</w:t>
-      </w:r>
-    </w:p>
-    <w:p>
-      <w:pPr>
-        <w:ind w:firstLine="540"/>
-        <w:rPr>
-          <w:rFonts w:eastAsia="Times New Roman"/>
-          <w:sz w:val="24"/>
-          <w:szCs w:val="24"/>
-          <w:lang w:val="en-IN"/>
-        </w:rPr>
-      </w:pPr>
-      <w:r>
-        <w:rPr>
-          <w:rFonts w:eastAsia="Times New Roman"/>
-          <w:sz w:val="24"/>
-          <w:szCs w:val="24"/>
-          <w:lang w:val="en-IN"/>
-        </w:rPr>
-        <w:t>Transportation Research Interdisciplinary Perspectives</w:t>
-      </w:r>
-    </w:p>
-    <w:p>
-      <w:pPr>
-        <w:ind w:firstLine="540"/>
-        <w:rPr>
-          <w:rFonts w:eastAsia="Times New Roman"/>
-          <w:sz w:val="24"/>
-          <w:szCs w:val="24"/>
-          <w:lang w:val="en-IN"/>
-        </w:rPr>
-      </w:pPr>
-      <w:r>
-        <w:rPr>
-          <w:rFonts w:eastAsia="Times New Roman"/>
-          <w:sz w:val="24"/>
-          <w:szCs w:val="24"/>
-          <w:lang w:val="en-IN"/>
-        </w:rPr>
-        <w:t>Transportation Research Part A: Policy and Planning</w:t>
-      </w:r>
-    </w:p>
-    <w:p>
-      <w:pPr>
-        <w:ind w:firstLine="540"/>
-        <w:rPr>
-          <w:rFonts w:eastAsia="Times New Roman"/>
-          <w:sz w:val="24"/>
-          <w:szCs w:val="24"/>
-          <w:lang w:val="en-IN"/>
-        </w:rPr>
-      </w:pPr>
-      <w:r>
-        <w:rPr>
-          <w:rFonts w:eastAsia="Times New Roman"/>
-          <w:sz w:val="24"/>
-          <w:szCs w:val="24"/>
-          <w:lang w:val="en-IN"/>
-        </w:rPr>
-        <w:t>Transportation Research Part B: Methodological</w:t>
-      </w:r>
-    </w:p>
-    <w:p>
-      <w:pPr>
-        <w:ind w:firstLine="540"/>
-        <w:rPr>
-          <w:rFonts w:eastAsia="Times New Roman"/>
-          <w:sz w:val="24"/>
-          <w:szCs w:val="24"/>
-          <w:lang w:val="en-IN"/>
-        </w:rPr>
-      </w:pPr>
-      <w:r>
-        <w:rPr>
-          <w:rFonts w:eastAsia="Times New Roman"/>
-          <w:sz w:val="24"/>
-          <w:szCs w:val="24"/>
-          <w:lang w:val="en-IN"/>
-        </w:rPr>
-        <w:t>Transportation Research Part C: Emerging Technologies</w:t>
-      </w:r>
-    </w:p>
-    <w:p>
-      <w:pPr>
-        <w:ind w:firstLine="540"/>
-        <w:rPr>
-          <w:rFonts w:eastAsia="Times New Roman"/>
-          <w:sz w:val="24"/>
-          <w:szCs w:val="24"/>
-          <w:lang w:val="en-IN"/>
-        </w:rPr>
-      </w:pPr>
-      <w:r>
-        <w:rPr>
-          <w:rFonts w:eastAsia="Times New Roman"/>
-          <w:sz w:val="24"/>
-          <w:szCs w:val="24"/>
-          <w:lang w:val="en-IN"/>
-        </w:rPr>
-        <w:t>Transportation Research Part D: Transport and Environment</w:t>
-      </w:r>
-    </w:p>
-    <w:p>
-      <w:pPr>
-        <w:ind w:firstLine="540"/>
-        <w:rPr>
-          <w:rFonts w:eastAsia="Times New Roman"/>
-          <w:sz w:val="24"/>
-          <w:szCs w:val="24"/>
-          <w:lang w:val="en-IN"/>
-        </w:rPr>
-      </w:pPr>
-      <w:r>
-        <w:rPr>
-          <w:rFonts w:eastAsia="Times New Roman"/>
-          <w:sz w:val="24"/>
-          <w:szCs w:val="24"/>
-          <w:lang w:val="en-IN"/>
-        </w:rPr>
-        <w:t>Transportation Research Part E: Logistics and Transportation Review</w:t>
-      </w:r>
-    </w:p>
-    <w:p>
-      <w:pPr>
-        <w:ind w:firstLine="540"/>
-        <w:rPr>
-          <w:rFonts w:eastAsia="Times New Roman"/>
-          <w:sz w:val="24"/>
-          <w:szCs w:val="24"/>
-          <w:lang w:val="en-IN"/>
-        </w:rPr>
-      </w:pPr>
-      <w:r>
-        <w:rPr>
-          <w:rFonts w:eastAsia="Times New Roman"/>
-          <w:sz w:val="24"/>
-          <w:szCs w:val="24"/>
-          <w:lang w:val="en-IN"/>
-        </w:rPr>
-        <w:t>Transportation Research Record</w:t>
-      </w:r>
-    </w:p>
-    <w:p>
-      <w:pPr>
-        <w:ind w:firstLine="540"/>
-        <w:rPr>
-          <w:rFonts w:eastAsia="Times New Roman"/>
-          <w:sz w:val="24"/>
-          <w:szCs w:val="24"/>
-          <w:lang w:val="en-IN"/>
-        </w:rPr>
-      </w:pPr>
-      <w:r>
-        <w:rPr>
-          <w:rFonts w:eastAsia="Times New Roman"/>
-          <w:sz w:val="24"/>
-          <w:szCs w:val="24"/>
-          <w:lang w:val="en-IN"/>
-        </w:rPr>
-        <w:t>Trauma care</w:t>
-      </w:r>
-    </w:p>
-    <w:p>
-      <w:pPr>
-        <w:ind w:firstLine="540"/>
-        <w:rPr>
-          <w:rFonts w:eastAsia="Times New Roman"/>
-          <w:sz w:val="24"/>
-          <w:szCs w:val="24"/>
-          <w:lang w:val="en-IN"/>
-        </w:rPr>
-      </w:pPr>
-      <w:r>
-        <w:rPr>
-          <w:rFonts w:eastAsia="Times New Roman"/>
-          <w:sz w:val="24"/>
-          <w:szCs w:val="24"/>
-          <w:lang w:val="en-IN"/>
-        </w:rPr>
-        <w:t>Urban Transitions</w:t>
-      </w:r>
-    </w:p>
-    <w:p>
-      <w:pPr>
-        <w:ind w:firstLine="540"/>
-        <w:rPr>
-          <w:rFonts w:eastAsia="Times New Roman"/>
-          <w:sz w:val="24"/>
-          <w:szCs w:val="24"/>
-          <w:lang w:val="en-IN"/>
-        </w:rPr>
-      </w:pPr>
-      <w:r>
-        <w:rPr>
-          <w:rFonts w:eastAsia="Times New Roman"/>
-          <w:sz w:val="24"/>
-          <w:szCs w:val="24"/>
-          <w:lang w:val="en-IN"/>
-        </w:rPr>
-        <w:t>World Symposium on Transport and Land Use Research</w:t>
-      </w:r>
-    </w:p>
-    <w:p>
-      <w:pPr>
-        <w:pStyle w:val="ListParagraph"/>
-        <w:rPr>
-          <w:rFonts w:ascii="Calibri Light" w:eastAsia="Calibri Light" w:hAnsi="Calibri Light" w:cs="Calibri Light"/>
-          <w:sz w:val="24"/>
-          <w:szCs w:val="24"/>
-          <w:lang w:val="en-IN"/>
-        </w:rPr>
-      </w:pPr>
-    </w:p>
-    <w:p>
-      <w:pPr>
-        <w:ind w:left="360"/>
+        <w:t>Ph</w:t>
+      </w:r>
+      <w:r>
         <w:rPr>
           <w:rFonts w:eastAsia="Times New Roman"/>
           <w:b/>
@@ -5594,7 +6009,8 @@
           <w:szCs w:val="24"/>
           <w:lang w:val="en-IN"/>
         </w:rPr>
-      </w:pPr>
+        <w:t>.</w:t>
+      </w:r>
       <w:r>
         <w:rPr>
           <w:rFonts w:eastAsia="Times New Roman"/>
@@ -5604,29 +6020,202 @@
           <w:szCs w:val="24"/>
           <w:lang w:val="en-IN"/>
         </w:rPr>
-        <w:t>Supervisor</w:t>
-      </w:r>
-    </w:p>
-    <w:p>
-      <w:pPr>
-        <w:ind w:firstLine="540"/>
-        <w:rPr>
+        <w:t>D</w:t>
+      </w:r>
+      <w:r>
+        <w:rPr>
+          <w:rFonts w:eastAsia="Times New Roman"/>
           <w:b/>
           <w:bCs/>
           <w:sz w:val="24"/>
           <w:szCs w:val="24"/>
           <w:lang w:val="en-IN"/>
         </w:rPr>
-      </w:pPr>
-      <w:r>
-        <w:rPr>
+        <w:t>.</w:t>
+      </w:r>
+      <w:r>
+        <w:rPr>
+          <w:rFonts w:eastAsia="Times New Roman"/>
           <w:b/>
           <w:bCs/>
           <w:sz w:val="24"/>
           <w:szCs w:val="24"/>
           <w:lang w:val="en-IN"/>
         </w:rPr>
-        <w:t>Postdoc</w:t>
+        <w:t xml:space="preserve"> </w:t>
+      </w:r>
+    </w:p>
+    <w:p>
+      <w:pPr>
+        <w:ind w:firstLine="720"/>
+        <w:rPr>
+          <w:rFonts w:eastAsia="Times New Roman"/>
+          <w:sz w:val="24"/>
+          <w:szCs w:val="24"/>
+          <w:lang w:val="en-IN"/>
+        </w:rPr>
+      </w:pPr>
+      <w:r>
+        <w:rPr>
+          <w:rFonts w:eastAsia="Times New Roman"/>
+          <w:sz w:val="24"/>
+          <w:szCs w:val="24"/>
+          <w:lang w:val="en-IN"/>
+        </w:rPr>
+        <w:t>Blessy K. (</w:t>
+      </w:r>
+      <w:r>
+        <w:rPr>
+          <w:rFonts w:eastAsia="Times New Roman"/>
+          <w:sz w:val="24"/>
+          <w:szCs w:val="24"/>
+          <w:lang w:val="en-IN"/>
+        </w:rPr>
+        <w:t>2024-</w:t>
+      </w:r>
+      <w:r>
+        <w:rPr>
+          <w:rFonts w:eastAsia="Times New Roman"/>
+          <w:sz w:val="24"/>
+          <w:szCs w:val="24"/>
+          <w:lang w:val="en-IN"/>
+        </w:rPr>
+        <w:t>present</w:t>
+      </w:r>
+      <w:r>
+        <w:rPr>
+          <w:rFonts w:eastAsia="Times New Roman"/>
+          <w:sz w:val="24"/>
+          <w:szCs w:val="24"/>
+          <w:lang w:val="en-IN"/>
+        </w:rPr>
+        <w:t>)</w:t>
+      </w:r>
+    </w:p>
+    <w:p>
+      <w:pPr>
+        <w:ind w:firstLine="720"/>
+        <w:rPr>
+          <w:rFonts w:eastAsia="Times New Roman"/>
+          <w:sz w:val="24"/>
+          <w:szCs w:val="24"/>
+          <w:lang w:val="en-IN"/>
+        </w:rPr>
+      </w:pPr>
+      <w:r>
+        <w:rPr>
+          <w:rFonts w:eastAsia="Times New Roman"/>
+          <w:sz w:val="24"/>
+          <w:szCs w:val="24"/>
+          <w:lang w:val="en-IN"/>
+        </w:rPr>
+        <w:lastRenderedPageBreak/>
+        <w:t>Stephen Babu (</w:t>
+      </w:r>
+      <w:r>
+        <w:rPr>
+          <w:rFonts w:eastAsia="Times New Roman"/>
+          <w:sz w:val="24"/>
+          <w:szCs w:val="24"/>
+          <w:lang w:val="en-IN"/>
+        </w:rPr>
+        <w:t>2025-</w:t>
+      </w:r>
+      <w:r>
+        <w:rPr>
+          <w:rFonts w:eastAsia="Times New Roman"/>
+          <w:sz w:val="24"/>
+          <w:szCs w:val="24"/>
+          <w:lang w:val="en-IN"/>
+        </w:rPr>
+        <w:t>present</w:t>
+      </w:r>
+      <w:r>
+        <w:rPr>
+          <w:rFonts w:eastAsia="Times New Roman"/>
+          <w:sz w:val="24"/>
+          <w:szCs w:val="24"/>
+          <w:lang w:val="en-IN"/>
+        </w:rPr>
+        <w:t>)</w:t>
+      </w:r>
+    </w:p>
+    <w:p>
+      <w:pPr>
+        <w:ind w:firstLine="720"/>
+        <w:rPr>
+          <w:rFonts w:eastAsia="Times New Roman"/>
+          <w:sz w:val="24"/>
+          <w:szCs w:val="24"/>
+          <w:lang w:val="en-IN"/>
+        </w:rPr>
+      </w:pPr>
+      <w:proofErr w:type="spellStart"/>
+      <w:r>
+        <w:rPr>
+          <w:rFonts w:eastAsia="Times New Roman"/>
+          <w:sz w:val="24"/>
+          <w:szCs w:val="24"/>
+          <w:lang w:val="en-IN"/>
+        </w:rPr>
+        <w:t>Nagasai</w:t>
+      </w:r>
+      <w:proofErr w:type="spellEnd"/>
+      <w:r>
+        <w:rPr>
+          <w:rFonts w:eastAsia="Times New Roman"/>
+          <w:sz w:val="24"/>
+          <w:szCs w:val="24"/>
+          <w:lang w:val="en-IN"/>
+        </w:rPr>
+        <w:t xml:space="preserve"> </w:t>
+      </w:r>
+      <w:proofErr w:type="spellStart"/>
+      <w:r>
+        <w:rPr>
+          <w:rFonts w:eastAsia="Times New Roman"/>
+          <w:sz w:val="24"/>
+          <w:szCs w:val="24"/>
+          <w:lang w:val="en-IN"/>
+        </w:rPr>
+        <w:t>Panidarapu</w:t>
+      </w:r>
+      <w:proofErr w:type="spellEnd"/>
+      <w:r>
+        <w:rPr>
+          <w:rFonts w:eastAsia="Times New Roman"/>
+          <w:sz w:val="24"/>
+          <w:szCs w:val="24"/>
+          <w:lang w:val="en-IN"/>
+        </w:rPr>
+        <w:t xml:space="preserve"> (</w:t>
+      </w:r>
+      <w:r>
+        <w:rPr>
+          <w:rFonts w:eastAsia="Times New Roman"/>
+          <w:sz w:val="24"/>
+          <w:szCs w:val="24"/>
+          <w:lang w:val="en-IN"/>
+        </w:rPr>
+        <w:t>2025-</w:t>
+      </w:r>
+      <w:r>
+        <w:rPr>
+          <w:rFonts w:eastAsia="Times New Roman"/>
+          <w:sz w:val="24"/>
+          <w:szCs w:val="24"/>
+          <w:lang w:val="en-IN"/>
+        </w:rPr>
+        <w:t>present</w:t>
+      </w:r>
+      <w:r>
+        <w:rPr>
+          <w:rFonts w:eastAsia="Times New Roman"/>
+          <w:sz w:val="24"/>
+          <w:szCs w:val="24"/>
+          <w:lang w:val="en-IN"/>
+        </w:rPr>
+        <w:t>)</w:t>
       </w:r>
     </w:p>
     <w:p>
@@ -5638,6 +6227,7 @@
           <w:lang w:val="en-IN"/>
         </w:rPr>
       </w:pPr>
+      <w:proofErr w:type="spellStart"/>
       <w:r>
         <w:rPr>
           <w:rFonts w:eastAsia="Times New Roman"/>
@@ -5647,7 +6237,7 @@
           <w:szCs w:val="24"/>
           <w:lang w:val="en-IN"/>
         </w:rPr>
-        <w:t>Ph</w:t>
+        <w:t>M</w:t>
       </w:r>
       <w:r>
         <w:rPr>
@@ -5669,8 +6259,9 @@
           <w:szCs w:val="24"/>
           <w:lang w:val="en-IN"/>
         </w:rPr>
-        <w:t>D</w:t>
-      </w:r>
+        <w:t>Tech</w:t>
+      </w:r>
+      <w:proofErr w:type="spellEnd"/>
       <w:r>
         <w:rPr>
           <w:rFonts w:eastAsia="Times New Roman"/>
@@ -5711,25 +6302,16 @@
           <w:szCs w:val="24"/>
           <w:lang w:val="en-IN"/>
         </w:rPr>
-        <w:t>Blessy K. (</w:t>
-      </w:r>
-      <w:r>
-        <w:rPr>
-          <w:rFonts w:eastAsia="Times New Roman"/>
-          <w:sz w:val="24"/>
-          <w:szCs w:val="24"/>
-          <w:lang w:val="en-IN"/>
-        </w:rPr>
-        <w:t>2024-</w:t>
-      </w:r>
-      <w:r>
-        <w:rPr>
-          <w:rFonts w:eastAsia="Times New Roman"/>
-          <w:sz w:val="24"/>
-          <w:szCs w:val="24"/>
-          <w:lang w:val="en-IN"/>
-        </w:rPr>
-        <w:t>present</w:t>
+        <w:t>Varun A. (202</w:t>
+      </w:r>
+      <w:r>
+        <w:rPr>
+          <w:rFonts w:eastAsia="Times New Roman"/>
+          <w:sz w:val="24"/>
+          <w:szCs w:val="24"/>
+          <w:lang w:val="en-IN"/>
+        </w:rPr>
+        <w:t>4-25</w:t>
       </w:r>
       <w:r>
         <w:rPr>
@@ -5758,7 +6340,7 @@
           <w:szCs w:val="24"/>
           <w:lang w:val="en-IN"/>
         </w:rPr>
-        <w:t>Stephen Babu (</w:t>
+        <w:t>Harshvardhan Shivram Ket (</w:t>
       </w:r>
       <w:r>
         <w:rPr>
@@ -5776,7 +6358,7 @@
           <w:szCs w:val="24"/>
           <w:lang w:val="en-IN"/>
         </w:rPr>
-        <w:t>present</w:t>
+        <w:t>26</w:t>
       </w:r>
       <w:r>
         <w:rPr>
@@ -5798,45 +6380,14 @@
           <w:lang w:val="en-IN"/>
         </w:rPr>
       </w:pPr>
-      <w:proofErr w:type="spellStart"/>
-      <w:r>
-        <w:rPr>
-          <w:rFonts w:eastAsia="Times New Roman"/>
-          <w:sz w:val="24"/>
-          <w:szCs w:val="24"/>
-          <w:lang w:val="en-IN"/>
-        </w:rPr>
-        <w:t>Nagasai</w:t>
-      </w:r>
-      <w:proofErr w:type="spellEnd"/>
-      <w:r>
-        <w:rPr>
-          <w:rFonts w:eastAsia="Times New Roman"/>
-          <w:sz w:val="24"/>
-          <w:szCs w:val="24"/>
-          <w:lang w:val="en-IN"/>
-        </w:rPr>
-        <w:t xml:space="preserve"> </w:t>
-      </w:r>
-      <w:proofErr w:type="spellStart"/>
-      <w:r>
-        <w:rPr>
-          <w:rFonts w:eastAsia="Times New Roman"/>
-          <w:sz w:val="24"/>
-          <w:szCs w:val="24"/>
-          <w:lang w:val="en-IN"/>
-        </w:rPr>
-        <w:t>Panidarapu</w:t>
-      </w:r>
-      <w:proofErr w:type="spellEnd"/>
-      <w:r>
-        <w:rPr>
-          <w:rFonts w:eastAsia="Times New Roman"/>
-          <w:sz w:val="24"/>
-          <w:szCs w:val="24"/>
-          <w:lang w:val="en-IN"/>
-        </w:rPr>
-        <w:t xml:space="preserve"> (</w:t>
+      <w:r>
+        <w:rPr>
+          <w:rFonts w:eastAsia="Times New Roman"/>
+          <w:sz w:val="24"/>
+          <w:szCs w:val="24"/>
+          <w:lang w:val="en-IN"/>
+        </w:rPr>
+        <w:t>Aditya Aggarwal (</w:t>
       </w:r>
       <w:r>
         <w:rPr>
@@ -5854,7 +6405,7 @@
           <w:szCs w:val="24"/>
           <w:lang w:val="en-IN"/>
         </w:rPr>
-        <w:t>present</w:t>
+        <w:t>26</w:t>
       </w:r>
       <w:r>
         <w:rPr>
@@ -5875,7 +6426,6 @@
           <w:lang w:val="en-IN"/>
         </w:rPr>
       </w:pPr>
-      <w:proofErr w:type="spellStart"/>
       <w:r>
         <w:rPr>
           <w:rFonts w:eastAsia="Times New Roman"/>
@@ -5885,7 +6435,7 @@
           <w:szCs w:val="24"/>
           <w:lang w:val="en-IN"/>
         </w:rPr>
-        <w:t>M</w:t>
+        <w:t>B</w:t>
       </w:r>
       <w:r>
         <w:rPr>
@@ -5909,7 +6459,6 @@
         </w:rPr>
         <w:t>Tech</w:t>
       </w:r>
-      <w:proofErr w:type="spellEnd"/>
       <w:r>
         <w:rPr>
           <w:rFonts w:eastAsia="Times New Roman"/>
@@ -5921,7 +6470,123 @@
         </w:rPr>
         <w:t>.</w:t>
       </w:r>
-      <w:r>
+    </w:p>
+    <w:p>
+      <w:pPr>
+        <w:ind w:firstLine="720"/>
+        <w:rPr>
+          <w:rFonts w:eastAsia="Times New Roman"/>
+          <w:sz w:val="24"/>
+          <w:szCs w:val="24"/>
+          <w:lang w:val="en-IN"/>
+        </w:rPr>
+      </w:pPr>
+      <w:r>
+        <w:rPr>
+          <w:rFonts w:eastAsia="Times New Roman"/>
+          <w:sz w:val="24"/>
+          <w:szCs w:val="24"/>
+          <w:lang w:val="en-IN"/>
+        </w:rPr>
+        <w:t>Arvind Vidhyashankar (</w:t>
+      </w:r>
+      <w:r>
+        <w:rPr>
+          <w:rFonts w:eastAsia="Times New Roman"/>
+          <w:sz w:val="24"/>
+          <w:szCs w:val="24"/>
+          <w:lang w:val="en-IN"/>
+        </w:rPr>
+        <w:t>2025-</w:t>
+      </w:r>
+      <w:r>
+        <w:rPr>
+          <w:rFonts w:eastAsia="Times New Roman"/>
+          <w:sz w:val="24"/>
+          <w:szCs w:val="24"/>
+          <w:lang w:val="en-IN"/>
+        </w:rPr>
+        <w:t>26</w:t>
+      </w:r>
+      <w:r>
+        <w:rPr>
+          <w:rFonts w:eastAsia="Times New Roman"/>
+          <w:sz w:val="24"/>
+          <w:szCs w:val="24"/>
+          <w:lang w:val="en-IN"/>
+        </w:rPr>
+        <w:t>)</w:t>
+      </w:r>
+    </w:p>
+    <w:p>
+      <w:pPr>
+        <w:ind w:firstLine="720"/>
+        <w:rPr>
+          <w:rFonts w:eastAsia="Times New Roman"/>
+          <w:sz w:val="24"/>
+          <w:szCs w:val="24"/>
+          <w:lang w:val="en-IN"/>
+        </w:rPr>
+      </w:pPr>
+      <w:r>
+        <w:rPr>
+          <w:rFonts w:eastAsia="Times New Roman"/>
+          <w:sz w:val="24"/>
+          <w:szCs w:val="24"/>
+          <w:lang w:val="en-IN"/>
+        </w:rPr>
+        <w:t xml:space="preserve">Om </w:t>
+      </w:r>
+      <w:proofErr w:type="spellStart"/>
+      <w:r>
+        <w:rPr>
+          <w:rFonts w:eastAsia="Times New Roman"/>
+          <w:sz w:val="24"/>
+          <w:szCs w:val="24"/>
+          <w:lang w:val="en-IN"/>
+        </w:rPr>
+        <w:t>Ramavtar</w:t>
+      </w:r>
+      <w:proofErr w:type="spellEnd"/>
+      <w:r>
+        <w:rPr>
+          <w:rFonts w:eastAsia="Times New Roman"/>
+          <w:sz w:val="24"/>
+          <w:szCs w:val="24"/>
+          <w:lang w:val="en-IN"/>
+        </w:rPr>
+        <w:t xml:space="preserve"> Yadav (</w:t>
+      </w:r>
+      <w:r>
+        <w:rPr>
+          <w:rFonts w:eastAsia="Times New Roman"/>
+          <w:sz w:val="24"/>
+          <w:szCs w:val="24"/>
+          <w:lang w:val="en-IN"/>
+        </w:rPr>
+        <w:t>2025-</w:t>
+      </w:r>
+      <w:r>
+        <w:rPr>
+          <w:rFonts w:eastAsia="Times New Roman"/>
+          <w:sz w:val="24"/>
+          <w:szCs w:val="24"/>
+          <w:lang w:val="en-IN"/>
+        </w:rPr>
+        <w:t>26</w:t>
+      </w:r>
+      <w:r>
+        <w:rPr>
+          <w:rFonts w:eastAsia="Times New Roman"/>
+          <w:sz w:val="24"/>
+          <w:szCs w:val="24"/>
+          <w:lang w:val="en-IN"/>
+        </w:rPr>
+        <w:t>)</w:t>
+      </w:r>
+    </w:p>
+    <w:p>
+      <w:pPr>
         <w:rPr>
           <w:rFonts w:eastAsia="Times New Roman"/>
           <w:b/>
@@ -5930,144 +6595,11 @@
           <w:szCs w:val="24"/>
           <w:lang w:val="en-IN"/>
         </w:rPr>
-        <w:t xml:space="preserve"> </w:t>
-      </w:r>
-    </w:p>
-    <w:p>
-      <w:pPr>
-        <w:ind w:firstLine="720"/>
-        <w:rPr>
-          <w:rFonts w:eastAsia="Times New Roman"/>
-          <w:sz w:val="24"/>
-          <w:szCs w:val="24"/>
-          <w:lang w:val="en-IN"/>
-        </w:rPr>
-      </w:pPr>
-      <w:r>
-        <w:rPr>
-          <w:rFonts w:eastAsia="Times New Roman"/>
-          <w:sz w:val="24"/>
-          <w:szCs w:val="24"/>
-          <w:lang w:val="en-IN"/>
-        </w:rPr>
-        <w:t>Varun A. (202</w:t>
-      </w:r>
-      <w:r>
-        <w:rPr>
-          <w:rFonts w:eastAsia="Times New Roman"/>
-          <w:sz w:val="24"/>
-          <w:szCs w:val="24"/>
-          <w:lang w:val="en-IN"/>
-        </w:rPr>
-        <w:t>4-25</w:t>
-      </w:r>
-      <w:r>
-        <w:rPr>
-          <w:rFonts w:eastAsia="Times New Roman"/>
-          <w:sz w:val="24"/>
-          <w:szCs w:val="24"/>
-          <w:lang w:val="en-IN"/>
-        </w:rPr>
-        <w:t>)</w:t>
-      </w:r>
-    </w:p>
-    <w:p>
-      <w:pPr>
-        <w:ind w:firstLine="720"/>
-        <w:rPr>
-          <w:rFonts w:eastAsia="Times New Roman"/>
-          <w:sz w:val="24"/>
-          <w:szCs w:val="24"/>
-          <w:lang w:val="en-IN"/>
-        </w:rPr>
-      </w:pPr>
-      <w:r>
-        <w:rPr>
-          <w:rFonts w:eastAsia="Times New Roman"/>
-          <w:sz w:val="24"/>
-          <w:szCs w:val="24"/>
-          <w:lang w:val="en-IN"/>
-        </w:rPr>
-        <w:t>Harshvardhan Shivram Ket (</w:t>
-      </w:r>
-      <w:r>
-        <w:rPr>
-          <w:rFonts w:eastAsia="Times New Roman"/>
-          <w:sz w:val="24"/>
-          <w:szCs w:val="24"/>
-          <w:lang w:val="en-IN"/>
-        </w:rPr>
-        <w:t>2025-</w:t>
-      </w:r>
-      <w:r>
-        <w:rPr>
-          <w:rFonts w:eastAsia="Times New Roman"/>
-          <w:sz w:val="24"/>
-          <w:szCs w:val="24"/>
-          <w:lang w:val="en-IN"/>
-        </w:rPr>
-        <w:t>26</w:t>
-      </w:r>
-      <w:r>
-        <w:rPr>
-          <w:rFonts w:eastAsia="Times New Roman"/>
-          <w:sz w:val="24"/>
-          <w:szCs w:val="24"/>
-          <w:lang w:val="en-IN"/>
-        </w:rPr>
-        <w:t>)</w:t>
-      </w:r>
-    </w:p>
-    <w:p>
-      <w:pPr>
-        <w:ind w:firstLine="720"/>
-        <w:rPr>
-          <w:rFonts w:eastAsia="Times New Roman"/>
-          <w:sz w:val="24"/>
-          <w:szCs w:val="24"/>
-          <w:lang w:val="en-IN"/>
-        </w:rPr>
-      </w:pPr>
-      <w:r>
-        <w:rPr>
-          <w:rFonts w:eastAsia="Times New Roman"/>
-          <w:sz w:val="24"/>
-          <w:szCs w:val="24"/>
-          <w:lang w:val="en-IN"/>
-        </w:rPr>
-        <w:t>Aditya Aggarwal (</w:t>
-      </w:r>
-      <w:r>
-        <w:rPr>
-          <w:rFonts w:eastAsia="Times New Roman"/>
-          <w:sz w:val="24"/>
-          <w:szCs w:val="24"/>
-          <w:lang w:val="en-IN"/>
-        </w:rPr>
-        <w:t>2025-</w:t>
-      </w:r>
-      <w:r>
-        <w:rPr>
-          <w:rFonts w:eastAsia="Times New Roman"/>
-          <w:sz w:val="24"/>
-          <w:szCs w:val="24"/>
-          <w:lang w:val="en-IN"/>
-        </w:rPr>
-        <w:t>26</w:t>
-      </w:r>
-      <w:r>
-        <w:rPr>
-          <w:rFonts w:eastAsia="Times New Roman"/>
-          <w:sz w:val="24"/>
-          <w:szCs w:val="24"/>
-          <w:lang w:val="en-IN"/>
-        </w:rPr>
-        <w:t>)</w:t>
-      </w:r>
-    </w:p>
-    <w:p>
-      <w:pPr>
-        <w:ind w:left="360" w:firstLine="180"/>
+      </w:pPr>
+    </w:p>
+    <w:p>
+      <w:pPr>
+        <w:ind w:left="360"/>
         <w:rPr>
           <w:sz w:val="20"/>
           <w:szCs w:val="20"/>
@@ -6083,7 +6615,7 @@
           <w:szCs w:val="24"/>
           <w:lang w:val="en-IN"/>
         </w:rPr>
-        <w:t>B</w:t>
+        <w:t xml:space="preserve">Course </w:t>
       </w:r>
       <w:r>
         <w:rPr>
@@ -6094,211 +6626,6 @@
           <w:szCs w:val="24"/>
           <w:lang w:val="en-IN"/>
         </w:rPr>
-        <w:t>.</w:t>
-      </w:r>
-      <w:r>
-        <w:rPr>
-          <w:rFonts w:eastAsia="Times New Roman"/>
-          <w:b/>
-          <w:bCs/>
-          <w:sz w:val="24"/>
-          <w:szCs w:val="24"/>
-          <w:lang w:val="en-IN"/>
-        </w:rPr>
-        <w:t>Tech</w:t>
-      </w:r>
-      <w:r>
-        <w:rPr>
-          <w:rFonts w:eastAsia="Times New Roman"/>
-          <w:b/>
-          <w:bCs/>
-          <w:sz w:val="24"/>
-          <w:szCs w:val="24"/>
-          <w:lang w:val="en-IN"/>
-        </w:rPr>
-        <w:t>.</w:t>
-      </w:r>
-    </w:p>
-    <w:p>
-      <w:pPr>
-        <w:ind w:firstLine="720"/>
-        <w:rPr>
-          <w:rFonts w:eastAsia="Times New Roman"/>
-          <w:sz w:val="24"/>
-          <w:szCs w:val="24"/>
-          <w:lang w:val="en-IN"/>
-        </w:rPr>
-      </w:pPr>
-      <w:r>
-        <w:rPr>
-          <w:rFonts w:eastAsia="Times New Roman"/>
-          <w:sz w:val="24"/>
-          <w:szCs w:val="24"/>
-          <w:lang w:val="en-IN"/>
-        </w:rPr>
-        <w:t>Arvind Vidhyashankar (</w:t>
-      </w:r>
-      <w:r>
-        <w:rPr>
-          <w:rFonts w:eastAsia="Times New Roman"/>
-          <w:sz w:val="24"/>
-          <w:szCs w:val="24"/>
-          <w:lang w:val="en-IN"/>
-        </w:rPr>
-        <w:t>2025-</w:t>
-      </w:r>
-      <w:r>
-        <w:rPr>
-          <w:rFonts w:eastAsia="Times New Roman"/>
-          <w:sz w:val="24"/>
-          <w:szCs w:val="24"/>
-          <w:lang w:val="en-IN"/>
-        </w:rPr>
-        <w:t>26</w:t>
-      </w:r>
-      <w:r>
-        <w:rPr>
-          <w:rFonts w:eastAsia="Times New Roman"/>
-          <w:sz w:val="24"/>
-          <w:szCs w:val="24"/>
-          <w:lang w:val="en-IN"/>
-        </w:rPr>
-        <w:t>)</w:t>
-      </w:r>
-    </w:p>
-    <w:p>
-      <w:pPr>
-        <w:ind w:firstLine="720"/>
-        <w:rPr>
-          <w:rFonts w:eastAsia="Times New Roman"/>
-          <w:sz w:val="24"/>
-          <w:szCs w:val="24"/>
-          <w:lang w:val="en-IN"/>
-        </w:rPr>
-      </w:pPr>
-      <w:r>
-        <w:rPr>
-          <w:rFonts w:eastAsia="Times New Roman"/>
-          <w:sz w:val="24"/>
-          <w:szCs w:val="24"/>
-          <w:lang w:val="en-IN"/>
-        </w:rPr>
-        <w:t xml:space="preserve">Om </w:t>
-      </w:r>
-      <w:proofErr w:type="spellStart"/>
-      <w:r>
-        <w:rPr>
-          <w:rFonts w:eastAsia="Times New Roman"/>
-          <w:sz w:val="24"/>
-          <w:szCs w:val="24"/>
-          <w:lang w:val="en-IN"/>
-        </w:rPr>
-        <w:t>Ramavtar</w:t>
-      </w:r>
-      <w:proofErr w:type="spellEnd"/>
-      <w:r>
-        <w:rPr>
-          <w:rFonts w:eastAsia="Times New Roman"/>
-          <w:sz w:val="24"/>
-          <w:szCs w:val="24"/>
-          <w:lang w:val="en-IN"/>
-        </w:rPr>
-        <w:t xml:space="preserve"> Yadav (</w:t>
-      </w:r>
-      <w:r>
-        <w:rPr>
-          <w:rFonts w:eastAsia="Times New Roman"/>
-          <w:sz w:val="24"/>
-          <w:szCs w:val="24"/>
-          <w:lang w:val="en-IN"/>
-        </w:rPr>
-        <w:t>2025-</w:t>
-      </w:r>
-      <w:r>
-        <w:rPr>
-          <w:rFonts w:eastAsia="Times New Roman"/>
-          <w:sz w:val="24"/>
-          <w:szCs w:val="24"/>
-          <w:lang w:val="en-IN"/>
-        </w:rPr>
-        <w:t>26</w:t>
-      </w:r>
-      <w:r>
-        <w:rPr>
-          <w:rFonts w:eastAsia="Times New Roman"/>
-          <w:sz w:val="24"/>
-          <w:szCs w:val="24"/>
-          <w:lang w:val="en-IN"/>
-        </w:rPr>
-        <w:t>)</w:t>
-      </w:r>
-    </w:p>
-    <w:p>
-      <w:pPr>
-        <w:spacing w:line="266" w:lineRule="exact"/>
-        <w:rPr>
-          <w:sz w:val="20"/>
-          <w:szCs w:val="20"/>
-          <w:lang w:val="en-IN"/>
-        </w:rPr>
-      </w:pPr>
-    </w:p>
-    <w:p>
-      <w:pPr>
-        <w:ind w:left="360"/>
-        <w:rPr>
-          <w:rFonts w:eastAsia="Times New Roman"/>
-          <w:b/>
-          <w:bCs/>
-          <w:sz w:val="24"/>
-          <w:szCs w:val="24"/>
-          <w:lang w:val="en-IN"/>
-        </w:rPr>
-      </w:pPr>
-    </w:p>
-    <w:p>
-      <w:pPr>
-        <w:ind w:left="360"/>
-        <w:rPr>
-          <w:rFonts w:eastAsia="Times New Roman"/>
-          <w:b/>
-          <w:bCs/>
-          <w:sz w:val="24"/>
-          <w:szCs w:val="24"/>
-          <w:lang w:val="en-IN"/>
-        </w:rPr>
-      </w:pPr>
-    </w:p>
-    <w:p>
-      <w:pPr>
-        <w:ind w:left="360"/>
-        <w:rPr>
-          <w:sz w:val="20"/>
-          <w:szCs w:val="20"/>
-          <w:lang w:val="en-IN"/>
-        </w:rPr>
-      </w:pPr>
-      <w:r>
-        <w:rPr>
-          <w:rFonts w:eastAsia="Times New Roman"/>
-          <w:b/>
-          <w:bCs/>
-          <w:sz w:val="24"/>
-          <w:szCs w:val="24"/>
-          <w:lang w:val="en-IN"/>
-        </w:rPr>
-        <w:lastRenderedPageBreak/>
-        <w:t xml:space="preserve">Course </w:t>
-      </w:r>
-      <w:r>
-        <w:rPr>
-          <w:rFonts w:eastAsia="Times New Roman"/>
-          <w:b/>
-          <w:bCs/>
-          <w:sz w:val="24"/>
-          <w:szCs w:val="24"/>
-          <w:lang w:val="en-IN"/>
-        </w:rPr>
         <w:t>Instructor</w:t>
       </w:r>
     </w:p>
@@ -6405,6 +6732,12 @@
       </w:r>
     </w:p>
     <w:sectPr>
+      <w:headerReference w:type="even" r:id="rId12"/>
+      <w:headerReference w:type="default" r:id="rId13"/>
+      <w:footerReference w:type="even" r:id="rId14"/>
+      <w:footerReference w:type="default" r:id="rId15"/>
+      <w:headerReference w:type="first" r:id="rId16"/>
+      <w:footerReference w:type="first" r:id="rId17"/>
       <w:pgSz w:w="12240" w:h="15840"/>
       <w:pgMar w:top="720" w:right="720" w:bottom="720" w:left="720" w:header="708" w:footer="708" w:gutter="0"/>
       <w:cols w:space="708"/>
@@ -6414,8 +6747,106 @@
 </w:document>
 </file>
 
+<file path=word/endnotes.xml><?xml version="1.0" encoding="utf-8"?>
+<w:endnotes xmlns:wpc="http://schemas.microsoft.com/office/word/2010/wordprocessingCanvas" xmlns:cx="http://schemas.microsoft.com/office/drawing/2014/chartex" xmlns:cx1="http://schemas.microsoft.com/office/drawing/2015/9/8/chartex" xmlns:cx2="http://schemas.microsoft.com/office/drawing/2015/10/21/chartex" xmlns:cx3="http://schemas.microsoft.com/office/drawing/2016/5/9/chartex" xmlns:cx4="http://schemas.microsoft.com/office/drawing/2016/5/10/chartex" xmlns:cx5="http://schemas.microsoft.com/office/drawing/2016/5/11/chartex" xmlns:cx6="http://schemas.microsoft.com/office/drawing/2016/5/12/chartex" xmlns:cx7="http://schemas.microsoft.com/office/drawing/2016/5/13/chartex" xmlns:cx8="http://schemas.microsoft.com/office/drawing/2016/5/14/chartex" xmlns:mc="http://schemas.openxmlformats.org/markup-compatibility/2006" xmlns:m="http://schemas.openxmlformats.org/officeDocument/2006/math" xmlns:aink="http://schemas.microsoft.com/office/drawing/2016/ink" xmlns:am3d="http://schemas.microsoft.com/office/drawing/2017/model3d" xmlns:oel="http://schemas.microsoft.com/office/2019/extlst" xmlns:r="http://schemas.openxmlformats.org/officeDocument/2006/relationships" xmlns:wp14="http://schemas.microsoft.com/office/word/2010/wordprocessingDrawing" xmlns:wp="http://schemas.openxmlformats.org/drawingml/2006/wordprocessingDrawing" xmlns:wpg="http://schemas.microsoft.com/office/word/2010/wordprocessingGroup" xmlns:wpi="http://schemas.microsoft.com/office/word/2010/wordprocessingInk" xmlns:wps="http://schemas.microsoft.com/office/word/2010/wordprocessingShape" xmlns:o="urn:schemas-microsoft-com:office:office" xmlns:v="urn:schemas-microsoft-com:vml" xmlns:w10="urn:schemas-microsoft-com:office:word" xmlns:w="http://schemas.openxmlformats.org/wordprocessingml/2006/main" xmlns:w14="http://schemas.microsoft.com/office/word/2010/wordml" xmlns:w15="http://schemas.microsoft.com/office/word/2012/wordml" xmlns:w16cex="http://schemas.microsoft.com/office/word/2018/wordml/cex" xmlns:w16cid="http://schemas.microsoft.com/office/word/2016/wordml/cid" xmlns:w16="http://schemas.microsoft.com/office/word/2018/wordml" xmlns:w16sdtdh="http://schemas.microsoft.com/office/word/2020/wordml/sdtdatahash" xmlns:w16sdtfl="http://schemas.microsoft.com/office/word/2024/wordml/sdtformatlock" xmlns:w16se="http://schemas.microsoft.com/office/word/2015/wordml/symex" xmlns:w16du="http://schemas.microsoft.com/office/word/2023/wordml/word16du" xmlns:wne="http://schemas.microsoft.com/office/word/2006/wordml" mc:Ignorable="w14 w15 w16se w16cid w16 w16cex w16sdtdh w16sdtfl w16du wp14">
+  <w:endnote w:type="separator" w:id="-1">
+    <w:p>
+      <w:r>
+        <w:separator/>
+      </w:r>
+    </w:p>
+  </w:endnote>
+  <w:endnote w:type="continuationSeparator" w:id="0">
+    <w:p>
+      <w:r>
+        <w:continuationSeparator/>
+      </w:r>
+    </w:p>
+  </w:endnote>
+</w:endnotes>
+</file>
+
+<file path=word/footer1.xml><?xml version="1.0" encoding="utf-8"?>
+<w:ftr xmlns:wpc="http://schemas.microsoft.com/office/word/2010/wordprocessingCanvas" xmlns:cx="http://schemas.microsoft.com/office/drawing/2014/chartex" xmlns:cx1="http://schemas.microsoft.com/office/drawing/2015/9/8/chartex" xmlns:cx2="http://schemas.microsoft.com/office/drawing/2015/10/21/chartex" xmlns:cx3="http://schemas.microsoft.com/office/drawing/2016/5/9/chartex" xmlns:cx4="http://schemas.microsoft.com/office/drawing/2016/5/10/chartex" xmlns:cx5="http://schemas.microsoft.com/office/drawing/2016/5/11/chartex" xmlns:cx6="http://schemas.microsoft.com/office/drawing/2016/5/12/chartex" xmlns:cx7="http://schemas.microsoft.com/office/drawing/2016/5/13/chartex" xmlns:cx8="http://schemas.microsoft.com/office/drawing/2016/5/14/chartex" xmlns:mc="http://schemas.openxmlformats.org/markup-compatibility/2006" xmlns:m="http://schemas.openxmlformats.org/officeDocument/2006/math" xmlns:aink="http://schemas.microsoft.com/office/drawing/2016/ink" xmlns:am3d="http://schemas.microsoft.com/office/drawing/2017/model3d" xmlns:oel="http://schemas.microsoft.com/office/2019/extlst" xmlns:r="http://schemas.openxmlformats.org/officeDocument/2006/relationships" xmlns:wp14="http://schemas.microsoft.com/office/word/2010/wordprocessingDrawing" xmlns:wp="http://schemas.openxmlformats.org/drawingml/2006/wordprocessingDrawing" xmlns:wpg="http://schemas.microsoft.com/office/word/2010/wordprocessingGroup" xmlns:wpi="http://schemas.microsoft.com/office/word/2010/wordprocessingInk" xmlns:wps="http://schemas.microsoft.com/office/word/2010/wordprocessingShape" xmlns:o="urn:schemas-microsoft-com:office:office" xmlns:v="urn:schemas-microsoft-com:vml" xmlns:w10="urn:schemas-microsoft-com:office:word" xmlns:w="http://schemas.openxmlformats.org/wordprocessingml/2006/main" xmlns:w14="http://schemas.microsoft.com/office/word/2010/wordml" xmlns:w15="http://schemas.microsoft.com/office/word/2012/wordml" xmlns:w16cex="http://schemas.microsoft.com/office/word/2018/wordml/cex" xmlns:w16cid="http://schemas.microsoft.com/office/word/2016/wordml/cid" xmlns:w16="http://schemas.microsoft.com/office/word/2018/wordml" xmlns:w16sdtdh="http://schemas.microsoft.com/office/word/2020/wordml/sdtdatahash" xmlns:w16sdtfl="http://schemas.microsoft.com/office/word/2024/wordml/sdtformatlock" xmlns:w16se="http://schemas.microsoft.com/office/word/2015/wordml/symex" xmlns:w16du="http://schemas.microsoft.com/office/word/2023/wordml/word16du" xmlns:wne="http://schemas.microsoft.com/office/word/2006/wordml" mc:Ignorable="w14 w15 w16se w16cid w16 w16cex w16sdtdh w16sdtfl w16du wp14">
+  <w:p>
+    <w:pPr>
+      <w:pStyle w:val="Footer"/>
+    </w:pPr>
+  </w:p>
+</w:ftr>
+</file>
+
+<file path=word/footer2.xml><?xml version="1.0" encoding="utf-8"?>
+<w:ftr xmlns:wpc="http://schemas.microsoft.com/office/word/2010/wordprocessingCanvas" xmlns:cx="http://schemas.microsoft.com/office/drawing/2014/chartex" xmlns:cx1="http://schemas.microsoft.com/office/drawing/2015/9/8/chartex" xmlns:cx2="http://schemas.microsoft.com/office/drawing/2015/10/21/chartex" xmlns:cx3="http://schemas.microsoft.com/office/drawing/2016/5/9/chartex" xmlns:cx4="http://schemas.microsoft.com/office/drawing/2016/5/10/chartex" xmlns:cx5="http://schemas.microsoft.com/office/drawing/2016/5/11/chartex" xmlns:cx6="http://schemas.microsoft.com/office/drawing/2016/5/12/chartex" xmlns:cx7="http://schemas.microsoft.com/office/drawing/2016/5/13/chartex" xmlns:cx8="http://schemas.microsoft.com/office/drawing/2016/5/14/chartex" xmlns:mc="http://schemas.openxmlformats.org/markup-compatibility/2006" xmlns:m="http://schemas.openxmlformats.org/officeDocument/2006/math" xmlns:aink="http://schemas.microsoft.com/office/drawing/2016/ink" xmlns:am3d="http://schemas.microsoft.com/office/drawing/2017/model3d" xmlns:oel="http://schemas.microsoft.com/office/2019/extlst" xmlns:r="http://schemas.openxmlformats.org/officeDocument/2006/relationships" xmlns:wp14="http://schemas.microsoft.com/office/word/2010/wordprocessingDrawing" xmlns:wp="http://schemas.openxmlformats.org/drawingml/2006/wordprocessingDrawing" xmlns:wpg="http://schemas.microsoft.com/office/word/2010/wordprocessingGroup" xmlns:wpi="http://schemas.microsoft.com/office/word/2010/wordprocessingInk" xmlns:wps="http://schemas.microsoft.com/office/word/2010/wordprocessingShape" xmlns:o="urn:schemas-microsoft-com:office:office" xmlns:v="urn:schemas-microsoft-com:vml" xmlns:w10="urn:schemas-microsoft-com:office:word" xmlns:w="http://schemas.openxmlformats.org/wordprocessingml/2006/main" xmlns:w14="http://schemas.microsoft.com/office/word/2010/wordml" xmlns:w15="http://schemas.microsoft.com/office/word/2012/wordml" xmlns:w16cex="http://schemas.microsoft.com/office/word/2018/wordml/cex" xmlns:w16cid="http://schemas.microsoft.com/office/word/2016/wordml/cid" xmlns:w16="http://schemas.microsoft.com/office/word/2018/wordml" xmlns:w16sdtdh="http://schemas.microsoft.com/office/word/2020/wordml/sdtdatahash" xmlns:w16sdtfl="http://schemas.microsoft.com/office/word/2024/wordml/sdtformatlock" xmlns:w16se="http://schemas.microsoft.com/office/word/2015/wordml/symex" xmlns:w16du="http://schemas.microsoft.com/office/word/2023/wordml/word16du" xmlns:wne="http://schemas.microsoft.com/office/word/2006/wordml" mc:Ignorable="w14 w15 w16se w16cid w16 w16cex w16sdtdh w16sdtfl w16du wp14">
+  <w:p>
+    <w:pPr>
+      <w:pStyle w:val="Footer"/>
+    </w:pPr>
+  </w:p>
+</w:ftr>
+</file>
+
+<file path=word/footer3.xml><?xml version="1.0" encoding="utf-8"?>
+<w:ftr xmlns:wpc="http://schemas.microsoft.com/office/word/2010/wordprocessingCanvas" xmlns:cx="http://schemas.microsoft.com/office/drawing/2014/chartex" xmlns:cx1="http://schemas.microsoft.com/office/drawing/2015/9/8/chartex" xmlns:cx2="http://schemas.microsoft.com/office/drawing/2015/10/21/chartex" xmlns:cx3="http://schemas.microsoft.com/office/drawing/2016/5/9/chartex" xmlns:cx4="http://schemas.microsoft.com/office/drawing/2016/5/10/chartex" xmlns:cx5="http://schemas.microsoft.com/office/drawing/2016/5/11/chartex" xmlns:cx6="http://schemas.microsoft.com/office/drawing/2016/5/12/chartex" xmlns:cx7="http://schemas.microsoft.com/office/drawing/2016/5/13/chartex" xmlns:cx8="http://schemas.microsoft.com/office/drawing/2016/5/14/chartex" xmlns:mc="http://schemas.openxmlformats.org/markup-compatibility/2006" xmlns:m="http://schemas.openxmlformats.org/officeDocument/2006/math" xmlns:aink="http://schemas.microsoft.com/office/drawing/2016/ink" xmlns:am3d="http://schemas.microsoft.com/office/drawing/2017/model3d" xmlns:oel="http://schemas.microsoft.com/office/2019/extlst" xmlns:r="http://schemas.openxmlformats.org/officeDocument/2006/relationships" xmlns:wp14="http://schemas.microsoft.com/office/word/2010/wordprocessingDrawing" xmlns:wp="http://schemas.openxmlformats.org/drawingml/2006/wordprocessingDrawing" xmlns:wpg="http://schemas.microsoft.com/office/word/2010/wordprocessingGroup" xmlns:wpi="http://schemas.microsoft.com/office/word/2010/wordprocessingInk" xmlns:wps="http://schemas.microsoft.com/office/word/2010/wordprocessingShape" xmlns:o="urn:schemas-microsoft-com:office:office" xmlns:v="urn:schemas-microsoft-com:vml" xmlns:w10="urn:schemas-microsoft-com:office:word" xmlns:w="http://schemas.openxmlformats.org/wordprocessingml/2006/main" xmlns:w14="http://schemas.microsoft.com/office/word/2010/wordml" xmlns:w15="http://schemas.microsoft.com/office/word/2012/wordml" xmlns:w16cex="http://schemas.microsoft.com/office/word/2018/wordml/cex" xmlns:w16cid="http://schemas.microsoft.com/office/word/2016/wordml/cid" xmlns:w16="http://schemas.microsoft.com/office/word/2018/wordml" xmlns:w16sdtdh="http://schemas.microsoft.com/office/word/2020/wordml/sdtdatahash" xmlns:w16sdtfl="http://schemas.microsoft.com/office/word/2024/wordml/sdtformatlock" xmlns:w16se="http://schemas.microsoft.com/office/word/2015/wordml/symex" xmlns:w16du="http://schemas.microsoft.com/office/word/2023/wordml/word16du" xmlns:wne="http://schemas.microsoft.com/office/word/2006/wordml" mc:Ignorable="w14 w15 w16se w16cid w16 w16cex w16sdtdh w16sdtfl w16du wp14">
+  <w:p>
+    <w:pPr>
+      <w:pStyle w:val="Footer"/>
+    </w:pPr>
+  </w:p>
+</w:ftr>
+</file>
+
+<file path=word/footnotes.xml><?xml version="1.0" encoding="utf-8"?>
+<w:footnotes xmlns:wpc="http://schemas.microsoft.com/office/word/2010/wordprocessingCanvas" xmlns:cx="http://schemas.microsoft.com/office/drawing/2014/chartex" xmlns:cx1="http://schemas.microsoft.com/office/drawing/2015/9/8/chartex" xmlns:cx2="http://schemas.microsoft.com/office/drawing/2015/10/21/chartex" xmlns:cx3="http://schemas.microsoft.com/office/drawing/2016/5/9/chartex" xmlns:cx4="http://schemas.microsoft.com/office/drawing/2016/5/10/chartex" xmlns:cx5="http://schemas.microsoft.com/office/drawing/2016/5/11/chartex" xmlns:cx6="http://schemas.microsoft.com/office/drawing/2016/5/12/chartex" xmlns:cx7="http://schemas.microsoft.com/office/drawing/2016/5/13/chartex" xmlns:cx8="http://schemas.microsoft.com/office/drawing/2016/5/14/chartex" xmlns:mc="http://schemas.openxmlformats.org/markup-compatibility/2006" xmlns:m="http://schemas.openxmlformats.org/officeDocument/2006/math" xmlns:aink="http://schemas.microsoft.com/office/drawing/2016/ink" xmlns:am3d="http://schemas.microsoft.com/office/drawing/2017/model3d" xmlns:oel="http://schemas.microsoft.com/office/2019/extlst" xmlns:r="http://schemas.openxmlformats.org/officeDocument/2006/relationships" xmlns:wp14="http://schemas.microsoft.com/office/word/2010/wordprocessingDrawing" xmlns:wp="http://schemas.openxmlformats.org/drawingml/2006/wordprocessingDrawing" xmlns:wpg="http://schemas.microsoft.com/office/word/2010/wordprocessingGroup" xmlns:wpi="http://schemas.microsoft.com/office/word/2010/wordprocessingInk" xmlns:wps="http://schemas.microsoft.com/office/word/2010/wordprocessingShape" xmlns:o="urn:schemas-microsoft-com:office:office" xmlns:v="urn:schemas-microsoft-com:vml" xmlns:w10="urn:schemas-microsoft-com:office:word" xmlns:w="http://schemas.openxmlformats.org/wordprocessingml/2006/main" xmlns:w14="http://schemas.microsoft.com/office/word/2010/wordml" xmlns:w15="http://schemas.microsoft.com/office/word/2012/wordml" xmlns:w16cex="http://schemas.microsoft.com/office/word/2018/wordml/cex" xmlns:w16cid="http://schemas.microsoft.com/office/word/2016/wordml/cid" xmlns:w16="http://schemas.microsoft.com/office/word/2018/wordml" xmlns:w16sdtdh="http://schemas.microsoft.com/office/word/2020/wordml/sdtdatahash" xmlns:w16sdtfl="http://schemas.microsoft.com/office/word/2024/wordml/sdtformatlock" xmlns:w16se="http://schemas.microsoft.com/office/word/2015/wordml/symex" xmlns:w16du="http://schemas.microsoft.com/office/word/2023/wordml/word16du" xmlns:wne="http://schemas.microsoft.com/office/word/2006/wordml" mc:Ignorable="w14 w15 w16se w16cid w16 w16cex w16sdtdh w16sdtfl w16du wp14">
+  <w:footnote w:type="separator" w:id="-1">
+    <w:p>
+      <w:r>
+        <w:separator/>
+      </w:r>
+    </w:p>
+  </w:footnote>
+  <w:footnote w:type="continuationSeparator" w:id="0">
+    <w:p>
+      <w:r>
+        <w:continuationSeparator/>
+      </w:r>
+    </w:p>
+  </w:footnote>
+</w:footnotes>
+</file>
+
+<file path=word/header1.xml><?xml version="1.0" encoding="utf-8"?>
+<w:hdr xmlns:wpc="http://schemas.microsoft.com/office/word/2010/wordprocessingCanvas" xmlns:cx="http://schemas.microsoft.com/office/drawing/2014/chartex" xmlns:cx1="http://schemas.microsoft.com/office/drawing/2015/9/8/chartex" xmlns:cx2="http://schemas.microsoft.com/office/drawing/2015/10/21/chartex" xmlns:cx3="http://schemas.microsoft.com/office/drawing/2016/5/9/chartex" xmlns:cx4="http://schemas.microsoft.com/office/drawing/2016/5/10/chartex" xmlns:cx5="http://schemas.microsoft.com/office/drawing/2016/5/11/chartex" xmlns:cx6="http://schemas.microsoft.com/office/drawing/2016/5/12/chartex" xmlns:cx7="http://schemas.microsoft.com/office/drawing/2016/5/13/chartex" xmlns:cx8="http://schemas.microsoft.com/office/drawing/2016/5/14/chartex" xmlns:mc="http://schemas.openxmlformats.org/markup-compatibility/2006" xmlns:m="http://schemas.openxmlformats.org/officeDocument/2006/math" xmlns:aink="http://schemas.microsoft.com/office/drawing/2016/ink" xmlns:am3d="http://schemas.microsoft.com/office/drawing/2017/model3d" xmlns:oel="http://schemas.microsoft.com/office/2019/extlst" xmlns:r="http://schemas.openxmlformats.org/officeDocument/2006/relationships" xmlns:wp14="http://schemas.microsoft.com/office/word/2010/wordprocessingDrawing" xmlns:wp="http://schemas.openxmlformats.org/drawingml/2006/wordprocessingDrawing" xmlns:wpg="http://schemas.microsoft.com/office/word/2010/wordprocessingGroup" xmlns:wpi="http://schemas.microsoft.com/office/word/2010/wordprocessingInk" xmlns:wps="http://schemas.microsoft.com/office/word/2010/wordprocessingShape" xmlns:o="urn:schemas-microsoft-com:office:office" xmlns:v="urn:schemas-microsoft-com:vml" xmlns:w10="urn:schemas-microsoft-com:office:word" xmlns:w="http://schemas.openxmlformats.org/wordprocessingml/2006/main" xmlns:w14="http://schemas.microsoft.com/office/word/2010/wordml" xmlns:w15="http://schemas.microsoft.com/office/word/2012/wordml" xmlns:w16cex="http://schemas.microsoft.com/office/word/2018/wordml/cex" xmlns:w16cid="http://schemas.microsoft.com/office/word/2016/wordml/cid" xmlns:w16="http://schemas.microsoft.com/office/word/2018/wordml" xmlns:w16sdtdh="http://schemas.microsoft.com/office/word/2020/wordml/sdtdatahash" xmlns:w16sdtfl="http://schemas.microsoft.com/office/word/2024/wordml/sdtformatlock" xmlns:w16se="http://schemas.microsoft.com/office/word/2015/wordml/symex" xmlns:w16du="http://schemas.microsoft.com/office/word/2023/wordml/word16du" xmlns:wne="http://schemas.microsoft.com/office/word/2006/wordml" mc:Ignorable="w14 w15 w16se w16cid w16 w16cex w16sdtdh w16sdtfl w16du wp14">
+  <w:p>
+    <w:pPr>
+      <w:pStyle w:val="Header"/>
+    </w:pPr>
+  </w:p>
+</w:hdr>
+</file>
+
+<file path=word/header2.xml><?xml version="1.0" encoding="utf-8"?>
+<w:hdr xmlns:wpc="http://schemas.microsoft.com/office/word/2010/wordprocessingCanvas" xmlns:cx="http://schemas.microsoft.com/office/drawing/2014/chartex" xmlns:cx1="http://schemas.microsoft.com/office/drawing/2015/9/8/chartex" xmlns:cx2="http://schemas.microsoft.com/office/drawing/2015/10/21/chartex" xmlns:cx3="http://schemas.microsoft.com/office/drawing/2016/5/9/chartex" xmlns:cx4="http://schemas.microsoft.com/office/drawing/2016/5/10/chartex" xmlns:cx5="http://schemas.microsoft.com/office/drawing/2016/5/11/chartex" xmlns:cx6="http://schemas.microsoft.com/office/drawing/2016/5/12/chartex" xmlns:cx7="http://schemas.microsoft.com/office/drawing/2016/5/13/chartex" xmlns:cx8="http://schemas.microsoft.com/office/drawing/2016/5/14/chartex" xmlns:mc="http://schemas.openxmlformats.org/markup-compatibility/2006" xmlns:m="http://schemas.openxmlformats.org/officeDocument/2006/math" xmlns:aink="http://schemas.microsoft.com/office/drawing/2016/ink" xmlns:am3d="http://schemas.microsoft.com/office/drawing/2017/model3d" xmlns:oel="http://schemas.microsoft.com/office/2019/extlst" xmlns:r="http://schemas.openxmlformats.org/officeDocument/2006/relationships" xmlns:wp14="http://schemas.microsoft.com/office/word/2010/wordprocessingDrawing" xmlns:wp="http://schemas.openxmlformats.org/drawingml/2006/wordprocessingDrawing" xmlns:wpg="http://schemas.microsoft.com/office/word/2010/wordprocessingGroup" xmlns:wpi="http://schemas.microsoft.com/office/word/2010/wordprocessingInk" xmlns:wps="http://schemas.microsoft.com/office/word/2010/wordprocessingShape" xmlns:o="urn:schemas-microsoft-com:office:office" xmlns:v="urn:schemas-microsoft-com:vml" xmlns:w10="urn:schemas-microsoft-com:office:word" xmlns:w="http://schemas.openxmlformats.org/wordprocessingml/2006/main" xmlns:w14="http://schemas.microsoft.com/office/word/2010/wordml" xmlns:w15="http://schemas.microsoft.com/office/word/2012/wordml" xmlns:w16cex="http://schemas.microsoft.com/office/word/2018/wordml/cex" xmlns:w16cid="http://schemas.microsoft.com/office/word/2016/wordml/cid" xmlns:w16="http://schemas.microsoft.com/office/word/2018/wordml" xmlns:w16sdtdh="http://schemas.microsoft.com/office/word/2020/wordml/sdtdatahash" xmlns:w16sdtfl="http://schemas.microsoft.com/office/word/2024/wordml/sdtformatlock" xmlns:w16se="http://schemas.microsoft.com/office/word/2015/wordml/symex" xmlns:w16du="http://schemas.microsoft.com/office/word/2023/wordml/word16du" xmlns:wne="http://schemas.microsoft.com/office/word/2006/wordml" mc:Ignorable="w14 w15 w16se w16cid w16 w16cex w16sdtdh w16sdtfl w16du wp14">
+  <w:p>
+    <w:pPr>
+      <w:pStyle w:val="Header"/>
+    </w:pPr>
+  </w:p>
+</w:hdr>
+</file>
+
+<file path=word/header3.xml><?xml version="1.0" encoding="utf-8"?>
+<w:hdr xmlns:wpc="http://schemas.microsoft.com/office/word/2010/wordprocessingCanvas" xmlns:cx="http://schemas.microsoft.com/office/drawing/2014/chartex" xmlns:cx1="http://schemas.microsoft.com/office/drawing/2015/9/8/chartex" xmlns:cx2="http://schemas.microsoft.com/office/drawing/2015/10/21/chartex" xmlns:cx3="http://schemas.microsoft.com/office/drawing/2016/5/9/chartex" xmlns:cx4="http://schemas.microsoft.com/office/drawing/2016/5/10/chartex" xmlns:cx5="http://schemas.microsoft.com/office/drawing/2016/5/11/chartex" xmlns:cx6="http://schemas.microsoft.com/office/drawing/2016/5/12/chartex" xmlns:cx7="http://schemas.microsoft.com/office/drawing/2016/5/13/chartex" xmlns:cx8="http://schemas.microsoft.com/office/drawing/2016/5/14/chartex" xmlns:mc="http://schemas.openxmlformats.org/markup-compatibility/2006" xmlns:m="http://schemas.openxmlformats.org/officeDocument/2006/math" xmlns:aink="http://schemas.microsoft.com/office/drawing/2016/ink" xmlns:am3d="http://schemas.microsoft.com/office/drawing/2017/model3d" xmlns:oel="http://schemas.microsoft.com/office/2019/extlst" xmlns:r="http://schemas.openxmlformats.org/officeDocument/2006/relationships" xmlns:wp14="http://schemas.microsoft.com/office/word/2010/wordprocessingDrawing" xmlns:wp="http://schemas.openxmlformats.org/drawingml/2006/wordprocessingDrawing" xmlns:wpg="http://schemas.microsoft.com/office/word/2010/wordprocessingGroup" xmlns:wpi="http://schemas.microsoft.com/office/word/2010/wordprocessingInk" xmlns:wps="http://schemas.microsoft.com/office/word/2010/wordprocessingShape" xmlns:o="urn:schemas-microsoft-com:office:office" xmlns:v="urn:schemas-microsoft-com:vml" xmlns:w10="urn:schemas-microsoft-com:office:word" xmlns:w="http://schemas.openxmlformats.org/wordprocessingml/2006/main" xmlns:w14="http://schemas.microsoft.com/office/word/2010/wordml" xmlns:w15="http://schemas.microsoft.com/office/word/2012/wordml" xmlns:w16cex="http://schemas.microsoft.com/office/word/2018/wordml/cex" xmlns:w16cid="http://schemas.microsoft.com/office/word/2016/wordml/cid" xmlns:w16="http://schemas.microsoft.com/office/word/2018/wordml" xmlns:w16sdtdh="http://schemas.microsoft.com/office/word/2020/wordml/sdtdatahash" xmlns:w16sdtfl="http://schemas.microsoft.com/office/word/2024/wordml/sdtformatlock" xmlns:w16se="http://schemas.microsoft.com/office/word/2015/wordml/symex" xmlns:w16du="http://schemas.microsoft.com/office/word/2023/wordml/word16du" xmlns:wne="http://schemas.microsoft.com/office/word/2006/wordml" mc:Ignorable="w14 w15 w16se w16cid w16 w16cex w16sdtdh w16sdtfl w16du wp14">
+  <w:p>
+    <w:pPr>
+      <w:pStyle w:val="Header"/>
+    </w:pPr>
+  </w:p>
+</w:hdr>
+</file>
+
 <file path=word/numbering.xml><?xml version="1.0" encoding="utf-8"?>
-<w:numbering xmlns:wpc="http://schemas.microsoft.com/office/word/2010/wordprocessingCanvas" xmlns:cx="http://schemas.microsoft.com/office/drawing/2014/chartex" xmlns:cx1="http://schemas.microsoft.com/office/drawing/2015/9/8/chartex" xmlns:cx2="http://schemas.microsoft.com/office/drawing/2015/10/21/chartex" xmlns:cx3="http://schemas.microsoft.com/office/drawing/2016/5/9/chartex" xmlns:cx4="http://schemas.microsoft.com/office/drawing/2016/5/10/chartex" xmlns:cx5="http://schemas.microsoft.com/office/drawing/2016/5/11/chartex" xmlns:cx6="http://schemas.microsoft.com/office/drawing/2016/5/12/chartex" xmlns:cx7="http://schemas.microsoft.com/office/drawing/2016/5/13/chartex" xmlns:cx8="http://schemas.microsoft.com/office/drawing/2016/5/14/chartex" xmlns:mc="http://schemas.openxmlformats.org/markup-compatibility/2006" xmlns:aink="http://schemas.microsoft.com/office/drawing/2016/ink" xmlns:am3d="http://schemas.microsoft.com/office/drawing/2017/model3d" xmlns:o="urn:schemas-microsoft-com:office:office" xmlns:oel="http://schemas.microsoft.com/office/2019/extlst" xmlns:r="http://schemas.openxmlformats.org/officeDocument/2006/relationships" xmlns:m="http://schemas.openxmlformats.org/officeDocument/2006/math" xmlns:v="urn:schemas-microsoft-com:vml" xmlns:wp14="http://schemas.microsoft.com/office/word/2010/wordprocessingDrawing" xmlns:wp="http://schemas.openxmlformats.org/drawingml/2006/wordprocessingDrawing" xmlns:w10="urn:schemas-microsoft-com:office:word" xmlns:w="http://schemas.openxmlformats.org/wordprocessingml/2006/main" xmlns:w14="http://schemas.microsoft.com/office/word/2010/wordml" xmlns:w15="http://schemas.microsoft.com/office/word/2012/wordml" xmlns:w16cex="http://schemas.microsoft.com/office/word/2018/wordml/cex" xmlns:w16cid="http://schemas.microsoft.com/office/word/2016/wordml/cid" xmlns:w16="http://schemas.microsoft.com/office/word/2018/wordml" xmlns:w16du="http://schemas.microsoft.com/office/word/2023/wordml/word16du" xmlns:w16sdtdh="http://schemas.microsoft.com/office/word/2020/wordml/sdtdatahash" xmlns:w16sdtfl="http://schemas.microsoft.com/office/word/2024/wordml/sdtformatlock" xmlns:w16se="http://schemas.microsoft.com/office/word/2015/wordml/symex" xmlns:wpg="http://schemas.microsoft.com/office/word/2010/wordprocessingGroup" xmlns:wpi="http://schemas.microsoft.com/office/word/2010/wordprocessingInk" xmlns:wne="http://schemas.microsoft.com/office/word/2006/wordml" xmlns:wps="http://schemas.microsoft.com/office/word/2010/wordprocessingShape" mc:Ignorable="w14 w15 w16se w16cid w16 w16cex w16sdtdh w16sdtfl w16du wp14">
+<w:numbering xmlns:wpc="http://schemas.microsoft.com/office/word/2010/wordprocessingCanvas" xmlns:cx="http://schemas.microsoft.com/office/drawing/2014/chartex" xmlns:cx1="http://schemas.microsoft.com/office/drawing/2015/9/8/chartex" xmlns:cx2="http://schemas.microsoft.com/office/drawing/2015/10/21/chartex" xmlns:cx3="http://schemas.microsoft.com/office/drawing/2016/5/9/chartex" xmlns:cx4="http://schemas.microsoft.com/office/drawing/2016/5/10/chartex" xmlns:cx5="http://schemas.microsoft.com/office/drawing/2016/5/11/chartex" xmlns:cx6="http://schemas.microsoft.com/office/drawing/2016/5/12/chartex" xmlns:cx7="http://schemas.microsoft.com/office/drawing/2016/5/13/chartex" xmlns:cx8="http://schemas.microsoft.com/office/drawing/2016/5/14/chartex" xmlns:mc="http://schemas.openxmlformats.org/markup-compatibility/2006" xmlns:m="http://schemas.openxmlformats.org/officeDocument/2006/math" xmlns:aink="http://schemas.microsoft.com/office/drawing/2016/ink" xmlns:am3d="http://schemas.microsoft.com/office/drawing/2017/model3d" xmlns:oel="http://schemas.microsoft.com/office/2019/extlst" xmlns:r="http://schemas.openxmlformats.org/officeDocument/2006/relationships" xmlns:wp14="http://schemas.microsoft.com/office/word/2010/wordprocessingDrawing" xmlns:wp="http://schemas.openxmlformats.org/drawingml/2006/wordprocessingDrawing" xmlns:wpg="http://schemas.microsoft.com/office/word/2010/wordprocessingGroup" xmlns:wpi="http://schemas.microsoft.com/office/word/2010/wordprocessingInk" xmlns:wps="http://schemas.microsoft.com/office/word/2010/wordprocessingShape" xmlns:o="urn:schemas-microsoft-com:office:office" xmlns:v="urn:schemas-microsoft-com:vml" xmlns:w10="urn:schemas-microsoft-com:office:word" xmlns:w="http://schemas.openxmlformats.org/wordprocessingml/2006/main" xmlns:w14="http://schemas.microsoft.com/office/word/2010/wordml" xmlns:w15="http://schemas.microsoft.com/office/word/2012/wordml" xmlns:w16cex="http://schemas.microsoft.com/office/word/2018/wordml/cex" xmlns:w16cid="http://schemas.microsoft.com/office/word/2016/wordml/cid" xmlns:w16="http://schemas.microsoft.com/office/word/2018/wordml" xmlns:w16sdtdh="http://schemas.microsoft.com/office/word/2020/wordml/sdtdatahash" xmlns:w16sdtfl="http://schemas.microsoft.com/office/word/2024/wordml/sdtformatlock" xmlns:w16se="http://schemas.microsoft.com/office/word/2015/wordml/symex" xmlns:w16du="http://schemas.microsoft.com/office/word/2023/wordml/word16du" xmlns:wne="http://schemas.microsoft.com/office/word/2006/wordml" mc:Ignorable="w14 w15 w16se w16cid w16 w16cex w16sdtdh w16sdtfl w16du wp14">
   <w:abstractNum w:abstractNumId="0" w15:restartNumberingAfterBreak="0">
     <w:nsid w:val="327B23C6"/>
     <w:multiLevelType w:val="hybridMultilevel"/>
@@ -6474,7 +6905,7 @@
 </file>
 
 <file path=word/styles.xml><?xml version="1.0" encoding="utf-8"?>
-<w:styles xmlns:mc="http://schemas.openxmlformats.org/markup-compatibility/2006" xmlns:r="http://schemas.openxmlformats.org/officeDocument/2006/relationships" xmlns:w="http://schemas.openxmlformats.org/wordprocessingml/2006/main" xmlns:w14="http://schemas.microsoft.com/office/word/2010/wordml" xmlns:w15="http://schemas.microsoft.com/office/word/2012/wordml" xmlns:w16cex="http://schemas.microsoft.com/office/word/2018/wordml/cex" xmlns:w16cid="http://schemas.microsoft.com/office/word/2016/wordml/cid" xmlns:w16="http://schemas.microsoft.com/office/word/2018/wordml" xmlns:w16du="http://schemas.microsoft.com/office/word/2023/wordml/word16du" xmlns:w16sdtdh="http://schemas.microsoft.com/office/word/2020/wordml/sdtdatahash" xmlns:w16sdtfl="http://schemas.microsoft.com/office/word/2024/wordml/sdtformatlock" xmlns:w16se="http://schemas.microsoft.com/office/word/2015/wordml/symex" mc:Ignorable="w14 w15 w16se w16cid w16 w16cex w16sdtdh w16sdtfl w16du">
+<w:styles xmlns:mc="http://schemas.openxmlformats.org/markup-compatibility/2006" xmlns:r="http://schemas.openxmlformats.org/officeDocument/2006/relationships" xmlns:w="http://schemas.openxmlformats.org/wordprocessingml/2006/main" xmlns:w14="http://schemas.microsoft.com/office/word/2010/wordml" xmlns:w15="http://schemas.microsoft.com/office/word/2012/wordml" xmlns:w16cex="http://schemas.microsoft.com/office/word/2018/wordml/cex" xmlns:w16cid="http://schemas.microsoft.com/office/word/2016/wordml/cid" xmlns:w16="http://schemas.microsoft.com/office/word/2018/wordml" xmlns:w16sdtdh="http://schemas.microsoft.com/office/word/2020/wordml/sdtdatahash" xmlns:w16sdtfl="http://schemas.microsoft.com/office/word/2024/wordml/sdtformatlock" xmlns:w16se="http://schemas.microsoft.com/office/word/2015/wordml/symex" xmlns:w16du="http://schemas.microsoft.com/office/word/2023/wordml/word16du" mc:Ignorable="w14 w15 w16se w16cid w16 w16cex w16sdtdh w16sdtfl w16du">
   <w:docDefaults>
     <w:rPrDefault>
       <w:rPr>
@@ -6971,6 +7402,67 @@
       <w:u w:val="single"/>
     </w:rPr>
   </w:style>
+  <w:style w:type="paragraph" w:styleId="Header">
+    <w:name w:val="header"/>
+    <w:basedOn w:val="Normal"/>
+    <w:link w:val="HeaderChar"/>
+    <w:uiPriority w:val="99"/>
+    <w:unhideWhenUsed/>
+    <w:rsid w:val="00E3018E"/>
+    <w:pPr>
+      <w:tabs>
+        <w:tab w:val="center" w:pos="4513"/>
+        <w:tab w:val="right" w:pos="9026"/>
+      </w:tabs>
+    </w:pPr>
+  </w:style>
+  <w:style w:type="character" w:customStyle="1" w:styleId="HeaderChar">
+    <w:name w:val="Header Char"/>
+    <w:basedOn w:val="DefaultParagraphFont"/>
+    <w:link w:val="Header"/>
+    <w:uiPriority w:val="99"/>
+    <w:rsid w:val="00E3018E"/>
+    <w:rPr>
+      <w:rFonts w:ascii="Times New Roman" w:eastAsiaTheme="minorEastAsia" w:hAnsi="Times New Roman" w:cs="Times New Roman"/>
+    </w:rPr>
+  </w:style>
+  <w:style w:type="paragraph" w:styleId="Footer">
+    <w:name w:val="footer"/>
+    <w:basedOn w:val="Normal"/>
+    <w:link w:val="FooterChar"/>
+    <w:uiPriority w:val="99"/>
+    <w:unhideWhenUsed/>
+    <w:rsid w:val="00E3018E"/>
+    <w:pPr>
+      <w:tabs>
+        <w:tab w:val="center" w:pos="4513"/>
+        <w:tab w:val="right" w:pos="9026"/>
+      </w:tabs>
+    </w:pPr>
+  </w:style>
+  <w:style w:type="character" w:customStyle="1" w:styleId="FooterChar">
+    <w:name w:val="Footer Char"/>
+    <w:basedOn w:val="DefaultParagraphFont"/>
+    <w:link w:val="Footer"/>
+    <w:uiPriority w:val="99"/>
+    <w:rsid w:val="00E3018E"/>
+    <w:rPr>
+      <w:rFonts w:ascii="Times New Roman" w:eastAsiaTheme="minorEastAsia" w:hAnsi="Times New Roman" w:cs="Times New Roman"/>
+    </w:rPr>
+  </w:style>
+  <w:style w:type="paragraph" w:styleId="Revision">
+    <w:name w:val="Revision"/>
+    <w:hidden/>
+    <w:uiPriority w:val="99"/>
+    <w:semiHidden/>
+    <w:rsid w:val="00E043CE"/>
+    <w:pPr>
+      <w:spacing w:after="0" w:line="240" w:lineRule="auto"/>
+    </w:pPr>
+    <w:rPr>
+      <w:rFonts w:ascii="Times New Roman" w:eastAsiaTheme="minorEastAsia" w:hAnsi="Times New Roman" w:cs="Times New Roman"/>
+    </w:rPr>
+  </w:style>
 </w:styles>
 </file>
 
@@ -7267,4 +7759,26 @@
     </a:ext>
   </a:extLst>
 </a:theme>
+</file>
+
+<file path=word/webextensions/taskpanes.xml><?xml version="1.0" encoding="utf-8"?>
+<wetp:taskpanes xmlns:wetp="http://schemas.microsoft.com/office/webextensions/taskpanes/2010/11">
+  <wetp:taskpane dockstate="right" visibility="0" width="350" row="0">
+    <wetp:webextensionref xmlns:r="http://schemas.openxmlformats.org/officeDocument/2006/relationships" r:id="rId1"/>
+  </wetp:taskpane>
+</wetp:taskpanes>
+</file>
+
+<file path=word/webextensions/webextension1.xml><?xml version="1.0" encoding="utf-8"?>
+<we:webextension xmlns:we="http://schemas.microsoft.com/office/webextensions/webextension/2010/11" id="{E7D9174C-92A3-9143-A812-0E050803BE4C}">
+  <we:reference id="wa200010453" version="1.0.0.1" store="en-GB" storeType="OMEX"/>
+  <we:alternateReferences>
+    <we:reference id="WA200010453" version="1.0.0.1" store="WA200010453" storeType="OMEX"/>
+  </we:alternateReferences>
+  <we:properties>
+    <we:property name="claude.fileId" value="&quot;2cdc9523-7083-4c8f-b922-780fcac6e8e5&quot;"/>
+  </we:properties>
+  <we:bindings/>
+  <we:snapshot xmlns:r="http://schemas.openxmlformats.org/officeDocument/2006/relationships"/>
+</we:webextension>
 </file>
</xml_diff>

<commit_message>
Deploying to gh-pages from @ lognitilab/lognitilab.github.io@2176b57e796580e5749e32651ab26ec124fe4d2f 🚀
</commit_message>
<xml_diff>
--- a/assets/doc/cv-anmolpahwa.docx
+++ b/assets/doc/cv-anmolpahwa.docx
@@ -3841,7 +3841,95 @@
           <w:szCs w:val="24"/>
           <w:lang w:val="en-IN"/>
         </w:rPr>
-        <w:t xml:space="preserve">Assessing pre- and post- pandemic shopping </w:t>
+        <w:t xml:space="preserve">Assessing </w:t>
+      </w:r>
+      <w:r>
+        <w:rPr>
+          <w:rFonts w:eastAsia="Times New Roman"/>
+          <w:i/>
+          <w:iCs/>
+          <w:sz w:val="24"/>
+          <w:szCs w:val="24"/>
+          <w:lang w:val="en-IN"/>
+        </w:rPr>
+        <w:t>P</w:t>
+      </w:r>
+      <w:r>
+        <w:rPr>
+          <w:rFonts w:eastAsia="Times New Roman"/>
+          <w:i/>
+          <w:iCs/>
+          <w:sz w:val="24"/>
+          <w:szCs w:val="24"/>
+          <w:lang w:val="en-IN"/>
+        </w:rPr>
+        <w:t xml:space="preserve">re- and </w:t>
+      </w:r>
+      <w:r>
+        <w:rPr>
+          <w:rFonts w:eastAsia="Times New Roman"/>
+          <w:i/>
+          <w:iCs/>
+          <w:sz w:val="24"/>
+          <w:szCs w:val="24"/>
+          <w:lang w:val="en-IN"/>
+        </w:rPr>
+        <w:t>P</w:t>
+      </w:r>
+      <w:r>
+        <w:rPr>
+          <w:rFonts w:eastAsia="Times New Roman"/>
+          <w:i/>
+          <w:iCs/>
+          <w:sz w:val="24"/>
+          <w:szCs w:val="24"/>
+          <w:lang w:val="en-IN"/>
+        </w:rPr>
+        <w:t xml:space="preserve">ost- </w:t>
+      </w:r>
+      <w:r>
+        <w:rPr>
+          <w:rFonts w:eastAsia="Times New Roman"/>
+          <w:i/>
+          <w:iCs/>
+          <w:sz w:val="24"/>
+          <w:szCs w:val="24"/>
+          <w:lang w:val="en-IN"/>
+        </w:rPr>
+        <w:t>P</w:t>
+      </w:r>
+      <w:r>
+        <w:rPr>
+          <w:rFonts w:eastAsia="Times New Roman"/>
+          <w:i/>
+          <w:iCs/>
+          <w:sz w:val="24"/>
+          <w:szCs w:val="24"/>
+          <w:lang w:val="en-IN"/>
+        </w:rPr>
+        <w:t xml:space="preserve">andemic </w:t>
+      </w:r>
+      <w:r>
+        <w:rPr>
+          <w:rFonts w:eastAsia="Times New Roman"/>
+          <w:i/>
+          <w:iCs/>
+          <w:sz w:val="24"/>
+          <w:szCs w:val="24"/>
+          <w:lang w:val="en-IN"/>
+        </w:rPr>
+        <w:t>S</w:t>
+      </w:r>
+      <w:r>
+        <w:rPr>
+          <w:rFonts w:eastAsia="Times New Roman"/>
+          <w:i/>
+          <w:iCs/>
+          <w:sz w:val="24"/>
+          <w:szCs w:val="24"/>
+          <w:lang w:val="en-IN"/>
+        </w:rPr>
+        <w:t xml:space="preserve">hopping </w:t>
       </w:r>
       <w:proofErr w:type="spellStart"/>
       <w:r>
@@ -3853,7 +3941,18 @@
           <w:szCs w:val="24"/>
           <w:lang w:val="en-IN"/>
         </w:rPr>
-        <w:t>behavior</w:t>
+        <w:t>B</w:t>
+      </w:r>
+      <w:r>
+        <w:rPr>
+          <w:rFonts w:eastAsia="Times New Roman"/>
+          <w:i/>
+          <w:iCs/>
+          <w:sz w:val="24"/>
+          <w:szCs w:val="24"/>
+          <w:lang w:val="en-IN"/>
+        </w:rPr>
+        <w:t>ehavior</w:t>
       </w:r>
       <w:proofErr w:type="spellEnd"/>
       <w:r>
@@ -3865,7 +3964,29 @@
           <w:szCs w:val="24"/>
           <w:lang w:val="en-IN"/>
         </w:rPr>
-        <w:t xml:space="preserve"> in Indian consumers</w:t>
+        <w:t xml:space="preserve"> in Indian </w:t>
+      </w:r>
+      <w:r>
+        <w:rPr>
+          <w:rFonts w:eastAsia="Times New Roman"/>
+          <w:i/>
+          <w:iCs/>
+          <w:sz w:val="24"/>
+          <w:szCs w:val="24"/>
+          <w:lang w:val="en-IN"/>
+        </w:rPr>
+        <w:t>C</w:t>
+      </w:r>
+      <w:r>
+        <w:rPr>
+          <w:rFonts w:eastAsia="Times New Roman"/>
+          <w:i/>
+          <w:iCs/>
+          <w:sz w:val="24"/>
+          <w:szCs w:val="24"/>
+          <w:lang w:val="en-IN"/>
+        </w:rPr>
+        <w:t>onsumers</w:t>
       </w:r>
       <w:r>
         <w:rPr>

</xml_diff>

<commit_message>
Deploying to gh-pages from @ lognitilab/lognitilab.github.io@681e6be082856a62f0cbe52a3bf5697edbedccc2 🚀
</commit_message>
<xml_diff>
--- a/assets/doc/cv-anmolpahwa.docx
+++ b/assets/doc/cv-anmolpahwa.docx
@@ -16,6 +16,17 @@
       </w:pPr>
       <w:bookmarkStart w:id="0" w:name="page1"/>
       <w:bookmarkEnd w:id="0"/>
+      <w:r>
+        <w:rPr>
+          <w:rFonts w:eastAsia="Times New Roman"/>
+          <w:b/>
+          <w:bCs/>
+          <w:sz w:val="40"/>
+          <w:szCs w:val="40"/>
+          <w:lang w:val="en-IN"/>
+        </w:rPr>
+        <w:t>9</w:t>
+      </w:r>
       <w:r>
         <w:rPr>
           <w:rFonts w:eastAsia="Times New Roman"/>
@@ -4840,7 +4851,7 @@
           <w:lang w:val="en-IN"/>
         </w:rPr>
         <w:drawing>
-          <wp:anchor distT="0" distB="0" distL="114300" distR="114300" simplePos="0" relativeHeight="251661312" behindDoc="1" locked="0" layoutInCell="0" allowOverlap="1" wp14:anchorId="3FDF0BEB" wp14:editId="6AD91753">
+          <wp:anchor distT="0" distB="0" distL="114300" distR="114300" simplePos="0" relativeHeight="251658241" behindDoc="1" locked="0" layoutInCell="0" allowOverlap="1" wp14:anchorId="3FDF0BEB" wp14:editId="6AD91753">
             <wp:simplePos x="0" y="0"/>
             <wp:positionH relativeFrom="column">
               <wp:posOffset>-18415</wp:posOffset>
@@ -5145,7 +5156,7 @@
           <w:lang w:val="en-IN"/>
         </w:rPr>
         <w:drawing>
-          <wp:anchor distT="0" distB="0" distL="114300" distR="114300" simplePos="0" relativeHeight="251659264" behindDoc="1" locked="0" layoutInCell="0" allowOverlap="1" wp14:anchorId="29AA7DDA" wp14:editId="0CAACD98">
+          <wp:anchor distT="0" distB="0" distL="114300" distR="114300" simplePos="0" relativeHeight="251658240" behindDoc="1" locked="0" layoutInCell="0" allowOverlap="1" wp14:anchorId="29AA7DDA" wp14:editId="0CAACD98">
             <wp:simplePos x="0" y="0"/>
             <wp:positionH relativeFrom="column">
               <wp:posOffset>-18415</wp:posOffset>

</xml_diff>

<commit_message>
Deploying to gh-pages from @ lognitilab/lognitilab.github.io@9445da8c1748e6df53b5bc624fe477a2b2566732 🚀
</commit_message>
<xml_diff>
--- a/assets/doc/cv-anmolpahwa.docx
+++ b/assets/doc/cv-anmolpahwa.docx
@@ -1,6 +1,6 @@
 
 <file path=word/document.xml><?xml version="1.0" encoding="utf-8"?>
-<w:document xmlns:wpc="http://schemas.microsoft.com/office/word/2010/wordprocessingCanvas" xmlns:cx="http://schemas.microsoft.com/office/drawing/2014/chartex" xmlns:cx1="http://schemas.microsoft.com/office/drawing/2015/9/8/chartex" xmlns:cx2="http://schemas.microsoft.com/office/drawing/2015/10/21/chartex" xmlns:cx3="http://schemas.microsoft.com/office/drawing/2016/5/9/chartex" xmlns:cx4="http://schemas.microsoft.com/office/drawing/2016/5/10/chartex" xmlns:cx5="http://schemas.microsoft.com/office/drawing/2016/5/11/chartex" xmlns:cx6="http://schemas.microsoft.com/office/drawing/2016/5/12/chartex" xmlns:cx7="http://schemas.microsoft.com/office/drawing/2016/5/13/chartex" xmlns:cx8="http://schemas.microsoft.com/office/drawing/2016/5/14/chartex" xmlns:mc="http://schemas.openxmlformats.org/markup-compatibility/2006" xmlns:m="http://schemas.openxmlformats.org/officeDocument/2006/math" xmlns:aink="http://schemas.microsoft.com/office/drawing/2016/ink" xmlns:am3d="http://schemas.microsoft.com/office/drawing/2017/model3d" xmlns:oel="http://schemas.microsoft.com/office/2019/extlst" xmlns:r="http://schemas.openxmlformats.org/officeDocument/2006/relationships" xmlns:wp14="http://schemas.microsoft.com/office/word/2010/wordprocessingDrawing" xmlns:wp="http://schemas.openxmlformats.org/drawingml/2006/wordprocessingDrawing" xmlns:wpg="http://schemas.microsoft.com/office/word/2010/wordprocessingGroup" xmlns:wpi="http://schemas.microsoft.com/office/word/2010/wordprocessingInk" xmlns:wps="http://schemas.microsoft.com/office/word/2010/wordprocessingShape" xmlns:o="urn:schemas-microsoft-com:office:office" xmlns:v="urn:schemas-microsoft-com:vml" xmlns:w10="urn:schemas-microsoft-com:office:word" xmlns:w="http://schemas.openxmlformats.org/wordprocessingml/2006/main" xmlns:w14="http://schemas.microsoft.com/office/word/2010/wordml" xmlns:w15="http://schemas.microsoft.com/office/word/2012/wordml" xmlns:w16cex="http://schemas.microsoft.com/office/word/2018/wordml/cex" xmlns:w16cid="http://schemas.microsoft.com/office/word/2016/wordml/cid" xmlns:w16="http://schemas.microsoft.com/office/word/2018/wordml" xmlns:w16sdtdh="http://schemas.microsoft.com/office/word/2020/wordml/sdtdatahash" xmlns:w16sdtfl="http://schemas.microsoft.com/office/word/2024/wordml/sdtformatlock" xmlns:w16se="http://schemas.microsoft.com/office/word/2015/wordml/symex" xmlns:w16du="http://schemas.microsoft.com/office/word/2023/wordml/word16du" xmlns:wne="http://schemas.microsoft.com/office/word/2006/wordml" mc:Ignorable="w14 w15 w16se w16cid w16 w16cex w16sdtdh w16sdtfl w16du wp14">
+<w:document xmlns:wpc="http://schemas.microsoft.com/office/word/2010/wordprocessingCanvas" xmlns:cx="http://schemas.microsoft.com/office/drawing/2014/chartex" xmlns:cx1="http://schemas.microsoft.com/office/drawing/2015/9/8/chartex" xmlns:cx2="http://schemas.microsoft.com/office/drawing/2015/10/21/chartex" xmlns:cx3="http://schemas.microsoft.com/office/drawing/2016/5/9/chartex" xmlns:cx4="http://schemas.microsoft.com/office/drawing/2016/5/10/chartex" xmlns:cx5="http://schemas.microsoft.com/office/drawing/2016/5/11/chartex" xmlns:cx6="http://schemas.microsoft.com/office/drawing/2016/5/12/chartex" xmlns:cx7="http://schemas.microsoft.com/office/drawing/2016/5/13/chartex" xmlns:cx8="http://schemas.microsoft.com/office/drawing/2016/5/14/chartex" xmlns:mc="http://schemas.openxmlformats.org/markup-compatibility/2006" xmlns:aink="http://schemas.microsoft.com/office/drawing/2016/ink" xmlns:am3d="http://schemas.microsoft.com/office/drawing/2017/model3d" xmlns:o="urn:schemas-microsoft-com:office:office" xmlns:oel="http://schemas.microsoft.com/office/2019/extlst" xmlns:r="http://schemas.openxmlformats.org/officeDocument/2006/relationships" xmlns:m="http://schemas.openxmlformats.org/officeDocument/2006/math" xmlns:v="urn:schemas-microsoft-com:vml" xmlns:wp14="http://schemas.microsoft.com/office/word/2010/wordprocessingDrawing" xmlns:wp="http://schemas.openxmlformats.org/drawingml/2006/wordprocessingDrawing" xmlns:w10="urn:schemas-microsoft-com:office:word" xmlns:w="http://schemas.openxmlformats.org/wordprocessingml/2006/main" xmlns:w14="http://schemas.microsoft.com/office/word/2010/wordml" xmlns:w15="http://schemas.microsoft.com/office/word/2012/wordml" xmlns:w16cei="http://schemas.microsoft.com/office/word/2026/wordml/cei" xmlns:w16cex="http://schemas.microsoft.com/office/word/2018/wordml/cex" xmlns:w16cid="http://schemas.microsoft.com/office/word/2016/wordml/cid" xmlns:w16="http://schemas.microsoft.com/office/word/2018/wordml" xmlns:w16du="http://schemas.microsoft.com/office/word/2023/wordml/word16du" xmlns:w16sdtdh="http://schemas.microsoft.com/office/word/2020/wordml/sdtdatahash" xmlns:w16sdtfl="http://schemas.microsoft.com/office/word/2024/wordml/sdtformatlock" xmlns:w16se="http://schemas.microsoft.com/office/word/2015/wordml/symex" xmlns:wpg="http://schemas.microsoft.com/office/word/2010/wordprocessingGroup" xmlns:wpi="http://schemas.microsoft.com/office/word/2010/wordprocessingInk" xmlns:wne="http://schemas.microsoft.com/office/word/2006/wordml" xmlns:wps="http://schemas.microsoft.com/office/word/2010/wordprocessingShape" mc:Ignorable="w14 w15 w16se w16cid w16 w16cex w16sdtdh w16sdtfl w16du wp14">
   <w:body>
     <w:p>
       <w:pPr>
@@ -2203,16 +2203,25 @@
           <w:szCs w:val="24"/>
           <w:lang w:val="en-IN"/>
         </w:rPr>
-        <w:t xml:space="preserve">Pahwa, A. </w:t>
-      </w:r>
-      <w:r>
-        <w:rPr>
-          <w:rFonts w:eastAsia="Times New Roman"/>
-          <w:sz w:val="24"/>
-          <w:szCs w:val="24"/>
-          <w:lang w:val="en-IN"/>
-        </w:rPr>
-        <w:t xml:space="preserve">(In Press). </w:t>
+        <w:t>Pahwa, A.</w:t>
+      </w:r>
+      <w:r>
+        <w:rPr>
+          <w:rFonts w:eastAsia="Times New Roman"/>
+          <w:sz w:val="24"/>
+          <w:szCs w:val="24"/>
+          <w:lang w:val="en-IN"/>
+        </w:rPr>
+        <w:t xml:space="preserve"> (2026)</w:t>
+      </w:r>
+      <w:r>
+        <w:rPr>
+          <w:rFonts w:eastAsia="Times New Roman"/>
+          <w:sz w:val="24"/>
+          <w:szCs w:val="24"/>
+          <w:lang w:val="en-IN"/>
+        </w:rPr>
+        <w:t xml:space="preserve">. </w:t>
       </w:r>
       <w:r>
         <w:rPr>
@@ -2467,7 +2476,23 @@
           <w:sz w:val="24"/>
           <w:szCs w:val="24"/>
         </w:rPr>
-        <w:t>, J. D., &amp; Hyland, M. (2024). Benefits, Challenges, and Opportunities of Different Last-Mile Delivery Strategies.</w:t>
+        <w:t xml:space="preserve">, J. D., &amp; Hyland, M. (2024). Benefits, Challenges, and Opportunities </w:t>
+      </w:r>
+      <w:proofErr w:type="gramStart"/>
+      <w:r>
+        <w:rPr>
+          <w:sz w:val="24"/>
+          <w:szCs w:val="24"/>
+        </w:rPr>
+        <w:t>of</w:t>
+      </w:r>
+      <w:proofErr w:type="gramEnd"/>
+      <w:r>
+        <w:rPr>
+          <w:sz w:val="24"/>
+          <w:szCs w:val="24"/>
+        </w:rPr>
+        <w:t xml:space="preserve"> Different Last-Mile Delivery Strategies.</w:t>
       </w:r>
       <w:r>
         <w:rPr>
@@ -4486,43 +4511,81 @@
           <w:szCs w:val="24"/>
           <w:lang w:val="en-IN"/>
         </w:rPr>
-        <w:t>Principal Investigator on Decision Support Tool for Sustainable Urban Freight Management in Bengaluru</w:t>
-      </w:r>
-      <w:r>
-        <w:rPr>
-          <w:rFonts w:eastAsia="Times New Roman"/>
-          <w:sz w:val="24"/>
-          <w:szCs w:val="24"/>
-          <w:lang w:val="en-IN"/>
-        </w:rPr>
-        <w:t xml:space="preserve">. Funded by </w:t>
-      </w:r>
-      <w:r>
-        <w:rPr>
-          <w:rFonts w:eastAsia="Times New Roman"/>
-          <w:sz w:val="24"/>
-          <w:szCs w:val="24"/>
-          <w:lang w:val="en-IN"/>
-        </w:rPr>
-        <w:t>Directorate of Urban Land Transport</w:t>
-      </w:r>
-      <w:r>
-        <w:rPr>
-          <w:rFonts w:eastAsia="Times New Roman"/>
-          <w:sz w:val="24"/>
-          <w:szCs w:val="24"/>
-          <w:lang w:val="en-IN"/>
-        </w:rPr>
-        <w:t xml:space="preserve">, Govt. of Karnataka (2025-26, </w:t>
-      </w:r>
-      <w:r>
-        <w:rPr>
-          <w:rFonts w:eastAsia="Times New Roman"/>
-          <w:sz w:val="24"/>
-          <w:szCs w:val="24"/>
-          <w:lang w:val="en-IN"/>
-        </w:rPr>
-        <w:t xml:space="preserve"> ₹20.82L</w:t>
+        <w:t xml:space="preserve">Principal Investigator on </w:t>
+      </w:r>
+      <w:r>
+        <w:rPr>
+          <w:rFonts w:eastAsia="Times New Roman"/>
+          <w:i/>
+          <w:iCs/>
+          <w:sz w:val="24"/>
+          <w:szCs w:val="24"/>
+          <w:lang w:val="en-IN"/>
+        </w:rPr>
+        <w:t>Network Economic Impact Assessment of India’s High-Speed Rail Programme Using a Validated Multi-Regional Transport CGE Model</w:t>
+      </w:r>
+      <w:r>
+        <w:rPr>
+          <w:rFonts w:eastAsia="Times New Roman"/>
+          <w:sz w:val="24"/>
+          <w:szCs w:val="24"/>
+          <w:lang w:val="en-IN"/>
+        </w:rPr>
+        <w:t xml:space="preserve">. Funded by National </w:t>
+      </w:r>
+      <w:r>
+        <w:rPr>
+          <w:rFonts w:eastAsia="Times New Roman"/>
+          <w:sz w:val="24"/>
+          <w:szCs w:val="24"/>
+          <w:lang w:val="en-IN"/>
+        </w:rPr>
+        <w:t>High-Speed</w:t>
+      </w:r>
+      <w:r>
+        <w:rPr>
+          <w:rFonts w:eastAsia="Times New Roman"/>
+          <w:sz w:val="24"/>
+          <w:szCs w:val="24"/>
+          <w:lang w:val="en-IN"/>
+        </w:rPr>
+        <w:t xml:space="preserve"> Rail Corpo</w:t>
+      </w:r>
+      <w:r>
+        <w:rPr>
+          <w:rFonts w:eastAsia="Times New Roman"/>
+          <w:sz w:val="24"/>
+          <w:szCs w:val="24"/>
+          <w:lang w:val="en-IN"/>
+        </w:rPr>
+        <w:t>ration Limited</w:t>
+      </w:r>
+      <w:r>
+        <w:rPr>
+          <w:rFonts w:eastAsia="Times New Roman"/>
+          <w:sz w:val="24"/>
+          <w:szCs w:val="24"/>
+          <w:lang w:val="en-IN"/>
+        </w:rPr>
+        <w:t xml:space="preserve"> (2026-27, </w:t>
+      </w:r>
+      <w:r>
+        <w:rPr>
+          <w:rFonts w:eastAsia="Times New Roman"/>
+          <w:sz w:val="24"/>
+          <w:szCs w:val="24"/>
+          <w:lang w:val="en-IN"/>
+        </w:rPr>
+        <w:t>₹</w:t>
+      </w:r>
+      <w:r>
+        <w:rPr>
+          <w:rFonts w:eastAsia="Times New Roman"/>
+          <w:sz w:val="24"/>
+          <w:szCs w:val="24"/>
+          <w:lang w:val="en-IN"/>
+        </w:rPr>
+        <w:t>2.065Cr</w:t>
       </w:r>
       <w:r>
         <w:rPr>
@@ -4558,20 +4621,42 @@
       <w:r>
         <w:rPr>
           <w:rFonts w:eastAsia="Times New Roman"/>
-          <w:sz w:val="24"/>
-          <w:szCs w:val="24"/>
-          <w:lang w:val="en-IN"/>
-        </w:rPr>
-        <w:t>Developing Battery-Aware Operations for Autonomous and Unmanned Last-Mile Delivery Systems</w:t>
-      </w:r>
-      <w:r>
-        <w:rPr>
-          <w:rFonts w:eastAsia="Times New Roman"/>
-          <w:sz w:val="24"/>
-          <w:szCs w:val="24"/>
-          <w:lang w:val="en-IN"/>
-        </w:rPr>
-        <w:t xml:space="preserve">. Funded by IC&amp;SR IIT Madras (2025-27, </w:t>
+          <w:i/>
+          <w:iCs/>
+          <w:sz w:val="24"/>
+          <w:szCs w:val="24"/>
+          <w:lang w:val="en-IN"/>
+        </w:rPr>
+        <w:t xml:space="preserve">A Digital </w:t>
+      </w:r>
+      <w:r>
+        <w:rPr>
+          <w:rFonts w:eastAsia="Times New Roman"/>
+          <w:i/>
+          <w:iCs/>
+          <w:sz w:val="24"/>
+          <w:szCs w:val="24"/>
+          <w:lang w:val="en-IN"/>
+        </w:rPr>
+        <w:t>Twin for Adaptive Bus Fleet Management – Enhancing Efficiency and Resilience under Disruptions</w:t>
+      </w:r>
+      <w:r>
+        <w:rPr>
+          <w:rFonts w:eastAsia="Times New Roman"/>
+          <w:sz w:val="24"/>
+          <w:szCs w:val="24"/>
+          <w:lang w:val="en-IN"/>
+        </w:rPr>
+        <w:t xml:space="preserve">. Funded by Office of Global Engagement, IIT Madras </w:t>
+      </w:r>
+      <w:r>
+        <w:rPr>
+          <w:rFonts w:eastAsia="Times New Roman"/>
+          <w:sz w:val="24"/>
+          <w:szCs w:val="24"/>
+          <w:lang w:val="en-IN"/>
+        </w:rPr>
+        <w:t xml:space="preserve">(2026-27, </w:t>
       </w:r>
       <w:r>
         <w:rPr>
@@ -4589,7 +4674,7 @@
           <w:szCs w:val="24"/>
           <w:lang w:val="en-IN"/>
         </w:rPr>
-        <w:t>49.9L)</w:t>
+        <w:t>9.43L)</w:t>
       </w:r>
     </w:p>
     <w:p>
@@ -4611,16 +4696,18 @@
           <w:szCs w:val="24"/>
           <w:lang w:val="en-IN"/>
         </w:rPr>
-        <w:t xml:space="preserve">Co-Principal Investigator on </w:t>
-      </w:r>
-      <w:r>
-        <w:rPr>
-          <w:rFonts w:eastAsia="Times New Roman"/>
-          <w:sz w:val="24"/>
-          <w:szCs w:val="24"/>
-          <w:lang w:val="en-IN"/>
-        </w:rPr>
-        <w:t>PACT-Digi-PULSE - Partnering for Advancing Carbon-neutral Transitions using Digital-twin based Planning for Urban Living and Sustainable Environment</w:t>
+        <w:t xml:space="preserve">Principal Investigator on </w:t>
+      </w:r>
+      <w:r>
+        <w:rPr>
+          <w:rFonts w:eastAsia="Times New Roman"/>
+          <w:i/>
+          <w:iCs/>
+          <w:sz w:val="24"/>
+          <w:szCs w:val="24"/>
+          <w:lang w:val="en-IN"/>
+        </w:rPr>
+        <w:t>Decision Support Tool for Sustainable Urban Freight Management in Bengaluru</w:t>
       </w:r>
       <w:r>
         <w:rPr>
@@ -4638,34 +4725,54 @@
           <w:szCs w:val="24"/>
           <w:lang w:val="en-IN"/>
         </w:rPr>
-        <w:t>Palladium International Limited</w:t>
-      </w:r>
-      <w:r>
-        <w:rPr>
-          <w:rFonts w:eastAsia="Times New Roman"/>
-          <w:sz w:val="24"/>
-          <w:szCs w:val="24"/>
-          <w:lang w:val="en-IN"/>
-        </w:rPr>
-        <w:t xml:space="preserve"> (2025-27, </w:t>
-      </w:r>
-      <w:r>
-        <w:rPr>
-          <w:rFonts w:eastAsia="Times New Roman"/>
-          <w:sz w:val="24"/>
-          <w:szCs w:val="24"/>
-          <w:lang w:val="en-IN"/>
-        </w:rPr>
-        <w:t>₹</w:t>
-      </w:r>
-      <w:r>
-        <w:rPr>
-          <w:rFonts w:eastAsia="Times New Roman"/>
-          <w:sz w:val="24"/>
-          <w:szCs w:val="24"/>
-          <w:lang w:val="en-IN"/>
-        </w:rPr>
-        <w:t>5.6Cr)</w:t>
+        <w:t>Directorate of Urban Land Transport</w:t>
+      </w:r>
+      <w:r>
+        <w:rPr>
+          <w:rFonts w:eastAsia="Times New Roman"/>
+          <w:sz w:val="24"/>
+          <w:szCs w:val="24"/>
+          <w:lang w:val="en-IN"/>
+        </w:rPr>
+        <w:t>, Govt. of Karnataka (2025-</w:t>
+      </w:r>
+      <w:proofErr w:type="gramStart"/>
+      <w:r>
+        <w:rPr>
+          <w:rFonts w:eastAsia="Times New Roman"/>
+          <w:sz w:val="24"/>
+          <w:szCs w:val="24"/>
+          <w:lang w:val="en-IN"/>
+        </w:rPr>
+        <w:t xml:space="preserve">26, </w:t>
+      </w:r>
+      <w:r>
+        <w:rPr>
+          <w:rFonts w:eastAsia="Times New Roman"/>
+          <w:sz w:val="24"/>
+          <w:szCs w:val="24"/>
+          <w:lang w:val="en-IN"/>
+        </w:rPr>
+        <w:t xml:space="preserve"> ₹</w:t>
+      </w:r>
+      <w:proofErr w:type="gramEnd"/>
+      <w:r>
+        <w:rPr>
+          <w:rFonts w:eastAsia="Times New Roman"/>
+          <w:sz w:val="24"/>
+          <w:szCs w:val="24"/>
+          <w:lang w:val="en-IN"/>
+        </w:rPr>
+        <w:t>20.82L</w:t>
+      </w:r>
+      <w:r>
+        <w:rPr>
+          <w:rFonts w:eastAsia="Times New Roman"/>
+          <w:sz w:val="24"/>
+          <w:szCs w:val="24"/>
+          <w:lang w:val="en-IN"/>
+        </w:rPr>
+        <w:t>)</w:t>
       </w:r>
     </w:p>
     <w:p>
@@ -4675,6 +4782,252 @@
         <w:jc w:val="both"/>
         <w:rPr>
           <w:rFonts w:eastAsia="Times New Roman"/>
+          <w:sz w:val="24"/>
+          <w:szCs w:val="24"/>
+          <w:lang w:val="en-IN"/>
+        </w:rPr>
+      </w:pPr>
+      <w:r>
+        <w:rPr>
+          <w:rFonts w:eastAsia="Times New Roman"/>
+          <w:sz w:val="24"/>
+          <w:szCs w:val="24"/>
+          <w:lang w:val="en-IN"/>
+        </w:rPr>
+        <w:t xml:space="preserve">Principal Investigator on </w:t>
+      </w:r>
+      <w:r>
+        <w:rPr>
+          <w:rFonts w:eastAsia="Times New Roman"/>
+          <w:i/>
+          <w:iCs/>
+          <w:sz w:val="24"/>
+          <w:szCs w:val="24"/>
+          <w:lang w:val="en-IN"/>
+        </w:rPr>
+        <w:t>Developing Battery-Aware Operations for Autonomous and Unmanned Last-Mile Delivery Systems</w:t>
+      </w:r>
+      <w:r>
+        <w:rPr>
+          <w:rFonts w:eastAsia="Times New Roman"/>
+          <w:sz w:val="24"/>
+          <w:szCs w:val="24"/>
+          <w:lang w:val="en-IN"/>
+        </w:rPr>
+        <w:t xml:space="preserve">. Funded by IC&amp;SR IIT Madras (2025-27, </w:t>
+      </w:r>
+      <w:r>
+        <w:rPr>
+          <w:rFonts w:eastAsia="Times New Roman"/>
+          <w:sz w:val="24"/>
+          <w:szCs w:val="24"/>
+          <w:lang w:val="en-IN"/>
+        </w:rPr>
+        <w:t>₹</w:t>
+      </w:r>
+      <w:r>
+        <w:rPr>
+          <w:rFonts w:eastAsia="Times New Roman"/>
+          <w:sz w:val="24"/>
+          <w:szCs w:val="24"/>
+          <w:lang w:val="en-IN"/>
+        </w:rPr>
+        <w:t>49.9L)</w:t>
+      </w:r>
+    </w:p>
+    <w:p>
+      <w:pPr>
+        <w:spacing w:line="276" w:lineRule="auto"/>
+        <w:ind w:left="480" w:hanging="120"/>
+        <w:jc w:val="both"/>
+        <w:rPr>
+          <w:rFonts w:eastAsia="Times New Roman"/>
+          <w:sz w:val="24"/>
+          <w:szCs w:val="24"/>
+          <w:lang w:val="en-IN"/>
+        </w:rPr>
+      </w:pPr>
+      <w:r>
+        <w:rPr>
+          <w:rFonts w:eastAsia="Times New Roman"/>
+          <w:sz w:val="24"/>
+          <w:szCs w:val="24"/>
+          <w:lang w:val="en-IN"/>
+        </w:rPr>
+        <w:lastRenderedPageBreak/>
+        <w:t xml:space="preserve">Co-Principal Investigator on </w:t>
+      </w:r>
+      <w:r>
+        <w:rPr>
+          <w:rFonts w:eastAsia="Times New Roman"/>
+          <w:i/>
+          <w:iCs/>
+          <w:sz w:val="24"/>
+          <w:szCs w:val="24"/>
+          <w:lang w:val="en-IN"/>
+        </w:rPr>
+        <w:t>PACT-Digi-PULSE - Partnering for Advancing Carbon-neutral Transitions using Digital-twin based Planning for Urban Living and Sustainable Environment</w:t>
+      </w:r>
+      <w:r>
+        <w:rPr>
+          <w:rFonts w:eastAsia="Times New Roman"/>
+          <w:sz w:val="24"/>
+          <w:szCs w:val="24"/>
+          <w:lang w:val="en-IN"/>
+        </w:rPr>
+        <w:t xml:space="preserve">. Funded by </w:t>
+      </w:r>
+      <w:r>
+        <w:rPr>
+          <w:rFonts w:eastAsia="Times New Roman"/>
+          <w:sz w:val="24"/>
+          <w:szCs w:val="24"/>
+          <w:lang w:val="en-IN"/>
+        </w:rPr>
+        <w:t>Palladium International Limited</w:t>
+      </w:r>
+      <w:r>
+        <w:rPr>
+          <w:rFonts w:eastAsia="Times New Roman"/>
+          <w:sz w:val="24"/>
+          <w:szCs w:val="24"/>
+          <w:lang w:val="en-IN"/>
+        </w:rPr>
+        <w:t xml:space="preserve"> (2025-27, </w:t>
+      </w:r>
+      <w:r>
+        <w:rPr>
+          <w:rFonts w:eastAsia="Times New Roman"/>
+          <w:sz w:val="24"/>
+          <w:szCs w:val="24"/>
+          <w:lang w:val="en-IN"/>
+        </w:rPr>
+        <w:t>₹</w:t>
+      </w:r>
+      <w:r>
+        <w:rPr>
+          <w:rFonts w:eastAsia="Times New Roman"/>
+          <w:sz w:val="24"/>
+          <w:szCs w:val="24"/>
+          <w:lang w:val="en-IN"/>
+        </w:rPr>
+        <w:t>5.6Cr)</w:t>
+      </w:r>
+    </w:p>
+    <w:p>
+      <w:pPr>
+        <w:spacing w:line="276" w:lineRule="auto"/>
+        <w:ind w:left="480" w:hanging="120"/>
+        <w:jc w:val="both"/>
+        <w:rPr>
+          <w:rFonts w:eastAsia="Times New Roman"/>
+          <w:sz w:val="24"/>
+          <w:szCs w:val="24"/>
+          <w:lang w:val="en-IN"/>
+        </w:rPr>
+      </w:pPr>
+      <w:r>
+        <w:rPr>
+          <w:rFonts w:eastAsia="Times New Roman"/>
+          <w:sz w:val="24"/>
+          <w:szCs w:val="24"/>
+          <w:lang w:val="en-IN"/>
+        </w:rPr>
+        <w:t xml:space="preserve">Co-Principal Investigator on </w:t>
+      </w:r>
+      <w:r>
+        <w:rPr>
+          <w:rFonts w:eastAsia="Times New Roman"/>
+          <w:i/>
+          <w:iCs/>
+          <w:sz w:val="24"/>
+          <w:szCs w:val="24"/>
+          <w:lang w:val="en-IN"/>
+        </w:rPr>
+        <w:t>Sustainable Logistics Infrastructure and Planning</w:t>
+      </w:r>
+      <w:r>
+        <w:rPr>
+          <w:rFonts w:eastAsia="Times New Roman"/>
+          <w:sz w:val="24"/>
+          <w:szCs w:val="24"/>
+          <w:lang w:val="en-IN"/>
+        </w:rPr>
+        <w:t xml:space="preserve">. Funded by </w:t>
+      </w:r>
+      <w:proofErr w:type="spellStart"/>
+      <w:r>
+        <w:rPr>
+          <w:rFonts w:eastAsia="Times New Roman"/>
+          <w:sz w:val="24"/>
+          <w:szCs w:val="24"/>
+          <w:lang w:val="en-IN"/>
+        </w:rPr>
+        <w:t>Fedex</w:t>
+      </w:r>
+      <w:proofErr w:type="spellEnd"/>
+      <w:r>
+        <w:rPr>
+          <w:rFonts w:eastAsia="Times New Roman"/>
+          <w:sz w:val="24"/>
+          <w:szCs w:val="24"/>
+          <w:lang w:val="en-IN"/>
+        </w:rPr>
+        <w:t xml:space="preserve"> Corporate Services</w:t>
+      </w:r>
+      <w:r>
+        <w:rPr>
+          <w:rFonts w:eastAsia="Times New Roman"/>
+          <w:sz w:val="24"/>
+          <w:szCs w:val="24"/>
+          <w:lang w:val="en-IN"/>
+        </w:rPr>
+        <w:t xml:space="preserve"> Inc. (2025-28, </w:t>
+      </w:r>
+      <w:r>
+        <w:rPr>
+          <w:rFonts w:eastAsia="Times New Roman"/>
+          <w:sz w:val="24"/>
+          <w:szCs w:val="24"/>
+          <w:lang w:val="en-IN"/>
+        </w:rPr>
+        <w:t>₹2</w:t>
+      </w:r>
+      <w:r>
+        <w:rPr>
+          <w:rFonts w:eastAsia="Times New Roman"/>
+          <w:sz w:val="24"/>
+          <w:szCs w:val="24"/>
+          <w:lang w:val="en-IN"/>
+        </w:rPr>
+        <w:t>5</w:t>
+      </w:r>
+      <w:r>
+        <w:rPr>
+          <w:rFonts w:eastAsia="Times New Roman"/>
+          <w:sz w:val="24"/>
+          <w:szCs w:val="24"/>
+          <w:lang w:val="en-IN"/>
+        </w:rPr>
+        <w:t>L</w:t>
+      </w:r>
+      <w:r>
+        <w:rPr>
+          <w:rFonts w:eastAsia="Times New Roman"/>
+          <w:sz w:val="24"/>
+          <w:szCs w:val="24"/>
+          <w:lang w:val="en-IN"/>
+        </w:rPr>
+        <w:t>)</w:t>
+      </w:r>
+    </w:p>
+    <w:p>
+      <w:pPr>
+        <w:spacing w:line="276" w:lineRule="auto"/>
+        <w:ind w:left="480" w:hanging="120"/>
+        <w:jc w:val="both"/>
+        <w:rPr>
+          <w:rFonts w:eastAsia="Times New Roman"/>
           <w:b/>
           <w:bCs/>
           <w:sz w:val="24"/>
@@ -4682,98 +5035,6 @@
           <w:lang w:val="en-IN"/>
         </w:rPr>
       </w:pPr>
-      <w:r>
-        <w:rPr>
-          <w:rFonts w:eastAsia="Times New Roman"/>
-          <w:sz w:val="24"/>
-          <w:szCs w:val="24"/>
-          <w:lang w:val="en-IN"/>
-        </w:rPr>
-        <w:t xml:space="preserve">Co-Principal Investigator on </w:t>
-      </w:r>
-      <w:r>
-        <w:rPr>
-          <w:rFonts w:eastAsia="Times New Roman"/>
-          <w:sz w:val="24"/>
-          <w:szCs w:val="24"/>
-          <w:lang w:val="en-IN"/>
-        </w:rPr>
-        <w:t>Sustainable Logistics Infrastructure and Planning</w:t>
-      </w:r>
-      <w:r>
-        <w:rPr>
-          <w:rFonts w:eastAsia="Times New Roman"/>
-          <w:sz w:val="24"/>
-          <w:szCs w:val="24"/>
-          <w:lang w:val="en-IN"/>
-        </w:rPr>
-        <w:t xml:space="preserve">. Funded by </w:t>
-      </w:r>
-      <w:proofErr w:type="spellStart"/>
-      <w:r>
-        <w:rPr>
-          <w:rFonts w:eastAsia="Times New Roman"/>
-          <w:sz w:val="24"/>
-          <w:szCs w:val="24"/>
-          <w:lang w:val="en-IN"/>
-        </w:rPr>
-        <w:t>Fedex</w:t>
-      </w:r>
-      <w:proofErr w:type="spellEnd"/>
-      <w:r>
-        <w:rPr>
-          <w:rFonts w:eastAsia="Times New Roman"/>
-          <w:sz w:val="24"/>
-          <w:szCs w:val="24"/>
-          <w:lang w:val="en-IN"/>
-        </w:rPr>
-        <w:t xml:space="preserve"> Corporate Services</w:t>
-      </w:r>
-      <w:r>
-        <w:rPr>
-          <w:rFonts w:eastAsia="Times New Roman"/>
-          <w:sz w:val="24"/>
-          <w:szCs w:val="24"/>
-          <w:lang w:val="en-IN"/>
-        </w:rPr>
-        <w:t xml:space="preserve"> Inc. (2025-28, </w:t>
-      </w:r>
-      <w:r>
-        <w:rPr>
-          <w:rFonts w:eastAsia="Times New Roman"/>
-          <w:sz w:val="24"/>
-          <w:szCs w:val="24"/>
-          <w:lang w:val="en-IN"/>
-        </w:rPr>
-        <w:t>₹2</w:t>
-      </w:r>
-      <w:r>
-        <w:rPr>
-          <w:rFonts w:eastAsia="Times New Roman"/>
-          <w:sz w:val="24"/>
-          <w:szCs w:val="24"/>
-          <w:lang w:val="en-IN"/>
-        </w:rPr>
-        <w:t>5</w:t>
-      </w:r>
-      <w:r>
-        <w:rPr>
-          <w:rFonts w:eastAsia="Times New Roman"/>
-          <w:sz w:val="24"/>
-          <w:szCs w:val="24"/>
-          <w:lang w:val="en-IN"/>
-        </w:rPr>
-        <w:t>L</w:t>
-      </w:r>
-      <w:r>
-        <w:rPr>
-          <w:rFonts w:eastAsia="Times New Roman"/>
-          <w:sz w:val="24"/>
-          <w:szCs w:val="24"/>
-          <w:lang w:val="en-IN"/>
-        </w:rPr>
-        <w:t>)</w:t>
-      </w:r>
     </w:p>
     <w:p>
       <w:pPr>
@@ -4797,7 +5058,6 @@
           <w:szCs w:val="24"/>
           <w:lang w:val="en-IN"/>
         </w:rPr>
-        <w:lastRenderedPageBreak/>
         <w:t>H</w:t>
       </w:r>
       <w:r>
@@ -5308,6 +5568,26 @@
     </w:p>
     <w:p>
       <w:pPr>
+        <w:ind w:firstLine="540"/>
+        <w:rPr>
+          <w:rFonts w:eastAsia="Times New Roman"/>
+          <w:sz w:val="24"/>
+          <w:szCs w:val="24"/>
+          <w:lang w:val="en-IN"/>
+        </w:rPr>
+      </w:pPr>
+      <w:r>
+        <w:rPr>
+          <w:rFonts w:eastAsia="Times New Roman"/>
+          <w:sz w:val="24"/>
+          <w:szCs w:val="24"/>
+          <w:lang w:val="en-IN"/>
+        </w:rPr>
+        <w:t>World Conference on Transportation Research – Lifetime Member</w:t>
+      </w:r>
+    </w:p>
+    <w:p>
+      <w:pPr>
         <w:rPr>
           <w:rFonts w:eastAsia="Times New Roman"/>
           <w:b/>
@@ -5317,6 +5597,17 @@
           <w:lang w:val="en-IN"/>
         </w:rPr>
       </w:pPr>
+      <w:r>
+        <w:rPr>
+          <w:rFonts w:eastAsia="Times New Roman"/>
+          <w:b/>
+          <w:bCs/>
+          <w:sz w:val="24"/>
+          <w:szCs w:val="24"/>
+          <w:lang w:val="en-IN"/>
+        </w:rPr>
+        <w:tab/>
+      </w:r>
     </w:p>
     <w:p>
       <w:pPr>
@@ -6032,6 +6323,7 @@
           <w:szCs w:val="24"/>
           <w:lang w:val="en-IN"/>
         </w:rPr>
+        <w:lastRenderedPageBreak/>
         <w:t>Urban Transitions</w:t>
       </w:r>
     </w:p>
@@ -6241,7 +6533,6 @@
           <w:szCs w:val="24"/>
           <w:lang w:val="en-IN"/>
         </w:rPr>
-        <w:lastRenderedPageBreak/>
         <w:t>Stephen Babu (</w:t>
       </w:r>
       <w:r>
@@ -6348,6 +6639,214 @@
           <w:lang w:val="en-IN"/>
         </w:rPr>
         <w:t>)</w:t>
+      </w:r>
+    </w:p>
+    <w:p>
+      <w:pPr>
+        <w:ind w:firstLine="720"/>
+        <w:rPr>
+          <w:rFonts w:eastAsia="Times New Roman"/>
+          <w:sz w:val="24"/>
+          <w:szCs w:val="24"/>
+          <w:lang w:val="en-IN"/>
+        </w:rPr>
+      </w:pPr>
+      <w:proofErr w:type="spellStart"/>
+      <w:r>
+        <w:rPr>
+          <w:rFonts w:eastAsia="Times New Roman"/>
+          <w:sz w:val="24"/>
+          <w:szCs w:val="24"/>
+          <w:lang w:val="en-IN"/>
+        </w:rPr>
+        <w:t>Dayanidha</w:t>
+      </w:r>
+      <w:proofErr w:type="spellEnd"/>
+      <w:r>
+        <w:rPr>
+          <w:rFonts w:eastAsia="Times New Roman"/>
+          <w:sz w:val="24"/>
+          <w:szCs w:val="24"/>
+          <w:lang w:val="en-IN"/>
+        </w:rPr>
+        <w:t xml:space="preserve"> S </w:t>
+      </w:r>
+      <w:r>
+        <w:rPr>
+          <w:rFonts w:eastAsia="Times New Roman"/>
+          <w:sz w:val="24"/>
+          <w:szCs w:val="24"/>
+          <w:lang w:val="en-IN"/>
+        </w:rPr>
+        <w:t>(2025-present)</w:t>
+      </w:r>
+    </w:p>
+    <w:p>
+      <w:pPr>
+        <w:ind w:firstLine="720"/>
+        <w:rPr>
+          <w:rFonts w:eastAsia="Times New Roman"/>
+          <w:sz w:val="24"/>
+          <w:szCs w:val="24"/>
+          <w:lang w:val="en-IN"/>
+        </w:rPr>
+      </w:pPr>
+      <w:r>
+        <w:rPr>
+          <w:rFonts w:eastAsia="Times New Roman"/>
+          <w:sz w:val="24"/>
+          <w:szCs w:val="24"/>
+          <w:lang w:val="en-IN"/>
+        </w:rPr>
+        <w:t>Hana Ab</w:t>
+      </w:r>
+      <w:r>
+        <w:rPr>
+          <w:rFonts w:eastAsia="Times New Roman"/>
+          <w:sz w:val="24"/>
+          <w:szCs w:val="24"/>
+          <w:lang w:val="en-IN"/>
+        </w:rPr>
+        <w:t>oo</w:t>
+      </w:r>
+      <w:r>
+        <w:rPr>
+          <w:rFonts w:eastAsia="Times New Roman"/>
+          <w:sz w:val="24"/>
+          <w:szCs w:val="24"/>
+          <w:lang w:val="en-IN"/>
+        </w:rPr>
+        <w:t>backe</w:t>
+      </w:r>
+      <w:r>
+        <w:rPr>
+          <w:rFonts w:eastAsia="Times New Roman"/>
+          <w:sz w:val="24"/>
+          <w:szCs w:val="24"/>
+          <w:lang w:val="en-IN"/>
+        </w:rPr>
+        <w:t>r (2026-present)</w:t>
+      </w:r>
+    </w:p>
+    <w:p>
+      <w:pPr>
+        <w:ind w:left="360" w:firstLine="180"/>
+        <w:rPr>
+          <w:sz w:val="20"/>
+          <w:szCs w:val="20"/>
+          <w:lang w:val="en-IN"/>
+        </w:rPr>
+      </w:pPr>
+      <w:r>
+        <w:rPr>
+          <w:rFonts w:eastAsia="Times New Roman"/>
+          <w:b/>
+          <w:bCs/>
+          <w:sz w:val="24"/>
+          <w:szCs w:val="24"/>
+          <w:lang w:val="en-IN"/>
+        </w:rPr>
+        <w:t>M</w:t>
+      </w:r>
+      <w:r>
+        <w:rPr>
+          <w:rFonts w:eastAsia="Times New Roman"/>
+          <w:b/>
+          <w:bCs/>
+          <w:sz w:val="24"/>
+          <w:szCs w:val="24"/>
+          <w:lang w:val="en-IN"/>
+        </w:rPr>
+        <w:t>.S.</w:t>
+      </w:r>
+      <w:r>
+        <w:rPr>
+          <w:rFonts w:eastAsia="Times New Roman"/>
+          <w:b/>
+          <w:bCs/>
+          <w:sz w:val="24"/>
+          <w:szCs w:val="24"/>
+          <w:lang w:val="en-IN"/>
+        </w:rPr>
+        <w:t xml:space="preserve"> </w:t>
+      </w:r>
+    </w:p>
+    <w:p>
+      <w:pPr>
+        <w:ind w:firstLine="720"/>
+        <w:rPr>
+          <w:rFonts w:eastAsia="Times New Roman"/>
+          <w:sz w:val="24"/>
+          <w:szCs w:val="24"/>
+          <w:lang w:val="en-IN"/>
+        </w:rPr>
+      </w:pPr>
+      <w:r>
+        <w:rPr>
+          <w:rFonts w:eastAsia="Times New Roman"/>
+          <w:sz w:val="24"/>
+          <w:szCs w:val="24"/>
+          <w:lang w:val="en-IN"/>
+        </w:rPr>
+        <w:t xml:space="preserve">Leena Pramod </w:t>
+      </w:r>
+      <w:proofErr w:type="spellStart"/>
+      <w:r>
+        <w:rPr>
+          <w:rFonts w:eastAsia="Times New Roman"/>
+          <w:sz w:val="24"/>
+          <w:szCs w:val="24"/>
+          <w:lang w:val="en-IN"/>
+        </w:rPr>
+        <w:t>Khandait</w:t>
+      </w:r>
+      <w:proofErr w:type="spellEnd"/>
+      <w:r>
+        <w:rPr>
+          <w:rFonts w:eastAsia="Times New Roman"/>
+          <w:sz w:val="24"/>
+          <w:szCs w:val="24"/>
+          <w:lang w:val="en-IN"/>
+        </w:rPr>
+        <w:t xml:space="preserve"> (2025-present)</w:t>
+      </w:r>
+    </w:p>
+    <w:p>
+      <w:pPr>
+        <w:ind w:firstLine="720"/>
+        <w:rPr>
+          <w:rFonts w:eastAsia="Times New Roman"/>
+          <w:sz w:val="24"/>
+          <w:szCs w:val="24"/>
+          <w:lang w:val="en-IN"/>
+        </w:rPr>
+      </w:pPr>
+      <w:r>
+        <w:rPr>
+          <w:rFonts w:eastAsia="Times New Roman"/>
+          <w:sz w:val="24"/>
+          <w:szCs w:val="24"/>
+          <w:lang w:val="en-IN"/>
+        </w:rPr>
+        <w:t>A R</w:t>
+      </w:r>
+      <w:r>
+        <w:rPr>
+          <w:rFonts w:eastAsia="Times New Roman"/>
+          <w:sz w:val="24"/>
+          <w:szCs w:val="24"/>
+          <w:lang w:val="en-IN"/>
+        </w:rPr>
+        <w:t>anjith Kanna</w:t>
+      </w:r>
+      <w:r>
+        <w:rPr>
+          <w:rFonts w:eastAsia="Times New Roman"/>
+          <w:sz w:val="24"/>
+          <w:szCs w:val="24"/>
+          <w:lang w:val="en-IN"/>
+        </w:rPr>
+        <w:t xml:space="preserve"> (2026-present)</w:t>
       </w:r>
     </w:p>
     <w:p>
@@ -6880,7 +7379,7 @@
 </file>
 
 <file path=word/endnotes.xml><?xml version="1.0" encoding="utf-8"?>
-<w:endnotes xmlns:wpc="http://schemas.microsoft.com/office/word/2010/wordprocessingCanvas" xmlns:cx="http://schemas.microsoft.com/office/drawing/2014/chartex" xmlns:cx1="http://schemas.microsoft.com/office/drawing/2015/9/8/chartex" xmlns:cx2="http://schemas.microsoft.com/office/drawing/2015/10/21/chartex" xmlns:cx3="http://schemas.microsoft.com/office/drawing/2016/5/9/chartex" xmlns:cx4="http://schemas.microsoft.com/office/drawing/2016/5/10/chartex" xmlns:cx5="http://schemas.microsoft.com/office/drawing/2016/5/11/chartex" xmlns:cx6="http://schemas.microsoft.com/office/drawing/2016/5/12/chartex" xmlns:cx7="http://schemas.microsoft.com/office/drawing/2016/5/13/chartex" xmlns:cx8="http://schemas.microsoft.com/office/drawing/2016/5/14/chartex" xmlns:mc="http://schemas.openxmlformats.org/markup-compatibility/2006" xmlns:m="http://schemas.openxmlformats.org/officeDocument/2006/math" xmlns:aink="http://schemas.microsoft.com/office/drawing/2016/ink" xmlns:am3d="http://schemas.microsoft.com/office/drawing/2017/model3d" xmlns:oel="http://schemas.microsoft.com/office/2019/extlst" xmlns:r="http://schemas.openxmlformats.org/officeDocument/2006/relationships" xmlns:wp14="http://schemas.microsoft.com/office/word/2010/wordprocessingDrawing" xmlns:wp="http://schemas.openxmlformats.org/drawingml/2006/wordprocessingDrawing" xmlns:wpg="http://schemas.microsoft.com/office/word/2010/wordprocessingGroup" xmlns:wpi="http://schemas.microsoft.com/office/word/2010/wordprocessingInk" xmlns:wps="http://schemas.microsoft.com/office/word/2010/wordprocessingShape" xmlns:o="urn:schemas-microsoft-com:office:office" xmlns:v="urn:schemas-microsoft-com:vml" xmlns:w10="urn:schemas-microsoft-com:office:word" xmlns:w="http://schemas.openxmlformats.org/wordprocessingml/2006/main" xmlns:w14="http://schemas.microsoft.com/office/word/2010/wordml" xmlns:w15="http://schemas.microsoft.com/office/word/2012/wordml" xmlns:w16cex="http://schemas.microsoft.com/office/word/2018/wordml/cex" xmlns:w16cid="http://schemas.microsoft.com/office/word/2016/wordml/cid" xmlns:w16="http://schemas.microsoft.com/office/word/2018/wordml" xmlns:w16sdtdh="http://schemas.microsoft.com/office/word/2020/wordml/sdtdatahash" xmlns:w16sdtfl="http://schemas.microsoft.com/office/word/2024/wordml/sdtformatlock" xmlns:w16se="http://schemas.microsoft.com/office/word/2015/wordml/symex" xmlns:w16du="http://schemas.microsoft.com/office/word/2023/wordml/word16du" xmlns:wne="http://schemas.microsoft.com/office/word/2006/wordml" mc:Ignorable="w14 w15 w16se w16cid w16 w16cex w16sdtdh w16sdtfl w16du wp14">
+<w:endnotes xmlns:wpc="http://schemas.microsoft.com/office/word/2010/wordprocessingCanvas" xmlns:cx="http://schemas.microsoft.com/office/drawing/2014/chartex" xmlns:cx1="http://schemas.microsoft.com/office/drawing/2015/9/8/chartex" xmlns:cx2="http://schemas.microsoft.com/office/drawing/2015/10/21/chartex" xmlns:cx3="http://schemas.microsoft.com/office/drawing/2016/5/9/chartex" xmlns:cx4="http://schemas.microsoft.com/office/drawing/2016/5/10/chartex" xmlns:cx5="http://schemas.microsoft.com/office/drawing/2016/5/11/chartex" xmlns:cx6="http://schemas.microsoft.com/office/drawing/2016/5/12/chartex" xmlns:cx7="http://schemas.microsoft.com/office/drawing/2016/5/13/chartex" xmlns:cx8="http://schemas.microsoft.com/office/drawing/2016/5/14/chartex" xmlns:mc="http://schemas.openxmlformats.org/markup-compatibility/2006" xmlns:aink="http://schemas.microsoft.com/office/drawing/2016/ink" xmlns:am3d="http://schemas.microsoft.com/office/drawing/2017/model3d" xmlns:o="urn:schemas-microsoft-com:office:office" xmlns:oel="http://schemas.microsoft.com/office/2019/extlst" xmlns:r="http://schemas.openxmlformats.org/officeDocument/2006/relationships" xmlns:m="http://schemas.openxmlformats.org/officeDocument/2006/math" xmlns:v="urn:schemas-microsoft-com:vml" xmlns:wp14="http://schemas.microsoft.com/office/word/2010/wordprocessingDrawing" xmlns:wp="http://schemas.openxmlformats.org/drawingml/2006/wordprocessingDrawing" xmlns:w10="urn:schemas-microsoft-com:office:word" xmlns:w="http://schemas.openxmlformats.org/wordprocessingml/2006/main" xmlns:w14="http://schemas.microsoft.com/office/word/2010/wordml" xmlns:w15="http://schemas.microsoft.com/office/word/2012/wordml" xmlns:w16cei="http://schemas.microsoft.com/office/word/2026/wordml/cei" xmlns:w16cex="http://schemas.microsoft.com/office/word/2018/wordml/cex" xmlns:w16cid="http://schemas.microsoft.com/office/word/2016/wordml/cid" xmlns:w16="http://schemas.microsoft.com/office/word/2018/wordml" xmlns:w16du="http://schemas.microsoft.com/office/word/2023/wordml/word16du" xmlns:w16sdtdh="http://schemas.microsoft.com/office/word/2020/wordml/sdtdatahash" xmlns:w16sdtfl="http://schemas.microsoft.com/office/word/2024/wordml/sdtformatlock" xmlns:w16se="http://schemas.microsoft.com/office/word/2015/wordml/symex" xmlns:wpg="http://schemas.microsoft.com/office/word/2010/wordprocessingGroup" xmlns:wpi="http://schemas.microsoft.com/office/word/2010/wordprocessingInk" xmlns:wne="http://schemas.microsoft.com/office/word/2006/wordml" xmlns:wps="http://schemas.microsoft.com/office/word/2010/wordprocessingShape" mc:Ignorable="w14 w15 w16se w16cid w16 w16cex w16sdtdh w16sdtfl w16du wp14">
   <w:endnote w:type="separator" w:id="-1">
     <w:p>
       <w:r>
@@ -6899,7 +7398,7 @@
 </file>
 
 <file path=word/footer1.xml><?xml version="1.0" encoding="utf-8"?>
-<w:ftr xmlns:wpc="http://schemas.microsoft.com/office/word/2010/wordprocessingCanvas" xmlns:cx="http://schemas.microsoft.com/office/drawing/2014/chartex" xmlns:cx1="http://schemas.microsoft.com/office/drawing/2015/9/8/chartex" xmlns:cx2="http://schemas.microsoft.com/office/drawing/2015/10/21/chartex" xmlns:cx3="http://schemas.microsoft.com/office/drawing/2016/5/9/chartex" xmlns:cx4="http://schemas.microsoft.com/office/drawing/2016/5/10/chartex" xmlns:cx5="http://schemas.microsoft.com/office/drawing/2016/5/11/chartex" xmlns:cx6="http://schemas.microsoft.com/office/drawing/2016/5/12/chartex" xmlns:cx7="http://schemas.microsoft.com/office/drawing/2016/5/13/chartex" xmlns:cx8="http://schemas.microsoft.com/office/drawing/2016/5/14/chartex" xmlns:mc="http://schemas.openxmlformats.org/markup-compatibility/2006" xmlns:m="http://schemas.openxmlformats.org/officeDocument/2006/math" xmlns:aink="http://schemas.microsoft.com/office/drawing/2016/ink" xmlns:am3d="http://schemas.microsoft.com/office/drawing/2017/model3d" xmlns:oel="http://schemas.microsoft.com/office/2019/extlst" xmlns:r="http://schemas.openxmlformats.org/officeDocument/2006/relationships" xmlns:wp14="http://schemas.microsoft.com/office/word/2010/wordprocessingDrawing" xmlns:wp="http://schemas.openxmlformats.org/drawingml/2006/wordprocessingDrawing" xmlns:wpg="http://schemas.microsoft.com/office/word/2010/wordprocessingGroup" xmlns:wpi="http://schemas.microsoft.com/office/word/2010/wordprocessingInk" xmlns:wps="http://schemas.microsoft.com/office/word/2010/wordprocessingShape" xmlns:o="urn:schemas-microsoft-com:office:office" xmlns:v="urn:schemas-microsoft-com:vml" xmlns:w10="urn:schemas-microsoft-com:office:word" xmlns:w="http://schemas.openxmlformats.org/wordprocessingml/2006/main" xmlns:w14="http://schemas.microsoft.com/office/word/2010/wordml" xmlns:w15="http://schemas.microsoft.com/office/word/2012/wordml" xmlns:w16cex="http://schemas.microsoft.com/office/word/2018/wordml/cex" xmlns:w16cid="http://schemas.microsoft.com/office/word/2016/wordml/cid" xmlns:w16="http://schemas.microsoft.com/office/word/2018/wordml" xmlns:w16sdtdh="http://schemas.microsoft.com/office/word/2020/wordml/sdtdatahash" xmlns:w16sdtfl="http://schemas.microsoft.com/office/word/2024/wordml/sdtformatlock" xmlns:w16se="http://schemas.microsoft.com/office/word/2015/wordml/symex" xmlns:w16du="http://schemas.microsoft.com/office/word/2023/wordml/word16du" xmlns:wne="http://schemas.microsoft.com/office/word/2006/wordml" mc:Ignorable="w14 w15 w16se w16cid w16 w16cex w16sdtdh w16sdtfl w16du wp14">
+<w:ftr xmlns:wpc="http://schemas.microsoft.com/office/word/2010/wordprocessingCanvas" xmlns:cx="http://schemas.microsoft.com/office/drawing/2014/chartex" xmlns:cx1="http://schemas.microsoft.com/office/drawing/2015/9/8/chartex" xmlns:cx2="http://schemas.microsoft.com/office/drawing/2015/10/21/chartex" xmlns:cx3="http://schemas.microsoft.com/office/drawing/2016/5/9/chartex" xmlns:cx4="http://schemas.microsoft.com/office/drawing/2016/5/10/chartex" xmlns:cx5="http://schemas.microsoft.com/office/drawing/2016/5/11/chartex" xmlns:cx6="http://schemas.microsoft.com/office/drawing/2016/5/12/chartex" xmlns:cx7="http://schemas.microsoft.com/office/drawing/2016/5/13/chartex" xmlns:cx8="http://schemas.microsoft.com/office/drawing/2016/5/14/chartex" xmlns:mc="http://schemas.openxmlformats.org/markup-compatibility/2006" xmlns:aink="http://schemas.microsoft.com/office/drawing/2016/ink" xmlns:am3d="http://schemas.microsoft.com/office/drawing/2017/model3d" xmlns:o="urn:schemas-microsoft-com:office:office" xmlns:oel="http://schemas.microsoft.com/office/2019/extlst" xmlns:r="http://schemas.openxmlformats.org/officeDocument/2006/relationships" xmlns:m="http://schemas.openxmlformats.org/officeDocument/2006/math" xmlns:v="urn:schemas-microsoft-com:vml" xmlns:wp14="http://schemas.microsoft.com/office/word/2010/wordprocessingDrawing" xmlns:wp="http://schemas.openxmlformats.org/drawingml/2006/wordprocessingDrawing" xmlns:w10="urn:schemas-microsoft-com:office:word" xmlns:w="http://schemas.openxmlformats.org/wordprocessingml/2006/main" xmlns:w14="http://schemas.microsoft.com/office/word/2010/wordml" xmlns:w15="http://schemas.microsoft.com/office/word/2012/wordml" xmlns:w16cei="http://schemas.microsoft.com/office/word/2026/wordml/cei" xmlns:w16cex="http://schemas.microsoft.com/office/word/2018/wordml/cex" xmlns:w16cid="http://schemas.microsoft.com/office/word/2016/wordml/cid" xmlns:w16="http://schemas.microsoft.com/office/word/2018/wordml" xmlns:w16du="http://schemas.microsoft.com/office/word/2023/wordml/word16du" xmlns:w16sdtdh="http://schemas.microsoft.com/office/word/2020/wordml/sdtdatahash" xmlns:w16sdtfl="http://schemas.microsoft.com/office/word/2024/wordml/sdtformatlock" xmlns:w16se="http://schemas.microsoft.com/office/word/2015/wordml/symex" xmlns:wpg="http://schemas.microsoft.com/office/word/2010/wordprocessingGroup" xmlns:wpi="http://schemas.microsoft.com/office/word/2010/wordprocessingInk" xmlns:wne="http://schemas.microsoft.com/office/word/2006/wordml" xmlns:wps="http://schemas.microsoft.com/office/word/2010/wordprocessingShape" mc:Ignorable="w14 w15 w16se w16cid w16 w16cex w16sdtdh w16sdtfl w16du wp14">
   <w:p>
     <w:pPr>
       <w:pStyle w:val="Footer"/>
@@ -6909,7 +7408,7 @@
 </file>
 
 <file path=word/footer2.xml><?xml version="1.0" encoding="utf-8"?>
-<w:ftr xmlns:wpc="http://schemas.microsoft.com/office/word/2010/wordprocessingCanvas" xmlns:cx="http://schemas.microsoft.com/office/drawing/2014/chartex" xmlns:cx1="http://schemas.microsoft.com/office/drawing/2015/9/8/chartex" xmlns:cx2="http://schemas.microsoft.com/office/drawing/2015/10/21/chartex" xmlns:cx3="http://schemas.microsoft.com/office/drawing/2016/5/9/chartex" xmlns:cx4="http://schemas.microsoft.com/office/drawing/2016/5/10/chartex" xmlns:cx5="http://schemas.microsoft.com/office/drawing/2016/5/11/chartex" xmlns:cx6="http://schemas.microsoft.com/office/drawing/2016/5/12/chartex" xmlns:cx7="http://schemas.microsoft.com/office/drawing/2016/5/13/chartex" xmlns:cx8="http://schemas.microsoft.com/office/drawing/2016/5/14/chartex" xmlns:mc="http://schemas.openxmlformats.org/markup-compatibility/2006" xmlns:m="http://schemas.openxmlformats.org/officeDocument/2006/math" xmlns:aink="http://schemas.microsoft.com/office/drawing/2016/ink" xmlns:am3d="http://schemas.microsoft.com/office/drawing/2017/model3d" xmlns:oel="http://schemas.microsoft.com/office/2019/extlst" xmlns:r="http://schemas.openxmlformats.org/officeDocument/2006/relationships" xmlns:wp14="http://schemas.microsoft.com/office/word/2010/wordprocessingDrawing" xmlns:wp="http://schemas.openxmlformats.org/drawingml/2006/wordprocessingDrawing" xmlns:wpg="http://schemas.microsoft.com/office/word/2010/wordprocessingGroup" xmlns:wpi="http://schemas.microsoft.com/office/word/2010/wordprocessingInk" xmlns:wps="http://schemas.microsoft.com/office/word/2010/wordprocessingShape" xmlns:o="urn:schemas-microsoft-com:office:office" xmlns:v="urn:schemas-microsoft-com:vml" xmlns:w10="urn:schemas-microsoft-com:office:word" xmlns:w="http://schemas.openxmlformats.org/wordprocessingml/2006/main" xmlns:w14="http://schemas.microsoft.com/office/word/2010/wordml" xmlns:w15="http://schemas.microsoft.com/office/word/2012/wordml" xmlns:w16cex="http://schemas.microsoft.com/office/word/2018/wordml/cex" xmlns:w16cid="http://schemas.microsoft.com/office/word/2016/wordml/cid" xmlns:w16="http://schemas.microsoft.com/office/word/2018/wordml" xmlns:w16sdtdh="http://schemas.microsoft.com/office/word/2020/wordml/sdtdatahash" xmlns:w16sdtfl="http://schemas.microsoft.com/office/word/2024/wordml/sdtformatlock" xmlns:w16se="http://schemas.microsoft.com/office/word/2015/wordml/symex" xmlns:w16du="http://schemas.microsoft.com/office/word/2023/wordml/word16du" xmlns:wne="http://schemas.microsoft.com/office/word/2006/wordml" mc:Ignorable="w14 w15 w16se w16cid w16 w16cex w16sdtdh w16sdtfl w16du wp14">
+<w:ftr xmlns:wpc="http://schemas.microsoft.com/office/word/2010/wordprocessingCanvas" xmlns:cx="http://schemas.microsoft.com/office/drawing/2014/chartex" xmlns:cx1="http://schemas.microsoft.com/office/drawing/2015/9/8/chartex" xmlns:cx2="http://schemas.microsoft.com/office/drawing/2015/10/21/chartex" xmlns:cx3="http://schemas.microsoft.com/office/drawing/2016/5/9/chartex" xmlns:cx4="http://schemas.microsoft.com/office/drawing/2016/5/10/chartex" xmlns:cx5="http://schemas.microsoft.com/office/drawing/2016/5/11/chartex" xmlns:cx6="http://schemas.microsoft.com/office/drawing/2016/5/12/chartex" xmlns:cx7="http://schemas.microsoft.com/office/drawing/2016/5/13/chartex" xmlns:cx8="http://schemas.microsoft.com/office/drawing/2016/5/14/chartex" xmlns:mc="http://schemas.openxmlformats.org/markup-compatibility/2006" xmlns:aink="http://schemas.microsoft.com/office/drawing/2016/ink" xmlns:am3d="http://schemas.microsoft.com/office/drawing/2017/model3d" xmlns:o="urn:schemas-microsoft-com:office:office" xmlns:oel="http://schemas.microsoft.com/office/2019/extlst" xmlns:r="http://schemas.openxmlformats.org/officeDocument/2006/relationships" xmlns:m="http://schemas.openxmlformats.org/officeDocument/2006/math" xmlns:v="urn:schemas-microsoft-com:vml" xmlns:wp14="http://schemas.microsoft.com/office/word/2010/wordprocessingDrawing" xmlns:wp="http://schemas.openxmlformats.org/drawingml/2006/wordprocessingDrawing" xmlns:w10="urn:schemas-microsoft-com:office:word" xmlns:w="http://schemas.openxmlformats.org/wordprocessingml/2006/main" xmlns:w14="http://schemas.microsoft.com/office/word/2010/wordml" xmlns:w15="http://schemas.microsoft.com/office/word/2012/wordml" xmlns:w16cei="http://schemas.microsoft.com/office/word/2026/wordml/cei" xmlns:w16cex="http://schemas.microsoft.com/office/word/2018/wordml/cex" xmlns:w16cid="http://schemas.microsoft.com/office/word/2016/wordml/cid" xmlns:w16="http://schemas.microsoft.com/office/word/2018/wordml" xmlns:w16du="http://schemas.microsoft.com/office/word/2023/wordml/word16du" xmlns:w16sdtdh="http://schemas.microsoft.com/office/word/2020/wordml/sdtdatahash" xmlns:w16sdtfl="http://schemas.microsoft.com/office/word/2024/wordml/sdtformatlock" xmlns:w16se="http://schemas.microsoft.com/office/word/2015/wordml/symex" xmlns:wpg="http://schemas.microsoft.com/office/word/2010/wordprocessingGroup" xmlns:wpi="http://schemas.microsoft.com/office/word/2010/wordprocessingInk" xmlns:wne="http://schemas.microsoft.com/office/word/2006/wordml" xmlns:wps="http://schemas.microsoft.com/office/word/2010/wordprocessingShape" mc:Ignorable="w14 w15 w16se w16cid w16 w16cex w16sdtdh w16sdtfl w16du wp14">
   <w:p>
     <w:pPr>
       <w:pStyle w:val="Footer"/>
@@ -6919,7 +7418,7 @@
 </file>
 
 <file path=word/footer3.xml><?xml version="1.0" encoding="utf-8"?>
-<w:ftr xmlns:wpc="http://schemas.microsoft.com/office/word/2010/wordprocessingCanvas" xmlns:cx="http://schemas.microsoft.com/office/drawing/2014/chartex" xmlns:cx1="http://schemas.microsoft.com/office/drawing/2015/9/8/chartex" xmlns:cx2="http://schemas.microsoft.com/office/drawing/2015/10/21/chartex" xmlns:cx3="http://schemas.microsoft.com/office/drawing/2016/5/9/chartex" xmlns:cx4="http://schemas.microsoft.com/office/drawing/2016/5/10/chartex" xmlns:cx5="http://schemas.microsoft.com/office/drawing/2016/5/11/chartex" xmlns:cx6="http://schemas.microsoft.com/office/drawing/2016/5/12/chartex" xmlns:cx7="http://schemas.microsoft.com/office/drawing/2016/5/13/chartex" xmlns:cx8="http://schemas.microsoft.com/office/drawing/2016/5/14/chartex" xmlns:mc="http://schemas.openxmlformats.org/markup-compatibility/2006" xmlns:m="http://schemas.openxmlformats.org/officeDocument/2006/math" xmlns:aink="http://schemas.microsoft.com/office/drawing/2016/ink" xmlns:am3d="http://schemas.microsoft.com/office/drawing/2017/model3d" xmlns:oel="http://schemas.microsoft.com/office/2019/extlst" xmlns:r="http://schemas.openxmlformats.org/officeDocument/2006/relationships" xmlns:wp14="http://schemas.microsoft.com/office/word/2010/wordprocessingDrawing" xmlns:wp="http://schemas.openxmlformats.org/drawingml/2006/wordprocessingDrawing" xmlns:wpg="http://schemas.microsoft.com/office/word/2010/wordprocessingGroup" xmlns:wpi="http://schemas.microsoft.com/office/word/2010/wordprocessingInk" xmlns:wps="http://schemas.microsoft.com/office/word/2010/wordprocessingShape" xmlns:o="urn:schemas-microsoft-com:office:office" xmlns:v="urn:schemas-microsoft-com:vml" xmlns:w10="urn:schemas-microsoft-com:office:word" xmlns:w="http://schemas.openxmlformats.org/wordprocessingml/2006/main" xmlns:w14="http://schemas.microsoft.com/office/word/2010/wordml" xmlns:w15="http://schemas.microsoft.com/office/word/2012/wordml" xmlns:w16cex="http://schemas.microsoft.com/office/word/2018/wordml/cex" xmlns:w16cid="http://schemas.microsoft.com/office/word/2016/wordml/cid" xmlns:w16="http://schemas.microsoft.com/office/word/2018/wordml" xmlns:w16sdtdh="http://schemas.microsoft.com/office/word/2020/wordml/sdtdatahash" xmlns:w16sdtfl="http://schemas.microsoft.com/office/word/2024/wordml/sdtformatlock" xmlns:w16se="http://schemas.microsoft.com/office/word/2015/wordml/symex" xmlns:w16du="http://schemas.microsoft.com/office/word/2023/wordml/word16du" xmlns:wne="http://schemas.microsoft.com/office/word/2006/wordml" mc:Ignorable="w14 w15 w16se w16cid w16 w16cex w16sdtdh w16sdtfl w16du wp14">
+<w:ftr xmlns:wpc="http://schemas.microsoft.com/office/word/2010/wordprocessingCanvas" xmlns:cx="http://schemas.microsoft.com/office/drawing/2014/chartex" xmlns:cx1="http://schemas.microsoft.com/office/drawing/2015/9/8/chartex" xmlns:cx2="http://schemas.microsoft.com/office/drawing/2015/10/21/chartex" xmlns:cx3="http://schemas.microsoft.com/office/drawing/2016/5/9/chartex" xmlns:cx4="http://schemas.microsoft.com/office/drawing/2016/5/10/chartex" xmlns:cx5="http://schemas.microsoft.com/office/drawing/2016/5/11/chartex" xmlns:cx6="http://schemas.microsoft.com/office/drawing/2016/5/12/chartex" xmlns:cx7="http://schemas.microsoft.com/office/drawing/2016/5/13/chartex" xmlns:cx8="http://schemas.microsoft.com/office/drawing/2016/5/14/chartex" xmlns:mc="http://schemas.openxmlformats.org/markup-compatibility/2006" xmlns:aink="http://schemas.microsoft.com/office/drawing/2016/ink" xmlns:am3d="http://schemas.microsoft.com/office/drawing/2017/model3d" xmlns:o="urn:schemas-microsoft-com:office:office" xmlns:oel="http://schemas.microsoft.com/office/2019/extlst" xmlns:r="http://schemas.openxmlformats.org/officeDocument/2006/relationships" xmlns:m="http://schemas.openxmlformats.org/officeDocument/2006/math" xmlns:v="urn:schemas-microsoft-com:vml" xmlns:wp14="http://schemas.microsoft.com/office/word/2010/wordprocessingDrawing" xmlns:wp="http://schemas.openxmlformats.org/drawingml/2006/wordprocessingDrawing" xmlns:w10="urn:schemas-microsoft-com:office:word" xmlns:w="http://schemas.openxmlformats.org/wordprocessingml/2006/main" xmlns:w14="http://schemas.microsoft.com/office/word/2010/wordml" xmlns:w15="http://schemas.microsoft.com/office/word/2012/wordml" xmlns:w16cei="http://schemas.microsoft.com/office/word/2026/wordml/cei" xmlns:w16cex="http://schemas.microsoft.com/office/word/2018/wordml/cex" xmlns:w16cid="http://schemas.microsoft.com/office/word/2016/wordml/cid" xmlns:w16="http://schemas.microsoft.com/office/word/2018/wordml" xmlns:w16du="http://schemas.microsoft.com/office/word/2023/wordml/word16du" xmlns:w16sdtdh="http://schemas.microsoft.com/office/word/2020/wordml/sdtdatahash" xmlns:w16sdtfl="http://schemas.microsoft.com/office/word/2024/wordml/sdtformatlock" xmlns:w16se="http://schemas.microsoft.com/office/word/2015/wordml/symex" xmlns:wpg="http://schemas.microsoft.com/office/word/2010/wordprocessingGroup" xmlns:wpi="http://schemas.microsoft.com/office/word/2010/wordprocessingInk" xmlns:wne="http://schemas.microsoft.com/office/word/2006/wordml" xmlns:wps="http://schemas.microsoft.com/office/word/2010/wordprocessingShape" mc:Ignorable="w14 w15 w16se w16cid w16 w16cex w16sdtdh w16sdtfl w16du wp14">
   <w:p>
     <w:pPr>
       <w:pStyle w:val="Footer"/>
@@ -6929,7 +7428,7 @@
 </file>
 
 <file path=word/footnotes.xml><?xml version="1.0" encoding="utf-8"?>
-<w:footnotes xmlns:wpc="http://schemas.microsoft.com/office/word/2010/wordprocessingCanvas" xmlns:cx="http://schemas.microsoft.com/office/drawing/2014/chartex" xmlns:cx1="http://schemas.microsoft.com/office/drawing/2015/9/8/chartex" xmlns:cx2="http://schemas.microsoft.com/office/drawing/2015/10/21/chartex" xmlns:cx3="http://schemas.microsoft.com/office/drawing/2016/5/9/chartex" xmlns:cx4="http://schemas.microsoft.com/office/drawing/2016/5/10/chartex" xmlns:cx5="http://schemas.microsoft.com/office/drawing/2016/5/11/chartex" xmlns:cx6="http://schemas.microsoft.com/office/drawing/2016/5/12/chartex" xmlns:cx7="http://schemas.microsoft.com/office/drawing/2016/5/13/chartex" xmlns:cx8="http://schemas.microsoft.com/office/drawing/2016/5/14/chartex" xmlns:mc="http://schemas.openxmlformats.org/markup-compatibility/2006" xmlns:m="http://schemas.openxmlformats.org/officeDocument/2006/math" xmlns:aink="http://schemas.microsoft.com/office/drawing/2016/ink" xmlns:am3d="http://schemas.microsoft.com/office/drawing/2017/model3d" xmlns:oel="http://schemas.microsoft.com/office/2019/extlst" xmlns:r="http://schemas.openxmlformats.org/officeDocument/2006/relationships" xmlns:wp14="http://schemas.microsoft.com/office/word/2010/wordprocessingDrawing" xmlns:wp="http://schemas.openxmlformats.org/drawingml/2006/wordprocessingDrawing" xmlns:wpg="http://schemas.microsoft.com/office/word/2010/wordprocessingGroup" xmlns:wpi="http://schemas.microsoft.com/office/word/2010/wordprocessingInk" xmlns:wps="http://schemas.microsoft.com/office/word/2010/wordprocessingShape" xmlns:o="urn:schemas-microsoft-com:office:office" xmlns:v="urn:schemas-microsoft-com:vml" xmlns:w10="urn:schemas-microsoft-com:office:word" xmlns:w="http://schemas.openxmlformats.org/wordprocessingml/2006/main" xmlns:w14="http://schemas.microsoft.com/office/word/2010/wordml" xmlns:w15="http://schemas.microsoft.com/office/word/2012/wordml" xmlns:w16cex="http://schemas.microsoft.com/office/word/2018/wordml/cex" xmlns:w16cid="http://schemas.microsoft.com/office/word/2016/wordml/cid" xmlns:w16="http://schemas.microsoft.com/office/word/2018/wordml" xmlns:w16sdtdh="http://schemas.microsoft.com/office/word/2020/wordml/sdtdatahash" xmlns:w16sdtfl="http://schemas.microsoft.com/office/word/2024/wordml/sdtformatlock" xmlns:w16se="http://schemas.microsoft.com/office/word/2015/wordml/symex" xmlns:w16du="http://schemas.microsoft.com/office/word/2023/wordml/word16du" xmlns:wne="http://schemas.microsoft.com/office/word/2006/wordml" mc:Ignorable="w14 w15 w16se w16cid w16 w16cex w16sdtdh w16sdtfl w16du wp14">
+<w:footnotes xmlns:wpc="http://schemas.microsoft.com/office/word/2010/wordprocessingCanvas" xmlns:cx="http://schemas.microsoft.com/office/drawing/2014/chartex" xmlns:cx1="http://schemas.microsoft.com/office/drawing/2015/9/8/chartex" xmlns:cx2="http://schemas.microsoft.com/office/drawing/2015/10/21/chartex" xmlns:cx3="http://schemas.microsoft.com/office/drawing/2016/5/9/chartex" xmlns:cx4="http://schemas.microsoft.com/office/drawing/2016/5/10/chartex" xmlns:cx5="http://schemas.microsoft.com/office/drawing/2016/5/11/chartex" xmlns:cx6="http://schemas.microsoft.com/office/drawing/2016/5/12/chartex" xmlns:cx7="http://schemas.microsoft.com/office/drawing/2016/5/13/chartex" xmlns:cx8="http://schemas.microsoft.com/office/drawing/2016/5/14/chartex" xmlns:mc="http://schemas.openxmlformats.org/markup-compatibility/2006" xmlns:aink="http://schemas.microsoft.com/office/drawing/2016/ink" xmlns:am3d="http://schemas.microsoft.com/office/drawing/2017/model3d" xmlns:o="urn:schemas-microsoft-com:office:office" xmlns:oel="http://schemas.microsoft.com/office/2019/extlst" xmlns:r="http://schemas.openxmlformats.org/officeDocument/2006/relationships" xmlns:m="http://schemas.openxmlformats.org/officeDocument/2006/math" xmlns:v="urn:schemas-microsoft-com:vml" xmlns:wp14="http://schemas.microsoft.com/office/word/2010/wordprocessingDrawing" xmlns:wp="http://schemas.openxmlformats.org/drawingml/2006/wordprocessingDrawing" xmlns:w10="urn:schemas-microsoft-com:office:word" xmlns:w="http://schemas.openxmlformats.org/wordprocessingml/2006/main" xmlns:w14="http://schemas.microsoft.com/office/word/2010/wordml" xmlns:w15="http://schemas.microsoft.com/office/word/2012/wordml" xmlns:w16cei="http://schemas.microsoft.com/office/word/2026/wordml/cei" xmlns:w16cex="http://schemas.microsoft.com/office/word/2018/wordml/cex" xmlns:w16cid="http://schemas.microsoft.com/office/word/2016/wordml/cid" xmlns:w16="http://schemas.microsoft.com/office/word/2018/wordml" xmlns:w16du="http://schemas.microsoft.com/office/word/2023/wordml/word16du" xmlns:w16sdtdh="http://schemas.microsoft.com/office/word/2020/wordml/sdtdatahash" xmlns:w16sdtfl="http://schemas.microsoft.com/office/word/2024/wordml/sdtformatlock" xmlns:w16se="http://schemas.microsoft.com/office/word/2015/wordml/symex" xmlns:wpg="http://schemas.microsoft.com/office/word/2010/wordprocessingGroup" xmlns:wpi="http://schemas.microsoft.com/office/word/2010/wordprocessingInk" xmlns:wne="http://schemas.microsoft.com/office/word/2006/wordml" xmlns:wps="http://schemas.microsoft.com/office/word/2010/wordprocessingShape" mc:Ignorable="w14 w15 w16se w16cid w16 w16cex w16sdtdh w16sdtfl w16du wp14">
   <w:footnote w:type="separator" w:id="-1">
     <w:p>
       <w:r>
@@ -6948,7 +7447,7 @@
 </file>
 
 <file path=word/header1.xml><?xml version="1.0" encoding="utf-8"?>
-<w:hdr xmlns:wpc="http://schemas.microsoft.com/office/word/2010/wordprocessingCanvas" xmlns:cx="http://schemas.microsoft.com/office/drawing/2014/chartex" xmlns:cx1="http://schemas.microsoft.com/office/drawing/2015/9/8/chartex" xmlns:cx2="http://schemas.microsoft.com/office/drawing/2015/10/21/chartex" xmlns:cx3="http://schemas.microsoft.com/office/drawing/2016/5/9/chartex" xmlns:cx4="http://schemas.microsoft.com/office/drawing/2016/5/10/chartex" xmlns:cx5="http://schemas.microsoft.com/office/drawing/2016/5/11/chartex" xmlns:cx6="http://schemas.microsoft.com/office/drawing/2016/5/12/chartex" xmlns:cx7="http://schemas.microsoft.com/office/drawing/2016/5/13/chartex" xmlns:cx8="http://schemas.microsoft.com/office/drawing/2016/5/14/chartex" xmlns:mc="http://schemas.openxmlformats.org/markup-compatibility/2006" xmlns:m="http://schemas.openxmlformats.org/officeDocument/2006/math" xmlns:aink="http://schemas.microsoft.com/office/drawing/2016/ink" xmlns:am3d="http://schemas.microsoft.com/office/drawing/2017/model3d" xmlns:oel="http://schemas.microsoft.com/office/2019/extlst" xmlns:r="http://schemas.openxmlformats.org/officeDocument/2006/relationships" xmlns:wp14="http://schemas.microsoft.com/office/word/2010/wordprocessingDrawing" xmlns:wp="http://schemas.openxmlformats.org/drawingml/2006/wordprocessingDrawing" xmlns:wpg="http://schemas.microsoft.com/office/word/2010/wordprocessingGroup" xmlns:wpi="http://schemas.microsoft.com/office/word/2010/wordprocessingInk" xmlns:wps="http://schemas.microsoft.com/office/word/2010/wordprocessingShape" xmlns:o="urn:schemas-microsoft-com:office:office" xmlns:v="urn:schemas-microsoft-com:vml" xmlns:w10="urn:schemas-microsoft-com:office:word" xmlns:w="http://schemas.openxmlformats.org/wordprocessingml/2006/main" xmlns:w14="http://schemas.microsoft.com/office/word/2010/wordml" xmlns:w15="http://schemas.microsoft.com/office/word/2012/wordml" xmlns:w16cex="http://schemas.microsoft.com/office/word/2018/wordml/cex" xmlns:w16cid="http://schemas.microsoft.com/office/word/2016/wordml/cid" xmlns:w16="http://schemas.microsoft.com/office/word/2018/wordml" xmlns:w16sdtdh="http://schemas.microsoft.com/office/word/2020/wordml/sdtdatahash" xmlns:w16sdtfl="http://schemas.microsoft.com/office/word/2024/wordml/sdtformatlock" xmlns:w16se="http://schemas.microsoft.com/office/word/2015/wordml/symex" xmlns:w16du="http://schemas.microsoft.com/office/word/2023/wordml/word16du" xmlns:wne="http://schemas.microsoft.com/office/word/2006/wordml" mc:Ignorable="w14 w15 w16se w16cid w16 w16cex w16sdtdh w16sdtfl w16du wp14">
+<w:hdr xmlns:wpc="http://schemas.microsoft.com/office/word/2010/wordprocessingCanvas" xmlns:cx="http://schemas.microsoft.com/office/drawing/2014/chartex" xmlns:cx1="http://schemas.microsoft.com/office/drawing/2015/9/8/chartex" xmlns:cx2="http://schemas.microsoft.com/office/drawing/2015/10/21/chartex" xmlns:cx3="http://schemas.microsoft.com/office/drawing/2016/5/9/chartex" xmlns:cx4="http://schemas.microsoft.com/office/drawing/2016/5/10/chartex" xmlns:cx5="http://schemas.microsoft.com/office/drawing/2016/5/11/chartex" xmlns:cx6="http://schemas.microsoft.com/office/drawing/2016/5/12/chartex" xmlns:cx7="http://schemas.microsoft.com/office/drawing/2016/5/13/chartex" xmlns:cx8="http://schemas.microsoft.com/office/drawing/2016/5/14/chartex" xmlns:mc="http://schemas.openxmlformats.org/markup-compatibility/2006" xmlns:aink="http://schemas.microsoft.com/office/drawing/2016/ink" xmlns:am3d="http://schemas.microsoft.com/office/drawing/2017/model3d" xmlns:o="urn:schemas-microsoft-com:office:office" xmlns:oel="http://schemas.microsoft.com/office/2019/extlst" xmlns:r="http://schemas.openxmlformats.org/officeDocument/2006/relationships" xmlns:m="http://schemas.openxmlformats.org/officeDocument/2006/math" xmlns:v="urn:schemas-microsoft-com:vml" xmlns:wp14="http://schemas.microsoft.com/office/word/2010/wordprocessingDrawing" xmlns:wp="http://schemas.openxmlformats.org/drawingml/2006/wordprocessingDrawing" xmlns:w10="urn:schemas-microsoft-com:office:word" xmlns:w="http://schemas.openxmlformats.org/wordprocessingml/2006/main" xmlns:w14="http://schemas.microsoft.com/office/word/2010/wordml" xmlns:w15="http://schemas.microsoft.com/office/word/2012/wordml" xmlns:w16cei="http://schemas.microsoft.com/office/word/2026/wordml/cei" xmlns:w16cex="http://schemas.microsoft.com/office/word/2018/wordml/cex" xmlns:w16cid="http://schemas.microsoft.com/office/word/2016/wordml/cid" xmlns:w16="http://schemas.microsoft.com/office/word/2018/wordml" xmlns:w16du="http://schemas.microsoft.com/office/word/2023/wordml/word16du" xmlns:w16sdtdh="http://schemas.microsoft.com/office/word/2020/wordml/sdtdatahash" xmlns:w16sdtfl="http://schemas.microsoft.com/office/word/2024/wordml/sdtformatlock" xmlns:w16se="http://schemas.microsoft.com/office/word/2015/wordml/symex" xmlns:wpg="http://schemas.microsoft.com/office/word/2010/wordprocessingGroup" xmlns:wpi="http://schemas.microsoft.com/office/word/2010/wordprocessingInk" xmlns:wne="http://schemas.microsoft.com/office/word/2006/wordml" xmlns:wps="http://schemas.microsoft.com/office/word/2010/wordprocessingShape" mc:Ignorable="w14 w15 w16se w16cid w16 w16cex w16sdtdh w16sdtfl w16du wp14">
   <w:p>
     <w:pPr>
       <w:pStyle w:val="Header"/>
@@ -6958,7 +7457,7 @@
 </file>
 
 <file path=word/header2.xml><?xml version="1.0" encoding="utf-8"?>
-<w:hdr xmlns:wpc="http://schemas.microsoft.com/office/word/2010/wordprocessingCanvas" xmlns:cx="http://schemas.microsoft.com/office/drawing/2014/chartex" xmlns:cx1="http://schemas.microsoft.com/office/drawing/2015/9/8/chartex" xmlns:cx2="http://schemas.microsoft.com/office/drawing/2015/10/21/chartex" xmlns:cx3="http://schemas.microsoft.com/office/drawing/2016/5/9/chartex" xmlns:cx4="http://schemas.microsoft.com/office/drawing/2016/5/10/chartex" xmlns:cx5="http://schemas.microsoft.com/office/drawing/2016/5/11/chartex" xmlns:cx6="http://schemas.microsoft.com/office/drawing/2016/5/12/chartex" xmlns:cx7="http://schemas.microsoft.com/office/drawing/2016/5/13/chartex" xmlns:cx8="http://schemas.microsoft.com/office/drawing/2016/5/14/chartex" xmlns:mc="http://schemas.openxmlformats.org/markup-compatibility/2006" xmlns:m="http://schemas.openxmlformats.org/officeDocument/2006/math" xmlns:aink="http://schemas.microsoft.com/office/drawing/2016/ink" xmlns:am3d="http://schemas.microsoft.com/office/drawing/2017/model3d" xmlns:oel="http://schemas.microsoft.com/office/2019/extlst" xmlns:r="http://schemas.openxmlformats.org/officeDocument/2006/relationships" xmlns:wp14="http://schemas.microsoft.com/office/word/2010/wordprocessingDrawing" xmlns:wp="http://schemas.openxmlformats.org/drawingml/2006/wordprocessingDrawing" xmlns:wpg="http://schemas.microsoft.com/office/word/2010/wordprocessingGroup" xmlns:wpi="http://schemas.microsoft.com/office/word/2010/wordprocessingInk" xmlns:wps="http://schemas.microsoft.com/office/word/2010/wordprocessingShape" xmlns:o="urn:schemas-microsoft-com:office:office" xmlns:v="urn:schemas-microsoft-com:vml" xmlns:w10="urn:schemas-microsoft-com:office:word" xmlns:w="http://schemas.openxmlformats.org/wordprocessingml/2006/main" xmlns:w14="http://schemas.microsoft.com/office/word/2010/wordml" xmlns:w15="http://schemas.microsoft.com/office/word/2012/wordml" xmlns:w16cex="http://schemas.microsoft.com/office/word/2018/wordml/cex" xmlns:w16cid="http://schemas.microsoft.com/office/word/2016/wordml/cid" xmlns:w16="http://schemas.microsoft.com/office/word/2018/wordml" xmlns:w16sdtdh="http://schemas.microsoft.com/office/word/2020/wordml/sdtdatahash" xmlns:w16sdtfl="http://schemas.microsoft.com/office/word/2024/wordml/sdtformatlock" xmlns:w16se="http://schemas.microsoft.com/office/word/2015/wordml/symex" xmlns:w16du="http://schemas.microsoft.com/office/word/2023/wordml/word16du" xmlns:wne="http://schemas.microsoft.com/office/word/2006/wordml" mc:Ignorable="w14 w15 w16se w16cid w16 w16cex w16sdtdh w16sdtfl w16du wp14">
+<w:hdr xmlns:wpc="http://schemas.microsoft.com/office/word/2010/wordprocessingCanvas" xmlns:cx="http://schemas.microsoft.com/office/drawing/2014/chartex" xmlns:cx1="http://schemas.microsoft.com/office/drawing/2015/9/8/chartex" xmlns:cx2="http://schemas.microsoft.com/office/drawing/2015/10/21/chartex" xmlns:cx3="http://schemas.microsoft.com/office/drawing/2016/5/9/chartex" xmlns:cx4="http://schemas.microsoft.com/office/drawing/2016/5/10/chartex" xmlns:cx5="http://schemas.microsoft.com/office/drawing/2016/5/11/chartex" xmlns:cx6="http://schemas.microsoft.com/office/drawing/2016/5/12/chartex" xmlns:cx7="http://schemas.microsoft.com/office/drawing/2016/5/13/chartex" xmlns:cx8="http://schemas.microsoft.com/office/drawing/2016/5/14/chartex" xmlns:mc="http://schemas.openxmlformats.org/markup-compatibility/2006" xmlns:aink="http://schemas.microsoft.com/office/drawing/2016/ink" xmlns:am3d="http://schemas.microsoft.com/office/drawing/2017/model3d" xmlns:o="urn:schemas-microsoft-com:office:office" xmlns:oel="http://schemas.microsoft.com/office/2019/extlst" xmlns:r="http://schemas.openxmlformats.org/officeDocument/2006/relationships" xmlns:m="http://schemas.openxmlformats.org/officeDocument/2006/math" xmlns:v="urn:schemas-microsoft-com:vml" xmlns:wp14="http://schemas.microsoft.com/office/word/2010/wordprocessingDrawing" xmlns:wp="http://schemas.openxmlformats.org/drawingml/2006/wordprocessingDrawing" xmlns:w10="urn:schemas-microsoft-com:office:word" xmlns:w="http://schemas.openxmlformats.org/wordprocessingml/2006/main" xmlns:w14="http://schemas.microsoft.com/office/word/2010/wordml" xmlns:w15="http://schemas.microsoft.com/office/word/2012/wordml" xmlns:w16cei="http://schemas.microsoft.com/office/word/2026/wordml/cei" xmlns:w16cex="http://schemas.microsoft.com/office/word/2018/wordml/cex" xmlns:w16cid="http://schemas.microsoft.com/office/word/2016/wordml/cid" xmlns:w16="http://schemas.microsoft.com/office/word/2018/wordml" xmlns:w16du="http://schemas.microsoft.com/office/word/2023/wordml/word16du" xmlns:w16sdtdh="http://schemas.microsoft.com/office/word/2020/wordml/sdtdatahash" xmlns:w16sdtfl="http://schemas.microsoft.com/office/word/2024/wordml/sdtformatlock" xmlns:w16se="http://schemas.microsoft.com/office/word/2015/wordml/symex" xmlns:wpg="http://schemas.microsoft.com/office/word/2010/wordprocessingGroup" xmlns:wpi="http://schemas.microsoft.com/office/word/2010/wordprocessingInk" xmlns:wne="http://schemas.microsoft.com/office/word/2006/wordml" xmlns:wps="http://schemas.microsoft.com/office/word/2010/wordprocessingShape" mc:Ignorable="w14 w15 w16se w16cid w16 w16cex w16sdtdh w16sdtfl w16du wp14">
   <w:p>
     <w:pPr>
       <w:pStyle w:val="Header"/>
@@ -6968,7 +7467,7 @@
 </file>
 
 <file path=word/header3.xml><?xml version="1.0" encoding="utf-8"?>
-<w:hdr xmlns:wpc="http://schemas.microsoft.com/office/word/2010/wordprocessingCanvas" xmlns:cx="http://schemas.microsoft.com/office/drawing/2014/chartex" xmlns:cx1="http://schemas.microsoft.com/office/drawing/2015/9/8/chartex" xmlns:cx2="http://schemas.microsoft.com/office/drawing/2015/10/21/chartex" xmlns:cx3="http://schemas.microsoft.com/office/drawing/2016/5/9/chartex" xmlns:cx4="http://schemas.microsoft.com/office/drawing/2016/5/10/chartex" xmlns:cx5="http://schemas.microsoft.com/office/drawing/2016/5/11/chartex" xmlns:cx6="http://schemas.microsoft.com/office/drawing/2016/5/12/chartex" xmlns:cx7="http://schemas.microsoft.com/office/drawing/2016/5/13/chartex" xmlns:cx8="http://schemas.microsoft.com/office/drawing/2016/5/14/chartex" xmlns:mc="http://schemas.openxmlformats.org/markup-compatibility/2006" xmlns:m="http://schemas.openxmlformats.org/officeDocument/2006/math" xmlns:aink="http://schemas.microsoft.com/office/drawing/2016/ink" xmlns:am3d="http://schemas.microsoft.com/office/drawing/2017/model3d" xmlns:oel="http://schemas.microsoft.com/office/2019/extlst" xmlns:r="http://schemas.openxmlformats.org/officeDocument/2006/relationships" xmlns:wp14="http://schemas.microsoft.com/office/word/2010/wordprocessingDrawing" xmlns:wp="http://schemas.openxmlformats.org/drawingml/2006/wordprocessingDrawing" xmlns:wpg="http://schemas.microsoft.com/office/word/2010/wordprocessingGroup" xmlns:wpi="http://schemas.microsoft.com/office/word/2010/wordprocessingInk" xmlns:wps="http://schemas.microsoft.com/office/word/2010/wordprocessingShape" xmlns:o="urn:schemas-microsoft-com:office:office" xmlns:v="urn:schemas-microsoft-com:vml" xmlns:w10="urn:schemas-microsoft-com:office:word" xmlns:w="http://schemas.openxmlformats.org/wordprocessingml/2006/main" xmlns:w14="http://schemas.microsoft.com/office/word/2010/wordml" xmlns:w15="http://schemas.microsoft.com/office/word/2012/wordml" xmlns:w16cex="http://schemas.microsoft.com/office/word/2018/wordml/cex" xmlns:w16cid="http://schemas.microsoft.com/office/word/2016/wordml/cid" xmlns:w16="http://schemas.microsoft.com/office/word/2018/wordml" xmlns:w16sdtdh="http://schemas.microsoft.com/office/word/2020/wordml/sdtdatahash" xmlns:w16sdtfl="http://schemas.microsoft.com/office/word/2024/wordml/sdtformatlock" xmlns:w16se="http://schemas.microsoft.com/office/word/2015/wordml/symex" xmlns:w16du="http://schemas.microsoft.com/office/word/2023/wordml/word16du" xmlns:wne="http://schemas.microsoft.com/office/word/2006/wordml" mc:Ignorable="w14 w15 w16se w16cid w16 w16cex w16sdtdh w16sdtfl w16du wp14">
+<w:hdr xmlns:wpc="http://schemas.microsoft.com/office/word/2010/wordprocessingCanvas" xmlns:cx="http://schemas.microsoft.com/office/drawing/2014/chartex" xmlns:cx1="http://schemas.microsoft.com/office/drawing/2015/9/8/chartex" xmlns:cx2="http://schemas.microsoft.com/office/drawing/2015/10/21/chartex" xmlns:cx3="http://schemas.microsoft.com/office/drawing/2016/5/9/chartex" xmlns:cx4="http://schemas.microsoft.com/office/drawing/2016/5/10/chartex" xmlns:cx5="http://schemas.microsoft.com/office/drawing/2016/5/11/chartex" xmlns:cx6="http://schemas.microsoft.com/office/drawing/2016/5/12/chartex" xmlns:cx7="http://schemas.microsoft.com/office/drawing/2016/5/13/chartex" xmlns:cx8="http://schemas.microsoft.com/office/drawing/2016/5/14/chartex" xmlns:mc="http://schemas.openxmlformats.org/markup-compatibility/2006" xmlns:aink="http://schemas.microsoft.com/office/drawing/2016/ink" xmlns:am3d="http://schemas.microsoft.com/office/drawing/2017/model3d" xmlns:o="urn:schemas-microsoft-com:office:office" xmlns:oel="http://schemas.microsoft.com/office/2019/extlst" xmlns:r="http://schemas.openxmlformats.org/officeDocument/2006/relationships" xmlns:m="http://schemas.openxmlformats.org/officeDocument/2006/math" xmlns:v="urn:schemas-microsoft-com:vml" xmlns:wp14="http://schemas.microsoft.com/office/word/2010/wordprocessingDrawing" xmlns:wp="http://schemas.openxmlformats.org/drawingml/2006/wordprocessingDrawing" xmlns:w10="urn:schemas-microsoft-com:office:word" xmlns:w="http://schemas.openxmlformats.org/wordprocessingml/2006/main" xmlns:w14="http://schemas.microsoft.com/office/word/2010/wordml" xmlns:w15="http://schemas.microsoft.com/office/word/2012/wordml" xmlns:w16cei="http://schemas.microsoft.com/office/word/2026/wordml/cei" xmlns:w16cex="http://schemas.microsoft.com/office/word/2018/wordml/cex" xmlns:w16cid="http://schemas.microsoft.com/office/word/2016/wordml/cid" xmlns:w16="http://schemas.microsoft.com/office/word/2018/wordml" xmlns:w16du="http://schemas.microsoft.com/office/word/2023/wordml/word16du" xmlns:w16sdtdh="http://schemas.microsoft.com/office/word/2020/wordml/sdtdatahash" xmlns:w16sdtfl="http://schemas.microsoft.com/office/word/2024/wordml/sdtformatlock" xmlns:w16se="http://schemas.microsoft.com/office/word/2015/wordml/symex" xmlns:wpg="http://schemas.microsoft.com/office/word/2010/wordprocessingGroup" xmlns:wpi="http://schemas.microsoft.com/office/word/2010/wordprocessingInk" xmlns:wne="http://schemas.microsoft.com/office/word/2006/wordml" xmlns:wps="http://schemas.microsoft.com/office/word/2010/wordprocessingShape" mc:Ignorable="w14 w15 w16se w16cid w16 w16cex w16sdtdh w16sdtfl w16du wp14">
   <w:p>
     <w:pPr>
       <w:pStyle w:val="Header"/>
@@ -6978,7 +7477,7 @@
 </file>
 
 <file path=word/numbering.xml><?xml version="1.0" encoding="utf-8"?>
-<w:numbering xmlns:wpc="http://schemas.microsoft.com/office/word/2010/wordprocessingCanvas" xmlns:cx="http://schemas.microsoft.com/office/drawing/2014/chartex" xmlns:cx1="http://schemas.microsoft.com/office/drawing/2015/9/8/chartex" xmlns:cx2="http://schemas.microsoft.com/office/drawing/2015/10/21/chartex" xmlns:cx3="http://schemas.microsoft.com/office/drawing/2016/5/9/chartex" xmlns:cx4="http://schemas.microsoft.com/office/drawing/2016/5/10/chartex" xmlns:cx5="http://schemas.microsoft.com/office/drawing/2016/5/11/chartex" xmlns:cx6="http://schemas.microsoft.com/office/drawing/2016/5/12/chartex" xmlns:cx7="http://schemas.microsoft.com/office/drawing/2016/5/13/chartex" xmlns:cx8="http://schemas.microsoft.com/office/drawing/2016/5/14/chartex" xmlns:mc="http://schemas.openxmlformats.org/markup-compatibility/2006" xmlns:m="http://schemas.openxmlformats.org/officeDocument/2006/math" xmlns:aink="http://schemas.microsoft.com/office/drawing/2016/ink" xmlns:am3d="http://schemas.microsoft.com/office/drawing/2017/model3d" xmlns:oel="http://schemas.microsoft.com/office/2019/extlst" xmlns:r="http://schemas.openxmlformats.org/officeDocument/2006/relationships" xmlns:wp14="http://schemas.microsoft.com/office/word/2010/wordprocessingDrawing" xmlns:wp="http://schemas.openxmlformats.org/drawingml/2006/wordprocessingDrawing" xmlns:wpg="http://schemas.microsoft.com/office/word/2010/wordprocessingGroup" xmlns:wpi="http://schemas.microsoft.com/office/word/2010/wordprocessingInk" xmlns:wps="http://schemas.microsoft.com/office/word/2010/wordprocessingShape" xmlns:o="urn:schemas-microsoft-com:office:office" xmlns:v="urn:schemas-microsoft-com:vml" xmlns:w10="urn:schemas-microsoft-com:office:word" xmlns:w="http://schemas.openxmlformats.org/wordprocessingml/2006/main" xmlns:w14="http://schemas.microsoft.com/office/word/2010/wordml" xmlns:w15="http://schemas.microsoft.com/office/word/2012/wordml" xmlns:w16cex="http://schemas.microsoft.com/office/word/2018/wordml/cex" xmlns:w16cid="http://schemas.microsoft.com/office/word/2016/wordml/cid" xmlns:w16="http://schemas.microsoft.com/office/word/2018/wordml" xmlns:w16sdtdh="http://schemas.microsoft.com/office/word/2020/wordml/sdtdatahash" xmlns:w16sdtfl="http://schemas.microsoft.com/office/word/2024/wordml/sdtformatlock" xmlns:w16se="http://schemas.microsoft.com/office/word/2015/wordml/symex" xmlns:w16du="http://schemas.microsoft.com/office/word/2023/wordml/word16du" xmlns:wne="http://schemas.microsoft.com/office/word/2006/wordml" mc:Ignorable="w14 w15 w16se w16cid w16 w16cex w16sdtdh w16sdtfl w16du wp14">
+<w:numbering xmlns:wpc="http://schemas.microsoft.com/office/word/2010/wordprocessingCanvas" xmlns:cx="http://schemas.microsoft.com/office/drawing/2014/chartex" xmlns:cx1="http://schemas.microsoft.com/office/drawing/2015/9/8/chartex" xmlns:cx2="http://schemas.microsoft.com/office/drawing/2015/10/21/chartex" xmlns:cx3="http://schemas.microsoft.com/office/drawing/2016/5/9/chartex" xmlns:cx4="http://schemas.microsoft.com/office/drawing/2016/5/10/chartex" xmlns:cx5="http://schemas.microsoft.com/office/drawing/2016/5/11/chartex" xmlns:cx6="http://schemas.microsoft.com/office/drawing/2016/5/12/chartex" xmlns:cx7="http://schemas.microsoft.com/office/drawing/2016/5/13/chartex" xmlns:cx8="http://schemas.microsoft.com/office/drawing/2016/5/14/chartex" xmlns:mc="http://schemas.openxmlformats.org/markup-compatibility/2006" xmlns:aink="http://schemas.microsoft.com/office/drawing/2016/ink" xmlns:am3d="http://schemas.microsoft.com/office/drawing/2017/model3d" xmlns:o="urn:schemas-microsoft-com:office:office" xmlns:oel="http://schemas.microsoft.com/office/2019/extlst" xmlns:r="http://schemas.openxmlformats.org/officeDocument/2006/relationships" xmlns:m="http://schemas.openxmlformats.org/officeDocument/2006/math" xmlns:v="urn:schemas-microsoft-com:vml" xmlns:wp14="http://schemas.microsoft.com/office/word/2010/wordprocessingDrawing" xmlns:wp="http://schemas.openxmlformats.org/drawingml/2006/wordprocessingDrawing" xmlns:w10="urn:schemas-microsoft-com:office:word" xmlns:w="http://schemas.openxmlformats.org/wordprocessingml/2006/main" xmlns:w14="http://schemas.microsoft.com/office/word/2010/wordml" xmlns:w15="http://schemas.microsoft.com/office/word/2012/wordml" xmlns:w16cei="http://schemas.microsoft.com/office/word/2026/wordml/cei" xmlns:w16cex="http://schemas.microsoft.com/office/word/2018/wordml/cex" xmlns:w16cid="http://schemas.microsoft.com/office/word/2016/wordml/cid" xmlns:w16="http://schemas.microsoft.com/office/word/2018/wordml" xmlns:w16du="http://schemas.microsoft.com/office/word/2023/wordml/word16du" xmlns:w16sdtdh="http://schemas.microsoft.com/office/word/2020/wordml/sdtdatahash" xmlns:w16sdtfl="http://schemas.microsoft.com/office/word/2024/wordml/sdtformatlock" xmlns:w16se="http://schemas.microsoft.com/office/word/2015/wordml/symex" xmlns:wpg="http://schemas.microsoft.com/office/word/2010/wordprocessingGroup" xmlns:wpi="http://schemas.microsoft.com/office/word/2010/wordprocessingInk" xmlns:wne="http://schemas.microsoft.com/office/word/2006/wordml" xmlns:wps="http://schemas.microsoft.com/office/word/2010/wordprocessingShape" mc:Ignorable="w14 w15 w16se w16cid w16 w16cex w16sdtdh w16sdtfl w16du wp14">
   <w:abstractNum w:abstractNumId="0" w15:restartNumberingAfterBreak="0">
     <w:nsid w:val="327B23C6"/>
     <w:multiLevelType w:val="hybridMultilevel"/>
@@ -7037,7 +7536,7 @@
 </file>
 
 <file path=word/styles.xml><?xml version="1.0" encoding="utf-8"?>
-<w:styles xmlns:mc="http://schemas.openxmlformats.org/markup-compatibility/2006" xmlns:r="http://schemas.openxmlformats.org/officeDocument/2006/relationships" xmlns:w="http://schemas.openxmlformats.org/wordprocessingml/2006/main" xmlns:w14="http://schemas.microsoft.com/office/word/2010/wordml" xmlns:w15="http://schemas.microsoft.com/office/word/2012/wordml" xmlns:w16cex="http://schemas.microsoft.com/office/word/2018/wordml/cex" xmlns:w16cid="http://schemas.microsoft.com/office/word/2016/wordml/cid" xmlns:w16="http://schemas.microsoft.com/office/word/2018/wordml" xmlns:w16sdtdh="http://schemas.microsoft.com/office/word/2020/wordml/sdtdatahash" xmlns:w16sdtfl="http://schemas.microsoft.com/office/word/2024/wordml/sdtformatlock" xmlns:w16se="http://schemas.microsoft.com/office/word/2015/wordml/symex" xmlns:w16du="http://schemas.microsoft.com/office/word/2023/wordml/word16du" mc:Ignorable="w14 w15 w16se w16cid w16 w16cex w16sdtdh w16sdtfl w16du">
+<w:styles xmlns:mc="http://schemas.openxmlformats.org/markup-compatibility/2006" xmlns:r="http://schemas.openxmlformats.org/officeDocument/2006/relationships" xmlns:w="http://schemas.openxmlformats.org/wordprocessingml/2006/main" xmlns:w14="http://schemas.microsoft.com/office/word/2010/wordml" xmlns:w15="http://schemas.microsoft.com/office/word/2012/wordml" xmlns:w16cex="http://schemas.microsoft.com/office/word/2018/wordml/cex" xmlns:w16cid="http://schemas.microsoft.com/office/word/2016/wordml/cid" xmlns:w16="http://schemas.microsoft.com/office/word/2018/wordml" xmlns:w16du="http://schemas.microsoft.com/office/word/2023/wordml/word16du" xmlns:w16sdtdh="http://schemas.microsoft.com/office/word/2020/wordml/sdtdatahash" xmlns:w16sdtfl="http://schemas.microsoft.com/office/word/2024/wordml/sdtformatlock" xmlns:w16se="http://schemas.microsoft.com/office/word/2015/wordml/symex" mc:Ignorable="w14 w15 w16se w16cid w16 w16cex w16sdtdh w16sdtfl w16du">
   <w:docDefaults>
     <w:rPrDefault>
       <w:rPr>

</xml_diff>

<commit_message>
Deploying to gh-pages from @ lognitilab/lognitilab.github.io@e67df1f5be9c5e89a7bdcf7ddd7c1036aeefc57f 🚀
</commit_message>
<xml_diff>
--- a/assets/doc/cv-anmolpahwa.docx
+++ b/assets/doc/cv-anmolpahwa.docx
@@ -1,6 +1,6 @@
 
 <file path=word/document.xml><?xml version="1.0" encoding="utf-8"?>
-<w:document xmlns:wpc="http://schemas.microsoft.com/office/word/2010/wordprocessingCanvas" xmlns:cx="http://schemas.microsoft.com/office/drawing/2014/chartex" xmlns:cx1="http://schemas.microsoft.com/office/drawing/2015/9/8/chartex" xmlns:cx2="http://schemas.microsoft.com/office/drawing/2015/10/21/chartex" xmlns:cx3="http://schemas.microsoft.com/office/drawing/2016/5/9/chartex" xmlns:cx4="http://schemas.microsoft.com/office/drawing/2016/5/10/chartex" xmlns:cx5="http://schemas.microsoft.com/office/drawing/2016/5/11/chartex" xmlns:cx6="http://schemas.microsoft.com/office/drawing/2016/5/12/chartex" xmlns:cx7="http://schemas.microsoft.com/office/drawing/2016/5/13/chartex" xmlns:cx8="http://schemas.microsoft.com/office/drawing/2016/5/14/chartex" xmlns:mc="http://schemas.openxmlformats.org/markup-compatibility/2006" xmlns:aink="http://schemas.microsoft.com/office/drawing/2016/ink" xmlns:am3d="http://schemas.microsoft.com/office/drawing/2017/model3d" xmlns:o="urn:schemas-microsoft-com:office:office" xmlns:oel="http://schemas.microsoft.com/office/2019/extlst" xmlns:r="http://schemas.openxmlformats.org/officeDocument/2006/relationships" xmlns:m="http://schemas.openxmlformats.org/officeDocument/2006/math" xmlns:v="urn:schemas-microsoft-com:vml" xmlns:wp14="http://schemas.microsoft.com/office/word/2010/wordprocessingDrawing" xmlns:wp="http://schemas.openxmlformats.org/drawingml/2006/wordprocessingDrawing" xmlns:w10="urn:schemas-microsoft-com:office:word" xmlns:w="http://schemas.openxmlformats.org/wordprocessingml/2006/main" xmlns:w14="http://schemas.microsoft.com/office/word/2010/wordml" xmlns:w15="http://schemas.microsoft.com/office/word/2012/wordml" xmlns:w16cei="http://schemas.microsoft.com/office/word/2026/wordml/cei" xmlns:w16cex="http://schemas.microsoft.com/office/word/2018/wordml/cex" xmlns:w16cid="http://schemas.microsoft.com/office/word/2016/wordml/cid" xmlns:w16="http://schemas.microsoft.com/office/word/2018/wordml" xmlns:w16du="http://schemas.microsoft.com/office/word/2023/wordml/word16du" xmlns:w16sdtdh="http://schemas.microsoft.com/office/word/2020/wordml/sdtdatahash" xmlns:w16sdtfl="http://schemas.microsoft.com/office/word/2024/wordml/sdtformatlock" xmlns:w16se="http://schemas.microsoft.com/office/word/2015/wordml/symex" xmlns:wpg="http://schemas.microsoft.com/office/word/2010/wordprocessingGroup" xmlns:wpi="http://schemas.microsoft.com/office/word/2010/wordprocessingInk" xmlns:wne="http://schemas.microsoft.com/office/word/2006/wordml" xmlns:wps="http://schemas.microsoft.com/office/word/2010/wordprocessingShape" mc:Ignorable="w14 w15 w16se w16cid w16 w16cex w16sdtdh w16sdtfl w16du wp14">
+<w:document xmlns:wpc="http://schemas.microsoft.com/office/word/2010/wordprocessingCanvas" xmlns:cx="http://schemas.microsoft.com/office/drawing/2014/chartex" xmlns:cx1="http://schemas.microsoft.com/office/drawing/2015/9/8/chartex" xmlns:cx2="http://schemas.microsoft.com/office/drawing/2015/10/21/chartex" xmlns:cx3="http://schemas.microsoft.com/office/drawing/2016/5/9/chartex" xmlns:cx4="http://schemas.microsoft.com/office/drawing/2016/5/10/chartex" xmlns:cx5="http://schemas.microsoft.com/office/drawing/2016/5/11/chartex" xmlns:cx6="http://schemas.microsoft.com/office/drawing/2016/5/12/chartex" xmlns:cx7="http://schemas.microsoft.com/office/drawing/2016/5/13/chartex" xmlns:cx8="http://schemas.microsoft.com/office/drawing/2016/5/14/chartex" xmlns:mc="http://schemas.openxmlformats.org/markup-compatibility/2006" xmlns:m="http://schemas.openxmlformats.org/officeDocument/2006/math" xmlns:aink="http://schemas.microsoft.com/office/drawing/2016/ink" xmlns:am3d="http://schemas.microsoft.com/office/drawing/2017/model3d" xmlns:oel="http://schemas.microsoft.com/office/2019/extlst" xmlns:r="http://schemas.openxmlformats.org/officeDocument/2006/relationships" xmlns:wp14="http://schemas.microsoft.com/office/word/2010/wordprocessingDrawing" xmlns:wp="http://schemas.openxmlformats.org/drawingml/2006/wordprocessingDrawing" xmlns:wpg="http://schemas.microsoft.com/office/word/2010/wordprocessingGroup" xmlns:wpi="http://schemas.microsoft.com/office/word/2010/wordprocessingInk" xmlns:wps="http://schemas.microsoft.com/office/word/2010/wordprocessingShape" xmlns:o="urn:schemas-microsoft-com:office:office" xmlns:v="urn:schemas-microsoft-com:vml" xmlns:w10="urn:schemas-microsoft-com:office:word" xmlns:w="http://schemas.openxmlformats.org/wordprocessingml/2006/main" xmlns:w14="http://schemas.microsoft.com/office/word/2010/wordml" xmlns:w15="http://schemas.microsoft.com/office/word/2012/wordml" xmlns:w16cex="http://schemas.microsoft.com/office/word/2018/wordml/cex" xmlns:w16cid="http://schemas.microsoft.com/office/word/2016/wordml/cid" xmlns:w16="http://schemas.microsoft.com/office/word/2018/wordml" xmlns:w16sdtdh="http://schemas.microsoft.com/office/word/2020/wordml/sdtdatahash" xmlns:w16sdtfl="http://schemas.microsoft.com/office/word/2024/wordml/sdtformatlock" xmlns:w16se="http://schemas.microsoft.com/office/word/2015/wordml/symex" xmlns:w16du="http://schemas.microsoft.com/office/word/2023/wordml/word16du" xmlns:wne="http://schemas.microsoft.com/office/word/2006/wordml" mc:Ignorable="w14 w15 w16se w16cid w16 w16cex w16sdtdh w16sdtfl w16du wp14">
   <w:body>
     <w:p>
       <w:pPr>
@@ -14,8 +14,6 @@
           <w:lang w:val="en-IN"/>
         </w:rPr>
       </w:pPr>
-      <w:bookmarkStart w:id="0" w:name="page1"/>
-      <w:bookmarkEnd w:id="0"/>
       <w:r>
         <w:rPr>
           <w:rFonts w:eastAsia="Times New Roman"/>
@@ -25,7 +23,7 @@
           <w:szCs w:val="40"/>
           <w:lang w:val="en-IN"/>
         </w:rPr>
-        <w:t>9</w:t>
+        <w:t> </w:t>
       </w:r>
       <w:r>
         <w:rPr>
@@ -374,7 +372,7 @@
                   <w:szCs w:val="24"/>
                   <w:lang w:val="en-IN"/>
                 </w:rPr>
-                <w:t>/faculty/</w:t>
+                <w:t>/faculty/a</w:t>
               </w:r>
               <w:proofErr w:type="spellStart"/>
               <w:r>
@@ -385,10 +383,10 @@
                   <w:szCs w:val="24"/>
                   <w:lang w:val="en-IN"/>
                 </w:rPr>
-                <w:t>anmpahwa</w:t>
+                <w:t>nmpahwa</w:t>
               </w:r>
-              <w:proofErr w:type="spellEnd"/>
             </w:hyperlink>
+            <w:proofErr w:type="spellEnd"/>
           </w:p>
         </w:tc>
         <w:tc>
@@ -2476,23 +2474,7 @@
           <w:sz w:val="24"/>
           <w:szCs w:val="24"/>
         </w:rPr>
-        <w:t xml:space="preserve">, J. D., &amp; Hyland, M. (2024). Benefits, Challenges, and Opportunities </w:t>
-      </w:r>
-      <w:proofErr w:type="gramStart"/>
-      <w:r>
-        <w:rPr>
-          <w:sz w:val="24"/>
-          <w:szCs w:val="24"/>
-        </w:rPr>
-        <w:t>of</w:t>
-      </w:r>
-      <w:proofErr w:type="gramEnd"/>
-      <w:r>
-        <w:rPr>
-          <w:sz w:val="24"/>
-          <w:szCs w:val="24"/>
-        </w:rPr>
-        <w:t xml:space="preserve"> Different Last-Mile Delivery Strategies.</w:t>
+        <w:t>, J. D., &amp; Hyland, M. (2024). Benefits, Challenges, and Opportunities of Different Last-Mile Delivery Strategies.</w:t>
       </w:r>
       <w:r>
         <w:rPr>
@@ -4734,36 +4716,16 @@
           <w:szCs w:val="24"/>
           <w:lang w:val="en-IN"/>
         </w:rPr>
-        <w:t>, Govt. of Karnataka (2025-</w:t>
-      </w:r>
-      <w:proofErr w:type="gramStart"/>
-      <w:r>
-        <w:rPr>
-          <w:rFonts w:eastAsia="Times New Roman"/>
-          <w:sz w:val="24"/>
-          <w:szCs w:val="24"/>
-          <w:lang w:val="en-IN"/>
-        </w:rPr>
-        <w:t xml:space="preserve">26, </w:t>
-      </w:r>
-      <w:r>
-        <w:rPr>
-          <w:rFonts w:eastAsia="Times New Roman"/>
-          <w:sz w:val="24"/>
-          <w:szCs w:val="24"/>
-          <w:lang w:val="en-IN"/>
-        </w:rPr>
-        <w:t xml:space="preserve"> ₹</w:t>
-      </w:r>
-      <w:proofErr w:type="gramEnd"/>
-      <w:r>
-        <w:rPr>
-          <w:rFonts w:eastAsia="Times New Roman"/>
-          <w:sz w:val="24"/>
-          <w:szCs w:val="24"/>
-          <w:lang w:val="en-IN"/>
-        </w:rPr>
-        <w:t>20.82L</w:t>
+        <w:t xml:space="preserve">, Govt. of Karnataka (2025-26, </w:t>
+      </w:r>
+      <w:r>
+        <w:rPr>
+          <w:rFonts w:eastAsia="Times New Roman"/>
+          <w:sz w:val="24"/>
+          <w:szCs w:val="24"/>
+          <w:lang w:val="en-IN"/>
+        </w:rPr>
+        <w:t xml:space="preserve"> ₹20.82L</w:t>
       </w:r>
       <w:r>
         <w:rPr>
@@ -7379,7 +7341,7 @@
 </file>
 
 <file path=word/endnotes.xml><?xml version="1.0" encoding="utf-8"?>
-<w:endnotes xmlns:wpc="http://schemas.microsoft.com/office/word/2010/wordprocessingCanvas" xmlns:cx="http://schemas.microsoft.com/office/drawing/2014/chartex" xmlns:cx1="http://schemas.microsoft.com/office/drawing/2015/9/8/chartex" xmlns:cx2="http://schemas.microsoft.com/office/drawing/2015/10/21/chartex" xmlns:cx3="http://schemas.microsoft.com/office/drawing/2016/5/9/chartex" xmlns:cx4="http://schemas.microsoft.com/office/drawing/2016/5/10/chartex" xmlns:cx5="http://schemas.microsoft.com/office/drawing/2016/5/11/chartex" xmlns:cx6="http://schemas.microsoft.com/office/drawing/2016/5/12/chartex" xmlns:cx7="http://schemas.microsoft.com/office/drawing/2016/5/13/chartex" xmlns:cx8="http://schemas.microsoft.com/office/drawing/2016/5/14/chartex" xmlns:mc="http://schemas.openxmlformats.org/markup-compatibility/2006" xmlns:aink="http://schemas.microsoft.com/office/drawing/2016/ink" xmlns:am3d="http://schemas.microsoft.com/office/drawing/2017/model3d" xmlns:o="urn:schemas-microsoft-com:office:office" xmlns:oel="http://schemas.microsoft.com/office/2019/extlst" xmlns:r="http://schemas.openxmlformats.org/officeDocument/2006/relationships" xmlns:m="http://schemas.openxmlformats.org/officeDocument/2006/math" xmlns:v="urn:schemas-microsoft-com:vml" xmlns:wp14="http://schemas.microsoft.com/office/word/2010/wordprocessingDrawing" xmlns:wp="http://schemas.openxmlformats.org/drawingml/2006/wordprocessingDrawing" xmlns:w10="urn:schemas-microsoft-com:office:word" xmlns:w="http://schemas.openxmlformats.org/wordprocessingml/2006/main" xmlns:w14="http://schemas.microsoft.com/office/word/2010/wordml" xmlns:w15="http://schemas.microsoft.com/office/word/2012/wordml" xmlns:w16cei="http://schemas.microsoft.com/office/word/2026/wordml/cei" xmlns:w16cex="http://schemas.microsoft.com/office/word/2018/wordml/cex" xmlns:w16cid="http://schemas.microsoft.com/office/word/2016/wordml/cid" xmlns:w16="http://schemas.microsoft.com/office/word/2018/wordml" xmlns:w16du="http://schemas.microsoft.com/office/word/2023/wordml/word16du" xmlns:w16sdtdh="http://schemas.microsoft.com/office/word/2020/wordml/sdtdatahash" xmlns:w16sdtfl="http://schemas.microsoft.com/office/word/2024/wordml/sdtformatlock" xmlns:w16se="http://schemas.microsoft.com/office/word/2015/wordml/symex" xmlns:wpg="http://schemas.microsoft.com/office/word/2010/wordprocessingGroup" xmlns:wpi="http://schemas.microsoft.com/office/word/2010/wordprocessingInk" xmlns:wne="http://schemas.microsoft.com/office/word/2006/wordml" xmlns:wps="http://schemas.microsoft.com/office/word/2010/wordprocessingShape" mc:Ignorable="w14 w15 w16se w16cid w16 w16cex w16sdtdh w16sdtfl w16du wp14">
+<w:endnotes xmlns:wpc="http://schemas.microsoft.com/office/word/2010/wordprocessingCanvas" xmlns:cx="http://schemas.microsoft.com/office/drawing/2014/chartex" xmlns:cx1="http://schemas.microsoft.com/office/drawing/2015/9/8/chartex" xmlns:cx2="http://schemas.microsoft.com/office/drawing/2015/10/21/chartex" xmlns:cx3="http://schemas.microsoft.com/office/drawing/2016/5/9/chartex" xmlns:cx4="http://schemas.microsoft.com/office/drawing/2016/5/10/chartex" xmlns:cx5="http://schemas.microsoft.com/office/drawing/2016/5/11/chartex" xmlns:cx6="http://schemas.microsoft.com/office/drawing/2016/5/12/chartex" xmlns:cx7="http://schemas.microsoft.com/office/drawing/2016/5/13/chartex" xmlns:cx8="http://schemas.microsoft.com/office/drawing/2016/5/14/chartex" xmlns:mc="http://schemas.openxmlformats.org/markup-compatibility/2006" xmlns:m="http://schemas.openxmlformats.org/officeDocument/2006/math" xmlns:aink="http://schemas.microsoft.com/office/drawing/2016/ink" xmlns:am3d="http://schemas.microsoft.com/office/drawing/2017/model3d" xmlns:oel="http://schemas.microsoft.com/office/2019/extlst" xmlns:r="http://schemas.openxmlformats.org/officeDocument/2006/relationships" xmlns:wp14="http://schemas.microsoft.com/office/word/2010/wordprocessingDrawing" xmlns:wp="http://schemas.openxmlformats.org/drawingml/2006/wordprocessingDrawing" xmlns:wpg="http://schemas.microsoft.com/office/word/2010/wordprocessingGroup" xmlns:wpi="http://schemas.microsoft.com/office/word/2010/wordprocessingInk" xmlns:wps="http://schemas.microsoft.com/office/word/2010/wordprocessingShape" xmlns:o="urn:schemas-microsoft-com:office:office" xmlns:v="urn:schemas-microsoft-com:vml" xmlns:w10="urn:schemas-microsoft-com:office:word" xmlns:w="http://schemas.openxmlformats.org/wordprocessingml/2006/main" xmlns:w14="http://schemas.microsoft.com/office/word/2010/wordml" xmlns:w15="http://schemas.microsoft.com/office/word/2012/wordml" xmlns:w16cex="http://schemas.microsoft.com/office/word/2018/wordml/cex" xmlns:w16cid="http://schemas.microsoft.com/office/word/2016/wordml/cid" xmlns:w16="http://schemas.microsoft.com/office/word/2018/wordml" xmlns:w16sdtdh="http://schemas.microsoft.com/office/word/2020/wordml/sdtdatahash" xmlns:w16sdtfl="http://schemas.microsoft.com/office/word/2024/wordml/sdtformatlock" xmlns:w16se="http://schemas.microsoft.com/office/word/2015/wordml/symex" xmlns:w16du="http://schemas.microsoft.com/office/word/2023/wordml/word16du" xmlns:wne="http://schemas.microsoft.com/office/word/2006/wordml" mc:Ignorable="w14 w15 w16se w16cid w16 w16cex w16sdtdh w16sdtfl w16du wp14">
   <w:endnote w:type="separator" w:id="-1">
     <w:p>
       <w:r>
@@ -7398,7 +7360,7 @@
 </file>
 
 <file path=word/footer1.xml><?xml version="1.0" encoding="utf-8"?>
-<w:ftr xmlns:wpc="http://schemas.microsoft.com/office/word/2010/wordprocessingCanvas" xmlns:cx="http://schemas.microsoft.com/office/drawing/2014/chartex" xmlns:cx1="http://schemas.microsoft.com/office/drawing/2015/9/8/chartex" xmlns:cx2="http://schemas.microsoft.com/office/drawing/2015/10/21/chartex" xmlns:cx3="http://schemas.microsoft.com/office/drawing/2016/5/9/chartex" xmlns:cx4="http://schemas.microsoft.com/office/drawing/2016/5/10/chartex" xmlns:cx5="http://schemas.microsoft.com/office/drawing/2016/5/11/chartex" xmlns:cx6="http://schemas.microsoft.com/office/drawing/2016/5/12/chartex" xmlns:cx7="http://schemas.microsoft.com/office/drawing/2016/5/13/chartex" xmlns:cx8="http://schemas.microsoft.com/office/drawing/2016/5/14/chartex" xmlns:mc="http://schemas.openxmlformats.org/markup-compatibility/2006" xmlns:aink="http://schemas.microsoft.com/office/drawing/2016/ink" xmlns:am3d="http://schemas.microsoft.com/office/drawing/2017/model3d" xmlns:o="urn:schemas-microsoft-com:office:office" xmlns:oel="http://schemas.microsoft.com/office/2019/extlst" xmlns:r="http://schemas.openxmlformats.org/officeDocument/2006/relationships" xmlns:m="http://schemas.openxmlformats.org/officeDocument/2006/math" xmlns:v="urn:schemas-microsoft-com:vml" xmlns:wp14="http://schemas.microsoft.com/office/word/2010/wordprocessingDrawing" xmlns:wp="http://schemas.openxmlformats.org/drawingml/2006/wordprocessingDrawing" xmlns:w10="urn:schemas-microsoft-com:office:word" xmlns:w="http://schemas.openxmlformats.org/wordprocessingml/2006/main" xmlns:w14="http://schemas.microsoft.com/office/word/2010/wordml" xmlns:w15="http://schemas.microsoft.com/office/word/2012/wordml" xmlns:w16cei="http://schemas.microsoft.com/office/word/2026/wordml/cei" xmlns:w16cex="http://schemas.microsoft.com/office/word/2018/wordml/cex" xmlns:w16cid="http://schemas.microsoft.com/office/word/2016/wordml/cid" xmlns:w16="http://schemas.microsoft.com/office/word/2018/wordml" xmlns:w16du="http://schemas.microsoft.com/office/word/2023/wordml/word16du" xmlns:w16sdtdh="http://schemas.microsoft.com/office/word/2020/wordml/sdtdatahash" xmlns:w16sdtfl="http://schemas.microsoft.com/office/word/2024/wordml/sdtformatlock" xmlns:w16se="http://schemas.microsoft.com/office/word/2015/wordml/symex" xmlns:wpg="http://schemas.microsoft.com/office/word/2010/wordprocessingGroup" xmlns:wpi="http://schemas.microsoft.com/office/word/2010/wordprocessingInk" xmlns:wne="http://schemas.microsoft.com/office/word/2006/wordml" xmlns:wps="http://schemas.microsoft.com/office/word/2010/wordprocessingShape" mc:Ignorable="w14 w15 w16se w16cid w16 w16cex w16sdtdh w16sdtfl w16du wp14">
+<w:ftr xmlns:wpc="http://schemas.microsoft.com/office/word/2010/wordprocessingCanvas" xmlns:cx="http://schemas.microsoft.com/office/drawing/2014/chartex" xmlns:cx1="http://schemas.microsoft.com/office/drawing/2015/9/8/chartex" xmlns:cx2="http://schemas.microsoft.com/office/drawing/2015/10/21/chartex" xmlns:cx3="http://schemas.microsoft.com/office/drawing/2016/5/9/chartex" xmlns:cx4="http://schemas.microsoft.com/office/drawing/2016/5/10/chartex" xmlns:cx5="http://schemas.microsoft.com/office/drawing/2016/5/11/chartex" xmlns:cx6="http://schemas.microsoft.com/office/drawing/2016/5/12/chartex" xmlns:cx7="http://schemas.microsoft.com/office/drawing/2016/5/13/chartex" xmlns:cx8="http://schemas.microsoft.com/office/drawing/2016/5/14/chartex" xmlns:mc="http://schemas.openxmlformats.org/markup-compatibility/2006" xmlns:m="http://schemas.openxmlformats.org/officeDocument/2006/math" xmlns:aink="http://schemas.microsoft.com/office/drawing/2016/ink" xmlns:am3d="http://schemas.microsoft.com/office/drawing/2017/model3d" xmlns:oel="http://schemas.microsoft.com/office/2019/extlst" xmlns:r="http://schemas.openxmlformats.org/officeDocument/2006/relationships" xmlns:wp14="http://schemas.microsoft.com/office/word/2010/wordprocessingDrawing" xmlns:wp="http://schemas.openxmlformats.org/drawingml/2006/wordprocessingDrawing" xmlns:wpg="http://schemas.microsoft.com/office/word/2010/wordprocessingGroup" xmlns:wpi="http://schemas.microsoft.com/office/word/2010/wordprocessingInk" xmlns:wps="http://schemas.microsoft.com/office/word/2010/wordprocessingShape" xmlns:o="urn:schemas-microsoft-com:office:office" xmlns:v="urn:schemas-microsoft-com:vml" xmlns:w10="urn:schemas-microsoft-com:office:word" xmlns:w="http://schemas.openxmlformats.org/wordprocessingml/2006/main" xmlns:w14="http://schemas.microsoft.com/office/word/2010/wordml" xmlns:w15="http://schemas.microsoft.com/office/word/2012/wordml" xmlns:w16cex="http://schemas.microsoft.com/office/word/2018/wordml/cex" xmlns:w16cid="http://schemas.microsoft.com/office/word/2016/wordml/cid" xmlns:w16="http://schemas.microsoft.com/office/word/2018/wordml" xmlns:w16sdtdh="http://schemas.microsoft.com/office/word/2020/wordml/sdtdatahash" xmlns:w16sdtfl="http://schemas.microsoft.com/office/word/2024/wordml/sdtformatlock" xmlns:w16se="http://schemas.microsoft.com/office/word/2015/wordml/symex" xmlns:w16du="http://schemas.microsoft.com/office/word/2023/wordml/word16du" xmlns:wne="http://schemas.microsoft.com/office/word/2006/wordml" mc:Ignorable="w14 w15 w16se w16cid w16 w16cex w16sdtdh w16sdtfl w16du wp14">
   <w:p>
     <w:pPr>
       <w:pStyle w:val="Footer"/>
@@ -7408,7 +7370,7 @@
 </file>
 
 <file path=word/footer2.xml><?xml version="1.0" encoding="utf-8"?>
-<w:ftr xmlns:wpc="http://schemas.microsoft.com/office/word/2010/wordprocessingCanvas" xmlns:cx="http://schemas.microsoft.com/office/drawing/2014/chartex" xmlns:cx1="http://schemas.microsoft.com/office/drawing/2015/9/8/chartex" xmlns:cx2="http://schemas.microsoft.com/office/drawing/2015/10/21/chartex" xmlns:cx3="http://schemas.microsoft.com/office/drawing/2016/5/9/chartex" xmlns:cx4="http://schemas.microsoft.com/office/drawing/2016/5/10/chartex" xmlns:cx5="http://schemas.microsoft.com/office/drawing/2016/5/11/chartex" xmlns:cx6="http://schemas.microsoft.com/office/drawing/2016/5/12/chartex" xmlns:cx7="http://schemas.microsoft.com/office/drawing/2016/5/13/chartex" xmlns:cx8="http://schemas.microsoft.com/office/drawing/2016/5/14/chartex" xmlns:mc="http://schemas.openxmlformats.org/markup-compatibility/2006" xmlns:aink="http://schemas.microsoft.com/office/drawing/2016/ink" xmlns:am3d="http://schemas.microsoft.com/office/drawing/2017/model3d" xmlns:o="urn:schemas-microsoft-com:office:office" xmlns:oel="http://schemas.microsoft.com/office/2019/extlst" xmlns:r="http://schemas.openxmlformats.org/officeDocument/2006/relationships" xmlns:m="http://schemas.openxmlformats.org/officeDocument/2006/math" xmlns:v="urn:schemas-microsoft-com:vml" xmlns:wp14="http://schemas.microsoft.com/office/word/2010/wordprocessingDrawing" xmlns:wp="http://schemas.openxmlformats.org/drawingml/2006/wordprocessingDrawing" xmlns:w10="urn:schemas-microsoft-com:office:word" xmlns:w="http://schemas.openxmlformats.org/wordprocessingml/2006/main" xmlns:w14="http://schemas.microsoft.com/office/word/2010/wordml" xmlns:w15="http://schemas.microsoft.com/office/word/2012/wordml" xmlns:w16cei="http://schemas.microsoft.com/office/word/2026/wordml/cei" xmlns:w16cex="http://schemas.microsoft.com/office/word/2018/wordml/cex" xmlns:w16cid="http://schemas.microsoft.com/office/word/2016/wordml/cid" xmlns:w16="http://schemas.microsoft.com/office/word/2018/wordml" xmlns:w16du="http://schemas.microsoft.com/office/word/2023/wordml/word16du" xmlns:w16sdtdh="http://schemas.microsoft.com/office/word/2020/wordml/sdtdatahash" xmlns:w16sdtfl="http://schemas.microsoft.com/office/word/2024/wordml/sdtformatlock" xmlns:w16se="http://schemas.microsoft.com/office/word/2015/wordml/symex" xmlns:wpg="http://schemas.microsoft.com/office/word/2010/wordprocessingGroup" xmlns:wpi="http://schemas.microsoft.com/office/word/2010/wordprocessingInk" xmlns:wne="http://schemas.microsoft.com/office/word/2006/wordml" xmlns:wps="http://schemas.microsoft.com/office/word/2010/wordprocessingShape" mc:Ignorable="w14 w15 w16se w16cid w16 w16cex w16sdtdh w16sdtfl w16du wp14">
+<w:ftr xmlns:wpc="http://schemas.microsoft.com/office/word/2010/wordprocessingCanvas" xmlns:cx="http://schemas.microsoft.com/office/drawing/2014/chartex" xmlns:cx1="http://schemas.microsoft.com/office/drawing/2015/9/8/chartex" xmlns:cx2="http://schemas.microsoft.com/office/drawing/2015/10/21/chartex" xmlns:cx3="http://schemas.microsoft.com/office/drawing/2016/5/9/chartex" xmlns:cx4="http://schemas.microsoft.com/office/drawing/2016/5/10/chartex" xmlns:cx5="http://schemas.microsoft.com/office/drawing/2016/5/11/chartex" xmlns:cx6="http://schemas.microsoft.com/office/drawing/2016/5/12/chartex" xmlns:cx7="http://schemas.microsoft.com/office/drawing/2016/5/13/chartex" xmlns:cx8="http://schemas.microsoft.com/office/drawing/2016/5/14/chartex" xmlns:mc="http://schemas.openxmlformats.org/markup-compatibility/2006" xmlns:m="http://schemas.openxmlformats.org/officeDocument/2006/math" xmlns:aink="http://schemas.microsoft.com/office/drawing/2016/ink" xmlns:am3d="http://schemas.microsoft.com/office/drawing/2017/model3d" xmlns:oel="http://schemas.microsoft.com/office/2019/extlst" xmlns:r="http://schemas.openxmlformats.org/officeDocument/2006/relationships" xmlns:wp14="http://schemas.microsoft.com/office/word/2010/wordprocessingDrawing" xmlns:wp="http://schemas.openxmlformats.org/drawingml/2006/wordprocessingDrawing" xmlns:wpg="http://schemas.microsoft.com/office/word/2010/wordprocessingGroup" xmlns:wpi="http://schemas.microsoft.com/office/word/2010/wordprocessingInk" xmlns:wps="http://schemas.microsoft.com/office/word/2010/wordprocessingShape" xmlns:o="urn:schemas-microsoft-com:office:office" xmlns:v="urn:schemas-microsoft-com:vml" xmlns:w10="urn:schemas-microsoft-com:office:word" xmlns:w="http://schemas.openxmlformats.org/wordprocessingml/2006/main" xmlns:w14="http://schemas.microsoft.com/office/word/2010/wordml" xmlns:w15="http://schemas.microsoft.com/office/word/2012/wordml" xmlns:w16cex="http://schemas.microsoft.com/office/word/2018/wordml/cex" xmlns:w16cid="http://schemas.microsoft.com/office/word/2016/wordml/cid" xmlns:w16="http://schemas.microsoft.com/office/word/2018/wordml" xmlns:w16sdtdh="http://schemas.microsoft.com/office/word/2020/wordml/sdtdatahash" xmlns:w16sdtfl="http://schemas.microsoft.com/office/word/2024/wordml/sdtformatlock" xmlns:w16se="http://schemas.microsoft.com/office/word/2015/wordml/symex" xmlns:w16du="http://schemas.microsoft.com/office/word/2023/wordml/word16du" xmlns:wne="http://schemas.microsoft.com/office/word/2006/wordml" mc:Ignorable="w14 w15 w16se w16cid w16 w16cex w16sdtdh w16sdtfl w16du wp14">
   <w:p>
     <w:pPr>
       <w:pStyle w:val="Footer"/>
@@ -7418,7 +7380,7 @@
 </file>
 
 <file path=word/footer3.xml><?xml version="1.0" encoding="utf-8"?>
-<w:ftr xmlns:wpc="http://schemas.microsoft.com/office/word/2010/wordprocessingCanvas" xmlns:cx="http://schemas.microsoft.com/office/drawing/2014/chartex" xmlns:cx1="http://schemas.microsoft.com/office/drawing/2015/9/8/chartex" xmlns:cx2="http://schemas.microsoft.com/office/drawing/2015/10/21/chartex" xmlns:cx3="http://schemas.microsoft.com/office/drawing/2016/5/9/chartex" xmlns:cx4="http://schemas.microsoft.com/office/drawing/2016/5/10/chartex" xmlns:cx5="http://schemas.microsoft.com/office/drawing/2016/5/11/chartex" xmlns:cx6="http://schemas.microsoft.com/office/drawing/2016/5/12/chartex" xmlns:cx7="http://schemas.microsoft.com/office/drawing/2016/5/13/chartex" xmlns:cx8="http://schemas.microsoft.com/office/drawing/2016/5/14/chartex" xmlns:mc="http://schemas.openxmlformats.org/markup-compatibility/2006" xmlns:aink="http://schemas.microsoft.com/office/drawing/2016/ink" xmlns:am3d="http://schemas.microsoft.com/office/drawing/2017/model3d" xmlns:o="urn:schemas-microsoft-com:office:office" xmlns:oel="http://schemas.microsoft.com/office/2019/extlst" xmlns:r="http://schemas.openxmlformats.org/officeDocument/2006/relationships" xmlns:m="http://schemas.openxmlformats.org/officeDocument/2006/math" xmlns:v="urn:schemas-microsoft-com:vml" xmlns:wp14="http://schemas.microsoft.com/office/word/2010/wordprocessingDrawing" xmlns:wp="http://schemas.openxmlformats.org/drawingml/2006/wordprocessingDrawing" xmlns:w10="urn:schemas-microsoft-com:office:word" xmlns:w="http://schemas.openxmlformats.org/wordprocessingml/2006/main" xmlns:w14="http://schemas.microsoft.com/office/word/2010/wordml" xmlns:w15="http://schemas.microsoft.com/office/word/2012/wordml" xmlns:w16cei="http://schemas.microsoft.com/office/word/2026/wordml/cei" xmlns:w16cex="http://schemas.microsoft.com/office/word/2018/wordml/cex" xmlns:w16cid="http://schemas.microsoft.com/office/word/2016/wordml/cid" xmlns:w16="http://schemas.microsoft.com/office/word/2018/wordml" xmlns:w16du="http://schemas.microsoft.com/office/word/2023/wordml/word16du" xmlns:w16sdtdh="http://schemas.microsoft.com/office/word/2020/wordml/sdtdatahash" xmlns:w16sdtfl="http://schemas.microsoft.com/office/word/2024/wordml/sdtformatlock" xmlns:w16se="http://schemas.microsoft.com/office/word/2015/wordml/symex" xmlns:wpg="http://schemas.microsoft.com/office/word/2010/wordprocessingGroup" xmlns:wpi="http://schemas.microsoft.com/office/word/2010/wordprocessingInk" xmlns:wne="http://schemas.microsoft.com/office/word/2006/wordml" xmlns:wps="http://schemas.microsoft.com/office/word/2010/wordprocessingShape" mc:Ignorable="w14 w15 w16se w16cid w16 w16cex w16sdtdh w16sdtfl w16du wp14">
+<w:ftr xmlns:wpc="http://schemas.microsoft.com/office/word/2010/wordprocessingCanvas" xmlns:cx="http://schemas.microsoft.com/office/drawing/2014/chartex" xmlns:cx1="http://schemas.microsoft.com/office/drawing/2015/9/8/chartex" xmlns:cx2="http://schemas.microsoft.com/office/drawing/2015/10/21/chartex" xmlns:cx3="http://schemas.microsoft.com/office/drawing/2016/5/9/chartex" xmlns:cx4="http://schemas.microsoft.com/office/drawing/2016/5/10/chartex" xmlns:cx5="http://schemas.microsoft.com/office/drawing/2016/5/11/chartex" xmlns:cx6="http://schemas.microsoft.com/office/drawing/2016/5/12/chartex" xmlns:cx7="http://schemas.microsoft.com/office/drawing/2016/5/13/chartex" xmlns:cx8="http://schemas.microsoft.com/office/drawing/2016/5/14/chartex" xmlns:mc="http://schemas.openxmlformats.org/markup-compatibility/2006" xmlns:m="http://schemas.openxmlformats.org/officeDocument/2006/math" xmlns:aink="http://schemas.microsoft.com/office/drawing/2016/ink" xmlns:am3d="http://schemas.microsoft.com/office/drawing/2017/model3d" xmlns:oel="http://schemas.microsoft.com/office/2019/extlst" xmlns:r="http://schemas.openxmlformats.org/officeDocument/2006/relationships" xmlns:wp14="http://schemas.microsoft.com/office/word/2010/wordprocessingDrawing" xmlns:wp="http://schemas.openxmlformats.org/drawingml/2006/wordprocessingDrawing" xmlns:wpg="http://schemas.microsoft.com/office/word/2010/wordprocessingGroup" xmlns:wpi="http://schemas.microsoft.com/office/word/2010/wordprocessingInk" xmlns:wps="http://schemas.microsoft.com/office/word/2010/wordprocessingShape" xmlns:o="urn:schemas-microsoft-com:office:office" xmlns:v="urn:schemas-microsoft-com:vml" xmlns:w10="urn:schemas-microsoft-com:office:word" xmlns:w="http://schemas.openxmlformats.org/wordprocessingml/2006/main" xmlns:w14="http://schemas.microsoft.com/office/word/2010/wordml" xmlns:w15="http://schemas.microsoft.com/office/word/2012/wordml" xmlns:w16cex="http://schemas.microsoft.com/office/word/2018/wordml/cex" xmlns:w16cid="http://schemas.microsoft.com/office/word/2016/wordml/cid" xmlns:w16="http://schemas.microsoft.com/office/word/2018/wordml" xmlns:w16sdtdh="http://schemas.microsoft.com/office/word/2020/wordml/sdtdatahash" xmlns:w16sdtfl="http://schemas.microsoft.com/office/word/2024/wordml/sdtformatlock" xmlns:w16se="http://schemas.microsoft.com/office/word/2015/wordml/symex" xmlns:w16du="http://schemas.microsoft.com/office/word/2023/wordml/word16du" xmlns:wne="http://schemas.microsoft.com/office/word/2006/wordml" mc:Ignorable="w14 w15 w16se w16cid w16 w16cex w16sdtdh w16sdtfl w16du wp14">
   <w:p>
     <w:pPr>
       <w:pStyle w:val="Footer"/>
@@ -7428,7 +7390,7 @@
 </file>
 
 <file path=word/footnotes.xml><?xml version="1.0" encoding="utf-8"?>
-<w:footnotes xmlns:wpc="http://schemas.microsoft.com/office/word/2010/wordprocessingCanvas" xmlns:cx="http://schemas.microsoft.com/office/drawing/2014/chartex" xmlns:cx1="http://schemas.microsoft.com/office/drawing/2015/9/8/chartex" xmlns:cx2="http://schemas.microsoft.com/office/drawing/2015/10/21/chartex" xmlns:cx3="http://schemas.microsoft.com/office/drawing/2016/5/9/chartex" xmlns:cx4="http://schemas.microsoft.com/office/drawing/2016/5/10/chartex" xmlns:cx5="http://schemas.microsoft.com/office/drawing/2016/5/11/chartex" xmlns:cx6="http://schemas.microsoft.com/office/drawing/2016/5/12/chartex" xmlns:cx7="http://schemas.microsoft.com/office/drawing/2016/5/13/chartex" xmlns:cx8="http://schemas.microsoft.com/office/drawing/2016/5/14/chartex" xmlns:mc="http://schemas.openxmlformats.org/markup-compatibility/2006" xmlns:aink="http://schemas.microsoft.com/office/drawing/2016/ink" xmlns:am3d="http://schemas.microsoft.com/office/drawing/2017/model3d" xmlns:o="urn:schemas-microsoft-com:office:office" xmlns:oel="http://schemas.microsoft.com/office/2019/extlst" xmlns:r="http://schemas.openxmlformats.org/officeDocument/2006/relationships" xmlns:m="http://schemas.openxmlformats.org/officeDocument/2006/math" xmlns:v="urn:schemas-microsoft-com:vml" xmlns:wp14="http://schemas.microsoft.com/office/word/2010/wordprocessingDrawing" xmlns:wp="http://schemas.openxmlformats.org/drawingml/2006/wordprocessingDrawing" xmlns:w10="urn:schemas-microsoft-com:office:word" xmlns:w="http://schemas.openxmlformats.org/wordprocessingml/2006/main" xmlns:w14="http://schemas.microsoft.com/office/word/2010/wordml" xmlns:w15="http://schemas.microsoft.com/office/word/2012/wordml" xmlns:w16cei="http://schemas.microsoft.com/office/word/2026/wordml/cei" xmlns:w16cex="http://schemas.microsoft.com/office/word/2018/wordml/cex" xmlns:w16cid="http://schemas.microsoft.com/office/word/2016/wordml/cid" xmlns:w16="http://schemas.microsoft.com/office/word/2018/wordml" xmlns:w16du="http://schemas.microsoft.com/office/word/2023/wordml/word16du" xmlns:w16sdtdh="http://schemas.microsoft.com/office/word/2020/wordml/sdtdatahash" xmlns:w16sdtfl="http://schemas.microsoft.com/office/word/2024/wordml/sdtformatlock" xmlns:w16se="http://schemas.microsoft.com/office/word/2015/wordml/symex" xmlns:wpg="http://schemas.microsoft.com/office/word/2010/wordprocessingGroup" xmlns:wpi="http://schemas.microsoft.com/office/word/2010/wordprocessingInk" xmlns:wne="http://schemas.microsoft.com/office/word/2006/wordml" xmlns:wps="http://schemas.microsoft.com/office/word/2010/wordprocessingShape" mc:Ignorable="w14 w15 w16se w16cid w16 w16cex w16sdtdh w16sdtfl w16du wp14">
+<w:footnotes xmlns:wpc="http://schemas.microsoft.com/office/word/2010/wordprocessingCanvas" xmlns:cx="http://schemas.microsoft.com/office/drawing/2014/chartex" xmlns:cx1="http://schemas.microsoft.com/office/drawing/2015/9/8/chartex" xmlns:cx2="http://schemas.microsoft.com/office/drawing/2015/10/21/chartex" xmlns:cx3="http://schemas.microsoft.com/office/drawing/2016/5/9/chartex" xmlns:cx4="http://schemas.microsoft.com/office/drawing/2016/5/10/chartex" xmlns:cx5="http://schemas.microsoft.com/office/drawing/2016/5/11/chartex" xmlns:cx6="http://schemas.microsoft.com/office/drawing/2016/5/12/chartex" xmlns:cx7="http://schemas.microsoft.com/office/drawing/2016/5/13/chartex" xmlns:cx8="http://schemas.microsoft.com/office/drawing/2016/5/14/chartex" xmlns:mc="http://schemas.openxmlformats.org/markup-compatibility/2006" xmlns:m="http://schemas.openxmlformats.org/officeDocument/2006/math" xmlns:aink="http://schemas.microsoft.com/office/drawing/2016/ink" xmlns:am3d="http://schemas.microsoft.com/office/drawing/2017/model3d" xmlns:oel="http://schemas.microsoft.com/office/2019/extlst" xmlns:r="http://schemas.openxmlformats.org/officeDocument/2006/relationships" xmlns:wp14="http://schemas.microsoft.com/office/word/2010/wordprocessingDrawing" xmlns:wp="http://schemas.openxmlformats.org/drawingml/2006/wordprocessingDrawing" xmlns:wpg="http://schemas.microsoft.com/office/word/2010/wordprocessingGroup" xmlns:wpi="http://schemas.microsoft.com/office/word/2010/wordprocessingInk" xmlns:wps="http://schemas.microsoft.com/office/word/2010/wordprocessingShape" xmlns:o="urn:schemas-microsoft-com:office:office" xmlns:v="urn:schemas-microsoft-com:vml" xmlns:w10="urn:schemas-microsoft-com:office:word" xmlns:w="http://schemas.openxmlformats.org/wordprocessingml/2006/main" xmlns:w14="http://schemas.microsoft.com/office/word/2010/wordml" xmlns:w15="http://schemas.microsoft.com/office/word/2012/wordml" xmlns:w16cex="http://schemas.microsoft.com/office/word/2018/wordml/cex" xmlns:w16cid="http://schemas.microsoft.com/office/word/2016/wordml/cid" xmlns:w16="http://schemas.microsoft.com/office/word/2018/wordml" xmlns:w16sdtdh="http://schemas.microsoft.com/office/word/2020/wordml/sdtdatahash" xmlns:w16sdtfl="http://schemas.microsoft.com/office/word/2024/wordml/sdtformatlock" xmlns:w16se="http://schemas.microsoft.com/office/word/2015/wordml/symex" xmlns:w16du="http://schemas.microsoft.com/office/word/2023/wordml/word16du" xmlns:wne="http://schemas.microsoft.com/office/word/2006/wordml" mc:Ignorable="w14 w15 w16se w16cid w16 w16cex w16sdtdh w16sdtfl w16du wp14">
   <w:footnote w:type="separator" w:id="-1">
     <w:p>
       <w:r>
@@ -7447,7 +7409,7 @@
 </file>
 
 <file path=word/header1.xml><?xml version="1.0" encoding="utf-8"?>
-<w:hdr xmlns:wpc="http://schemas.microsoft.com/office/word/2010/wordprocessingCanvas" xmlns:cx="http://schemas.microsoft.com/office/drawing/2014/chartex" xmlns:cx1="http://schemas.microsoft.com/office/drawing/2015/9/8/chartex" xmlns:cx2="http://schemas.microsoft.com/office/drawing/2015/10/21/chartex" xmlns:cx3="http://schemas.microsoft.com/office/drawing/2016/5/9/chartex" xmlns:cx4="http://schemas.microsoft.com/office/drawing/2016/5/10/chartex" xmlns:cx5="http://schemas.microsoft.com/office/drawing/2016/5/11/chartex" xmlns:cx6="http://schemas.microsoft.com/office/drawing/2016/5/12/chartex" xmlns:cx7="http://schemas.microsoft.com/office/drawing/2016/5/13/chartex" xmlns:cx8="http://schemas.microsoft.com/office/drawing/2016/5/14/chartex" xmlns:mc="http://schemas.openxmlformats.org/markup-compatibility/2006" xmlns:aink="http://schemas.microsoft.com/office/drawing/2016/ink" xmlns:am3d="http://schemas.microsoft.com/office/drawing/2017/model3d" xmlns:o="urn:schemas-microsoft-com:office:office" xmlns:oel="http://schemas.microsoft.com/office/2019/extlst" xmlns:r="http://schemas.openxmlformats.org/officeDocument/2006/relationships" xmlns:m="http://schemas.openxmlformats.org/officeDocument/2006/math" xmlns:v="urn:schemas-microsoft-com:vml" xmlns:wp14="http://schemas.microsoft.com/office/word/2010/wordprocessingDrawing" xmlns:wp="http://schemas.openxmlformats.org/drawingml/2006/wordprocessingDrawing" xmlns:w10="urn:schemas-microsoft-com:office:word" xmlns:w="http://schemas.openxmlformats.org/wordprocessingml/2006/main" xmlns:w14="http://schemas.microsoft.com/office/word/2010/wordml" xmlns:w15="http://schemas.microsoft.com/office/word/2012/wordml" xmlns:w16cei="http://schemas.microsoft.com/office/word/2026/wordml/cei" xmlns:w16cex="http://schemas.microsoft.com/office/word/2018/wordml/cex" xmlns:w16cid="http://schemas.microsoft.com/office/word/2016/wordml/cid" xmlns:w16="http://schemas.microsoft.com/office/word/2018/wordml" xmlns:w16du="http://schemas.microsoft.com/office/word/2023/wordml/word16du" xmlns:w16sdtdh="http://schemas.microsoft.com/office/word/2020/wordml/sdtdatahash" xmlns:w16sdtfl="http://schemas.microsoft.com/office/word/2024/wordml/sdtformatlock" xmlns:w16se="http://schemas.microsoft.com/office/word/2015/wordml/symex" xmlns:wpg="http://schemas.microsoft.com/office/word/2010/wordprocessingGroup" xmlns:wpi="http://schemas.microsoft.com/office/word/2010/wordprocessingInk" xmlns:wne="http://schemas.microsoft.com/office/word/2006/wordml" xmlns:wps="http://schemas.microsoft.com/office/word/2010/wordprocessingShape" mc:Ignorable="w14 w15 w16se w16cid w16 w16cex w16sdtdh w16sdtfl w16du wp14">
+<w:hdr xmlns:wpc="http://schemas.microsoft.com/office/word/2010/wordprocessingCanvas" xmlns:cx="http://schemas.microsoft.com/office/drawing/2014/chartex" xmlns:cx1="http://schemas.microsoft.com/office/drawing/2015/9/8/chartex" xmlns:cx2="http://schemas.microsoft.com/office/drawing/2015/10/21/chartex" xmlns:cx3="http://schemas.microsoft.com/office/drawing/2016/5/9/chartex" xmlns:cx4="http://schemas.microsoft.com/office/drawing/2016/5/10/chartex" xmlns:cx5="http://schemas.microsoft.com/office/drawing/2016/5/11/chartex" xmlns:cx6="http://schemas.microsoft.com/office/drawing/2016/5/12/chartex" xmlns:cx7="http://schemas.microsoft.com/office/drawing/2016/5/13/chartex" xmlns:cx8="http://schemas.microsoft.com/office/drawing/2016/5/14/chartex" xmlns:mc="http://schemas.openxmlformats.org/markup-compatibility/2006" xmlns:m="http://schemas.openxmlformats.org/officeDocument/2006/math" xmlns:aink="http://schemas.microsoft.com/office/drawing/2016/ink" xmlns:am3d="http://schemas.microsoft.com/office/drawing/2017/model3d" xmlns:oel="http://schemas.microsoft.com/office/2019/extlst" xmlns:r="http://schemas.openxmlformats.org/officeDocument/2006/relationships" xmlns:wp14="http://schemas.microsoft.com/office/word/2010/wordprocessingDrawing" xmlns:wp="http://schemas.openxmlformats.org/drawingml/2006/wordprocessingDrawing" xmlns:wpg="http://schemas.microsoft.com/office/word/2010/wordprocessingGroup" xmlns:wpi="http://schemas.microsoft.com/office/word/2010/wordprocessingInk" xmlns:wps="http://schemas.microsoft.com/office/word/2010/wordprocessingShape" xmlns:o="urn:schemas-microsoft-com:office:office" xmlns:v="urn:schemas-microsoft-com:vml" xmlns:w10="urn:schemas-microsoft-com:office:word" xmlns:w="http://schemas.openxmlformats.org/wordprocessingml/2006/main" xmlns:w14="http://schemas.microsoft.com/office/word/2010/wordml" xmlns:w15="http://schemas.microsoft.com/office/word/2012/wordml" xmlns:w16cex="http://schemas.microsoft.com/office/word/2018/wordml/cex" xmlns:w16cid="http://schemas.microsoft.com/office/word/2016/wordml/cid" xmlns:w16="http://schemas.microsoft.com/office/word/2018/wordml" xmlns:w16sdtdh="http://schemas.microsoft.com/office/word/2020/wordml/sdtdatahash" xmlns:w16sdtfl="http://schemas.microsoft.com/office/word/2024/wordml/sdtformatlock" xmlns:w16se="http://schemas.microsoft.com/office/word/2015/wordml/symex" xmlns:w16du="http://schemas.microsoft.com/office/word/2023/wordml/word16du" xmlns:wne="http://schemas.microsoft.com/office/word/2006/wordml" mc:Ignorable="w14 w15 w16se w16cid w16 w16cex w16sdtdh w16sdtfl w16du wp14">
   <w:p>
     <w:pPr>
       <w:pStyle w:val="Header"/>
@@ -7457,7 +7419,7 @@
 </file>
 
 <file path=word/header2.xml><?xml version="1.0" encoding="utf-8"?>
-<w:hdr xmlns:wpc="http://schemas.microsoft.com/office/word/2010/wordprocessingCanvas" xmlns:cx="http://schemas.microsoft.com/office/drawing/2014/chartex" xmlns:cx1="http://schemas.microsoft.com/office/drawing/2015/9/8/chartex" xmlns:cx2="http://schemas.microsoft.com/office/drawing/2015/10/21/chartex" xmlns:cx3="http://schemas.microsoft.com/office/drawing/2016/5/9/chartex" xmlns:cx4="http://schemas.microsoft.com/office/drawing/2016/5/10/chartex" xmlns:cx5="http://schemas.microsoft.com/office/drawing/2016/5/11/chartex" xmlns:cx6="http://schemas.microsoft.com/office/drawing/2016/5/12/chartex" xmlns:cx7="http://schemas.microsoft.com/office/drawing/2016/5/13/chartex" xmlns:cx8="http://schemas.microsoft.com/office/drawing/2016/5/14/chartex" xmlns:mc="http://schemas.openxmlformats.org/markup-compatibility/2006" xmlns:aink="http://schemas.microsoft.com/office/drawing/2016/ink" xmlns:am3d="http://schemas.microsoft.com/office/drawing/2017/model3d" xmlns:o="urn:schemas-microsoft-com:office:office" xmlns:oel="http://schemas.microsoft.com/office/2019/extlst" xmlns:r="http://schemas.openxmlformats.org/officeDocument/2006/relationships" xmlns:m="http://schemas.openxmlformats.org/officeDocument/2006/math" xmlns:v="urn:schemas-microsoft-com:vml" xmlns:wp14="http://schemas.microsoft.com/office/word/2010/wordprocessingDrawing" xmlns:wp="http://schemas.openxmlformats.org/drawingml/2006/wordprocessingDrawing" xmlns:w10="urn:schemas-microsoft-com:office:word" xmlns:w="http://schemas.openxmlformats.org/wordprocessingml/2006/main" xmlns:w14="http://schemas.microsoft.com/office/word/2010/wordml" xmlns:w15="http://schemas.microsoft.com/office/word/2012/wordml" xmlns:w16cei="http://schemas.microsoft.com/office/word/2026/wordml/cei" xmlns:w16cex="http://schemas.microsoft.com/office/word/2018/wordml/cex" xmlns:w16cid="http://schemas.microsoft.com/office/word/2016/wordml/cid" xmlns:w16="http://schemas.microsoft.com/office/word/2018/wordml" xmlns:w16du="http://schemas.microsoft.com/office/word/2023/wordml/word16du" xmlns:w16sdtdh="http://schemas.microsoft.com/office/word/2020/wordml/sdtdatahash" xmlns:w16sdtfl="http://schemas.microsoft.com/office/word/2024/wordml/sdtformatlock" xmlns:w16se="http://schemas.microsoft.com/office/word/2015/wordml/symex" xmlns:wpg="http://schemas.microsoft.com/office/word/2010/wordprocessingGroup" xmlns:wpi="http://schemas.microsoft.com/office/word/2010/wordprocessingInk" xmlns:wne="http://schemas.microsoft.com/office/word/2006/wordml" xmlns:wps="http://schemas.microsoft.com/office/word/2010/wordprocessingShape" mc:Ignorable="w14 w15 w16se w16cid w16 w16cex w16sdtdh w16sdtfl w16du wp14">
+<w:hdr xmlns:wpc="http://schemas.microsoft.com/office/word/2010/wordprocessingCanvas" xmlns:cx="http://schemas.microsoft.com/office/drawing/2014/chartex" xmlns:cx1="http://schemas.microsoft.com/office/drawing/2015/9/8/chartex" xmlns:cx2="http://schemas.microsoft.com/office/drawing/2015/10/21/chartex" xmlns:cx3="http://schemas.microsoft.com/office/drawing/2016/5/9/chartex" xmlns:cx4="http://schemas.microsoft.com/office/drawing/2016/5/10/chartex" xmlns:cx5="http://schemas.microsoft.com/office/drawing/2016/5/11/chartex" xmlns:cx6="http://schemas.microsoft.com/office/drawing/2016/5/12/chartex" xmlns:cx7="http://schemas.microsoft.com/office/drawing/2016/5/13/chartex" xmlns:cx8="http://schemas.microsoft.com/office/drawing/2016/5/14/chartex" xmlns:mc="http://schemas.openxmlformats.org/markup-compatibility/2006" xmlns:m="http://schemas.openxmlformats.org/officeDocument/2006/math" xmlns:aink="http://schemas.microsoft.com/office/drawing/2016/ink" xmlns:am3d="http://schemas.microsoft.com/office/drawing/2017/model3d" xmlns:oel="http://schemas.microsoft.com/office/2019/extlst" xmlns:r="http://schemas.openxmlformats.org/officeDocument/2006/relationships" xmlns:wp14="http://schemas.microsoft.com/office/word/2010/wordprocessingDrawing" xmlns:wp="http://schemas.openxmlformats.org/drawingml/2006/wordprocessingDrawing" xmlns:wpg="http://schemas.microsoft.com/office/word/2010/wordprocessingGroup" xmlns:wpi="http://schemas.microsoft.com/office/word/2010/wordprocessingInk" xmlns:wps="http://schemas.microsoft.com/office/word/2010/wordprocessingShape" xmlns:o="urn:schemas-microsoft-com:office:office" xmlns:v="urn:schemas-microsoft-com:vml" xmlns:w10="urn:schemas-microsoft-com:office:word" xmlns:w="http://schemas.openxmlformats.org/wordprocessingml/2006/main" xmlns:w14="http://schemas.microsoft.com/office/word/2010/wordml" xmlns:w15="http://schemas.microsoft.com/office/word/2012/wordml" xmlns:w16cex="http://schemas.microsoft.com/office/word/2018/wordml/cex" xmlns:w16cid="http://schemas.microsoft.com/office/word/2016/wordml/cid" xmlns:w16="http://schemas.microsoft.com/office/word/2018/wordml" xmlns:w16sdtdh="http://schemas.microsoft.com/office/word/2020/wordml/sdtdatahash" xmlns:w16sdtfl="http://schemas.microsoft.com/office/word/2024/wordml/sdtformatlock" xmlns:w16se="http://schemas.microsoft.com/office/word/2015/wordml/symex" xmlns:w16du="http://schemas.microsoft.com/office/word/2023/wordml/word16du" xmlns:wne="http://schemas.microsoft.com/office/word/2006/wordml" mc:Ignorable="w14 w15 w16se w16cid w16 w16cex w16sdtdh w16sdtfl w16du wp14">
   <w:p>
     <w:pPr>
       <w:pStyle w:val="Header"/>
@@ -7467,7 +7429,7 @@
 </file>
 
 <file path=word/header3.xml><?xml version="1.0" encoding="utf-8"?>
-<w:hdr xmlns:wpc="http://schemas.microsoft.com/office/word/2010/wordprocessingCanvas" xmlns:cx="http://schemas.microsoft.com/office/drawing/2014/chartex" xmlns:cx1="http://schemas.microsoft.com/office/drawing/2015/9/8/chartex" xmlns:cx2="http://schemas.microsoft.com/office/drawing/2015/10/21/chartex" xmlns:cx3="http://schemas.microsoft.com/office/drawing/2016/5/9/chartex" xmlns:cx4="http://schemas.microsoft.com/office/drawing/2016/5/10/chartex" xmlns:cx5="http://schemas.microsoft.com/office/drawing/2016/5/11/chartex" xmlns:cx6="http://schemas.microsoft.com/office/drawing/2016/5/12/chartex" xmlns:cx7="http://schemas.microsoft.com/office/drawing/2016/5/13/chartex" xmlns:cx8="http://schemas.microsoft.com/office/drawing/2016/5/14/chartex" xmlns:mc="http://schemas.openxmlformats.org/markup-compatibility/2006" xmlns:aink="http://schemas.microsoft.com/office/drawing/2016/ink" xmlns:am3d="http://schemas.microsoft.com/office/drawing/2017/model3d" xmlns:o="urn:schemas-microsoft-com:office:office" xmlns:oel="http://schemas.microsoft.com/office/2019/extlst" xmlns:r="http://schemas.openxmlformats.org/officeDocument/2006/relationships" xmlns:m="http://schemas.openxmlformats.org/officeDocument/2006/math" xmlns:v="urn:schemas-microsoft-com:vml" xmlns:wp14="http://schemas.microsoft.com/office/word/2010/wordprocessingDrawing" xmlns:wp="http://schemas.openxmlformats.org/drawingml/2006/wordprocessingDrawing" xmlns:w10="urn:schemas-microsoft-com:office:word" xmlns:w="http://schemas.openxmlformats.org/wordprocessingml/2006/main" xmlns:w14="http://schemas.microsoft.com/office/word/2010/wordml" xmlns:w15="http://schemas.microsoft.com/office/word/2012/wordml" xmlns:w16cei="http://schemas.microsoft.com/office/word/2026/wordml/cei" xmlns:w16cex="http://schemas.microsoft.com/office/word/2018/wordml/cex" xmlns:w16cid="http://schemas.microsoft.com/office/word/2016/wordml/cid" xmlns:w16="http://schemas.microsoft.com/office/word/2018/wordml" xmlns:w16du="http://schemas.microsoft.com/office/word/2023/wordml/word16du" xmlns:w16sdtdh="http://schemas.microsoft.com/office/word/2020/wordml/sdtdatahash" xmlns:w16sdtfl="http://schemas.microsoft.com/office/word/2024/wordml/sdtformatlock" xmlns:w16se="http://schemas.microsoft.com/office/word/2015/wordml/symex" xmlns:wpg="http://schemas.microsoft.com/office/word/2010/wordprocessingGroup" xmlns:wpi="http://schemas.microsoft.com/office/word/2010/wordprocessingInk" xmlns:wne="http://schemas.microsoft.com/office/word/2006/wordml" xmlns:wps="http://schemas.microsoft.com/office/word/2010/wordprocessingShape" mc:Ignorable="w14 w15 w16se w16cid w16 w16cex w16sdtdh w16sdtfl w16du wp14">
+<w:hdr xmlns:wpc="http://schemas.microsoft.com/office/word/2010/wordprocessingCanvas" xmlns:cx="http://schemas.microsoft.com/office/drawing/2014/chartex" xmlns:cx1="http://schemas.microsoft.com/office/drawing/2015/9/8/chartex" xmlns:cx2="http://schemas.microsoft.com/office/drawing/2015/10/21/chartex" xmlns:cx3="http://schemas.microsoft.com/office/drawing/2016/5/9/chartex" xmlns:cx4="http://schemas.microsoft.com/office/drawing/2016/5/10/chartex" xmlns:cx5="http://schemas.microsoft.com/office/drawing/2016/5/11/chartex" xmlns:cx6="http://schemas.microsoft.com/office/drawing/2016/5/12/chartex" xmlns:cx7="http://schemas.microsoft.com/office/drawing/2016/5/13/chartex" xmlns:cx8="http://schemas.microsoft.com/office/drawing/2016/5/14/chartex" xmlns:mc="http://schemas.openxmlformats.org/markup-compatibility/2006" xmlns:m="http://schemas.openxmlformats.org/officeDocument/2006/math" xmlns:aink="http://schemas.microsoft.com/office/drawing/2016/ink" xmlns:am3d="http://schemas.microsoft.com/office/drawing/2017/model3d" xmlns:oel="http://schemas.microsoft.com/office/2019/extlst" xmlns:r="http://schemas.openxmlformats.org/officeDocument/2006/relationships" xmlns:wp14="http://schemas.microsoft.com/office/word/2010/wordprocessingDrawing" xmlns:wp="http://schemas.openxmlformats.org/drawingml/2006/wordprocessingDrawing" xmlns:wpg="http://schemas.microsoft.com/office/word/2010/wordprocessingGroup" xmlns:wpi="http://schemas.microsoft.com/office/word/2010/wordprocessingInk" xmlns:wps="http://schemas.microsoft.com/office/word/2010/wordprocessingShape" xmlns:o="urn:schemas-microsoft-com:office:office" xmlns:v="urn:schemas-microsoft-com:vml" xmlns:w10="urn:schemas-microsoft-com:office:word" xmlns:w="http://schemas.openxmlformats.org/wordprocessingml/2006/main" xmlns:w14="http://schemas.microsoft.com/office/word/2010/wordml" xmlns:w15="http://schemas.microsoft.com/office/word/2012/wordml" xmlns:w16cex="http://schemas.microsoft.com/office/word/2018/wordml/cex" xmlns:w16cid="http://schemas.microsoft.com/office/word/2016/wordml/cid" xmlns:w16="http://schemas.microsoft.com/office/word/2018/wordml" xmlns:w16sdtdh="http://schemas.microsoft.com/office/word/2020/wordml/sdtdatahash" xmlns:w16sdtfl="http://schemas.microsoft.com/office/word/2024/wordml/sdtformatlock" xmlns:w16se="http://schemas.microsoft.com/office/word/2015/wordml/symex" xmlns:w16du="http://schemas.microsoft.com/office/word/2023/wordml/word16du" xmlns:wne="http://schemas.microsoft.com/office/word/2006/wordml" mc:Ignorable="w14 w15 w16se w16cid w16 w16cex w16sdtdh w16sdtfl w16du wp14">
   <w:p>
     <w:pPr>
       <w:pStyle w:val="Header"/>
@@ -7477,7 +7439,7 @@
 </file>
 
 <file path=word/numbering.xml><?xml version="1.0" encoding="utf-8"?>
-<w:numbering xmlns:wpc="http://schemas.microsoft.com/office/word/2010/wordprocessingCanvas" xmlns:cx="http://schemas.microsoft.com/office/drawing/2014/chartex" xmlns:cx1="http://schemas.microsoft.com/office/drawing/2015/9/8/chartex" xmlns:cx2="http://schemas.microsoft.com/office/drawing/2015/10/21/chartex" xmlns:cx3="http://schemas.microsoft.com/office/drawing/2016/5/9/chartex" xmlns:cx4="http://schemas.microsoft.com/office/drawing/2016/5/10/chartex" xmlns:cx5="http://schemas.microsoft.com/office/drawing/2016/5/11/chartex" xmlns:cx6="http://schemas.microsoft.com/office/drawing/2016/5/12/chartex" xmlns:cx7="http://schemas.microsoft.com/office/drawing/2016/5/13/chartex" xmlns:cx8="http://schemas.microsoft.com/office/drawing/2016/5/14/chartex" xmlns:mc="http://schemas.openxmlformats.org/markup-compatibility/2006" xmlns:aink="http://schemas.microsoft.com/office/drawing/2016/ink" xmlns:am3d="http://schemas.microsoft.com/office/drawing/2017/model3d" xmlns:o="urn:schemas-microsoft-com:office:office" xmlns:oel="http://schemas.microsoft.com/office/2019/extlst" xmlns:r="http://schemas.openxmlformats.org/officeDocument/2006/relationships" xmlns:m="http://schemas.openxmlformats.org/officeDocument/2006/math" xmlns:v="urn:schemas-microsoft-com:vml" xmlns:wp14="http://schemas.microsoft.com/office/word/2010/wordprocessingDrawing" xmlns:wp="http://schemas.openxmlformats.org/drawingml/2006/wordprocessingDrawing" xmlns:w10="urn:schemas-microsoft-com:office:word" xmlns:w="http://schemas.openxmlformats.org/wordprocessingml/2006/main" xmlns:w14="http://schemas.microsoft.com/office/word/2010/wordml" xmlns:w15="http://schemas.microsoft.com/office/word/2012/wordml" xmlns:w16cei="http://schemas.microsoft.com/office/word/2026/wordml/cei" xmlns:w16cex="http://schemas.microsoft.com/office/word/2018/wordml/cex" xmlns:w16cid="http://schemas.microsoft.com/office/word/2016/wordml/cid" xmlns:w16="http://schemas.microsoft.com/office/word/2018/wordml" xmlns:w16du="http://schemas.microsoft.com/office/word/2023/wordml/word16du" xmlns:w16sdtdh="http://schemas.microsoft.com/office/word/2020/wordml/sdtdatahash" xmlns:w16sdtfl="http://schemas.microsoft.com/office/word/2024/wordml/sdtformatlock" xmlns:w16se="http://schemas.microsoft.com/office/word/2015/wordml/symex" xmlns:wpg="http://schemas.microsoft.com/office/word/2010/wordprocessingGroup" xmlns:wpi="http://schemas.microsoft.com/office/word/2010/wordprocessingInk" xmlns:wne="http://schemas.microsoft.com/office/word/2006/wordml" xmlns:wps="http://schemas.microsoft.com/office/word/2010/wordprocessingShape" mc:Ignorable="w14 w15 w16se w16cid w16 w16cex w16sdtdh w16sdtfl w16du wp14">
+<w:numbering xmlns:wpc="http://schemas.microsoft.com/office/word/2010/wordprocessingCanvas" xmlns:cx="http://schemas.microsoft.com/office/drawing/2014/chartex" xmlns:cx1="http://schemas.microsoft.com/office/drawing/2015/9/8/chartex" xmlns:cx2="http://schemas.microsoft.com/office/drawing/2015/10/21/chartex" xmlns:cx3="http://schemas.microsoft.com/office/drawing/2016/5/9/chartex" xmlns:cx4="http://schemas.microsoft.com/office/drawing/2016/5/10/chartex" xmlns:cx5="http://schemas.microsoft.com/office/drawing/2016/5/11/chartex" xmlns:cx6="http://schemas.microsoft.com/office/drawing/2016/5/12/chartex" xmlns:cx7="http://schemas.microsoft.com/office/drawing/2016/5/13/chartex" xmlns:cx8="http://schemas.microsoft.com/office/drawing/2016/5/14/chartex" xmlns:mc="http://schemas.openxmlformats.org/markup-compatibility/2006" xmlns:m="http://schemas.openxmlformats.org/officeDocument/2006/math" xmlns:aink="http://schemas.microsoft.com/office/drawing/2016/ink" xmlns:am3d="http://schemas.microsoft.com/office/drawing/2017/model3d" xmlns:oel="http://schemas.microsoft.com/office/2019/extlst" xmlns:r="http://schemas.openxmlformats.org/officeDocument/2006/relationships" xmlns:wp14="http://schemas.microsoft.com/office/word/2010/wordprocessingDrawing" xmlns:wp="http://schemas.openxmlformats.org/drawingml/2006/wordprocessingDrawing" xmlns:wpg="http://schemas.microsoft.com/office/word/2010/wordprocessingGroup" xmlns:wpi="http://schemas.microsoft.com/office/word/2010/wordprocessingInk" xmlns:wps="http://schemas.microsoft.com/office/word/2010/wordprocessingShape" xmlns:o="urn:schemas-microsoft-com:office:office" xmlns:v="urn:schemas-microsoft-com:vml" xmlns:w10="urn:schemas-microsoft-com:office:word" xmlns:w="http://schemas.openxmlformats.org/wordprocessingml/2006/main" xmlns:w14="http://schemas.microsoft.com/office/word/2010/wordml" xmlns:w15="http://schemas.microsoft.com/office/word/2012/wordml" xmlns:w16cex="http://schemas.microsoft.com/office/word/2018/wordml/cex" xmlns:w16cid="http://schemas.microsoft.com/office/word/2016/wordml/cid" xmlns:w16="http://schemas.microsoft.com/office/word/2018/wordml" xmlns:w16sdtdh="http://schemas.microsoft.com/office/word/2020/wordml/sdtdatahash" xmlns:w16sdtfl="http://schemas.microsoft.com/office/word/2024/wordml/sdtformatlock" xmlns:w16se="http://schemas.microsoft.com/office/word/2015/wordml/symex" xmlns:w16du="http://schemas.microsoft.com/office/word/2023/wordml/word16du" xmlns:wne="http://schemas.microsoft.com/office/word/2006/wordml" mc:Ignorable="w14 w15 w16se w16cid w16 w16cex w16sdtdh w16sdtfl w16du wp14">
   <w:abstractNum w:abstractNumId="0" w15:restartNumberingAfterBreak="0">
     <w:nsid w:val="327B23C6"/>
     <w:multiLevelType w:val="hybridMultilevel"/>
@@ -7536,7 +7498,7 @@
 </file>
 
 <file path=word/styles.xml><?xml version="1.0" encoding="utf-8"?>
-<w:styles xmlns:mc="http://schemas.openxmlformats.org/markup-compatibility/2006" xmlns:r="http://schemas.openxmlformats.org/officeDocument/2006/relationships" xmlns:w="http://schemas.openxmlformats.org/wordprocessingml/2006/main" xmlns:w14="http://schemas.microsoft.com/office/word/2010/wordml" xmlns:w15="http://schemas.microsoft.com/office/word/2012/wordml" xmlns:w16cex="http://schemas.microsoft.com/office/word/2018/wordml/cex" xmlns:w16cid="http://schemas.microsoft.com/office/word/2016/wordml/cid" xmlns:w16="http://schemas.microsoft.com/office/word/2018/wordml" xmlns:w16du="http://schemas.microsoft.com/office/word/2023/wordml/word16du" xmlns:w16sdtdh="http://schemas.microsoft.com/office/word/2020/wordml/sdtdatahash" xmlns:w16sdtfl="http://schemas.microsoft.com/office/word/2024/wordml/sdtformatlock" xmlns:w16se="http://schemas.microsoft.com/office/word/2015/wordml/symex" mc:Ignorable="w14 w15 w16se w16cid w16 w16cex w16sdtdh w16sdtfl w16du">
+<w:styles xmlns:mc="http://schemas.openxmlformats.org/markup-compatibility/2006" xmlns:r="http://schemas.openxmlformats.org/officeDocument/2006/relationships" xmlns:w="http://schemas.openxmlformats.org/wordprocessingml/2006/main" xmlns:w14="http://schemas.microsoft.com/office/word/2010/wordml" xmlns:w15="http://schemas.microsoft.com/office/word/2012/wordml" xmlns:w16cex="http://schemas.microsoft.com/office/word/2018/wordml/cex" xmlns:w16cid="http://schemas.microsoft.com/office/word/2016/wordml/cid" xmlns:w16="http://schemas.microsoft.com/office/word/2018/wordml" xmlns:w16sdtdh="http://schemas.microsoft.com/office/word/2020/wordml/sdtdatahash" xmlns:w16sdtfl="http://schemas.microsoft.com/office/word/2024/wordml/sdtformatlock" xmlns:w16se="http://schemas.microsoft.com/office/word/2015/wordml/symex" xmlns:w16du="http://schemas.microsoft.com/office/word/2023/wordml/word16du" mc:Ignorable="w14 w15 w16se w16cid w16 w16cex w16sdtdh w16sdtfl w16du">
   <w:docDefaults>
     <w:rPrDefault>
       <w:rPr>

</xml_diff>